<commit_message>
updated Entwicklungsplan to V2/V3 not completed yet
</commit_message>
<xml_diff>
--- a/doc/Gruppe1_Audio_BPM_Erkennung_Entwicklungsplan.docx
+++ b/doc/Gruppe1_Audio_BPM_Erkennung_Entwicklungsplan.docx
@@ -235,7 +235,11 @@
             <w:rPr>
               <w:rFonts w:eastAsiaTheme="minorEastAsia"/>
               <w:noProof/>
+              <w:kern w:val="2"/>
+              <w:sz w:val="24"/>
+              <w:szCs w:val="24"/>
               <w:lang w:eastAsia="de-DE"/>
+              <w14:ligatures w14:val="standardContextual"/>
             </w:rPr>
           </w:pPr>
           <w:r>
@@ -247,7 +251,7 @@
           <w:r>
             <w:fldChar w:fldCharType="separate"/>
           </w:r>
-          <w:hyperlink w:anchor="_Toc162876564" w:history="1">
+          <w:hyperlink w:anchor="_Toc227674012" w:history="1">
             <w:r>
               <w:rPr>
                 <w:rStyle w:val="Hyperlink"/>
@@ -274,7 +278,7 @@
                 <w:noProof/>
                 <w:webHidden/>
               </w:rPr>
-              <w:instrText xml:space="preserve"> PAGEREF _Toc162876564 \h </w:instrText>
+              <w:instrText xml:space="preserve"> PAGEREF _Toc227674012 \h </w:instrText>
             </w:r>
             <w:r>
               <w:rPr>
@@ -314,10 +318,14 @@
             <w:rPr>
               <w:rFonts w:eastAsiaTheme="minorEastAsia"/>
               <w:noProof/>
+              <w:kern w:val="2"/>
+              <w:sz w:val="24"/>
+              <w:szCs w:val="24"/>
               <w:lang w:eastAsia="de-DE"/>
+              <w14:ligatures w14:val="standardContextual"/>
             </w:rPr>
           </w:pPr>
-          <w:hyperlink w:anchor="_Toc162876565" w:history="1">
+          <w:hyperlink w:anchor="_Toc227674013" w:history="1">
             <w:r>
               <w:rPr>
                 <w:rStyle w:val="Hyperlink"/>
@@ -344,7 +352,7 @@
                 <w:noProof/>
                 <w:webHidden/>
               </w:rPr>
-              <w:instrText xml:space="preserve"> PAGEREF _Toc162876565 \h </w:instrText>
+              <w:instrText xml:space="preserve"> PAGEREF _Toc227674013 \h </w:instrText>
             </w:r>
             <w:r>
               <w:rPr>
@@ -384,17 +392,21 @@
             <w:rPr>
               <w:rFonts w:eastAsiaTheme="minorEastAsia"/>
               <w:noProof/>
+              <w:kern w:val="2"/>
+              <w:sz w:val="24"/>
+              <w:szCs w:val="24"/>
               <w:lang w:eastAsia="de-DE"/>
+              <w14:ligatures w14:val="standardContextual"/>
             </w:rPr>
           </w:pPr>
-          <w:hyperlink w:anchor="_Toc162876566" w:history="1">
+          <w:hyperlink w:anchor="_Toc227674014" w:history="1">
             <w:r>
               <w:rPr>
                 <w:rStyle w:val="Hyperlink"/>
                 <w:noProof/>
                 <w:lang w:val="en-US"/>
               </w:rPr>
-              <w:t>Purpose</w:t>
+              <w:t>Zweck</w:t>
             </w:r>
             <w:r>
               <w:rPr>
@@ -415,7 +427,7 @@
                 <w:noProof/>
                 <w:webHidden/>
               </w:rPr>
-              <w:instrText xml:space="preserve"> PAGEREF _Toc162876566 \h </w:instrText>
+              <w:instrText xml:space="preserve"> PAGEREF _Toc227674014 \h </w:instrText>
             </w:r>
             <w:r>
               <w:rPr>
@@ -455,17 +467,21 @@
             <w:rPr>
               <w:rFonts w:eastAsiaTheme="minorEastAsia"/>
               <w:noProof/>
+              <w:kern w:val="2"/>
+              <w:sz w:val="24"/>
+              <w:szCs w:val="24"/>
               <w:lang w:eastAsia="de-DE"/>
+              <w14:ligatures w14:val="standardContextual"/>
             </w:rPr>
           </w:pPr>
-          <w:hyperlink w:anchor="_Toc162876567" w:history="1">
+          <w:hyperlink w:anchor="_Toc227674015" w:history="1">
             <w:r>
               <w:rPr>
                 <w:rStyle w:val="Hyperlink"/>
                 <w:noProof/>
                 <w:lang w:val="en-US"/>
               </w:rPr>
-              <w:t>Scope</w:t>
+              <w:t>Umfang</w:t>
             </w:r>
             <w:r>
               <w:rPr>
@@ -486,7 +502,7 @@
                 <w:noProof/>
                 <w:webHidden/>
               </w:rPr>
-              <w:instrText xml:space="preserve"> PAGEREF _Toc162876567 \h </w:instrText>
+              <w:instrText xml:space="preserve"> PAGEREF _Toc227674015 \h </w:instrText>
             </w:r>
             <w:r>
               <w:rPr>
@@ -526,17 +542,21 @@
             <w:rPr>
               <w:rFonts w:eastAsiaTheme="minorEastAsia"/>
               <w:noProof/>
+              <w:kern w:val="2"/>
+              <w:sz w:val="24"/>
+              <w:szCs w:val="24"/>
               <w:lang w:eastAsia="de-DE"/>
+              <w14:ligatures w14:val="standardContextual"/>
             </w:rPr>
           </w:pPr>
-          <w:hyperlink w:anchor="_Toc162876568" w:history="1">
+          <w:hyperlink w:anchor="_Toc227674016" w:history="1">
             <w:r>
               <w:rPr>
                 <w:rStyle w:val="Hyperlink"/>
                 <w:noProof/>
                 <w:lang w:val="en-US"/>
               </w:rPr>
-              <w:t>Organization des Projektes</w:t>
+              <w:t>Organisation des Projektes</w:t>
             </w:r>
             <w:r>
               <w:rPr>
@@ -557,7 +577,7 @@
                 <w:noProof/>
                 <w:webHidden/>
               </w:rPr>
-              <w:instrText xml:space="preserve"> PAGEREF _Toc162876568 \h </w:instrText>
+              <w:instrText xml:space="preserve"> PAGEREF _Toc227674016 \h </w:instrText>
             </w:r>
             <w:r>
               <w:rPr>
@@ -578,6 +598,377 @@
                 <w:webHidden/>
               </w:rPr>
               <w:t>5</w:t>
+            </w:r>
+            <w:r>
+              <w:rPr>
+                <w:noProof/>
+                <w:webHidden/>
+              </w:rPr>
+              <w:fldChar w:fldCharType="end"/>
+            </w:r>
+          </w:hyperlink>
+        </w:p>
+        <w:p>
+          <w:pPr>
+            <w:pStyle w:val="Verzeichnis2"/>
+            <w:tabs>
+              <w:tab w:val="right" w:leader="dot" w:pos="9062"/>
+            </w:tabs>
+            <w:rPr>
+              <w:rFonts w:eastAsiaTheme="minorEastAsia"/>
+              <w:noProof/>
+              <w:kern w:val="2"/>
+              <w:sz w:val="24"/>
+              <w:szCs w:val="24"/>
+              <w:lang w:eastAsia="de-DE"/>
+              <w14:ligatures w14:val="standardContextual"/>
+            </w:rPr>
+          </w:pPr>
+          <w:hyperlink w:anchor="_Toc227674017" w:history="1">
+            <w:r>
+              <w:rPr>
+                <w:rStyle w:val="Hyperlink"/>
+                <w:noProof/>
+              </w:rPr>
+              <w:t>Organization des Teams</w:t>
+            </w:r>
+            <w:r>
+              <w:rPr>
+                <w:noProof/>
+                <w:webHidden/>
+              </w:rPr>
+              <w:tab/>
+            </w:r>
+            <w:r>
+              <w:rPr>
+                <w:noProof/>
+                <w:webHidden/>
+              </w:rPr>
+              <w:fldChar w:fldCharType="begin"/>
+            </w:r>
+            <w:r>
+              <w:rPr>
+                <w:noProof/>
+                <w:webHidden/>
+              </w:rPr>
+              <w:instrText xml:space="preserve"> PAGEREF _Toc227674017 \h </w:instrText>
+            </w:r>
+            <w:r>
+              <w:rPr>
+                <w:noProof/>
+                <w:webHidden/>
+              </w:rPr>
+            </w:r>
+            <w:r>
+              <w:rPr>
+                <w:noProof/>
+                <w:webHidden/>
+              </w:rPr>
+              <w:fldChar w:fldCharType="separate"/>
+            </w:r>
+            <w:r>
+              <w:rPr>
+                <w:noProof/>
+                <w:webHidden/>
+              </w:rPr>
+              <w:t>5</w:t>
+            </w:r>
+            <w:r>
+              <w:rPr>
+                <w:noProof/>
+                <w:webHidden/>
+              </w:rPr>
+              <w:fldChar w:fldCharType="end"/>
+            </w:r>
+          </w:hyperlink>
+        </w:p>
+        <w:p>
+          <w:pPr>
+            <w:pStyle w:val="Verzeichnis2"/>
+            <w:tabs>
+              <w:tab w:val="right" w:leader="dot" w:pos="9062"/>
+            </w:tabs>
+            <w:rPr>
+              <w:rFonts w:eastAsiaTheme="minorEastAsia"/>
+              <w:noProof/>
+              <w:kern w:val="2"/>
+              <w:sz w:val="24"/>
+              <w:szCs w:val="24"/>
+              <w:lang w:eastAsia="de-DE"/>
+              <w14:ligatures w14:val="standardContextual"/>
+            </w:rPr>
+          </w:pPr>
+          <w:hyperlink w:anchor="_Toc227674018" w:history="1">
+            <w:r>
+              <w:rPr>
+                <w:rStyle w:val="Hyperlink"/>
+                <w:noProof/>
+              </w:rPr>
+              <w:t>Team/Verantwortlichkeiten</w:t>
+            </w:r>
+            <w:r>
+              <w:rPr>
+                <w:noProof/>
+                <w:webHidden/>
+              </w:rPr>
+              <w:tab/>
+            </w:r>
+            <w:r>
+              <w:rPr>
+                <w:noProof/>
+                <w:webHidden/>
+              </w:rPr>
+              <w:fldChar w:fldCharType="begin"/>
+            </w:r>
+            <w:r>
+              <w:rPr>
+                <w:noProof/>
+                <w:webHidden/>
+              </w:rPr>
+              <w:instrText xml:space="preserve"> PAGEREF _Toc227674018 \h </w:instrText>
+            </w:r>
+            <w:r>
+              <w:rPr>
+                <w:noProof/>
+                <w:webHidden/>
+              </w:rPr>
+            </w:r>
+            <w:r>
+              <w:rPr>
+                <w:noProof/>
+                <w:webHidden/>
+              </w:rPr>
+              <w:fldChar w:fldCharType="separate"/>
+            </w:r>
+            <w:r>
+              <w:rPr>
+                <w:noProof/>
+                <w:webHidden/>
+              </w:rPr>
+              <w:t>5</w:t>
+            </w:r>
+            <w:r>
+              <w:rPr>
+                <w:noProof/>
+                <w:webHidden/>
+              </w:rPr>
+              <w:fldChar w:fldCharType="end"/>
+            </w:r>
+          </w:hyperlink>
+        </w:p>
+        <w:p>
+          <w:pPr>
+            <w:pStyle w:val="Verzeichnis2"/>
+            <w:tabs>
+              <w:tab w:val="right" w:leader="dot" w:pos="9062"/>
+            </w:tabs>
+            <w:rPr>
+              <w:rFonts w:eastAsiaTheme="minorEastAsia"/>
+              <w:noProof/>
+              <w:kern w:val="2"/>
+              <w:sz w:val="24"/>
+              <w:szCs w:val="24"/>
+              <w:lang w:eastAsia="de-DE"/>
+              <w14:ligatures w14:val="standardContextual"/>
+            </w:rPr>
+          </w:pPr>
+          <w:hyperlink w:anchor="_Toc227674019" w:history="1">
+            <w:r>
+              <w:rPr>
+                <w:rStyle w:val="Hyperlink"/>
+                <w:noProof/>
+                <w:lang w:val="en-US"/>
+              </w:rPr>
+              <w:t>Scrum/Sprints</w:t>
+            </w:r>
+            <w:r>
+              <w:rPr>
+                <w:noProof/>
+                <w:webHidden/>
+              </w:rPr>
+              <w:tab/>
+            </w:r>
+            <w:r>
+              <w:rPr>
+                <w:noProof/>
+                <w:webHidden/>
+              </w:rPr>
+              <w:fldChar w:fldCharType="begin"/>
+            </w:r>
+            <w:r>
+              <w:rPr>
+                <w:noProof/>
+                <w:webHidden/>
+              </w:rPr>
+              <w:instrText xml:space="preserve"> PAGEREF _Toc227674019 \h </w:instrText>
+            </w:r>
+            <w:r>
+              <w:rPr>
+                <w:noProof/>
+                <w:webHidden/>
+              </w:rPr>
+            </w:r>
+            <w:r>
+              <w:rPr>
+                <w:noProof/>
+                <w:webHidden/>
+              </w:rPr>
+              <w:fldChar w:fldCharType="separate"/>
+            </w:r>
+            <w:r>
+              <w:rPr>
+                <w:noProof/>
+                <w:webHidden/>
+              </w:rPr>
+              <w:t>5</w:t>
+            </w:r>
+            <w:r>
+              <w:rPr>
+                <w:noProof/>
+                <w:webHidden/>
+              </w:rPr>
+              <w:fldChar w:fldCharType="end"/>
+            </w:r>
+          </w:hyperlink>
+        </w:p>
+        <w:p>
+          <w:pPr>
+            <w:pStyle w:val="Verzeichnis2"/>
+            <w:tabs>
+              <w:tab w:val="right" w:leader="dot" w:pos="9062"/>
+            </w:tabs>
+            <w:rPr>
+              <w:rFonts w:eastAsiaTheme="minorEastAsia"/>
+              <w:noProof/>
+              <w:kern w:val="2"/>
+              <w:sz w:val="24"/>
+              <w:szCs w:val="24"/>
+              <w:lang w:eastAsia="de-DE"/>
+              <w14:ligatures w14:val="standardContextual"/>
+            </w:rPr>
+          </w:pPr>
+          <w:hyperlink w:anchor="_Toc227674020" w:history="1">
+            <w:r>
+              <w:rPr>
+                <w:rStyle w:val="Hyperlink"/>
+                <w:noProof/>
+              </w:rPr>
+              <w:t>Kanban Board</w:t>
+            </w:r>
+            <w:r>
+              <w:rPr>
+                <w:noProof/>
+                <w:webHidden/>
+              </w:rPr>
+              <w:tab/>
+            </w:r>
+            <w:r>
+              <w:rPr>
+                <w:noProof/>
+                <w:webHidden/>
+              </w:rPr>
+              <w:fldChar w:fldCharType="begin"/>
+            </w:r>
+            <w:r>
+              <w:rPr>
+                <w:noProof/>
+                <w:webHidden/>
+              </w:rPr>
+              <w:instrText xml:space="preserve"> PAGEREF _Toc227674020 \h </w:instrText>
+            </w:r>
+            <w:r>
+              <w:rPr>
+                <w:noProof/>
+                <w:webHidden/>
+              </w:rPr>
+            </w:r>
+            <w:r>
+              <w:rPr>
+                <w:noProof/>
+                <w:webHidden/>
+              </w:rPr>
+              <w:fldChar w:fldCharType="separate"/>
+            </w:r>
+            <w:r>
+              <w:rPr>
+                <w:noProof/>
+                <w:webHidden/>
+              </w:rPr>
+              <w:t>6</w:t>
+            </w:r>
+            <w:r>
+              <w:rPr>
+                <w:noProof/>
+                <w:webHidden/>
+              </w:rPr>
+              <w:fldChar w:fldCharType="end"/>
+            </w:r>
+          </w:hyperlink>
+        </w:p>
+        <w:p>
+          <w:pPr>
+            <w:pStyle w:val="Verzeichnis2"/>
+            <w:tabs>
+              <w:tab w:val="right" w:leader="dot" w:pos="9062"/>
+            </w:tabs>
+            <w:rPr>
+              <w:rFonts w:eastAsiaTheme="minorEastAsia"/>
+              <w:noProof/>
+              <w:kern w:val="2"/>
+              <w:sz w:val="24"/>
+              <w:szCs w:val="24"/>
+              <w:lang w:eastAsia="de-DE"/>
+              <w14:ligatures w14:val="standardContextual"/>
+            </w:rPr>
+          </w:pPr>
+          <w:hyperlink w:anchor="_Toc227674021" w:history="1">
+            <w:r>
+              <w:rPr>
+                <w:rStyle w:val="Hyperlink"/>
+                <w:noProof/>
+              </w:rPr>
+              <w:t>Projektablage/Versionierung</w:t>
+            </w:r>
+            <w:r>
+              <w:rPr>
+                <w:noProof/>
+                <w:webHidden/>
+              </w:rPr>
+              <w:tab/>
+            </w:r>
+            <w:r>
+              <w:rPr>
+                <w:noProof/>
+                <w:webHidden/>
+              </w:rPr>
+              <w:fldChar w:fldCharType="begin"/>
+            </w:r>
+            <w:r>
+              <w:rPr>
+                <w:noProof/>
+                <w:webHidden/>
+              </w:rPr>
+              <w:instrText xml:space="preserve"> PAGEREF _Toc227674021 \h </w:instrText>
+            </w:r>
+            <w:r>
+              <w:rPr>
+                <w:noProof/>
+                <w:webHidden/>
+              </w:rPr>
+            </w:r>
+            <w:r>
+              <w:rPr>
+                <w:noProof/>
+                <w:webHidden/>
+              </w:rPr>
+              <w:fldChar w:fldCharType="separate"/>
+            </w:r>
+            <w:r>
+              <w:rPr>
+                <w:noProof/>
+                <w:webHidden/>
+              </w:rPr>
+              <w:t>6</w:t>
             </w:r>
             <w:r>
               <w:rPr>
@@ -597,17 +988,21 @@
             <w:rPr>
               <w:rFonts w:eastAsiaTheme="minorEastAsia"/>
               <w:noProof/>
+              <w:kern w:val="2"/>
+              <w:sz w:val="24"/>
+              <w:szCs w:val="24"/>
               <w:lang w:eastAsia="de-DE"/>
+              <w14:ligatures w14:val="standardContextual"/>
             </w:rPr>
           </w:pPr>
-          <w:hyperlink w:anchor="_Toc162876569" w:history="1">
+          <w:hyperlink w:anchor="_Toc227674022" w:history="1">
             <w:r>
               <w:rPr>
                 <w:rStyle w:val="Hyperlink"/>
                 <w:noProof/>
                 <w:lang w:val="en-US"/>
               </w:rPr>
-              <w:t>Anforderungsmanagement</w:t>
+              <w:t>Anwendung &amp; Ziele</w:t>
             </w:r>
             <w:r>
               <w:rPr>
@@ -628,7 +1023,7 @@
                 <w:noProof/>
                 <w:webHidden/>
               </w:rPr>
-              <w:instrText xml:space="preserve"> PAGEREF _Toc162876569 \h </w:instrText>
+              <w:instrText xml:space="preserve"> PAGEREF _Toc227674022 \h </w:instrText>
             </w:r>
             <w:r>
               <w:rPr>
@@ -648,7 +1043,155 @@
                 <w:noProof/>
                 <w:webHidden/>
               </w:rPr>
-              <w:t>5</w:t>
+              <w:t>6</w:t>
+            </w:r>
+            <w:r>
+              <w:rPr>
+                <w:noProof/>
+                <w:webHidden/>
+              </w:rPr>
+              <w:fldChar w:fldCharType="end"/>
+            </w:r>
+          </w:hyperlink>
+        </w:p>
+        <w:p>
+          <w:pPr>
+            <w:pStyle w:val="Verzeichnis2"/>
+            <w:tabs>
+              <w:tab w:val="right" w:leader="dot" w:pos="9062"/>
+            </w:tabs>
+            <w:rPr>
+              <w:rFonts w:eastAsiaTheme="minorEastAsia"/>
+              <w:noProof/>
+              <w:kern w:val="2"/>
+              <w:sz w:val="24"/>
+              <w:szCs w:val="24"/>
+              <w:lang w:eastAsia="de-DE"/>
+              <w14:ligatures w14:val="standardContextual"/>
+            </w:rPr>
+          </w:pPr>
+          <w:hyperlink w:anchor="_Toc227674023" w:history="1">
+            <w:r>
+              <w:rPr>
+                <w:rStyle w:val="Hyperlink"/>
+                <w:noProof/>
+              </w:rPr>
+              <w:t>Beschreibung der projektspezifischen Anwendung</w:t>
+            </w:r>
+            <w:r>
+              <w:rPr>
+                <w:noProof/>
+                <w:webHidden/>
+              </w:rPr>
+              <w:tab/>
+            </w:r>
+            <w:r>
+              <w:rPr>
+                <w:noProof/>
+                <w:webHidden/>
+              </w:rPr>
+              <w:fldChar w:fldCharType="begin"/>
+            </w:r>
+            <w:r>
+              <w:rPr>
+                <w:noProof/>
+                <w:webHidden/>
+              </w:rPr>
+              <w:instrText xml:space="preserve"> PAGEREF _Toc227674023 \h </w:instrText>
+            </w:r>
+            <w:r>
+              <w:rPr>
+                <w:noProof/>
+                <w:webHidden/>
+              </w:rPr>
+            </w:r>
+            <w:r>
+              <w:rPr>
+                <w:noProof/>
+                <w:webHidden/>
+              </w:rPr>
+              <w:fldChar w:fldCharType="separate"/>
+            </w:r>
+            <w:r>
+              <w:rPr>
+                <w:noProof/>
+                <w:webHidden/>
+              </w:rPr>
+              <w:t>6</w:t>
+            </w:r>
+            <w:r>
+              <w:rPr>
+                <w:noProof/>
+                <w:webHidden/>
+              </w:rPr>
+              <w:fldChar w:fldCharType="end"/>
+            </w:r>
+          </w:hyperlink>
+        </w:p>
+        <w:p>
+          <w:pPr>
+            <w:pStyle w:val="Verzeichnis2"/>
+            <w:tabs>
+              <w:tab w:val="right" w:leader="dot" w:pos="9062"/>
+            </w:tabs>
+            <w:rPr>
+              <w:rFonts w:eastAsiaTheme="minorEastAsia"/>
+              <w:noProof/>
+              <w:kern w:val="2"/>
+              <w:sz w:val="24"/>
+              <w:szCs w:val="24"/>
+              <w:lang w:eastAsia="de-DE"/>
+              <w14:ligatures w14:val="standardContextual"/>
+            </w:rPr>
+          </w:pPr>
+          <w:hyperlink w:anchor="_Toc227674024" w:history="1">
+            <w:r>
+              <w:rPr>
+                <w:rStyle w:val="Hyperlink"/>
+                <w:noProof/>
+              </w:rPr>
+              <w:t>Ziele</w:t>
+            </w:r>
+            <w:r>
+              <w:rPr>
+                <w:noProof/>
+                <w:webHidden/>
+              </w:rPr>
+              <w:tab/>
+            </w:r>
+            <w:r>
+              <w:rPr>
+                <w:noProof/>
+                <w:webHidden/>
+              </w:rPr>
+              <w:fldChar w:fldCharType="begin"/>
+            </w:r>
+            <w:r>
+              <w:rPr>
+                <w:noProof/>
+                <w:webHidden/>
+              </w:rPr>
+              <w:instrText xml:space="preserve"> PAGEREF _Toc227674024 \h </w:instrText>
+            </w:r>
+            <w:r>
+              <w:rPr>
+                <w:noProof/>
+                <w:webHidden/>
+              </w:rPr>
+            </w:r>
+            <w:r>
+              <w:rPr>
+                <w:noProof/>
+                <w:webHidden/>
+              </w:rPr>
+              <w:fldChar w:fldCharType="separate"/>
+            </w:r>
+            <w:r>
+              <w:rPr>
+                <w:noProof/>
+                <w:webHidden/>
+              </w:rPr>
+              <w:t>6</w:t>
             </w:r>
             <w:r>
               <w:rPr>
@@ -668,17 +1211,21 @@
             <w:rPr>
               <w:rFonts w:eastAsiaTheme="minorEastAsia"/>
               <w:noProof/>
+              <w:kern w:val="2"/>
+              <w:sz w:val="24"/>
+              <w:szCs w:val="24"/>
               <w:lang w:eastAsia="de-DE"/>
+              <w14:ligatures w14:val="standardContextual"/>
             </w:rPr>
           </w:pPr>
-          <w:hyperlink w:anchor="_Toc162876570" w:history="1">
+          <w:hyperlink w:anchor="_Toc227674025" w:history="1">
             <w:r>
               <w:rPr>
                 <w:rStyle w:val="Hyperlink"/>
                 <w:noProof/>
                 <w:lang w:val="en-US"/>
               </w:rPr>
-              <w:t>Architektur &amp; Design</w:t>
+              <w:t>Anforderungsmanagement</w:t>
             </w:r>
             <w:r>
               <w:rPr>
@@ -699,7 +1246,7 @@
                 <w:noProof/>
                 <w:webHidden/>
               </w:rPr>
-              <w:instrText xml:space="preserve"> PAGEREF _Toc162876570 \h </w:instrText>
+              <w:instrText xml:space="preserve"> PAGEREF _Toc227674025 \h </w:instrText>
             </w:r>
             <w:r>
               <w:rPr>
@@ -719,7 +1266,81 @@
                 <w:noProof/>
                 <w:webHidden/>
               </w:rPr>
-              <w:t>5</w:t>
+              <w:t>7</w:t>
+            </w:r>
+            <w:r>
+              <w:rPr>
+                <w:noProof/>
+                <w:webHidden/>
+              </w:rPr>
+              <w:fldChar w:fldCharType="end"/>
+            </w:r>
+          </w:hyperlink>
+        </w:p>
+        <w:p>
+          <w:pPr>
+            <w:pStyle w:val="Verzeichnis2"/>
+            <w:tabs>
+              <w:tab w:val="right" w:leader="dot" w:pos="9062"/>
+            </w:tabs>
+            <w:rPr>
+              <w:rFonts w:eastAsiaTheme="minorEastAsia"/>
+              <w:noProof/>
+              <w:kern w:val="2"/>
+              <w:sz w:val="24"/>
+              <w:szCs w:val="24"/>
+              <w:lang w:eastAsia="de-DE"/>
+              <w14:ligatures w14:val="standardContextual"/>
+            </w:rPr>
+          </w:pPr>
+          <w:hyperlink w:anchor="_Toc227674026" w:history="1">
+            <w:r>
+              <w:rPr>
+                <w:rStyle w:val="Hyperlink"/>
+                <w:noProof/>
+              </w:rPr>
+              <w:t>Anforderungsmanagement</w:t>
+            </w:r>
+            <w:r>
+              <w:rPr>
+                <w:noProof/>
+                <w:webHidden/>
+              </w:rPr>
+              <w:tab/>
+            </w:r>
+            <w:r>
+              <w:rPr>
+                <w:noProof/>
+                <w:webHidden/>
+              </w:rPr>
+              <w:fldChar w:fldCharType="begin"/>
+            </w:r>
+            <w:r>
+              <w:rPr>
+                <w:noProof/>
+                <w:webHidden/>
+              </w:rPr>
+              <w:instrText xml:space="preserve"> PAGEREF _Toc227674026 \h </w:instrText>
+            </w:r>
+            <w:r>
+              <w:rPr>
+                <w:noProof/>
+                <w:webHidden/>
+              </w:rPr>
+            </w:r>
+            <w:r>
+              <w:rPr>
+                <w:noProof/>
+                <w:webHidden/>
+              </w:rPr>
+              <w:fldChar w:fldCharType="separate"/>
+            </w:r>
+            <w:r>
+              <w:rPr>
+                <w:noProof/>
+                <w:webHidden/>
+              </w:rPr>
+              <w:t>7</w:t>
             </w:r>
             <w:r>
               <w:rPr>
@@ -739,17 +1360,21 @@
             <w:rPr>
               <w:rFonts w:eastAsiaTheme="minorEastAsia"/>
               <w:noProof/>
+              <w:kern w:val="2"/>
+              <w:sz w:val="24"/>
+              <w:szCs w:val="24"/>
               <w:lang w:eastAsia="de-DE"/>
+              <w14:ligatures w14:val="standardContextual"/>
             </w:rPr>
           </w:pPr>
-          <w:hyperlink w:anchor="_Toc162876571" w:history="1">
+          <w:hyperlink w:anchor="_Toc227674027" w:history="1">
             <w:r>
               <w:rPr>
                 <w:rStyle w:val="Hyperlink"/>
                 <w:noProof/>
                 <w:lang w:val="en-US"/>
               </w:rPr>
-              <w:t>Verifizierung und Validierung</w:t>
+              <w:t>Architektur &amp; Design</w:t>
             </w:r>
             <w:r>
               <w:rPr>
@@ -770,7 +1395,7 @@
                 <w:noProof/>
                 <w:webHidden/>
               </w:rPr>
-              <w:instrText xml:space="preserve"> PAGEREF _Toc162876571 \h </w:instrText>
+              <w:instrText xml:space="preserve"> PAGEREF _Toc227674027 \h </w:instrText>
             </w:r>
             <w:r>
               <w:rPr>
@@ -790,7 +1415,229 @@
                 <w:noProof/>
                 <w:webHidden/>
               </w:rPr>
-              <w:t>5</w:t>
+              <w:t>8</w:t>
+            </w:r>
+            <w:r>
+              <w:rPr>
+                <w:noProof/>
+                <w:webHidden/>
+              </w:rPr>
+              <w:fldChar w:fldCharType="end"/>
+            </w:r>
+          </w:hyperlink>
+        </w:p>
+        <w:p>
+          <w:pPr>
+            <w:pStyle w:val="Verzeichnis2"/>
+            <w:tabs>
+              <w:tab w:val="right" w:leader="dot" w:pos="9062"/>
+            </w:tabs>
+            <w:rPr>
+              <w:rFonts w:eastAsiaTheme="minorEastAsia"/>
+              <w:noProof/>
+              <w:kern w:val="2"/>
+              <w:sz w:val="24"/>
+              <w:szCs w:val="24"/>
+              <w:lang w:eastAsia="de-DE"/>
+              <w14:ligatures w14:val="standardContextual"/>
+            </w:rPr>
+          </w:pPr>
+          <w:hyperlink w:anchor="_Toc227674028" w:history="1">
+            <w:r>
+              <w:rPr>
+                <w:rStyle w:val="Hyperlink"/>
+                <w:noProof/>
+              </w:rPr>
+              <w:t>Architektur</w:t>
+            </w:r>
+            <w:r>
+              <w:rPr>
+                <w:noProof/>
+                <w:webHidden/>
+              </w:rPr>
+              <w:tab/>
+            </w:r>
+            <w:r>
+              <w:rPr>
+                <w:noProof/>
+                <w:webHidden/>
+              </w:rPr>
+              <w:fldChar w:fldCharType="begin"/>
+            </w:r>
+            <w:r>
+              <w:rPr>
+                <w:noProof/>
+                <w:webHidden/>
+              </w:rPr>
+              <w:instrText xml:space="preserve"> PAGEREF _Toc227674028 \h </w:instrText>
+            </w:r>
+            <w:r>
+              <w:rPr>
+                <w:noProof/>
+                <w:webHidden/>
+              </w:rPr>
+            </w:r>
+            <w:r>
+              <w:rPr>
+                <w:noProof/>
+                <w:webHidden/>
+              </w:rPr>
+              <w:fldChar w:fldCharType="separate"/>
+            </w:r>
+            <w:r>
+              <w:rPr>
+                <w:noProof/>
+                <w:webHidden/>
+              </w:rPr>
+              <w:t>8</w:t>
+            </w:r>
+            <w:r>
+              <w:rPr>
+                <w:noProof/>
+                <w:webHidden/>
+              </w:rPr>
+              <w:fldChar w:fldCharType="end"/>
+            </w:r>
+          </w:hyperlink>
+        </w:p>
+        <w:p>
+          <w:pPr>
+            <w:pStyle w:val="Verzeichnis2"/>
+            <w:tabs>
+              <w:tab w:val="right" w:leader="dot" w:pos="9062"/>
+            </w:tabs>
+            <w:rPr>
+              <w:rFonts w:eastAsiaTheme="minorEastAsia"/>
+              <w:noProof/>
+              <w:kern w:val="2"/>
+              <w:sz w:val="24"/>
+              <w:szCs w:val="24"/>
+              <w:lang w:eastAsia="de-DE"/>
+              <w14:ligatures w14:val="standardContextual"/>
+            </w:rPr>
+          </w:pPr>
+          <w:hyperlink w:anchor="_Toc227674029" w:history="1">
+            <w:r>
+              <w:rPr>
+                <w:rStyle w:val="Hyperlink"/>
+                <w:noProof/>
+              </w:rPr>
+              <w:t>Designentscheidungen</w:t>
+            </w:r>
+            <w:r>
+              <w:rPr>
+                <w:noProof/>
+                <w:webHidden/>
+              </w:rPr>
+              <w:tab/>
+            </w:r>
+            <w:r>
+              <w:rPr>
+                <w:noProof/>
+                <w:webHidden/>
+              </w:rPr>
+              <w:fldChar w:fldCharType="begin"/>
+            </w:r>
+            <w:r>
+              <w:rPr>
+                <w:noProof/>
+                <w:webHidden/>
+              </w:rPr>
+              <w:instrText xml:space="preserve"> PAGEREF _Toc227674029 \h </w:instrText>
+            </w:r>
+            <w:r>
+              <w:rPr>
+                <w:noProof/>
+                <w:webHidden/>
+              </w:rPr>
+            </w:r>
+            <w:r>
+              <w:rPr>
+                <w:noProof/>
+                <w:webHidden/>
+              </w:rPr>
+              <w:fldChar w:fldCharType="separate"/>
+            </w:r>
+            <w:r>
+              <w:rPr>
+                <w:noProof/>
+                <w:webHidden/>
+              </w:rPr>
+              <w:t>8</w:t>
+            </w:r>
+            <w:r>
+              <w:rPr>
+                <w:noProof/>
+                <w:webHidden/>
+              </w:rPr>
+              <w:fldChar w:fldCharType="end"/>
+            </w:r>
+          </w:hyperlink>
+        </w:p>
+        <w:p>
+          <w:pPr>
+            <w:pStyle w:val="Verzeichnis2"/>
+            <w:tabs>
+              <w:tab w:val="right" w:leader="dot" w:pos="9062"/>
+            </w:tabs>
+            <w:rPr>
+              <w:rFonts w:eastAsiaTheme="minorEastAsia"/>
+              <w:noProof/>
+              <w:kern w:val="2"/>
+              <w:sz w:val="24"/>
+              <w:szCs w:val="24"/>
+              <w:lang w:eastAsia="de-DE"/>
+              <w14:ligatures w14:val="standardContextual"/>
+            </w:rPr>
+          </w:pPr>
+          <w:hyperlink w:anchor="_Toc227674030" w:history="1">
+            <w:r>
+              <w:rPr>
+                <w:rStyle w:val="Hyperlink"/>
+                <w:noProof/>
+              </w:rPr>
+              <w:t>Wiederverwendung von Open Source Libraries</w:t>
+            </w:r>
+            <w:r>
+              <w:rPr>
+                <w:noProof/>
+                <w:webHidden/>
+              </w:rPr>
+              <w:tab/>
+            </w:r>
+            <w:r>
+              <w:rPr>
+                <w:noProof/>
+                <w:webHidden/>
+              </w:rPr>
+              <w:fldChar w:fldCharType="begin"/>
+            </w:r>
+            <w:r>
+              <w:rPr>
+                <w:noProof/>
+                <w:webHidden/>
+              </w:rPr>
+              <w:instrText xml:space="preserve"> PAGEREF _Toc227674030 \h </w:instrText>
+            </w:r>
+            <w:r>
+              <w:rPr>
+                <w:noProof/>
+                <w:webHidden/>
+              </w:rPr>
+            </w:r>
+            <w:r>
+              <w:rPr>
+                <w:noProof/>
+                <w:webHidden/>
+              </w:rPr>
+              <w:fldChar w:fldCharType="separate"/>
+            </w:r>
+            <w:r>
+              <w:rPr>
+                <w:noProof/>
+                <w:webHidden/>
+              </w:rPr>
+              <w:t>9</w:t>
             </w:r>
             <w:r>
               <w:rPr>
@@ -810,17 +1657,21 @@
             <w:rPr>
               <w:rFonts w:eastAsiaTheme="minorEastAsia"/>
               <w:noProof/>
+              <w:kern w:val="2"/>
+              <w:sz w:val="24"/>
+              <w:szCs w:val="24"/>
               <w:lang w:eastAsia="de-DE"/>
+              <w14:ligatures w14:val="standardContextual"/>
             </w:rPr>
           </w:pPr>
-          <w:hyperlink w:anchor="_Toc162876572" w:history="1">
+          <w:hyperlink w:anchor="_Toc227674031" w:history="1">
             <w:r>
               <w:rPr>
                 <w:rStyle w:val="Hyperlink"/>
                 <w:noProof/>
                 <w:lang w:val="en-US"/>
               </w:rPr>
-              <w:t>References</w:t>
+              <w:t>Verifizierung und Validierung</w:t>
             </w:r>
             <w:r>
               <w:rPr>
@@ -841,7 +1692,7 @@
                 <w:noProof/>
                 <w:webHidden/>
               </w:rPr>
-              <w:instrText xml:space="preserve"> PAGEREF _Toc162876572 \h </w:instrText>
+              <w:instrText xml:space="preserve"> PAGEREF _Toc227674031 \h </w:instrText>
             </w:r>
             <w:r>
               <w:rPr>
@@ -861,7 +1712,82 @@
                 <w:noProof/>
                 <w:webHidden/>
               </w:rPr>
-              <w:t>6</w:t>
+              <w:t>9</w:t>
+            </w:r>
+            <w:r>
+              <w:rPr>
+                <w:noProof/>
+                <w:webHidden/>
+              </w:rPr>
+              <w:fldChar w:fldCharType="end"/>
+            </w:r>
+          </w:hyperlink>
+        </w:p>
+        <w:p>
+          <w:pPr>
+            <w:pStyle w:val="Verzeichnis2"/>
+            <w:tabs>
+              <w:tab w:val="right" w:leader="dot" w:pos="9062"/>
+            </w:tabs>
+            <w:rPr>
+              <w:rFonts w:eastAsiaTheme="minorEastAsia"/>
+              <w:noProof/>
+              <w:kern w:val="2"/>
+              <w:sz w:val="24"/>
+              <w:szCs w:val="24"/>
+              <w:lang w:eastAsia="de-DE"/>
+              <w14:ligatures w14:val="standardContextual"/>
+            </w:rPr>
+          </w:pPr>
+          <w:hyperlink w:anchor="_Toc227674032" w:history="1">
+            <w:r>
+              <w:rPr>
+                <w:rStyle w:val="Hyperlink"/>
+                <w:noProof/>
+                <w:lang w:val="en-US"/>
+              </w:rPr>
+              <w:t>Formelle Test Cases</w:t>
+            </w:r>
+            <w:r>
+              <w:rPr>
+                <w:noProof/>
+                <w:webHidden/>
+              </w:rPr>
+              <w:tab/>
+            </w:r>
+            <w:r>
+              <w:rPr>
+                <w:noProof/>
+                <w:webHidden/>
+              </w:rPr>
+              <w:fldChar w:fldCharType="begin"/>
+            </w:r>
+            <w:r>
+              <w:rPr>
+                <w:noProof/>
+                <w:webHidden/>
+              </w:rPr>
+              <w:instrText xml:space="preserve"> PAGEREF _Toc227674032 \h </w:instrText>
+            </w:r>
+            <w:r>
+              <w:rPr>
+                <w:noProof/>
+                <w:webHidden/>
+              </w:rPr>
+            </w:r>
+            <w:r>
+              <w:rPr>
+                <w:noProof/>
+                <w:webHidden/>
+              </w:rPr>
+              <w:fldChar w:fldCharType="separate"/>
+            </w:r>
+            <w:r>
+              <w:rPr>
+                <w:noProof/>
+                <w:webHidden/>
+              </w:rPr>
+              <w:t>9</w:t>
             </w:r>
             <w:r>
               <w:rPr>
@@ -881,16 +1807,95 @@
             <w:rPr>
               <w:rFonts w:eastAsiaTheme="minorEastAsia"/>
               <w:noProof/>
+              <w:kern w:val="2"/>
+              <w:sz w:val="24"/>
+              <w:szCs w:val="24"/>
               <w:lang w:eastAsia="de-DE"/>
+              <w14:ligatures w14:val="standardContextual"/>
             </w:rPr>
           </w:pPr>
-          <w:hyperlink w:anchor="_Toc162876573" w:history="1">
+          <w:hyperlink w:anchor="_Toc227674033" w:history="1">
             <w:r>
               <w:rPr>
                 <w:rStyle w:val="Hyperlink"/>
                 <w:noProof/>
                 <w:lang w:val="en-US"/>
               </w:rPr>
+              <w:t>References</w:t>
+            </w:r>
+            <w:r>
+              <w:rPr>
+                <w:noProof/>
+                <w:webHidden/>
+              </w:rPr>
+              <w:tab/>
+            </w:r>
+            <w:r>
+              <w:rPr>
+                <w:noProof/>
+                <w:webHidden/>
+              </w:rPr>
+              <w:fldChar w:fldCharType="begin"/>
+            </w:r>
+            <w:r>
+              <w:rPr>
+                <w:noProof/>
+                <w:webHidden/>
+              </w:rPr>
+              <w:instrText xml:space="preserve"> PAGEREF _Toc227674033 \h </w:instrText>
+            </w:r>
+            <w:r>
+              <w:rPr>
+                <w:noProof/>
+                <w:webHidden/>
+              </w:rPr>
+            </w:r>
+            <w:r>
+              <w:rPr>
+                <w:noProof/>
+                <w:webHidden/>
+              </w:rPr>
+              <w:fldChar w:fldCharType="separate"/>
+            </w:r>
+            <w:r>
+              <w:rPr>
+                <w:noProof/>
+                <w:webHidden/>
+              </w:rPr>
+              <w:t>11</w:t>
+            </w:r>
+            <w:r>
+              <w:rPr>
+                <w:noProof/>
+                <w:webHidden/>
+              </w:rPr>
+              <w:fldChar w:fldCharType="end"/>
+            </w:r>
+          </w:hyperlink>
+        </w:p>
+        <w:p>
+          <w:pPr>
+            <w:pStyle w:val="Verzeichnis1"/>
+            <w:tabs>
+              <w:tab w:val="right" w:leader="dot" w:pos="9062"/>
+            </w:tabs>
+            <w:rPr>
+              <w:rFonts w:eastAsiaTheme="minorEastAsia"/>
+              <w:noProof/>
+              <w:kern w:val="2"/>
+              <w:sz w:val="24"/>
+              <w:szCs w:val="24"/>
+              <w:lang w:eastAsia="de-DE"/>
+              <w14:ligatures w14:val="standardContextual"/>
+            </w:rPr>
+          </w:pPr>
+          <w:hyperlink w:anchor="_Toc227674034" w:history="1">
+            <w:r>
+              <w:rPr>
+                <w:rStyle w:val="Hyperlink"/>
+                <w:noProof/>
+                <w:lang w:val="en-US"/>
+              </w:rPr>
               <w:t>Distribution list</w:t>
             </w:r>
             <w:r>
@@ -912,7 +1917,7 @@
                 <w:noProof/>
                 <w:webHidden/>
               </w:rPr>
-              <w:instrText xml:space="preserve"> PAGEREF _Toc162876573 \h </w:instrText>
+              <w:instrText xml:space="preserve"> PAGEREF _Toc227674034 \h </w:instrText>
             </w:r>
             <w:r>
               <w:rPr>
@@ -932,7 +1937,7 @@
                 <w:noProof/>
                 <w:webHidden/>
               </w:rPr>
-              <w:t>7</w:t>
+              <w:t>12</w:t>
             </w:r>
             <w:r>
               <w:rPr>
@@ -963,7 +1968,7 @@
       <w:pPr>
         <w:pStyle w:val="berschrift1"/>
       </w:pPr>
-      <w:bookmarkStart w:id="0" w:name="_Toc162876564"/>
+      <w:bookmarkStart w:id="0" w:name="_Toc227674012"/>
       <w:proofErr w:type="spellStart"/>
       <w:r>
         <w:lastRenderedPageBreak/>
@@ -1072,19 +2077,31 @@
           <w:tcPr>
             <w:tcW w:w="988" w:type="dxa"/>
           </w:tcPr>
-          <w:p/>
+          <w:p>
+            <w:r>
+              <w:t>2.0</w:t>
+            </w:r>
+          </w:p>
         </w:tc>
         <w:tc>
           <w:tcPr>
             <w:tcW w:w="1842" w:type="dxa"/>
           </w:tcPr>
-          <w:p/>
+          <w:p>
+            <w:r>
+              <w:t>Gruppe 1</w:t>
+            </w:r>
+          </w:p>
         </w:tc>
         <w:tc>
           <w:tcPr>
             <w:tcW w:w="6232" w:type="dxa"/>
           </w:tcPr>
-          <w:p/>
+          <w:p>
+            <w:r>
+              <w:t>Kapitel Anwendung &amp; Ziele und Anforderungsmanagement ergänzt.</w:t>
+            </w:r>
+          </w:p>
         </w:tc>
       </w:tr>
       <w:tr>
@@ -1092,19 +2109,31 @@
           <w:tcPr>
             <w:tcW w:w="988" w:type="dxa"/>
           </w:tcPr>
-          <w:p/>
+          <w:p>
+            <w:r>
+              <w:t>3.0</w:t>
+            </w:r>
+          </w:p>
         </w:tc>
         <w:tc>
           <w:tcPr>
             <w:tcW w:w="1842" w:type="dxa"/>
           </w:tcPr>
-          <w:p/>
+          <w:p>
+            <w:r>
+              <w:t>Gruppe 1</w:t>
+            </w:r>
+          </w:p>
         </w:tc>
         <w:tc>
           <w:tcPr>
             <w:tcW w:w="6232" w:type="dxa"/>
           </w:tcPr>
-          <w:p/>
+          <w:p>
+            <w:r>
+              <w:t>Kapitel Architektur &amp; Design und Verifizierung und Validierung ergänzt</w:t>
+            </w:r>
+          </w:p>
         </w:tc>
       </w:tr>
       <w:tr>
@@ -1173,7 +2202,7 @@
       <w:pPr>
         <w:pStyle w:val="berschrift1"/>
       </w:pPr>
-      <w:bookmarkStart w:id="1" w:name="_Toc162876565"/>
+      <w:bookmarkStart w:id="1" w:name="_Toc227674013"/>
       <w:r>
         <w:t xml:space="preserve">Template </w:t>
       </w:r>
@@ -1376,6 +2405,7 @@
           <w:lang w:val="en-US"/>
         </w:rPr>
       </w:pPr>
+      <w:bookmarkStart w:id="2" w:name="_Toc227674014"/>
       <w:r>
         <w:rPr>
           <w:lang w:val="en-US"/>
@@ -1383,6 +2413,7 @@
         <w:lastRenderedPageBreak/>
         <w:t>Zweck</w:t>
       </w:r>
+      <w:bookmarkEnd w:id="2"/>
     </w:p>
     <w:p>
       <w:r>
@@ -1415,6 +2446,7 @@
           <w:lang w:val="en-US"/>
         </w:rPr>
       </w:pPr>
+      <w:bookmarkStart w:id="3" w:name="_Toc227674015"/>
       <w:proofErr w:type="spellStart"/>
       <w:r>
         <w:rPr>
@@ -1422,6 +2454,7 @@
         </w:rPr>
         <w:t>Umfang</w:t>
       </w:r>
+      <w:bookmarkEnd w:id="3"/>
       <w:proofErr w:type="spellEnd"/>
     </w:p>
     <w:p>
@@ -1467,7 +2500,7 @@
           <w:lang w:val="en-US"/>
         </w:rPr>
       </w:pPr>
-      <w:bookmarkStart w:id="2" w:name="_Toc162876568"/>
+      <w:bookmarkStart w:id="4" w:name="_Toc227674016"/>
       <w:proofErr w:type="spellStart"/>
       <w:r>
         <w:rPr>
@@ -1502,7 +2535,7 @@
         </w:rPr>
         <w:t>Projektes</w:t>
       </w:r>
-      <w:bookmarkEnd w:id="2"/>
+      <w:bookmarkEnd w:id="4"/>
       <w:proofErr w:type="spellEnd"/>
     </w:p>
     <w:p>
@@ -1514,167 +2547,53 @@
     </w:p>
     <w:p>
       <w:pPr>
-        <w:pStyle w:val="Listenabsatz"/>
-        <w:numPr>
-          <w:ilvl w:val="0"/>
-          <w:numId w:val="1"/>
-        </w:numPr>
-        <w:rPr>
-          <w:lang w:val="en-US"/>
-        </w:rPr>
-      </w:pPr>
-      <w:r>
-        <w:rPr>
-          <w:lang w:val="en-US"/>
-        </w:rPr>
-        <w:t>Team</w:t>
-      </w:r>
-    </w:p>
-    <w:p>
-      <w:pPr>
-        <w:pStyle w:val="Listenabsatz"/>
-        <w:numPr>
-          <w:ilvl w:val="0"/>
-          <w:numId w:val="1"/>
-        </w:numPr>
-        <w:rPr>
-          <w:lang w:val="en-US"/>
-        </w:rPr>
-      </w:pPr>
-      <w:r>
-        <w:rPr>
-          <w:lang w:val="en-US"/>
-        </w:rPr>
+        <w:pStyle w:val="berschrift2"/>
+      </w:pPr>
+      <w:bookmarkStart w:id="5" w:name="_Toc163900061"/>
+      <w:bookmarkStart w:id="6" w:name="_Toc227674017"/>
+      <w:proofErr w:type="spellStart"/>
+      <w:r>
+        <w:t>Organization</w:t>
+      </w:r>
+      <w:proofErr w:type="spellEnd"/>
+      <w:r>
+        <w:t xml:space="preserve"> des Teams</w:t>
+      </w:r>
+      <w:bookmarkEnd w:id="5"/>
+      <w:bookmarkEnd w:id="6"/>
+    </w:p>
+    <w:p>
+      <w:r>
+        <w:t xml:space="preserve">Das Projekt wird die agile Methode </w:t>
+      </w:r>
+      <w:proofErr w:type="spellStart"/>
+      <w:r>
         <w:t>Scrum</w:t>
       </w:r>
-    </w:p>
-    <w:p>
-      <w:pPr>
-        <w:pStyle w:val="Listenabsatz"/>
-        <w:numPr>
-          <w:ilvl w:val="0"/>
-          <w:numId w:val="1"/>
-        </w:numPr>
-        <w:rPr>
-          <w:lang w:val="en-US"/>
-        </w:rPr>
-      </w:pPr>
-      <w:r>
-        <w:rPr>
-          <w:lang w:val="en-US"/>
-        </w:rPr>
-        <w:t>Sprints</w:t>
-      </w:r>
-    </w:p>
-    <w:p>
-      <w:pPr>
-        <w:pStyle w:val="Listenabsatz"/>
-        <w:numPr>
-          <w:ilvl w:val="0"/>
-          <w:numId w:val="1"/>
-        </w:numPr>
-        <w:rPr>
-          <w:lang w:val="en-US"/>
-        </w:rPr>
-      </w:pPr>
-      <w:r>
-        <w:rPr>
-          <w:lang w:val="en-US"/>
-        </w:rPr>
-        <w:t>Kanban Board</w:t>
-      </w:r>
-    </w:p>
-    <w:p>
-      <w:pPr>
-        <w:pStyle w:val="Listenabsatz"/>
-        <w:numPr>
-          <w:ilvl w:val="0"/>
-          <w:numId w:val="1"/>
-        </w:numPr>
-        <w:rPr>
-          <w:lang w:val="en-US"/>
-        </w:rPr>
-      </w:pPr>
+      <w:proofErr w:type="spellEnd"/>
+      <w:r>
+        <w:t xml:space="preserve"> für die Entwicklung verwenden. Siehe Abschnitt „</w:t>
+      </w:r>
       <w:proofErr w:type="spellStart"/>
       <w:r>
-        <w:rPr>
-          <w:lang w:val="en-US"/>
-        </w:rPr>
-        <w:t>Projektablage</w:t>
+        <w:t>Scrum</w:t>
       </w:r>
       <w:proofErr w:type="spellEnd"/>
-    </w:p>
-    <w:p>
-      <w:pPr>
-        <w:pStyle w:val="Listenabsatz"/>
-        <w:numPr>
-          <w:ilvl w:val="0"/>
-          <w:numId w:val="1"/>
-        </w:numPr>
-        <w:rPr>
-          <w:lang w:val="en-US"/>
-        </w:rPr>
-      </w:pPr>
-      <w:proofErr w:type="spellStart"/>
-      <w:r>
-        <w:rPr>
-          <w:lang w:val="en-US"/>
-        </w:rPr>
-        <w:t>Versionierung</w:t>
-      </w:r>
-      <w:proofErr w:type="spellEnd"/>
-      <w:r>
-        <w:rPr>
-          <w:lang w:val="en-US"/>
-        </w:rPr>
-        <w:t>/Configuration Management</w:t>
+      <w:r>
+        <w:t>“.</w:t>
       </w:r>
     </w:p>
     <w:p>
       <w:pPr>
         <w:pStyle w:val="berschrift2"/>
       </w:pPr>
-      <w:bookmarkStart w:id="3" w:name="_Toc163900061"/>
-      <w:proofErr w:type="spellStart"/>
-      <w:r>
-        <w:t>Organization</w:t>
-      </w:r>
-      <w:proofErr w:type="spellEnd"/>
-      <w:r>
-        <w:t xml:space="preserve"> des Teams</w:t>
-      </w:r>
-      <w:bookmarkEnd w:id="3"/>
-    </w:p>
-    <w:p>
-      <w:r>
-        <w:t xml:space="preserve">Das Projekt wird die agile Methode </w:t>
-      </w:r>
-      <w:proofErr w:type="spellStart"/>
-      <w:r>
-        <w:t>Scrum</w:t>
-      </w:r>
-      <w:proofErr w:type="spellEnd"/>
-      <w:r>
-        <w:t xml:space="preserve"> für die Entwicklung verwenden. Siehe Abschnitt „</w:t>
-      </w:r>
-      <w:proofErr w:type="spellStart"/>
-      <w:r>
-        <w:t>Scrum</w:t>
-      </w:r>
-      <w:proofErr w:type="spellEnd"/>
-      <w:r>
-        <w:t>“.</w:t>
-      </w:r>
-    </w:p>
-    <w:p>
-      <w:pPr>
-        <w:pStyle w:val="berschrift2"/>
-      </w:pPr>
-      <w:bookmarkStart w:id="4" w:name="_Toc163900062"/>
+      <w:bookmarkStart w:id="7" w:name="_Toc163900062"/>
+      <w:bookmarkStart w:id="8" w:name="_Toc227674018"/>
       <w:r>
         <w:t>Team/Verantwortlichkeiten</w:t>
       </w:r>
-      <w:bookmarkEnd w:id="4"/>
+      <w:bookmarkEnd w:id="7"/>
+      <w:bookmarkEnd w:id="8"/>
     </w:p>
     <w:p>
       <w:r>
@@ -1682,23 +2601,11 @@
       </w:r>
       <w:proofErr w:type="gramStart"/>
       <w:r>
-        <w:t>aus folgende</w:t>
-      </w:r>
-      <w:r>
-        <w:t>n</w:t>
+        <w:t>aus folgenden</w:t>
       </w:r>
       <w:proofErr w:type="gramEnd"/>
       <w:r>
-        <w:t xml:space="preserve"> </w:t>
-      </w:r>
-      <w:r>
-        <w:t>Mitglieder</w:t>
-      </w:r>
-      <w:r>
-        <w:t>n</w:t>
-      </w:r>
-      <w:r>
-        <w:t xml:space="preserve"> mit den entsprechenden Rollen und Verantwortlichkeiten:</w:t>
+        <w:t xml:space="preserve"> Mitgliedern mit den entsprechenden Rollen und Verantwortlichkeiten:</w:t>
       </w:r>
     </w:p>
     <w:tbl>
@@ -1825,11 +2732,9 @@
             <w:r>
               <w:t xml:space="preserve">Bericht an P. Pagliarulo im Fall </w:t>
             </w:r>
-            <w:proofErr w:type="gramStart"/>
-            <w:r>
-              <w:t>von Blockers</w:t>
-            </w:r>
-            <w:proofErr w:type="gramEnd"/>
+            <w:r>
+              <w:t>von Blocker</w:t>
+            </w:r>
             <w:r>
               <w:t xml:space="preserve"> und Unterbrechungen</w:t>
             </w:r>
@@ -1928,10 +2833,7 @@
           </w:tcPr>
           <w:p>
             <w:r>
-              <w:t>HW-Beschaffung/</w:t>
-            </w:r>
-            <w:r>
-              <w:t>SW Tester</w:t>
+              <w:t>HW-Beschaffung/SW Tester</w:t>
             </w:r>
           </w:p>
         </w:tc>
@@ -2095,20 +2997,22 @@
           <w:lang w:val="en-US"/>
         </w:rPr>
       </w:pPr>
-      <w:bookmarkStart w:id="5" w:name="_Toc163900063"/>
+      <w:bookmarkStart w:id="9" w:name="_Toc163900063"/>
+      <w:bookmarkStart w:id="10" w:name="_Toc227674019"/>
       <w:r>
         <w:rPr>
           <w:lang w:val="en-US"/>
         </w:rPr>
         <w:t>Scrum</w:t>
       </w:r>
-      <w:bookmarkEnd w:id="5"/>
+      <w:bookmarkEnd w:id="9"/>
       <w:r>
         <w:rPr>
           <w:lang w:val="en-US"/>
         </w:rPr>
         <w:t>/Sprints</w:t>
       </w:r>
+      <w:bookmarkEnd w:id="10"/>
     </w:p>
     <w:p>
       <w:r>
@@ -2181,32 +3085,45 @@
     </w:p>
     <w:p>
       <w:r>
+        <w:t>Die Planung des Sprints wird mit der Excel Tabelle „</w:t>
+      </w:r>
+      <w:proofErr w:type="spellStart"/>
+      <w:r>
+        <w:t>Prozessortechnik_</w:t>
+      </w:r>
+      <w:r>
+        <w:t>Sprint_Backlog</w:t>
+      </w:r>
+      <w:proofErr w:type="spellEnd"/>
+      <w:r>
+        <w:t>“ [1] vorgenommen.</w:t>
+      </w:r>
+    </w:p>
+    <w:p>
+      <w:r>
+        <w:t xml:space="preserve">Die Tabelle ermöglicht auch die Darstellung von dem </w:t>
+      </w:r>
+      <w:proofErr w:type="spellStart"/>
+      <w:r>
+        <w:t>Burndown</w:t>
+      </w:r>
+      <w:proofErr w:type="spellEnd"/>
+      <w:r>
+        <w:t xml:space="preserve"> Chart und dient auch als Ablage für Sprint Review, Sprint Retrospektive und Blocker/Interrupt Verwaltung.</w:t>
+      </w:r>
+    </w:p>
+    <w:p>
+      <w:pPr>
+        <w:pStyle w:val="berschrift2"/>
+      </w:pPr>
+      <w:bookmarkStart w:id="11" w:name="_Toc163900064"/>
+      <w:bookmarkStart w:id="12" w:name="_Toc227674020"/>
+      <w:r>
         <w:lastRenderedPageBreak/>
-        <w:t>Die Planung des Sprints wird mit der Excel Tabelle „Prozessortechnik_2Weeks_Sprint_Backlog_Template“ [1] vorgenommen.</w:t>
-      </w:r>
-    </w:p>
-    <w:p>
-      <w:r>
-        <w:t xml:space="preserve">Die Tabelle ermöglicht auch die Darstellung von dem </w:t>
-      </w:r>
-      <w:proofErr w:type="spellStart"/>
-      <w:r>
-        <w:t>Burndown</w:t>
-      </w:r>
-      <w:proofErr w:type="spellEnd"/>
-      <w:r>
-        <w:t xml:space="preserve"> Chart und dient auch als Ablage für Sprint Review, Sprint Retrospektive und Blocker/Interrupt Verwaltung.</w:t>
-      </w:r>
-    </w:p>
-    <w:p>
-      <w:pPr>
-        <w:pStyle w:val="berschrift2"/>
-      </w:pPr>
-      <w:bookmarkStart w:id="6" w:name="_Toc163900064"/>
-      <w:r>
         <w:t>Kanban Board</w:t>
       </w:r>
-      <w:bookmarkEnd w:id="6"/>
+      <w:bookmarkEnd w:id="11"/>
+      <w:bookmarkEnd w:id="12"/>
     </w:p>
     <w:p>
       <w:r>
@@ -2224,7 +3141,7 @@
           <w:noProof/>
         </w:rPr>
         <w:drawing>
-          <wp:inline distT="0" distB="0" distL="0" distR="0" wp14:anchorId="192B646E" wp14:editId="463ACD44">
+          <wp:inline distT="0" distB="0" distL="0" distR="0" wp14:anchorId="192B646E" wp14:editId="7D0018C9">
             <wp:extent cx="5753100" cy="577850"/>
             <wp:effectExtent l="0" t="0" r="0" b="0"/>
             <wp:docPr id="488241168" name="Grafik 1"/>
@@ -2273,21 +3190,31 @@
         </w:drawing>
       </w:r>
       <w:r>
-        <w:t>Die Kanban Board wird ebenso in der Excel Tabelle „Prozessortechnik_2Weeks_Sprint_Backlog_Template“ realisiert.</w:t>
+        <w:t>Die Kanban Board wird ebenso in der Excel Tabelle „</w:t>
+      </w:r>
+      <w:proofErr w:type="spellStart"/>
+      <w:r>
+        <w:t>Prozessortechnik_Sprint_Backlog</w:t>
+      </w:r>
+      <w:proofErr w:type="spellEnd"/>
+      <w:r>
+        <w:t>“ realisiert.</w:t>
       </w:r>
     </w:p>
     <w:p>
       <w:pPr>
         <w:pStyle w:val="berschrift2"/>
       </w:pPr>
-      <w:bookmarkStart w:id="7" w:name="_Toc163900065"/>
+      <w:bookmarkStart w:id="13" w:name="_Toc163900065"/>
+      <w:bookmarkStart w:id="14" w:name="_Toc227674021"/>
       <w:r>
         <w:t>Projektablage</w:t>
       </w:r>
-      <w:bookmarkEnd w:id="7"/>
+      <w:bookmarkEnd w:id="13"/>
       <w:r>
         <w:t>/Versionierung</w:t>
       </w:r>
+      <w:bookmarkEnd w:id="14"/>
     </w:p>
     <w:p>
       <w:r>
@@ -2338,7 +3265,7 @@
           <w:lang w:val="en-US"/>
         </w:rPr>
       </w:pPr>
-      <w:bookmarkStart w:id="8" w:name="_Toc162876569"/>
+      <w:bookmarkStart w:id="15" w:name="_Toc227674022"/>
       <w:proofErr w:type="spellStart"/>
       <w:r>
         <w:rPr>
@@ -2360,75 +3287,450 @@
         </w:rPr>
         <w:t>Ziele</w:t>
       </w:r>
+      <w:bookmarkEnd w:id="15"/>
       <w:proofErr w:type="spellEnd"/>
     </w:p>
     <w:p>
       <w:pPr>
-        <w:pStyle w:val="Listenabsatz"/>
-        <w:numPr>
-          <w:ilvl w:val="0"/>
-          <w:numId w:val="5"/>
-        </w:numPr>
         <w:rPr>
           <w:lang w:val="en-US"/>
         </w:rPr>
       </w:pPr>
-      <w:proofErr w:type="spellStart"/>
-      <w:r>
+    </w:p>
+    <w:p>
+      <w:pPr>
+        <w:pStyle w:val="berschrift2"/>
+      </w:pPr>
+      <w:bookmarkStart w:id="16" w:name="_Toc165127826"/>
+      <w:bookmarkStart w:id="17" w:name="_Toc227674023"/>
+      <w:r>
+        <w:t>Be</w:t>
+      </w:r>
+      <w:r>
+        <w:t>schreibung der projektspezifischen Anwendung</w:t>
+      </w:r>
+      <w:bookmarkEnd w:id="16"/>
+      <w:bookmarkEnd w:id="17"/>
+    </w:p>
+    <w:p>
+      <w:r>
+        <w:t>Die Anwendung ist eine Audio</w:t>
+      </w:r>
+      <w:r>
+        <w:t xml:space="preserve"> </w:t>
+      </w:r>
+      <w:r>
+        <w:t>BPM</w:t>
+      </w:r>
+      <w:r>
+        <w:t xml:space="preserve"> </w:t>
+      </w:r>
+      <w:r>
+        <w:t>Erkennung. Sie wird auf dem Board „STM32F746G-Discovery“ unter Nutzung der DSP-Funktionalität des Mikrocontrollers „Arm Cortex-M7“ realisiert. Für die Aufnahme des Audiosignals werden die auf dem Board integrierten Mikrofone verwendet.</w:t>
+      </w:r>
+    </w:p>
+    <w:p>
+      <w:r>
+        <w:t>Nach dem Start der Anwendung wird das eingehende Audiosignal kontinuierlich erfasst und über den ADC digitalisiert. Anschließen</w:t>
+      </w:r>
+      <w:r>
+        <w:t xml:space="preserve">d </w:t>
+      </w:r>
+      <w:r>
+        <w:t>erfolgt die Verarbeitung mittels digitaler Signalverarbeitung, um aus dem Musiksignal die Beats zu extrahieren und die Beats per Minute (BPM) zu berechnen.</w:t>
+      </w:r>
+      <w:r>
+        <w:t xml:space="preserve"> </w:t>
+      </w:r>
+      <w:r>
+        <w:t>Die ermittelte BPM-Zahl wird in Echtzeit auf dem Display des Boards angezeigt.</w:t>
+      </w:r>
+    </w:p>
+    <w:p>
+      <w:r>
+        <w:t>Die Messung kann beliebig oft wiederholt werden, indem neue Audiosignale (z. B. verschiedene Musikstücke) erfasst und analysiert werden. Dabei dient das Entwicklungsboard als Plattform zur Aufnahme analoger Signale, deren Digitalisierung über den ADC sowie zur anschließenden BPM-Erkennung mittels DSP-Algorithmen.</w:t>
+      </w:r>
+    </w:p>
+    <w:p>
+      <w:pPr>
+        <w:pStyle w:val="berschrift2"/>
+      </w:pPr>
+      <w:bookmarkStart w:id="18" w:name="_Toc227674024"/>
+      <w:r>
+        <w:t>Ziele</w:t>
+      </w:r>
+      <w:bookmarkEnd w:id="18"/>
+    </w:p>
+    <w:p>
+      <w:r>
+        <w:t>Die Entwicklung startet in KW1</w:t>
+      </w:r>
+      <w:r>
+        <w:t>7</w:t>
+      </w:r>
+      <w:r>
+        <w:t xml:space="preserve"> und endet in KW2</w:t>
+      </w:r>
+      <w:r>
+        <w:t>6</w:t>
+      </w:r>
+      <w:r>
+        <w:t>:</w:t>
+      </w:r>
+    </w:p>
+    <w:tbl>
+      <w:tblPr>
+        <w:tblStyle w:val="Tabellenraster"/>
+        <w:tblW w:w="0" w:type="auto"/>
+        <w:tblLook w:val="04A0" w:firstRow="1" w:lastRow="0" w:firstColumn="1" w:lastColumn="0" w:noHBand="0" w:noVBand="1"/>
+      </w:tblPr>
+      <w:tblGrid>
+        <w:gridCol w:w="3681"/>
+        <w:gridCol w:w="1276"/>
+        <w:gridCol w:w="4105"/>
+      </w:tblGrid>
+      <w:tr>
+        <w:tc>
+          <w:tcPr>
+            <w:tcW w:w="3681" w:type="dxa"/>
+          </w:tcPr>
+          <w:p>
+            <w:r>
+              <w:t>Ziel</w:t>
+            </w:r>
+          </w:p>
+        </w:tc>
+        <w:tc>
+          <w:tcPr>
+            <w:tcW w:w="1276" w:type="dxa"/>
+          </w:tcPr>
+          <w:p>
+            <w:r>
+              <w:t>Milestone</w:t>
+            </w:r>
+          </w:p>
+        </w:tc>
+        <w:tc>
+          <w:tcPr>
+            <w:tcW w:w="4105" w:type="dxa"/>
+          </w:tcPr>
+          <w:p>
+            <w:r>
+              <w:t>Metrik</w:t>
+            </w:r>
+          </w:p>
+        </w:tc>
+      </w:tr>
+      <w:tr>
+        <w:tc>
+          <w:tcPr>
+            <w:tcW w:w="3681" w:type="dxa"/>
+          </w:tcPr>
+          <w:p>
+            <w:r>
+              <w:t>Alle User Stories und Anforderungen entsprechend dieses Planes durchgesprochen (</w:t>
+            </w:r>
+            <w:proofErr w:type="spellStart"/>
+            <w:r>
+              <w:t>reviewed</w:t>
+            </w:r>
+            <w:proofErr w:type="spellEnd"/>
+            <w:r>
+              <w:t>) und freigegeben</w:t>
+            </w:r>
+          </w:p>
+          <w:p/>
+        </w:tc>
+        <w:tc>
+          <w:tcPr>
+            <w:tcW w:w="1276" w:type="dxa"/>
+          </w:tcPr>
+          <w:p>
+            <w:r>
+              <w:t>KW18</w:t>
+            </w:r>
+          </w:p>
+        </w:tc>
+        <w:tc>
+          <w:tcPr>
+            <w:tcW w:w="4105" w:type="dxa"/>
+          </w:tcPr>
+          <w:p>
+            <w:pPr>
+              <w:rPr>
+                <w:lang w:val="en-US"/>
+              </w:rPr>
+            </w:pPr>
+            <w:r>
+              <w:rPr>
+                <w:lang w:val="en-US"/>
+              </w:rPr>
+              <w:t>Sprint Burndown chart / Kanban Board</w:t>
+            </w:r>
+          </w:p>
+          <w:p>
+            <w:pPr>
+              <w:rPr>
+                <w:lang w:val="en-US"/>
+              </w:rPr>
+            </w:pPr>
+            <w:proofErr w:type="spellStart"/>
+            <w:r>
+              <w:rPr>
+                <w:lang w:val="en-US"/>
+              </w:rPr>
+              <w:t>Sammelstatus</w:t>
+            </w:r>
+            <w:proofErr w:type="spellEnd"/>
+            <w:r>
+              <w:rPr>
+                <w:lang w:val="en-US"/>
+              </w:rPr>
+              <w:t xml:space="preserve"> </w:t>
+            </w:r>
+            <w:proofErr w:type="spellStart"/>
+            <w:r>
+              <w:rPr>
+                <w:lang w:val="en-US"/>
+              </w:rPr>
+              <w:t>Anforderungen</w:t>
+            </w:r>
+            <w:proofErr w:type="spellEnd"/>
+            <w:r>
+              <w:rPr>
+                <w:lang w:val="en-US"/>
+              </w:rPr>
+              <w:t>/User Stories</w:t>
+            </w:r>
+          </w:p>
+        </w:tc>
+      </w:tr>
+      <w:tr>
+        <w:tc>
+          <w:tcPr>
+            <w:tcW w:w="3681" w:type="dxa"/>
+          </w:tcPr>
+          <w:p>
+            <w:r>
+              <w:t>Architektur entsprechend dieses Planes durchgesprochen vervollständigt und freigegeben</w:t>
+            </w:r>
+          </w:p>
+          <w:p/>
+        </w:tc>
+        <w:tc>
+          <w:tcPr>
+            <w:tcW w:w="1276" w:type="dxa"/>
+          </w:tcPr>
+          <w:p>
+            <w:r>
+              <w:t>KW19</w:t>
+            </w:r>
+          </w:p>
+        </w:tc>
+        <w:tc>
+          <w:tcPr>
+            <w:tcW w:w="4105" w:type="dxa"/>
+          </w:tcPr>
+          <w:p>
+            <w:pPr>
+              <w:rPr>
+                <w:lang w:val="en-US"/>
+              </w:rPr>
+            </w:pPr>
+            <w:r>
+              <w:rPr>
+                <w:lang w:val="en-US"/>
+              </w:rPr>
+              <w:t>Sprint Burndown chart / Kanban Board</w:t>
+            </w:r>
+          </w:p>
+          <w:p>
+            <w:pPr>
+              <w:rPr>
+                <w:lang w:val="en-US"/>
+              </w:rPr>
+            </w:pPr>
+            <w:proofErr w:type="spellStart"/>
+            <w:r>
+              <w:rPr>
+                <w:lang w:val="en-US"/>
+              </w:rPr>
+              <w:t>Sammelstatus</w:t>
+            </w:r>
+            <w:proofErr w:type="spellEnd"/>
+            <w:r>
+              <w:rPr>
+                <w:lang w:val="en-US"/>
+              </w:rPr>
+              <w:t xml:space="preserve"> Status </w:t>
+            </w:r>
+            <w:proofErr w:type="spellStart"/>
+            <w:r>
+              <w:rPr>
+                <w:lang w:val="en-US"/>
+              </w:rPr>
+              <w:t>Architektur</w:t>
+            </w:r>
+            <w:proofErr w:type="spellEnd"/>
+          </w:p>
+        </w:tc>
+      </w:tr>
+      <w:tr>
+        <w:tc>
+          <w:tcPr>
+            <w:tcW w:w="3681" w:type="dxa"/>
+          </w:tcPr>
+          <w:p>
+            <w:r>
+              <w:t>Implementierung entsprechend dieses Planes durchgeführt</w:t>
+            </w:r>
+          </w:p>
+          <w:p/>
+        </w:tc>
+        <w:tc>
+          <w:tcPr>
+            <w:tcW w:w="1276" w:type="dxa"/>
+          </w:tcPr>
+          <w:p>
+            <w:r>
+              <w:lastRenderedPageBreak/>
+              <w:t>KW23</w:t>
+            </w:r>
+          </w:p>
+        </w:tc>
+        <w:tc>
+          <w:tcPr>
+            <w:tcW w:w="4105" w:type="dxa"/>
+          </w:tcPr>
+          <w:p>
+            <w:pPr>
+              <w:rPr>
+                <w:lang w:val="en-US"/>
+              </w:rPr>
+            </w:pPr>
+            <w:r>
+              <w:rPr>
+                <w:lang w:val="en-US"/>
+              </w:rPr>
+              <w:t>Sprint Burndown chart / Kanban Board</w:t>
+            </w:r>
+          </w:p>
+          <w:p>
+            <w:pPr>
+              <w:rPr>
+                <w:lang w:val="en-US"/>
+              </w:rPr>
+            </w:pPr>
+            <w:proofErr w:type="spellStart"/>
+            <w:r>
+              <w:rPr>
+                <w:lang w:val="en-US"/>
+              </w:rPr>
+              <w:t>Sammelstatus</w:t>
+            </w:r>
+            <w:proofErr w:type="spellEnd"/>
+            <w:r>
+              <w:rPr>
+                <w:lang w:val="en-US"/>
+              </w:rPr>
+              <w:t xml:space="preserve"> Module </w:t>
+            </w:r>
+            <w:proofErr w:type="spellStart"/>
+            <w:r>
+              <w:rPr>
+                <w:lang w:val="en-US"/>
+              </w:rPr>
+              <w:t>zu</w:t>
+            </w:r>
+            <w:proofErr w:type="spellEnd"/>
+            <w:r>
+              <w:rPr>
+                <w:lang w:val="en-US"/>
+              </w:rPr>
+              <w:t xml:space="preserve"> </w:t>
+            </w:r>
+            <w:proofErr w:type="spellStart"/>
+            <w:r>
+              <w:rPr>
+                <w:lang w:val="en-US"/>
+              </w:rPr>
+              <w:t>implementieren</w:t>
+            </w:r>
+            <w:proofErr w:type="spellEnd"/>
+          </w:p>
+        </w:tc>
+      </w:tr>
+      <w:tr>
+        <w:tc>
+          <w:tcPr>
+            <w:tcW w:w="3681" w:type="dxa"/>
+          </w:tcPr>
+          <w:p>
+            <w:r>
+              <w:t>Verifikation entsprechend dieses Planes durchgeführt</w:t>
+            </w:r>
+          </w:p>
+          <w:p/>
+        </w:tc>
+        <w:tc>
+          <w:tcPr>
+            <w:tcW w:w="1276" w:type="dxa"/>
+          </w:tcPr>
+          <w:p>
+            <w:r>
+              <w:t>KW24</w:t>
+            </w:r>
+          </w:p>
+        </w:tc>
+        <w:tc>
+          <w:tcPr>
+            <w:tcW w:w="4105" w:type="dxa"/>
+          </w:tcPr>
+          <w:p>
+            <w:pPr>
+              <w:rPr>
+                <w:lang w:val="en-US"/>
+              </w:rPr>
+            </w:pPr>
+            <w:r>
+              <w:rPr>
+                <w:lang w:val="en-US"/>
+              </w:rPr>
+              <w:t>Sprint Burndown chart / Kanban Board</w:t>
+            </w:r>
+          </w:p>
+          <w:p>
+            <w:pPr>
+              <w:rPr>
+                <w:lang w:val="en-US"/>
+              </w:rPr>
+            </w:pPr>
+            <w:proofErr w:type="spellStart"/>
+            <w:r>
+              <w:rPr>
+                <w:lang w:val="en-US"/>
+              </w:rPr>
+              <w:t>Sammelstatus</w:t>
+            </w:r>
+            <w:proofErr w:type="spellEnd"/>
+            <w:r>
+              <w:rPr>
+                <w:lang w:val="en-US"/>
+              </w:rPr>
+              <w:t xml:space="preserve"> Test Cases</w:t>
+            </w:r>
+          </w:p>
+        </w:tc>
+      </w:tr>
+    </w:tbl>
+    <w:p/>
+    <w:p>
+      <w:pPr>
+        <w:ind w:left="360"/>
         <w:rPr>
           <w:lang w:val="en-US"/>
         </w:rPr>
-        <w:t>Beschreibung</w:t>
-      </w:r>
-      <w:proofErr w:type="spellEnd"/>
-      <w:r>
-        <w:rPr>
-          <w:lang w:val="en-US"/>
-        </w:rPr>
-        <w:t xml:space="preserve"> der </w:t>
-      </w:r>
-      <w:proofErr w:type="spellStart"/>
-      <w:r>
-        <w:rPr>
-          <w:lang w:val="en-US"/>
-        </w:rPr>
-        <w:t>projektspezifischen</w:t>
-      </w:r>
-      <w:proofErr w:type="spellEnd"/>
-      <w:r>
-        <w:rPr>
-          <w:lang w:val="en-US"/>
-        </w:rPr>
-        <w:t xml:space="preserve"> </w:t>
-      </w:r>
-      <w:proofErr w:type="spellStart"/>
-      <w:r>
-        <w:rPr>
-          <w:lang w:val="en-US"/>
-        </w:rPr>
-        <w:t>Anwendung</w:t>
-      </w:r>
-      <w:proofErr w:type="spellEnd"/>
-    </w:p>
-    <w:p>
-      <w:pPr>
-        <w:pStyle w:val="Listenabsatz"/>
-        <w:numPr>
-          <w:ilvl w:val="0"/>
-          <w:numId w:val="5"/>
-        </w:numPr>
-        <w:rPr>
-          <w:lang w:val="en-US"/>
-        </w:rPr>
-      </w:pPr>
-      <w:proofErr w:type="spellStart"/>
-      <w:r>
-        <w:rPr>
-          <w:lang w:val="en-US"/>
-        </w:rPr>
-        <w:t>Ziele</w:t>
-      </w:r>
-      <w:proofErr w:type="spellEnd"/>
+      </w:pPr>
     </w:p>
     <w:p>
       <w:pPr>
@@ -2437,6 +3739,7 @@
           <w:lang w:val="en-US"/>
         </w:rPr>
       </w:pPr>
+      <w:bookmarkStart w:id="19" w:name="_Toc227674025"/>
       <w:proofErr w:type="spellStart"/>
       <w:r>
         <w:rPr>
@@ -2444,7 +3747,7 @@
         </w:rPr>
         <w:t>Anforderungsmanagement</w:t>
       </w:r>
-      <w:bookmarkEnd w:id="8"/>
+      <w:bookmarkEnd w:id="19"/>
       <w:proofErr w:type="spellEnd"/>
     </w:p>
     <w:p>
@@ -2455,47 +3758,551 @@
       </w:pPr>
     </w:p>
     <w:p>
-      <w:pPr>
-        <w:pStyle w:val="Listenabsatz"/>
-        <w:numPr>
-          <w:ilvl w:val="0"/>
-          <w:numId w:val="2"/>
-        </w:numPr>
+      <w:r>
+        <w:t>In dem Projekt werden zunächst die Stakeholder identifiziert und ihre Bedürfnisse mithilfe von User Stories erfasst. Auf Basis dieser User Stories werden anschließend die Anforderungen abgeleitet.</w:t>
+      </w:r>
+    </w:p>
+    <w:p>
+      <w:r>
+        <w:t xml:space="preserve">Aus den definierten Anforderungen wird die Systemarchitektur entwickelt. Darauf aufbauend werden die </w:t>
+      </w:r>
+      <w:proofErr w:type="gramStart"/>
+      <w:r>
+        <w:t>Test Cases</w:t>
+      </w:r>
+      <w:proofErr w:type="gramEnd"/>
+      <w:r>
+        <w:t xml:space="preserve"> aus den Anforderungen hergeleitet, wobei insbesondere die in den User Stories formulierten Akzeptanzkriterien berücksichtigt werden.</w:t>
+      </w:r>
+    </w:p>
+    <w:p>
+      <w:r>
         <w:rPr>
-          <w:color w:val="000000" w:themeColor="text1"/>
-          <w:lang w:val="en-US"/>
+          <w:noProof/>
+          <w:lang w:eastAsia="de-DE"/>
         </w:rPr>
-      </w:pPr>
+        <w:drawing>
+          <wp:inline distT="0" distB="0" distL="0" distR="0" wp14:anchorId="315C9F89" wp14:editId="496122F6">
+            <wp:extent cx="4694222" cy="1986455"/>
+            <wp:effectExtent l="0" t="0" r="0" b="0"/>
+            <wp:docPr id="2" name="Grafik 2"/>
+            <wp:cNvGraphicFramePr>
+              <a:graphicFrameLocks xmlns:a="http://schemas.openxmlformats.org/drawingml/2006/main" noChangeAspect="1"/>
+            </wp:cNvGraphicFramePr>
+            <a:graphic xmlns:a="http://schemas.openxmlformats.org/drawingml/2006/main">
+              <a:graphicData uri="http://schemas.openxmlformats.org/drawingml/2006/picture">
+                <pic:pic xmlns:pic="http://schemas.openxmlformats.org/drawingml/2006/picture">
+                  <pic:nvPicPr>
+                    <pic:cNvPr id="1" name=""/>
+                    <pic:cNvPicPr/>
+                  </pic:nvPicPr>
+                  <pic:blipFill>
+                    <a:blip r:embed="rId10"/>
+                    <a:stretch>
+                      <a:fillRect/>
+                    </a:stretch>
+                  </pic:blipFill>
+                  <pic:spPr>
+                    <a:xfrm>
+                      <a:off x="0" y="0"/>
+                      <a:ext cx="4701381" cy="1989484"/>
+                    </a:xfrm>
+                    <a:prstGeom prst="rect">
+                      <a:avLst/>
+                    </a:prstGeom>
+                  </pic:spPr>
+                </pic:pic>
+              </a:graphicData>
+            </a:graphic>
+          </wp:inline>
+        </w:drawing>
+      </w:r>
+    </w:p>
+    <w:p>
+      <w:r>
+        <w:t xml:space="preserve">Die </w:t>
+      </w:r>
+      <w:r>
+        <w:t>User Stories werden mit Hilfe der Schablone</w:t>
+      </w:r>
+      <w:r>
+        <w:t xml:space="preserve"> </w:t>
+      </w:r>
+      <w:r>
+        <w:t>definiert:</w:t>
+      </w:r>
+    </w:p>
+    <w:tbl>
+      <w:tblPr>
+        <w:tblStyle w:val="Tabellenraster"/>
+        <w:tblW w:w="0" w:type="auto"/>
+        <w:tblLook w:val="04A0" w:firstRow="1" w:lastRow="0" w:firstColumn="1" w:lastColumn="0" w:noHBand="0" w:noVBand="1"/>
+      </w:tblPr>
+      <w:tblGrid>
+        <w:gridCol w:w="9062"/>
+      </w:tblGrid>
+      <w:tr>
+        <w:tc>
+          <w:tcPr>
+            <w:tcW w:w="9062" w:type="dxa"/>
+          </w:tcPr>
+          <w:p>
+            <w:pPr>
+              <w:rPr>
+                <w:b/>
+              </w:rPr>
+            </w:pPr>
+            <w:r>
+              <w:rPr>
+                <w:b/>
+              </w:rPr>
+              <w:t>User Story ID / Name</w:t>
+            </w:r>
+            <w:r>
+              <w:rPr>
+                <w:b/>
+              </w:rPr>
+              <w:t>:</w:t>
+            </w:r>
+          </w:p>
+        </w:tc>
+      </w:tr>
+      <w:tr>
+        <w:tc>
+          <w:tcPr>
+            <w:tcW w:w="9062" w:type="dxa"/>
+          </w:tcPr>
+          <w:p>
+            <w:r>
+              <w:rPr>
+                <w:b/>
+              </w:rPr>
+              <w:t>User Story</w:t>
+            </w:r>
+            <w:r>
+              <w:t xml:space="preserve">: Als &lt;Beschreibung Benutzer&gt; will ich &lt;Beschreibung Funktion&gt;, so dass &lt;Beschreibung Nutzen&gt; </w:t>
+            </w:r>
+          </w:p>
+        </w:tc>
+      </w:tr>
+      <w:tr>
+        <w:tc>
+          <w:tcPr>
+            <w:tcW w:w="9062" w:type="dxa"/>
+          </w:tcPr>
+          <w:p>
+            <w:r>
+              <w:rPr>
+                <w:b/>
+              </w:rPr>
+              <w:t>Akzeptanzkriterium:</w:t>
+            </w:r>
+            <w:r>
+              <w:t xml:space="preserve"> Gegeben, dass &lt;&gt;, wenn &lt;Beschreibung Aktion</w:t>
+            </w:r>
+            <w:r>
+              <w:t>&gt;, dann</w:t>
+            </w:r>
+            <w:r>
+              <w:t xml:space="preserve"> &lt;Ergebnis der Aktion&gt;</w:t>
+            </w:r>
+          </w:p>
+        </w:tc>
+      </w:tr>
+    </w:tbl>
+    <w:p/>
+    <w:p>
+      <w:pPr>
+        <w:pStyle w:val="berschrift2"/>
+      </w:pPr>
+      <w:bookmarkStart w:id="20" w:name="_Toc165127830"/>
+      <w:bookmarkStart w:id="21" w:name="_Toc227674026"/>
+      <w:r>
+        <w:t>Anforderungsmanagement</w:t>
+      </w:r>
+      <w:bookmarkEnd w:id="20"/>
+      <w:bookmarkEnd w:id="21"/>
+    </w:p>
+    <w:p>
+      <w:r>
+        <w:t xml:space="preserve">Anforderungen werden aus den User Stories hergeleitet. </w:t>
+      </w:r>
+    </w:p>
+    <w:p>
+      <w:r>
+        <w:t>Anforderungen werden mit Hilfe der folgenden Schablone geschrieben:</w:t>
+      </w:r>
+    </w:p>
+    <w:p>
       <w:r>
         <w:rPr>
-          <w:color w:val="000000" w:themeColor="text1"/>
-          <w:lang w:val="en-US"/>
+          <w:noProof/>
+          <w:lang w:eastAsia="de-DE"/>
         </w:rPr>
-        <w:t>User Stories</w:t>
-      </w:r>
-    </w:p>
-    <w:p>
-      <w:pPr>
-        <w:pStyle w:val="Listenabsatz"/>
-        <w:numPr>
-          <w:ilvl w:val="0"/>
-          <w:numId w:val="2"/>
-        </w:numPr>
+        <w:drawing>
+          <wp:inline distT="0" distB="0" distL="0" distR="0" wp14:anchorId="620BEB57" wp14:editId="7E505818">
+            <wp:extent cx="5760720" cy="271145"/>
+            <wp:effectExtent l="0" t="0" r="0" b="0"/>
+            <wp:docPr id="3" name="Grafik 3"/>
+            <wp:cNvGraphicFramePr>
+              <a:graphicFrameLocks xmlns:a="http://schemas.openxmlformats.org/drawingml/2006/main" noChangeAspect="1"/>
+            </wp:cNvGraphicFramePr>
+            <a:graphic xmlns:a="http://schemas.openxmlformats.org/drawingml/2006/main">
+              <a:graphicData uri="http://schemas.openxmlformats.org/drawingml/2006/picture">
+                <pic:pic xmlns:pic="http://schemas.openxmlformats.org/drawingml/2006/picture">
+                  <pic:nvPicPr>
+                    <pic:cNvPr id="1" name=""/>
+                    <pic:cNvPicPr/>
+                  </pic:nvPicPr>
+                  <pic:blipFill>
+                    <a:blip r:embed="rId11"/>
+                    <a:stretch>
+                      <a:fillRect/>
+                    </a:stretch>
+                  </pic:blipFill>
+                  <pic:spPr>
+                    <a:xfrm>
+                      <a:off x="0" y="0"/>
+                      <a:ext cx="5760720" cy="271145"/>
+                    </a:xfrm>
+                    <a:prstGeom prst="rect">
+                      <a:avLst/>
+                    </a:prstGeom>
+                  </pic:spPr>
+                </pic:pic>
+              </a:graphicData>
+            </a:graphic>
+          </wp:inline>
+        </w:drawing>
+      </w:r>
+    </w:p>
+    <w:p>
+      <w:r>
+        <w:t>Folgende Attribute werden für die Anforderungen verwendet:</w:t>
+      </w:r>
+    </w:p>
+    <w:tbl>
+      <w:tblPr>
+        <w:tblStyle w:val="Tabellenraster"/>
+        <w:tblW w:w="0" w:type="auto"/>
+        <w:tblLook w:val="04A0" w:firstRow="1" w:lastRow="0" w:firstColumn="1" w:lastColumn="0" w:noHBand="0" w:noVBand="1"/>
+      </w:tblPr>
+      <w:tblGrid>
+        <w:gridCol w:w="1250"/>
+        <w:gridCol w:w="7812"/>
+      </w:tblGrid>
+      <w:tr>
+        <w:tc>
+          <w:tcPr>
+            <w:tcW w:w="1250" w:type="dxa"/>
+          </w:tcPr>
+          <w:p>
+            <w:pPr>
+              <w:rPr>
+                <w:b/>
+              </w:rPr>
+            </w:pPr>
+            <w:r>
+              <w:rPr>
+                <w:b/>
+              </w:rPr>
+              <w:t>Attribute</w:t>
+            </w:r>
+          </w:p>
+        </w:tc>
+        <w:tc>
+          <w:tcPr>
+            <w:tcW w:w="7812" w:type="dxa"/>
+          </w:tcPr>
+          <w:p>
+            <w:pPr>
+              <w:rPr>
+                <w:b/>
+              </w:rPr>
+            </w:pPr>
+            <w:r>
+              <w:rPr>
+                <w:b/>
+              </w:rPr>
+              <w:t>Definition</w:t>
+            </w:r>
+          </w:p>
+        </w:tc>
+      </w:tr>
+      <w:tr>
+        <w:tc>
+          <w:tcPr>
+            <w:tcW w:w="1250" w:type="dxa"/>
+          </w:tcPr>
+          <w:p>
+            <w:r>
+              <w:t>ID</w:t>
+            </w:r>
+          </w:p>
+        </w:tc>
+        <w:tc>
+          <w:tcPr>
+            <w:tcW w:w="7812" w:type="dxa"/>
+          </w:tcPr>
+          <w:p>
+            <w:r>
+              <w:t xml:space="preserve">Eindeutiger Identifizierungscode, z.B.: </w:t>
+            </w:r>
+            <w:r>
+              <w:rPr>
+                <w:b/>
+                <w:bCs/>
+              </w:rPr>
+              <w:t>DSP_G5_WWW</w:t>
+            </w:r>
+          </w:p>
+        </w:tc>
+      </w:tr>
+      <w:tr>
+        <w:tc>
+          <w:tcPr>
+            <w:tcW w:w="1250" w:type="dxa"/>
+          </w:tcPr>
+          <w:p>
+            <w:r>
+              <w:t>Text</w:t>
+            </w:r>
+          </w:p>
+        </w:tc>
+        <w:tc>
+          <w:tcPr>
+            <w:tcW w:w="7812" w:type="dxa"/>
+          </w:tcPr>
+          <w:p>
+            <w:r>
+              <w:t xml:space="preserve">Anforderungstext: </w:t>
+            </w:r>
+            <w:r>
+              <w:t>Schablonenbasiert</w:t>
+            </w:r>
+          </w:p>
+        </w:tc>
+      </w:tr>
+      <w:tr>
+        <w:tc>
+          <w:tcPr>
+            <w:tcW w:w="1250" w:type="dxa"/>
+          </w:tcPr>
+          <w:p>
+            <w:r>
+              <w:t>Kategorie</w:t>
+            </w:r>
+          </w:p>
+        </w:tc>
+        <w:tc>
+          <w:tcPr>
+            <w:tcW w:w="7812" w:type="dxa"/>
+          </w:tcPr>
+          <w:p>
+            <w:r>
+              <w:t>TBD, Überschrift, Informationen, Funktionale Anforderung, Nicht-Funktionale Anforderung</w:t>
+            </w:r>
+          </w:p>
+        </w:tc>
+      </w:tr>
+      <w:tr>
+        <w:tc>
+          <w:tcPr>
+            <w:tcW w:w="1250" w:type="dxa"/>
+          </w:tcPr>
+          <w:p>
+            <w:r>
+              <w:t>Status</w:t>
+            </w:r>
+          </w:p>
+        </w:tc>
+        <w:tc>
+          <w:tcPr>
+            <w:tcW w:w="7812" w:type="dxa"/>
+          </w:tcPr>
+          <w:p>
+            <w:r>
+              <w:t>TBD, In Klärung, Freigegeben</w:t>
+            </w:r>
+          </w:p>
+        </w:tc>
+      </w:tr>
+      <w:tr>
+        <w:tc>
+          <w:tcPr>
+            <w:tcW w:w="1250" w:type="dxa"/>
+          </w:tcPr>
+          <w:p>
+            <w:r>
+              <w:lastRenderedPageBreak/>
+              <w:t>Review</w:t>
+            </w:r>
+          </w:p>
+        </w:tc>
+        <w:tc>
+          <w:tcPr>
+            <w:tcW w:w="7812" w:type="dxa"/>
+          </w:tcPr>
+          <w:p>
+            <w:r>
+              <w:t xml:space="preserve">TBD, in Review, </w:t>
+            </w:r>
+            <w:proofErr w:type="spellStart"/>
+            <w:r>
+              <w:t>Reviewed</w:t>
+            </w:r>
+            <w:proofErr w:type="spellEnd"/>
+          </w:p>
+        </w:tc>
+      </w:tr>
+      <w:tr>
+        <w:tc>
+          <w:tcPr>
+            <w:tcW w:w="1250" w:type="dxa"/>
+          </w:tcPr>
+          <w:p>
+            <w:proofErr w:type="spellStart"/>
+            <w:r>
+              <w:t>Verification</w:t>
+            </w:r>
+            <w:proofErr w:type="spellEnd"/>
+          </w:p>
+        </w:tc>
+        <w:tc>
+          <w:tcPr>
+            <w:tcW w:w="7812" w:type="dxa"/>
+          </w:tcPr>
+          <w:p>
+            <w:pPr>
+              <w:rPr>
+                <w:lang w:val="en-US"/>
+              </w:rPr>
+            </w:pPr>
+            <w:r>
+              <w:rPr>
+                <w:lang w:val="en-US"/>
+              </w:rPr>
+              <w:t>TBD, positive test, negative test</w:t>
+            </w:r>
+          </w:p>
+        </w:tc>
+      </w:tr>
+    </w:tbl>
+    <w:p>
+      <w:r>
+        <w:t xml:space="preserve">User Stories und Anforderungen werden in einer Excel Tabelle „Stories_Req.xlsx“ verwaltet. In der Tabelle wird auch die </w:t>
+      </w:r>
+      <w:proofErr w:type="spellStart"/>
+      <w:r>
+        <w:t>Traceability</w:t>
+      </w:r>
+      <w:proofErr w:type="spellEnd"/>
+      <w:r>
+        <w:t xml:space="preserve"> manuell hergestellt.</w:t>
+      </w:r>
+    </w:p>
+    <w:p>
+      <w:pPr>
+        <w:pStyle w:val="berschrift1"/>
+      </w:pPr>
+    </w:p>
+    <w:p>
+      <w:r>
+        <w:t>Tabelle User Stories:</w:t>
+      </w:r>
+    </w:p>
+    <w:p>
+      <w:r>
         <w:rPr>
-          <w:color w:val="000000" w:themeColor="text1"/>
-          <w:lang w:val="en-US"/>
+          <w:noProof/>
+          <w:lang w:eastAsia="de-DE"/>
         </w:rPr>
-      </w:pPr>
-      <w:proofErr w:type="spellStart"/>
+        <w:drawing>
+          <wp:inline distT="0" distB="0" distL="0" distR="0" wp14:anchorId="6B509BB5" wp14:editId="0E726CDD">
+            <wp:extent cx="5760720" cy="975360"/>
+            <wp:effectExtent l="0" t="0" r="0" b="0"/>
+            <wp:docPr id="4" name="Grafik 4"/>
+            <wp:cNvGraphicFramePr>
+              <a:graphicFrameLocks xmlns:a="http://schemas.openxmlformats.org/drawingml/2006/main" noChangeAspect="1"/>
+            </wp:cNvGraphicFramePr>
+            <a:graphic xmlns:a="http://schemas.openxmlformats.org/drawingml/2006/main">
+              <a:graphicData uri="http://schemas.openxmlformats.org/drawingml/2006/picture">
+                <pic:pic xmlns:pic="http://schemas.openxmlformats.org/drawingml/2006/picture">
+                  <pic:nvPicPr>
+                    <pic:cNvPr id="1" name=""/>
+                    <pic:cNvPicPr/>
+                  </pic:nvPicPr>
+                  <pic:blipFill>
+                    <a:blip r:embed="rId12"/>
+                    <a:stretch>
+                      <a:fillRect/>
+                    </a:stretch>
+                  </pic:blipFill>
+                  <pic:spPr>
+                    <a:xfrm>
+                      <a:off x="0" y="0"/>
+                      <a:ext cx="5760720" cy="975360"/>
+                    </a:xfrm>
+                    <a:prstGeom prst="rect">
+                      <a:avLst/>
+                    </a:prstGeom>
+                  </pic:spPr>
+                </pic:pic>
+              </a:graphicData>
+            </a:graphic>
+          </wp:inline>
+        </w:drawing>
+      </w:r>
+    </w:p>
+    <w:p>
+      <w:r>
+        <w:t>Tabelle Anforderungen:</w:t>
+      </w:r>
+    </w:p>
+    <w:p>
       <w:r>
         <w:rPr>
-          <w:color w:val="000000" w:themeColor="text1"/>
-          <w:lang w:val="en-US"/>
+          <w:noProof/>
+          <w:lang w:eastAsia="de-DE"/>
         </w:rPr>
-        <w:t>Anforderungen</w:t>
-      </w:r>
-      <w:proofErr w:type="spellEnd"/>
-    </w:p>
+        <w:drawing>
+          <wp:inline distT="0" distB="0" distL="0" distR="0" wp14:anchorId="56C7025F" wp14:editId="2BB2D72C">
+            <wp:extent cx="5760720" cy="528955"/>
+            <wp:effectExtent l="0" t="0" r="0" b="4445"/>
+            <wp:docPr id="5" name="Grafik 5"/>
+            <wp:cNvGraphicFramePr>
+              <a:graphicFrameLocks xmlns:a="http://schemas.openxmlformats.org/drawingml/2006/main" noChangeAspect="1"/>
+            </wp:cNvGraphicFramePr>
+            <a:graphic xmlns:a="http://schemas.openxmlformats.org/drawingml/2006/main">
+              <a:graphicData uri="http://schemas.openxmlformats.org/drawingml/2006/picture">
+                <pic:pic xmlns:pic="http://schemas.openxmlformats.org/drawingml/2006/picture">
+                  <pic:nvPicPr>
+                    <pic:cNvPr id="1" name=""/>
+                    <pic:cNvPicPr/>
+                  </pic:nvPicPr>
+                  <pic:blipFill>
+                    <a:blip r:embed="rId13"/>
+                    <a:stretch>
+                      <a:fillRect/>
+                    </a:stretch>
+                  </pic:blipFill>
+                  <pic:spPr>
+                    <a:xfrm>
+                      <a:off x="0" y="0"/>
+                      <a:ext cx="5760720" cy="528955"/>
+                    </a:xfrm>
+                    <a:prstGeom prst="rect">
+                      <a:avLst/>
+                    </a:prstGeom>
+                  </pic:spPr>
+                </pic:pic>
+              </a:graphicData>
+            </a:graphic>
+          </wp:inline>
+        </w:drawing>
+      </w:r>
+    </w:p>
+    <w:p/>
     <w:p>
       <w:pPr>
         <w:pStyle w:val="berschrift1"/>
@@ -2503,7 +4310,7 @@
           <w:lang w:val="en-US"/>
         </w:rPr>
       </w:pPr>
-      <w:bookmarkStart w:id="9" w:name="_Toc162876570"/>
+      <w:bookmarkStart w:id="22" w:name="_Toc227674027"/>
       <w:proofErr w:type="spellStart"/>
       <w:r>
         <w:rPr>
@@ -2518,7 +4325,7 @@
         </w:rPr>
         <w:t xml:space="preserve"> &amp; Design</w:t>
       </w:r>
-      <w:bookmarkEnd w:id="9"/>
+      <w:bookmarkEnd w:id="22"/>
     </w:p>
     <w:p>
       <w:pPr>
@@ -2529,77 +4336,267 @@
     </w:p>
     <w:p>
       <w:pPr>
+        <w:pStyle w:val="berschrift2"/>
+      </w:pPr>
+      <w:bookmarkStart w:id="23" w:name="_Toc165127832"/>
+      <w:bookmarkStart w:id="24" w:name="_Toc227674028"/>
+      <w:r>
+        <w:t>Architektur</w:t>
+      </w:r>
+      <w:bookmarkEnd w:id="23"/>
+      <w:bookmarkEnd w:id="24"/>
+    </w:p>
+    <w:p>
+      <w:r>
+        <w:t>Die Architektur wird auf unterschiedlichen Abstraktionsebenen beschrieben:</w:t>
+      </w:r>
+    </w:p>
+    <w:p>
+      <w:pPr>
         <w:pStyle w:val="Listenabsatz"/>
         <w:numPr>
           <w:ilvl w:val="0"/>
-          <w:numId w:val="3"/>
+          <w:numId w:val="6"/>
         </w:numPr>
-        <w:rPr>
-          <w:color w:val="000000" w:themeColor="text1"/>
-          <w:lang w:val="en-US"/>
-        </w:rPr>
-      </w:pPr>
-      <w:proofErr w:type="spellStart"/>
-      <w:r>
-        <w:rPr>
-          <w:color w:val="000000" w:themeColor="text1"/>
-          <w:lang w:val="en-US"/>
-        </w:rPr>
-        <w:t>Architektur</w:t>
-      </w:r>
-      <w:proofErr w:type="spellEnd"/>
+      </w:pPr>
+      <w:r>
+        <w:t>Funktional</w:t>
+      </w:r>
     </w:p>
     <w:p>
       <w:pPr>
         <w:pStyle w:val="Listenabsatz"/>
         <w:numPr>
           <w:ilvl w:val="0"/>
-          <w:numId w:val="3"/>
+          <w:numId w:val="6"/>
         </w:numPr>
-        <w:rPr>
-          <w:color w:val="000000" w:themeColor="text1"/>
-          <w:lang w:val="en-US"/>
-        </w:rPr>
-      </w:pPr>
-      <w:proofErr w:type="spellStart"/>
-      <w:r>
-        <w:rPr>
-          <w:color w:val="000000" w:themeColor="text1"/>
-          <w:lang w:val="en-US"/>
-        </w:rPr>
-        <w:t>Designentscheidungen</w:t>
-      </w:r>
-      <w:proofErr w:type="spellEnd"/>
+      </w:pPr>
+      <w:r>
+        <w:t>Logisch</w:t>
+      </w:r>
     </w:p>
     <w:p>
       <w:pPr>
         <w:pStyle w:val="Listenabsatz"/>
         <w:numPr>
           <w:ilvl w:val="0"/>
-          <w:numId w:val="3"/>
+          <w:numId w:val="6"/>
         </w:numPr>
+      </w:pPr>
+      <w:r>
+        <w:t>Physikalisch</w:t>
+      </w:r>
+    </w:p>
+    <w:p>
+      <w:r>
+        <w:t>Die Elemente der Architektur haben einen Namen und eine eindeutige Identifizierung entsprechend folgende Namenskonvention: &lt;</w:t>
+      </w:r>
+      <w:proofErr w:type="spellStart"/>
+      <w:r>
+        <w:t>ArchEl_x</w:t>
+      </w:r>
+      <w:proofErr w:type="spellEnd"/>
+      <w:r>
+        <w:t>&gt;. Die Identifizierung wird verwendet, um Anforderungen mit den Architekturelementen zu verlinken. Die Verlinkung wird in der Excel Tabelle „Stories_Req.xlsx“ dokumentiert.</w:t>
+      </w:r>
+    </w:p>
+    <w:p>
+      <w:r>
+        <w:t xml:space="preserve">Für die Darstellung der Architektur wird die </w:t>
+      </w:r>
+      <w:r>
+        <w:t>UML-Modellierungssprache</w:t>
+      </w:r>
+      <w:r>
+        <w:t xml:space="preserve"> verwendet.</w:t>
+      </w:r>
+    </w:p>
+    <w:p>
+      <w:r>
+        <w:t>Für die Struktur werden Klassendiagramme verwendet.</w:t>
+      </w:r>
+    </w:p>
+    <w:p>
+      <w:r>
+        <w:t>Für das dynamische Verhalten werden Aktivitätsdiagramme und Sequenzdiagramme verwendet.</w:t>
+      </w:r>
+    </w:p>
+    <w:p>
+      <w:r>
+        <w:t>Zustandsbasiertes Verhalten wird durch Hilfe von Zustandsdiagrammen modelliert.</w:t>
+      </w:r>
+    </w:p>
+    <w:p>
+      <w:r>
+        <w:t>Für die Erstellung der Diagramme wird das Tool IBM Rational Rhapsody.</w:t>
+      </w:r>
+    </w:p>
+    <w:p>
+      <w:pPr>
+        <w:pStyle w:val="berschrift2"/>
+      </w:pPr>
+      <w:bookmarkStart w:id="25" w:name="_Toc165127833"/>
+      <w:bookmarkStart w:id="26" w:name="_Toc227674029"/>
+      <w:r>
+        <w:t>Designentscheidungen</w:t>
+      </w:r>
+      <w:bookmarkEnd w:id="25"/>
+      <w:bookmarkEnd w:id="26"/>
+    </w:p>
+    <w:p>
+      <w:r>
+        <w:t>Designentscheidungen werden mit Hilfe von Entscheidungsmatrix begründet und dokumentiert.</w:t>
+      </w:r>
+    </w:p>
+    <w:p>
+      <w:r>
+        <w:t>Folgende Kriterien für die Gegenüberstellung von Alternativen werden berücksichtigt:</w:t>
+      </w:r>
+    </w:p>
+    <w:p>
+      <w:pPr>
+        <w:pStyle w:val="Listenabsatz"/>
+        <w:numPr>
+          <w:ilvl w:val="0"/>
+          <w:numId w:val="7"/>
+        </w:numPr>
+      </w:pPr>
+      <w:r>
+        <w:t>Verfügbarkeit</w:t>
+      </w:r>
+    </w:p>
+    <w:p>
+      <w:pPr>
+        <w:pStyle w:val="Listenabsatz"/>
+        <w:numPr>
+          <w:ilvl w:val="0"/>
+          <w:numId w:val="7"/>
+        </w:numPr>
+      </w:pPr>
+      <w:r>
+        <w:t>Integrierbarkeit</w:t>
+      </w:r>
+    </w:p>
+    <w:p>
+      <w:pPr>
+        <w:pStyle w:val="Listenabsatz"/>
+        <w:numPr>
+          <w:ilvl w:val="0"/>
+          <w:numId w:val="7"/>
+        </w:numPr>
+      </w:pPr>
+      <w:r>
+        <w:lastRenderedPageBreak/>
+        <w:t>Erweiterbarkeit</w:t>
+      </w:r>
+    </w:p>
+    <w:p>
+      <w:pPr>
+        <w:pStyle w:val="Listenabsatz"/>
+        <w:numPr>
+          <w:ilvl w:val="0"/>
+          <w:numId w:val="7"/>
+        </w:numPr>
+      </w:pPr>
+      <w:r>
+        <w:t>Aufwand</w:t>
+      </w:r>
+    </w:p>
+    <w:p>
+      <w:pPr>
+        <w:pStyle w:val="Listenabsatz"/>
+        <w:numPr>
+          <w:ilvl w:val="0"/>
+          <w:numId w:val="7"/>
+        </w:numPr>
+      </w:pPr>
+      <w:r>
+        <w:t>Dokumentation</w:t>
+      </w:r>
+    </w:p>
+    <w:p>
+      <w:pPr>
+        <w:pStyle w:val="Listenabsatz"/>
+        <w:numPr>
+          <w:ilvl w:val="0"/>
+          <w:numId w:val="7"/>
+        </w:numPr>
+      </w:pPr>
+      <w:r>
+        <w:t>Lizenz</w:t>
+      </w:r>
+    </w:p>
+    <w:p/>
+    <w:p>
+      <w:r>
+        <w:t>Für die Entscheidungsmatrix wird folgendes Template verwendet:</w:t>
+      </w:r>
+    </w:p>
+    <w:p>
+      <w:r>
         <w:rPr>
-          <w:color w:val="000000" w:themeColor="text1"/>
-          <w:lang w:val="en-US"/>
+          <w:noProof/>
         </w:rPr>
-      </w:pPr>
-      <w:proofErr w:type="spellStart"/>
-      <w:r>
-        <w:rPr>
-          <w:color w:val="000000" w:themeColor="text1"/>
-          <w:lang w:val="en-US"/>
-        </w:rPr>
-        <w:t>Wiederverwendung</w:t>
-      </w:r>
-      <w:proofErr w:type="spellEnd"/>
-      <w:r>
-        <w:rPr>
-          <w:color w:val="000000" w:themeColor="text1"/>
-          <w:lang w:val="en-US"/>
-        </w:rPr>
-        <w:t xml:space="preserve"> von Open Source Libraries</w:t>
-      </w:r>
-    </w:p>
+        <w:drawing>
+          <wp:inline distT="0" distB="0" distL="0" distR="0" wp14:anchorId="757690D7" wp14:editId="609F7354">
+            <wp:extent cx="5760720" cy="3414395"/>
+            <wp:effectExtent l="0" t="0" r="0" b="0"/>
+            <wp:docPr id="7" name="Grafik 7"/>
+            <wp:cNvGraphicFramePr>
+              <a:graphicFrameLocks xmlns:a="http://schemas.openxmlformats.org/drawingml/2006/main" noChangeAspect="1"/>
+            </wp:cNvGraphicFramePr>
+            <a:graphic xmlns:a="http://schemas.openxmlformats.org/drawingml/2006/main">
+              <a:graphicData uri="http://schemas.openxmlformats.org/drawingml/2006/picture">
+                <pic:pic xmlns:pic="http://schemas.openxmlformats.org/drawingml/2006/picture">
+                  <pic:nvPicPr>
+                    <pic:cNvPr id="1" name=""/>
+                    <pic:cNvPicPr/>
+                  </pic:nvPicPr>
+                  <pic:blipFill>
+                    <a:blip r:embed="rId14"/>
+                    <a:stretch>
+                      <a:fillRect/>
+                    </a:stretch>
+                  </pic:blipFill>
+                  <pic:spPr>
+                    <a:xfrm>
+                      <a:off x="0" y="0"/>
+                      <a:ext cx="5760720" cy="3414395"/>
+                    </a:xfrm>
+                    <a:prstGeom prst="rect">
+                      <a:avLst/>
+                    </a:prstGeom>
+                  </pic:spPr>
+                </pic:pic>
+              </a:graphicData>
+            </a:graphic>
+          </wp:inline>
+        </w:drawing>
+      </w:r>
+    </w:p>
+    <w:p>
+      <w:r>
+        <w:t xml:space="preserve">Die Designentscheidungen werden auch in der Excel Tabelle „Stories_Req.xlsx“ dokumentiert. </w:t>
+      </w:r>
+    </w:p>
+    <w:p>
+      <w:pPr>
+        <w:pStyle w:val="berschrift2"/>
+      </w:pPr>
+      <w:bookmarkStart w:id="27" w:name="_Toc165127834"/>
+      <w:bookmarkStart w:id="28" w:name="_Toc227674030"/>
+      <w:r>
+        <w:t>Wiederverwendung von Open Source Libraries</w:t>
+      </w:r>
+      <w:bookmarkEnd w:id="27"/>
+      <w:bookmarkEnd w:id="28"/>
+    </w:p>
+    <w:p>
+      <w:r>
+        <w:t>Wenn in der Architektur Open Source Libraries verwendet werden, werden diese gekennzeichnet und die entsprechenden Lizenzvorgaben/Lizenzidentifikation werden dokumentiert.</w:t>
+      </w:r>
+    </w:p>
+    <w:p/>
     <w:p>
       <w:pPr>
         <w:pStyle w:val="berschrift1"/>
@@ -2607,7 +4604,7 @@
           <w:lang w:val="en-US"/>
         </w:rPr>
       </w:pPr>
-      <w:bookmarkStart w:id="10" w:name="_Toc162876571"/>
+      <w:bookmarkStart w:id="29" w:name="_Toc227674031"/>
       <w:proofErr w:type="spellStart"/>
       <w:r>
         <w:rPr>
@@ -2629,40 +4626,28 @@
         </w:rPr>
         <w:t>Validierung</w:t>
       </w:r>
-      <w:bookmarkEnd w:id="10"/>
+      <w:bookmarkEnd w:id="29"/>
       <w:proofErr w:type="spellEnd"/>
     </w:p>
     <w:p>
       <w:pPr>
         <w:rPr>
-          <w:color w:val="00B0F0"/>
           <w:lang w:val="en-US"/>
         </w:rPr>
       </w:pPr>
-      <w:r>
+    </w:p>
+    <w:p>
+      <w:pPr>
+        <w:pStyle w:val="berschrift2"/>
         <w:rPr>
-          <w:color w:val="00B0F0"/>
           <w:lang w:val="en-US"/>
         </w:rPr>
-        <w:t>&lt;Content of this section: TBD&gt;</w:t>
-      </w:r>
-    </w:p>
-    <w:p>
-      <w:pPr>
-        <w:pStyle w:val="Listenabsatz"/>
-        <w:numPr>
-          <w:ilvl w:val="0"/>
-          <w:numId w:val="4"/>
-        </w:numPr>
+      </w:pPr>
+      <w:bookmarkStart w:id="30" w:name="_Toc165127836"/>
+      <w:bookmarkStart w:id="31" w:name="_Toc227674032"/>
+      <w:proofErr w:type="spellStart"/>
+      <w:r>
         <w:rPr>
-          <w:color w:val="000000" w:themeColor="text1"/>
-          <w:lang w:val="en-US"/>
-        </w:rPr>
-      </w:pPr>
-      <w:proofErr w:type="spellStart"/>
-      <w:r>
-        <w:rPr>
-          <w:color w:val="000000" w:themeColor="text1"/>
           <w:lang w:val="en-US"/>
         </w:rPr>
         <w:t>Formelle</w:t>
@@ -2670,10 +4655,120 @@
       <w:proofErr w:type="spellEnd"/>
       <w:r>
         <w:rPr>
-          <w:color w:val="000000" w:themeColor="text1"/>
           <w:lang w:val="en-US"/>
         </w:rPr>
-        <w:t xml:space="preserve"> Testcases</w:t>
+        <w:t xml:space="preserve"> Test Cases</w:t>
+      </w:r>
+      <w:bookmarkEnd w:id="30"/>
+      <w:bookmarkEnd w:id="31"/>
+    </w:p>
+    <w:p>
+      <w:proofErr w:type="gramStart"/>
+      <w:r>
+        <w:t>Test Cases</w:t>
+      </w:r>
+      <w:proofErr w:type="gramEnd"/>
+      <w:r>
+        <w:t xml:space="preserve"> w</w:t>
+      </w:r>
+      <w:r>
+        <w:t>e</w:t>
+      </w:r>
+      <w:r>
+        <w:t>rden aus den An</w:t>
+      </w:r>
+      <w:r>
+        <w:t>forderungen hergeleitet und zu den Anforderungen verlink</w:t>
+      </w:r>
+      <w:r>
+        <w:t>t</w:t>
+      </w:r>
+      <w:r>
+        <w:t>.</w:t>
+      </w:r>
+    </w:p>
+    <w:p>
+      <w:r>
+        <w:t xml:space="preserve">Die </w:t>
+      </w:r>
+      <w:proofErr w:type="gramStart"/>
+      <w:r>
+        <w:t>Test Cases</w:t>
+      </w:r>
+      <w:proofErr w:type="gramEnd"/>
+      <w:r>
+        <w:t xml:space="preserve"> werden geschrieben mit Hilfe </w:t>
+      </w:r>
+      <w:proofErr w:type="gramStart"/>
+      <w:r>
+        <w:t>vom folgendem Template</w:t>
+      </w:r>
+      <w:proofErr w:type="gramEnd"/>
+      <w:r>
+        <w:t>:</w:t>
+      </w:r>
+    </w:p>
+    <w:p>
+      <w:r>
+        <w:rPr>
+          <w:noProof/>
+        </w:rPr>
+        <w:drawing>
+          <wp:inline distT="0" distB="0" distL="0" distR="0" wp14:anchorId="4A66F466" wp14:editId="6ABAC492">
+            <wp:extent cx="5760720" cy="387985"/>
+            <wp:effectExtent l="0" t="0" r="0" b="0"/>
+            <wp:docPr id="8" name="Grafik 8"/>
+            <wp:cNvGraphicFramePr>
+              <a:graphicFrameLocks xmlns:a="http://schemas.openxmlformats.org/drawingml/2006/main" noChangeAspect="1"/>
+            </wp:cNvGraphicFramePr>
+            <a:graphic xmlns:a="http://schemas.openxmlformats.org/drawingml/2006/main">
+              <a:graphicData uri="http://schemas.openxmlformats.org/drawingml/2006/picture">
+                <pic:pic xmlns:pic="http://schemas.openxmlformats.org/drawingml/2006/picture">
+                  <pic:nvPicPr>
+                    <pic:cNvPr id="1" name=""/>
+                    <pic:cNvPicPr/>
+                  </pic:nvPicPr>
+                  <pic:blipFill>
+                    <a:blip r:embed="rId15"/>
+                    <a:stretch>
+                      <a:fillRect/>
+                    </a:stretch>
+                  </pic:blipFill>
+                  <pic:spPr>
+                    <a:xfrm>
+                      <a:off x="0" y="0"/>
+                      <a:ext cx="5760720" cy="387985"/>
+                    </a:xfrm>
+                    <a:prstGeom prst="rect">
+                      <a:avLst/>
+                    </a:prstGeom>
+                  </pic:spPr>
+                </pic:pic>
+              </a:graphicData>
+            </a:graphic>
+          </wp:inline>
+        </w:drawing>
+      </w:r>
+    </w:p>
+    <w:p>
+      <w:r>
+        <w:t xml:space="preserve">Die </w:t>
+      </w:r>
+      <w:proofErr w:type="gramStart"/>
+      <w:r>
+        <w:t>Test Cases</w:t>
+      </w:r>
+      <w:proofErr w:type="gramEnd"/>
+      <w:r>
+        <w:t xml:space="preserve"> werden in de</w:t>
+      </w:r>
+      <w:r>
+        <w:t>r Excel Tabelle „Stories_Req.xlsx“ dokumentiert.</w:t>
+      </w:r>
+    </w:p>
+    <w:p>
+      <w:r>
+        <w:t>Log Files werden in der Projektablage abgelegt. Die Log Files werden entsprechend Test Case ID benannt, um die Nachverfolgbarkeit zu unterstützen.</w:t>
       </w:r>
     </w:p>
     <w:p>
@@ -2687,6 +4782,7 @@
         <w:rPr>
           <w:lang w:val="en-US"/>
         </w:rPr>
+        <w:lastRenderedPageBreak/>
         <w:br w:type="page"/>
       </w:r>
     </w:p>
@@ -2697,7 +4793,7 @@
           <w:lang w:val="en-US"/>
         </w:rPr>
       </w:pPr>
-      <w:bookmarkStart w:id="11" w:name="_Toc162876572"/>
+      <w:bookmarkStart w:id="32" w:name="_Toc227674033"/>
       <w:r>
         <w:rPr>
           <w:lang w:val="en-US"/>
@@ -2705,7 +4801,7 @@
         <w:lastRenderedPageBreak/>
         <w:t>References</w:t>
       </w:r>
-      <w:bookmarkEnd w:id="11"/>
+      <w:bookmarkEnd w:id="32"/>
     </w:p>
     <w:tbl>
       <w:tblPr>
@@ -2822,6 +4918,38 @@
                 <w:lang w:val="en-US"/>
               </w:rPr>
             </w:pPr>
+            <w:proofErr w:type="spellStart"/>
+            <w:r>
+              <w:rPr>
+                <w:lang w:val="en-US"/>
+              </w:rPr>
+              <w:t>Prozessortechnik</w:t>
+            </w:r>
+            <w:r>
+              <w:rPr>
+                <w:lang w:val="en-US"/>
+              </w:rPr>
+              <w:t>_</w:t>
+            </w:r>
+            <w:r>
+              <w:rPr>
+                <w:lang w:val="en-US"/>
+              </w:rPr>
+              <w:t>Sprint_Backlog</w:t>
+            </w:r>
+            <w:proofErr w:type="spellEnd"/>
+          </w:p>
+        </w:tc>
+        <w:tc>
+          <w:tcPr>
+            <w:tcW w:w="3544" w:type="dxa"/>
+          </w:tcPr>
+          <w:p>
+            <w:pPr>
+              <w:rPr>
+                <w:lang w:val="en-US"/>
+              </w:rPr>
+            </w:pPr>
             <w:r>
               <w:rPr>
                 <w:lang w:val="en-US"/>
@@ -2832,24 +4960,6 @@
         </w:tc>
         <w:tc>
           <w:tcPr>
-            <w:tcW w:w="3544" w:type="dxa"/>
-          </w:tcPr>
-          <w:p>
-            <w:pPr>
-              <w:rPr>
-                <w:lang w:val="en-US"/>
-              </w:rPr>
-            </w:pPr>
-            <w:r>
-              <w:rPr>
-                <w:lang w:val="en-US"/>
-              </w:rPr>
-              <w:t>TBD</w:t>
-            </w:r>
-          </w:p>
-        </w:tc>
-        <w:tc>
-          <w:tcPr>
             <w:tcW w:w="1270" w:type="dxa"/>
           </w:tcPr>
           <w:p>
@@ -2862,7 +4972,7 @@
               <w:rPr>
                 <w:lang w:val="en-US"/>
               </w:rPr>
-              <w:t>TBD</w:t>
+              <w:t>1.0</w:t>
             </w:r>
           </w:p>
         </w:tc>
@@ -2878,6 +4988,12 @@
                 <w:lang w:val="en-US"/>
               </w:rPr>
             </w:pPr>
+            <w:r>
+              <w:rPr>
+                <w:lang w:val="en-US"/>
+              </w:rPr>
+              <w:t>[2]</w:t>
+            </w:r>
           </w:p>
         </w:tc>
         <w:tc>
@@ -2890,6 +5006,9 @@
                 <w:lang w:val="en-US"/>
               </w:rPr>
             </w:pPr>
+            <w:r>
+              <w:t>Stories_Req.xlsx</w:t>
+            </w:r>
           </w:p>
         </w:tc>
         <w:tc>
@@ -2902,6 +5021,12 @@
                 <w:lang w:val="en-US"/>
               </w:rPr>
             </w:pPr>
+            <w:r>
+              <w:rPr>
+                <w:lang w:val="en-US"/>
+              </w:rPr>
+              <w:t>TBD</w:t>
+            </w:r>
           </w:p>
         </w:tc>
         <w:tc>
@@ -2914,6 +5039,12 @@
                 <w:lang w:val="en-US"/>
               </w:rPr>
             </w:pPr>
+            <w:r>
+              <w:rPr>
+                <w:lang w:val="en-US"/>
+              </w:rPr>
+              <w:t>2.0</w:t>
+            </w:r>
           </w:p>
         </w:tc>
       </w:tr>
@@ -3606,7 +5737,7 @@
           <w:lang w:val="en-US"/>
         </w:rPr>
       </w:pPr>
-      <w:bookmarkStart w:id="12" w:name="_Toc162876573"/>
+      <w:bookmarkStart w:id="33" w:name="_Toc227674034"/>
       <w:r>
         <w:rPr>
           <w:lang w:val="en-US"/>
@@ -3614,7 +5745,7 @@
         <w:lastRenderedPageBreak/>
         <w:t>Distribution list</w:t>
       </w:r>
-      <w:bookmarkEnd w:id="12"/>
+      <w:bookmarkEnd w:id="33"/>
     </w:p>
     <w:tbl>
       <w:tblPr>
@@ -3694,6 +5825,9 @@
                 <w:lang w:val="en-US"/>
               </w:rPr>
             </w:pPr>
+            <w:r>
+              <w:t>Felix Maunz</w:t>
+            </w:r>
           </w:p>
         </w:tc>
         <w:tc>
@@ -3706,6 +5840,14 @@
                 <w:lang w:val="en-US"/>
               </w:rPr>
             </w:pPr>
+            <w:proofErr w:type="spellStart"/>
+            <w:r>
+              <w:t>Scrum</w:t>
+            </w:r>
+            <w:proofErr w:type="spellEnd"/>
+            <w:r>
+              <w:t xml:space="preserve"> Master</w:t>
+            </w:r>
           </w:p>
         </w:tc>
         <w:tc>
@@ -3732,6 +5874,9 @@
                 <w:lang w:val="en-US"/>
               </w:rPr>
             </w:pPr>
+            <w:r>
+              <w:t>Alexander Graf</w:t>
+            </w:r>
           </w:p>
         </w:tc>
         <w:tc>
@@ -3744,6 +5889,9 @@
                 <w:lang w:val="en-US"/>
               </w:rPr>
             </w:pPr>
+            <w:r>
+              <w:t>SW-Tester</w:t>
+            </w:r>
           </w:p>
         </w:tc>
         <w:tc>
@@ -3770,6 +5918,9 @@
                 <w:lang w:val="en-US"/>
               </w:rPr>
             </w:pPr>
+            <w:r>
+              <w:t>David Rösch</w:t>
+            </w:r>
           </w:p>
         </w:tc>
         <w:tc>
@@ -3782,6 +5933,9 @@
                 <w:lang w:val="en-US"/>
               </w:rPr>
             </w:pPr>
+            <w:r>
+              <w:t>HW-Beschaffung/SW Tester</w:t>
+            </w:r>
           </w:p>
         </w:tc>
         <w:tc>
@@ -3808,6 +5962,9 @@
                 <w:lang w:val="en-US"/>
               </w:rPr>
             </w:pPr>
+            <w:r>
+              <w:t>Jacob Jäger</w:t>
+            </w:r>
           </w:p>
         </w:tc>
         <w:tc>
@@ -3820,6 +5977,9 @@
                 <w:lang w:val="en-US"/>
               </w:rPr>
             </w:pPr>
+            <w:r>
+              <w:t>SW-Entwickler</w:t>
+            </w:r>
           </w:p>
         </w:tc>
         <w:tc>
@@ -3846,6 +6006,9 @@
                 <w:lang w:val="en-US"/>
               </w:rPr>
             </w:pPr>
+            <w:r>
+              <w:t>Johannes Winter</w:t>
+            </w:r>
           </w:p>
         </w:tc>
         <w:tc>
@@ -3858,6 +6021,9 @@
                 <w:lang w:val="en-US"/>
               </w:rPr>
             </w:pPr>
+            <w:r>
+              <w:t>SW-Entwickler</w:t>
+            </w:r>
           </w:p>
         </w:tc>
         <w:tc>
@@ -3958,7 +6124,7 @@
       </w:pPr>
     </w:p>
     <w:sectPr>
-      <w:headerReference w:type="default" r:id="rId10"/>
+      <w:headerReference w:type="default" r:id="rId16"/>
       <w:pgSz w:w="11906" w:h="16838"/>
       <w:pgMar w:top="1417" w:right="1417" w:bottom="1134" w:left="1417" w:header="708" w:footer="708" w:gutter="0"/>
       <w:cols w:space="708"/>
@@ -4409,9 +6575,122 @@
     </w:lvl>
   </w:abstractNum>
   <w:abstractNum w:abstractNumId="3" w15:restartNumberingAfterBreak="0">
-    <w:nsid w:val="661F6CFE"/>
+    <w:nsid w:val="524A3869"/>
     <w:multiLevelType w:val="hybridMultilevel"/>
-    <w:tmpl w:val="16CE4A62"/>
+    <w:tmpl w:val="234EDC54"/>
+    <w:lvl w:ilvl="0" w:tplc="C924EE4A">
+      <w:start w:val="3"/>
+      <w:numFmt w:val="bullet"/>
+      <w:lvlText w:val="-"/>
+      <w:lvlJc w:val="left"/>
+      <w:pPr>
+        <w:ind w:left="720" w:hanging="360"/>
+      </w:pPr>
+      <w:rPr>
+        <w:rFonts w:ascii="Calibri" w:eastAsiaTheme="minorHAnsi" w:hAnsi="Calibri" w:cs="Calibri" w:hint="default"/>
+      </w:rPr>
+    </w:lvl>
+    <w:lvl w:ilvl="1" w:tplc="04070003" w:tentative="1">
+      <w:start w:val="1"/>
+      <w:numFmt w:val="bullet"/>
+      <w:lvlText w:val="o"/>
+      <w:lvlJc w:val="left"/>
+      <w:pPr>
+        <w:ind w:left="1440" w:hanging="360"/>
+      </w:pPr>
+      <w:rPr>
+        <w:rFonts w:ascii="Courier New" w:hAnsi="Courier New" w:cs="Courier New" w:hint="default"/>
+      </w:rPr>
+    </w:lvl>
+    <w:lvl w:ilvl="2" w:tplc="04070005" w:tentative="1">
+      <w:start w:val="1"/>
+      <w:numFmt w:val="bullet"/>
+      <w:lvlText w:val=""/>
+      <w:lvlJc w:val="left"/>
+      <w:pPr>
+        <w:ind w:left="2160" w:hanging="360"/>
+      </w:pPr>
+      <w:rPr>
+        <w:rFonts w:ascii="Wingdings" w:hAnsi="Wingdings" w:hint="default"/>
+      </w:rPr>
+    </w:lvl>
+    <w:lvl w:ilvl="3" w:tplc="04070001" w:tentative="1">
+      <w:start w:val="1"/>
+      <w:numFmt w:val="bullet"/>
+      <w:lvlText w:val=""/>
+      <w:lvlJc w:val="left"/>
+      <w:pPr>
+        <w:ind w:left="2880" w:hanging="360"/>
+      </w:pPr>
+      <w:rPr>
+        <w:rFonts w:ascii="Symbol" w:hAnsi="Symbol" w:hint="default"/>
+      </w:rPr>
+    </w:lvl>
+    <w:lvl w:ilvl="4" w:tplc="04070003" w:tentative="1">
+      <w:start w:val="1"/>
+      <w:numFmt w:val="bullet"/>
+      <w:lvlText w:val="o"/>
+      <w:lvlJc w:val="left"/>
+      <w:pPr>
+        <w:ind w:left="3600" w:hanging="360"/>
+      </w:pPr>
+      <w:rPr>
+        <w:rFonts w:ascii="Courier New" w:hAnsi="Courier New" w:cs="Courier New" w:hint="default"/>
+      </w:rPr>
+    </w:lvl>
+    <w:lvl w:ilvl="5" w:tplc="04070005" w:tentative="1">
+      <w:start w:val="1"/>
+      <w:numFmt w:val="bullet"/>
+      <w:lvlText w:val=""/>
+      <w:lvlJc w:val="left"/>
+      <w:pPr>
+        <w:ind w:left="4320" w:hanging="360"/>
+      </w:pPr>
+      <w:rPr>
+        <w:rFonts w:ascii="Wingdings" w:hAnsi="Wingdings" w:hint="default"/>
+      </w:rPr>
+    </w:lvl>
+    <w:lvl w:ilvl="6" w:tplc="04070001" w:tentative="1">
+      <w:start w:val="1"/>
+      <w:numFmt w:val="bullet"/>
+      <w:lvlText w:val=""/>
+      <w:lvlJc w:val="left"/>
+      <w:pPr>
+        <w:ind w:left="5040" w:hanging="360"/>
+      </w:pPr>
+      <w:rPr>
+        <w:rFonts w:ascii="Symbol" w:hAnsi="Symbol" w:hint="default"/>
+      </w:rPr>
+    </w:lvl>
+    <w:lvl w:ilvl="7" w:tplc="04070003" w:tentative="1">
+      <w:start w:val="1"/>
+      <w:numFmt w:val="bullet"/>
+      <w:lvlText w:val="o"/>
+      <w:lvlJc w:val="left"/>
+      <w:pPr>
+        <w:ind w:left="5760" w:hanging="360"/>
+      </w:pPr>
+      <w:rPr>
+        <w:rFonts w:ascii="Courier New" w:hAnsi="Courier New" w:cs="Courier New" w:hint="default"/>
+      </w:rPr>
+    </w:lvl>
+    <w:lvl w:ilvl="8" w:tplc="04070005" w:tentative="1">
+      <w:start w:val="1"/>
+      <w:numFmt w:val="bullet"/>
+      <w:lvlText w:val=""/>
+      <w:lvlJc w:val="left"/>
+      <w:pPr>
+        <w:ind w:left="6480" w:hanging="360"/>
+      </w:pPr>
+      <w:rPr>
+        <w:rFonts w:ascii="Wingdings" w:hAnsi="Wingdings" w:hint="default"/>
+      </w:rPr>
+    </w:lvl>
+  </w:abstractNum>
+  <w:abstractNum w:abstractNumId="4" w15:restartNumberingAfterBreak="0">
+    <w:nsid w:val="5E791327"/>
+    <w:multiLevelType w:val="hybridMultilevel"/>
+    <w:tmpl w:val="61508D90"/>
     <w:lvl w:ilvl="0" w:tplc="04070011">
       <w:start w:val="1"/>
       <w:numFmt w:val="decimal"/>
@@ -4497,10 +6776,10 @@
       </w:pPr>
     </w:lvl>
   </w:abstractNum>
-  <w:abstractNum w:abstractNumId="4" w15:restartNumberingAfterBreak="0">
-    <w:nsid w:val="7F4A062F"/>
+  <w:abstractNum w:abstractNumId="5" w15:restartNumberingAfterBreak="0">
+    <w:nsid w:val="661F6CFE"/>
     <w:multiLevelType w:val="hybridMultilevel"/>
-    <w:tmpl w:val="7F82FEBE"/>
+    <w:tmpl w:val="16CE4A62"/>
     <w:lvl w:ilvl="0" w:tplc="04070011">
       <w:start w:val="1"/>
       <w:numFmt w:val="decimal"/>
@@ -4586,11 +6865,100 @@
       </w:pPr>
     </w:lvl>
   </w:abstractNum>
+  <w:abstractNum w:abstractNumId="6" w15:restartNumberingAfterBreak="0">
+    <w:nsid w:val="7F4A062F"/>
+    <w:multiLevelType w:val="hybridMultilevel"/>
+    <w:tmpl w:val="7F82FEBE"/>
+    <w:lvl w:ilvl="0" w:tplc="04070011">
+      <w:start w:val="1"/>
+      <w:numFmt w:val="decimal"/>
+      <w:lvlText w:val="%1)"/>
+      <w:lvlJc w:val="left"/>
+      <w:pPr>
+        <w:ind w:left="720" w:hanging="360"/>
+      </w:pPr>
+      <w:rPr>
+        <w:rFonts w:hint="default"/>
+      </w:rPr>
+    </w:lvl>
+    <w:lvl w:ilvl="1" w:tplc="04070019" w:tentative="1">
+      <w:start w:val="1"/>
+      <w:numFmt w:val="lowerLetter"/>
+      <w:lvlText w:val="%2."/>
+      <w:lvlJc w:val="left"/>
+      <w:pPr>
+        <w:ind w:left="1440" w:hanging="360"/>
+      </w:pPr>
+    </w:lvl>
+    <w:lvl w:ilvl="2" w:tplc="0407001B" w:tentative="1">
+      <w:start w:val="1"/>
+      <w:numFmt w:val="lowerRoman"/>
+      <w:lvlText w:val="%3."/>
+      <w:lvlJc w:val="right"/>
+      <w:pPr>
+        <w:ind w:left="2160" w:hanging="180"/>
+      </w:pPr>
+    </w:lvl>
+    <w:lvl w:ilvl="3" w:tplc="0407000F" w:tentative="1">
+      <w:start w:val="1"/>
+      <w:numFmt w:val="decimal"/>
+      <w:lvlText w:val="%4."/>
+      <w:lvlJc w:val="left"/>
+      <w:pPr>
+        <w:ind w:left="2880" w:hanging="360"/>
+      </w:pPr>
+    </w:lvl>
+    <w:lvl w:ilvl="4" w:tplc="04070019" w:tentative="1">
+      <w:start w:val="1"/>
+      <w:numFmt w:val="lowerLetter"/>
+      <w:lvlText w:val="%5."/>
+      <w:lvlJc w:val="left"/>
+      <w:pPr>
+        <w:ind w:left="3600" w:hanging="360"/>
+      </w:pPr>
+    </w:lvl>
+    <w:lvl w:ilvl="5" w:tplc="0407001B" w:tentative="1">
+      <w:start w:val="1"/>
+      <w:numFmt w:val="lowerRoman"/>
+      <w:lvlText w:val="%6."/>
+      <w:lvlJc w:val="right"/>
+      <w:pPr>
+        <w:ind w:left="4320" w:hanging="180"/>
+      </w:pPr>
+    </w:lvl>
+    <w:lvl w:ilvl="6" w:tplc="0407000F" w:tentative="1">
+      <w:start w:val="1"/>
+      <w:numFmt w:val="decimal"/>
+      <w:lvlText w:val="%7."/>
+      <w:lvlJc w:val="left"/>
+      <w:pPr>
+        <w:ind w:left="5040" w:hanging="360"/>
+      </w:pPr>
+    </w:lvl>
+    <w:lvl w:ilvl="7" w:tplc="04070019" w:tentative="1">
+      <w:start w:val="1"/>
+      <w:numFmt w:val="lowerLetter"/>
+      <w:lvlText w:val="%8."/>
+      <w:lvlJc w:val="left"/>
+      <w:pPr>
+        <w:ind w:left="5760" w:hanging="360"/>
+      </w:pPr>
+    </w:lvl>
+    <w:lvl w:ilvl="8" w:tplc="0407001B" w:tentative="1">
+      <w:start w:val="1"/>
+      <w:numFmt w:val="lowerRoman"/>
+      <w:lvlText w:val="%9."/>
+      <w:lvlJc w:val="right"/>
+      <w:pPr>
+        <w:ind w:left="6480" w:hanging="180"/>
+      </w:pPr>
+    </w:lvl>
+  </w:abstractNum>
   <w:num w:numId="1" w16cid:durableId="1572277153">
     <w:abstractNumId w:val="1"/>
   </w:num>
   <w:num w:numId="2" w16cid:durableId="759570397">
-    <w:abstractNumId w:val="4"/>
+    <w:abstractNumId w:val="6"/>
   </w:num>
   <w:num w:numId="3" w16cid:durableId="1187403510">
     <w:abstractNumId w:val="2"/>
@@ -4599,7 +6967,13 @@
     <w:abstractNumId w:val="0"/>
   </w:num>
   <w:num w:numId="5" w16cid:durableId="1852407121">
+    <w:abstractNumId w:val="5"/>
+  </w:num>
+  <w:num w:numId="6" w16cid:durableId="898172429">
     <w:abstractNumId w:val="3"/>
+  </w:num>
+  <w:num w:numId="7" w16cid:durableId="138424886">
+    <w:abstractNumId w:val="4"/>
   </w:num>
 </w:numbering>
 </file>
@@ -5030,7 +7404,6 @@
     <w:next w:val="Standard"/>
     <w:link w:val="berschrift2Zchn"/>
     <w:uiPriority w:val="9"/>
-    <w:semiHidden/>
     <w:unhideWhenUsed/>
     <w:qFormat/>
     <w:rsid w:val="00614BEE"/>
@@ -5247,7 +7620,6 @@
     <w:basedOn w:val="Absatz-Standardschriftart"/>
     <w:link w:val="berschrift2"/>
     <w:uiPriority w:val="9"/>
-    <w:semiHidden/>
     <w:rsid w:val="00614BEE"/>
     <w:rPr>
       <w:rFonts w:asciiTheme="majorHAnsi" w:eastAsiaTheme="majorEastAsia" w:hAnsiTheme="majorHAnsi" w:cstheme="majorBidi"/>
@@ -5267,6 +7639,19 @@
       <w:color w:val="605E5C"/>
       <w:shd w:val="clear" w:color="auto" w:fill="E1DFDD"/>
     </w:rPr>
+  </w:style>
+  <w:style w:type="paragraph" w:styleId="Verzeichnis2">
+    <w:name w:val="toc 2"/>
+    <w:basedOn w:val="Standard"/>
+    <w:next w:val="Standard"/>
+    <w:autoRedefine/>
+    <w:uiPriority w:val="39"/>
+    <w:unhideWhenUsed/>
+    <w:rsid w:val="00392CDE"/>
+    <w:pPr>
+      <w:spacing w:after="100"/>
+      <w:ind w:left="220"/>
+    </w:pPr>
   </w:style>
 </w:styles>
 </file>
@@ -5462,6 +7847,27 @@
     <w:pitch w:val="variable"/>
     <w:sig w:usb0="E4002EFF" w:usb1="C200247B" w:usb2="00000009" w:usb3="00000000" w:csb0="000001FF" w:csb1="00000000"/>
   </w:font>
+  <w:font w:name="Courier New">
+    <w:panose1 w:val="02070309020205020404"/>
+    <w:charset w:val="00"/>
+    <w:family w:val="modern"/>
+    <w:pitch w:val="fixed"/>
+    <w:sig w:usb0="E0002EFF" w:usb1="C0007843" w:usb2="00000009" w:usb3="00000000" w:csb0="000001FF" w:csb1="00000000"/>
+  </w:font>
+  <w:font w:name="Wingdings">
+    <w:panose1 w:val="05000000000000000000"/>
+    <w:charset w:val="02"/>
+    <w:family w:val="auto"/>
+    <w:pitch w:val="variable"/>
+    <w:sig w:usb0="00000000" w:usb1="10000000" w:usb2="00000000" w:usb3="00000000" w:csb0="80000000" w:csb1="00000000"/>
+  </w:font>
+  <w:font w:name="Symbol">
+    <w:panose1 w:val="05050102010706020507"/>
+    <w:charset w:val="02"/>
+    <w:family w:val="roman"/>
+    <w:pitch w:val="variable"/>
+    <w:sig w:usb0="00000000" w:usb1="10000000" w:usb2="00000000" w:usb3="00000000" w:csb0="80000000" w:csb1="00000000"/>
+  </w:font>
   <w:font w:name="Calibri Light">
     <w:panose1 w:val="020F0302020204030204"/>
     <w:charset w:val="00"/>
@@ -5503,13 +7909,17 @@
     <w:rsidRoot w:val="00B02220"/>
     <w:rsid w:val="0022503B"/>
     <w:rsid w:val="00285192"/>
+    <w:rsid w:val="00494141"/>
     <w:rsid w:val="004F715D"/>
     <w:rsid w:val="005543CF"/>
+    <w:rsid w:val="00835503"/>
     <w:rsid w:val="00996D87"/>
     <w:rsid w:val="009D51D8"/>
     <w:rsid w:val="00A16EBD"/>
     <w:rsid w:val="00A50927"/>
     <w:rsid w:val="00B02220"/>
+    <w:rsid w:val="00E46FFA"/>
+    <w:rsid w:val="00E66FC6"/>
     <w:rsid w:val="00F72BAA"/>
   </w:rsids>
   <m:mathPr>

</xml_diff>

<commit_message>
Erstinbetriebnahme mit Example abgeschlossen. Bisher C Projekt, Zukunft Cpp??. STM32CubeIDE Version 1.18.1 !!
</commit_message>
<xml_diff>
--- a/doc/Gruppe1_Audio_BPM_Erkennung_Entwicklungsplan.docx
+++ b/doc/Gruppe1_Audio_BPM_Erkennung_Entwicklungsplan.docx
@@ -59,7 +59,6 @@
         </w:rPr>
         <w:t xml:space="preserve">Audio BPM </w:t>
       </w:r>
-      <w:proofErr w:type="spellStart"/>
       <w:r>
         <w:rPr>
           <w:color w:val="FF0000"/>
@@ -69,7 +68,6 @@
         </w:rPr>
         <w:t>Erkennung</w:t>
       </w:r>
-      <w:proofErr w:type="spellEnd"/>
     </w:p>
     <w:p>
       <w:pPr>
@@ -1969,21 +1967,11 @@
         <w:pStyle w:val="berschrift1"/>
       </w:pPr>
       <w:bookmarkStart w:id="0" w:name="_Toc227674012"/>
-      <w:proofErr w:type="spellStart"/>
       <w:r>
         <w:lastRenderedPageBreak/>
-        <w:t>Document</w:t>
-      </w:r>
-      <w:proofErr w:type="spellEnd"/>
-      <w:r>
-        <w:t xml:space="preserve"> </w:t>
-      </w:r>
-      <w:proofErr w:type="spellStart"/>
-      <w:r>
-        <w:t>History</w:t>
+        <w:t>Document History</w:t>
       </w:r>
       <w:bookmarkEnd w:id="0"/>
-      <w:proofErr w:type="spellEnd"/>
     </w:p>
     <w:p/>
     <w:tbl>
@@ -2023,11 +2011,9 @@
             <w:tcW w:w="6232" w:type="dxa"/>
           </w:tcPr>
           <w:p>
-            <w:proofErr w:type="spellStart"/>
             <w:r>
               <w:t>Changes</w:t>
             </w:r>
-            <w:proofErr w:type="spellEnd"/>
           </w:p>
         </w:tc>
       </w:tr>
@@ -2204,14 +2190,9 @@
       </w:pPr>
       <w:bookmarkStart w:id="1" w:name="_Toc227674013"/>
       <w:r>
-        <w:t xml:space="preserve">Template </w:t>
-      </w:r>
-      <w:proofErr w:type="spellStart"/>
-      <w:r>
-        <w:t>History</w:t>
+        <w:t>Template History</w:t>
       </w:r>
       <w:bookmarkEnd w:id="1"/>
-      <w:proofErr w:type="spellEnd"/>
     </w:p>
     <w:p/>
     <w:tbl>
@@ -2251,11 +2232,9 @@
             <w:tcW w:w="6232" w:type="dxa"/>
           </w:tcPr>
           <w:p>
-            <w:proofErr w:type="spellStart"/>
             <w:r>
               <w:t>Changes</w:t>
             </w:r>
-            <w:proofErr w:type="spellEnd"/>
           </w:p>
         </w:tc>
       </w:tr>
@@ -2447,7 +2426,6 @@
         </w:rPr>
       </w:pPr>
       <w:bookmarkStart w:id="3" w:name="_Toc227674015"/>
-      <w:proofErr w:type="spellStart"/>
       <w:r>
         <w:rPr>
           <w:lang w:val="en-US"/>
@@ -2455,7 +2433,6 @@
         <w:t>Umfang</w:t>
       </w:r>
       <w:bookmarkEnd w:id="3"/>
-      <w:proofErr w:type="spellEnd"/>
     </w:p>
     <w:p>
       <w:r>
@@ -2501,7 +2478,6 @@
         </w:rPr>
       </w:pPr>
       <w:bookmarkStart w:id="4" w:name="_Toc227674016"/>
-      <w:proofErr w:type="spellStart"/>
       <w:r>
         <w:rPr>
           <w:lang w:val="en-US"/>
@@ -2519,30 +2495,15 @@
         <w:rPr>
           <w:lang w:val="en-US"/>
         </w:rPr>
-        <w:t>ation</w:t>
-      </w:r>
-      <w:proofErr w:type="spellEnd"/>
-      <w:r>
+        <w:t>ation des Projektes</w:t>
+      </w:r>
+      <w:bookmarkEnd w:id="4"/>
+    </w:p>
+    <w:p>
+      <w:pPr>
         <w:rPr>
           <w:lang w:val="en-US"/>
         </w:rPr>
-        <w:t xml:space="preserve"> des </w:t>
-      </w:r>
-      <w:proofErr w:type="spellStart"/>
-      <w:r>
-        <w:rPr>
-          <w:lang w:val="en-US"/>
-        </w:rPr>
-        <w:t>Projektes</w:t>
-      </w:r>
-      <w:bookmarkEnd w:id="4"/>
-      <w:proofErr w:type="spellEnd"/>
-    </w:p>
-    <w:p>
-      <w:pPr>
-        <w:rPr>
-          <w:lang w:val="en-US"/>
-        </w:rPr>
       </w:pPr>
     </w:p>
     <w:p>
@@ -2551,36 +2512,15 @@
       </w:pPr>
       <w:bookmarkStart w:id="5" w:name="_Toc163900061"/>
       <w:bookmarkStart w:id="6" w:name="_Toc227674017"/>
-      <w:proofErr w:type="spellStart"/>
-      <w:r>
-        <w:t>Organization</w:t>
-      </w:r>
-      <w:proofErr w:type="spellEnd"/>
-      <w:r>
-        <w:t xml:space="preserve"> des Teams</w:t>
+      <w:r>
+        <w:t>Organization des Teams</w:t>
       </w:r>
       <w:bookmarkEnd w:id="5"/>
       <w:bookmarkEnd w:id="6"/>
     </w:p>
     <w:p>
       <w:r>
-        <w:t xml:space="preserve">Das Projekt wird die agile Methode </w:t>
-      </w:r>
-      <w:proofErr w:type="spellStart"/>
-      <w:r>
-        <w:t>Scrum</w:t>
-      </w:r>
-      <w:proofErr w:type="spellEnd"/>
-      <w:r>
-        <w:t xml:space="preserve"> für die Entwicklung verwenden. Siehe Abschnitt „</w:t>
-      </w:r>
-      <w:proofErr w:type="spellStart"/>
-      <w:r>
-        <w:t>Scrum</w:t>
-      </w:r>
-      <w:proofErr w:type="spellEnd"/>
-      <w:r>
-        <w:t>“.</w:t>
+        <w:t>Das Projekt wird die agile Methode Scrum für die Entwicklung verwenden. Siehe Abschnitt „Scrum“.</w:t>
       </w:r>
     </w:p>
     <w:p>
@@ -2597,15 +2537,7 @@
     </w:p>
     <w:p>
       <w:r>
-        <w:t xml:space="preserve">Das Team besteht </w:t>
-      </w:r>
-      <w:proofErr w:type="gramStart"/>
-      <w:r>
-        <w:t>aus folgenden</w:t>
-      </w:r>
-      <w:proofErr w:type="gramEnd"/>
-      <w:r>
-        <w:t xml:space="preserve"> Mitgliedern mit den entsprechenden Rollen und Verantwortlichkeiten:</w:t>
+        <w:t>Das Team besteht aus folgenden Mitgliedern mit den entsprechenden Rollen und Verantwortlichkeiten:</w:t>
       </w:r>
     </w:p>
     <w:tbl>
@@ -2702,13 +2634,8 @@
             <w:hideMark/>
           </w:tcPr>
           <w:p>
-            <w:proofErr w:type="spellStart"/>
-            <w:r>
-              <w:t>Scrum</w:t>
-            </w:r>
-            <w:proofErr w:type="spellEnd"/>
-            <w:r>
-              <w:t xml:space="preserve"> Master</w:t>
+            <w:r>
+              <w:t>Scrum Master</w:t>
             </w:r>
           </w:p>
         </w:tc>
@@ -2788,16 +2715,11 @@
             <w:hideMark/>
           </w:tcPr>
           <w:p>
-            <w:proofErr w:type="gramStart"/>
             <w:r>
               <w:t>SW</w:t>
             </w:r>
             <w:r>
-              <w:t xml:space="preserve"> Test</w:t>
-            </w:r>
-            <w:proofErr w:type="gramEnd"/>
-            <w:r>
-              <w:t xml:space="preserve"> / Debugging</w:t>
+              <w:t xml:space="preserve"> Test / Debugging</w:t>
             </w:r>
           </w:p>
         </w:tc>
@@ -2902,18 +2824,14 @@
             <w:hideMark/>
           </w:tcPr>
           <w:p>
-            <w:proofErr w:type="gramStart"/>
             <w:r>
               <w:t>SW Architektur</w:t>
             </w:r>
-            <w:proofErr w:type="gramEnd"/>
-          </w:p>
-          <w:p>
-            <w:proofErr w:type="gramStart"/>
+          </w:p>
+          <w:p>
             <w:r>
               <w:t>SW Implementierung</w:t>
             </w:r>
-            <w:proofErr w:type="gramEnd"/>
           </w:p>
         </w:tc>
       </w:tr>
@@ -2964,14 +2882,12 @@
             <w:hideMark/>
           </w:tcPr>
           <w:p>
-            <w:proofErr w:type="gramStart"/>
             <w:r>
               <w:t>SW</w:t>
             </w:r>
             <w:r>
               <w:t xml:space="preserve"> Implementierung</w:t>
             </w:r>
-            <w:proofErr w:type="gramEnd"/>
           </w:p>
           <w:p>
             <w:r>
@@ -3038,15 +2954,7 @@
     </w:p>
     <w:p>
       <w:r>
-        <w:t xml:space="preserve">Bei der Sprint Planung werden die Sprint Ziele definiert, die effektive Kapazität der einzelnen Teammitglieder, die Aktivitäten und die entsprechende „Definition </w:t>
-      </w:r>
-      <w:proofErr w:type="spellStart"/>
-      <w:r>
-        <w:t>of</w:t>
-      </w:r>
-      <w:proofErr w:type="spellEnd"/>
-      <w:r>
-        <w:t xml:space="preserve"> Done“. </w:t>
+        <w:t xml:space="preserve">Bei der Sprint Planung werden die Sprint Ziele definiert, die effektive Kapazität der einzelnen Teammitglieder, die Aktivitäten und die entsprechende „Definition of Done“. </w:t>
       </w:r>
     </w:p>
     <w:p>
@@ -3056,15 +2964,7 @@
     </w:p>
     <w:p>
       <w:r>
-        <w:t xml:space="preserve">Die Daily Sprints werden täglich durchgeführt, der amtierende </w:t>
-      </w:r>
-      <w:proofErr w:type="spellStart"/>
-      <w:r>
-        <w:t>Scrum</w:t>
-      </w:r>
-      <w:proofErr w:type="spellEnd"/>
-      <w:r>
-        <w:t xml:space="preserve"> Muster berichtet an Herr Pagliarulo, falls es Blockers gibt, die im Team nicht gelöst werden können.</w:t>
+        <w:t>Die Daily Sprints werden täglich durchgeführt, der amtierende Scrum Muster berichtet an Herr Pagliarulo, falls es Blockers gibt, die im Team nicht gelöst werden können.</w:t>
       </w:r>
     </w:p>
     <w:p>
@@ -3085,31 +2985,18 @@
     </w:p>
     <w:p>
       <w:r>
-        <w:t>Die Planung des Sprints wird mit der Excel Tabelle „</w:t>
-      </w:r>
-      <w:proofErr w:type="spellStart"/>
-      <w:r>
-        <w:t>Prozessortechnik_</w:t>
+        <w:t>Die Planung des Sprints wird mit der Excel Tabelle „Prozessortechnik_</w:t>
       </w:r>
       <w:r>
         <w:t>Sprint_Backlog</w:t>
       </w:r>
-      <w:proofErr w:type="spellEnd"/>
       <w:r>
         <w:t>“ [1] vorgenommen.</w:t>
       </w:r>
     </w:p>
     <w:p>
       <w:r>
-        <w:t xml:space="preserve">Die Tabelle ermöglicht auch die Darstellung von dem </w:t>
-      </w:r>
-      <w:proofErr w:type="spellStart"/>
-      <w:r>
-        <w:t>Burndown</w:t>
-      </w:r>
-      <w:proofErr w:type="spellEnd"/>
-      <w:r>
-        <w:t xml:space="preserve"> Chart und dient auch als Ablage für Sprint Review, Sprint Retrospektive und Blocker/Interrupt Verwaltung.</w:t>
+        <w:t>Die Tabelle ermöglicht auch die Darstellung von dem Burndown Chart und dient auch als Ablage für Sprint Review, Sprint Retrospektive und Blocker/Interrupt Verwaltung.</w:t>
       </w:r>
     </w:p>
     <w:p>
@@ -3141,7 +3028,7 @@
           <w:noProof/>
         </w:rPr>
         <w:drawing>
-          <wp:inline distT="0" distB="0" distL="0" distR="0" wp14:anchorId="192B646E" wp14:editId="3C4AB2C7">
+          <wp:inline distT="0" distB="0" distL="0" distR="0" wp14:anchorId="192B646E" wp14:editId="0919A02B">
             <wp:extent cx="5753100" cy="577850"/>
             <wp:effectExtent l="0" t="0" r="0" b="0"/>
             <wp:docPr id="488241168" name="Grafik 1"/>
@@ -3192,11 +3079,9 @@
       <w:r>
         <w:t>Die Kanban Board wird ebenso in der Excel Tabelle „</w:t>
       </w:r>
-      <w:proofErr w:type="spellStart"/>
       <w:r>
         <w:t>Prozessortechnik_Sprint_Backlog</w:t>
       </w:r>
-      <w:proofErr w:type="spellEnd"/>
       <w:r>
         <w:t>“ realisiert.</w:t>
       </w:r>
@@ -3240,15 +3125,7 @@
     </w:p>
     <w:p>
       <w:r>
-        <w:t xml:space="preserve">GitHub wird ebenso als </w:t>
-      </w:r>
-      <w:proofErr w:type="spellStart"/>
-      <w:r>
-        <w:t>Versionierungsprogramm</w:t>
-      </w:r>
-      <w:proofErr w:type="spellEnd"/>
-      <w:r>
-        <w:t xml:space="preserve"> verwendet.</w:t>
+        <w:t>GitHub wird ebenso als Versionierungsprogramm verwendet.</w:t>
       </w:r>
     </w:p>
     <w:p>
@@ -3266,29 +3143,13 @@
         </w:rPr>
       </w:pPr>
       <w:bookmarkStart w:id="15" w:name="_Toc227674022"/>
-      <w:proofErr w:type="spellStart"/>
       <w:r>
         <w:rPr>
           <w:lang w:val="en-US"/>
         </w:rPr>
-        <w:t>Anwendung</w:t>
-      </w:r>
-      <w:proofErr w:type="spellEnd"/>
-      <w:r>
-        <w:rPr>
-          <w:lang w:val="en-US"/>
-        </w:rPr>
-        <w:t xml:space="preserve"> &amp; </w:t>
-      </w:r>
-      <w:proofErr w:type="spellStart"/>
-      <w:r>
-        <w:rPr>
-          <w:lang w:val="en-US"/>
-        </w:rPr>
-        <w:t>Ziele</w:t>
+        <w:t>Anwendung &amp; Ziele</w:t>
       </w:r>
       <w:bookmarkEnd w:id="15"/>
-      <w:proofErr w:type="spellEnd"/>
     </w:p>
     <w:p>
       <w:pPr>
@@ -3428,15 +3289,7 @@
           </w:tcPr>
           <w:p>
             <w:r>
-              <w:t>Alle User Stories und Anforderungen entsprechend dieses Planes durchgesprochen (</w:t>
-            </w:r>
-            <w:proofErr w:type="spellStart"/>
-            <w:r>
-              <w:t>reviewed</w:t>
-            </w:r>
-            <w:proofErr w:type="spellEnd"/>
-            <w:r>
-              <w:t>) und freigegeben</w:t>
+              <w:t>Alle User Stories und Anforderungen entsprechend dieses Planes durchgesprochen (reviewed) und freigegeben</w:t>
             </w:r>
           </w:p>
           <w:p/>
@@ -3474,33 +3327,11 @@
                 <w:lang w:val="en-US"/>
               </w:rPr>
             </w:pPr>
-            <w:proofErr w:type="spellStart"/>
-            <w:r>
-              <w:rPr>
-                <w:lang w:val="en-US"/>
-              </w:rPr>
-              <w:t>Sammelstatus</w:t>
-            </w:r>
-            <w:proofErr w:type="spellEnd"/>
-            <w:r>
-              <w:rPr>
-                <w:lang w:val="en-US"/>
-              </w:rPr>
-              <w:t xml:space="preserve"> </w:t>
-            </w:r>
-            <w:proofErr w:type="spellStart"/>
-            <w:r>
-              <w:rPr>
-                <w:lang w:val="en-US"/>
-              </w:rPr>
-              <w:t>Anforderungen</w:t>
-            </w:r>
-            <w:proofErr w:type="spellEnd"/>
-            <w:r>
-              <w:rPr>
-                <w:lang w:val="en-US"/>
-              </w:rPr>
-              <w:t>/User Stories</w:t>
+            <w:r>
+              <w:rPr>
+                <w:lang w:val="en-US"/>
+              </w:rPr>
+              <w:t>Sammelstatus Anforderungen/User Stories</w:t>
             </w:r>
           </w:p>
         </w:tc>
@@ -3550,28 +3381,12 @@
                 <w:lang w:val="en-US"/>
               </w:rPr>
             </w:pPr>
-            <w:proofErr w:type="spellStart"/>
-            <w:r>
-              <w:rPr>
-                <w:lang w:val="en-US"/>
-              </w:rPr>
-              <w:t>Sammelstatus</w:t>
-            </w:r>
-            <w:proofErr w:type="spellEnd"/>
-            <w:r>
-              <w:rPr>
-                <w:lang w:val="en-US"/>
-              </w:rPr>
-              <w:t xml:space="preserve"> Status </w:t>
-            </w:r>
-            <w:proofErr w:type="spellStart"/>
-            <w:r>
-              <w:rPr>
-                <w:lang w:val="en-US"/>
-              </w:rPr>
-              <w:t>Architektur</w:t>
-            </w:r>
-            <w:proofErr w:type="spellEnd"/>
+            <w:r>
+              <w:rPr>
+                <w:lang w:val="en-US"/>
+              </w:rPr>
+              <w:t>Sammelstatus Status Architektur</w:t>
+            </w:r>
           </w:p>
         </w:tc>
       </w:tr>
@@ -3621,42 +3436,12 @@
                 <w:lang w:val="en-US"/>
               </w:rPr>
             </w:pPr>
-            <w:proofErr w:type="spellStart"/>
-            <w:r>
-              <w:rPr>
-                <w:lang w:val="en-US"/>
-              </w:rPr>
-              <w:t>Sammelstatus</w:t>
-            </w:r>
-            <w:proofErr w:type="spellEnd"/>
-            <w:r>
-              <w:rPr>
-                <w:lang w:val="en-US"/>
-              </w:rPr>
-              <w:t xml:space="preserve"> Module </w:t>
-            </w:r>
-            <w:proofErr w:type="spellStart"/>
-            <w:r>
-              <w:rPr>
-                <w:lang w:val="en-US"/>
-              </w:rPr>
-              <w:t>zu</w:t>
-            </w:r>
-            <w:proofErr w:type="spellEnd"/>
-            <w:r>
-              <w:rPr>
-                <w:lang w:val="en-US"/>
-              </w:rPr>
-              <w:t xml:space="preserve"> </w:t>
-            </w:r>
-            <w:proofErr w:type="spellStart"/>
-            <w:r>
-              <w:rPr>
-                <w:lang w:val="en-US"/>
-              </w:rPr>
-              <w:t>implementieren</w:t>
-            </w:r>
-            <w:proofErr w:type="spellEnd"/>
+            <w:r>
+              <w:rPr>
+                <w:lang w:val="en-US"/>
+              </w:rPr>
+              <w:t>Sammelstatus Module zu implementieren</w:t>
+            </w:r>
           </w:p>
         </w:tc>
       </w:tr>
@@ -3705,19 +3490,11 @@
                 <w:lang w:val="en-US"/>
               </w:rPr>
             </w:pPr>
-            <w:proofErr w:type="spellStart"/>
-            <w:r>
-              <w:rPr>
-                <w:lang w:val="en-US"/>
-              </w:rPr>
-              <w:t>Sammelstatus</w:t>
-            </w:r>
-            <w:proofErr w:type="spellEnd"/>
-            <w:r>
-              <w:rPr>
-                <w:lang w:val="en-US"/>
-              </w:rPr>
-              <w:t xml:space="preserve"> Test Cases</w:t>
+            <w:r>
+              <w:rPr>
+                <w:lang w:val="en-US"/>
+              </w:rPr>
+              <w:t>Sammelstatus Test Cases</w:t>
             </w:r>
           </w:p>
         </w:tc>
@@ -3740,7 +3517,6 @@
         </w:rPr>
       </w:pPr>
       <w:bookmarkStart w:id="19" w:name="_Toc227674025"/>
-      <w:proofErr w:type="spellStart"/>
       <w:r>
         <w:rPr>
           <w:lang w:val="en-US"/>
@@ -3748,7 +3524,6 @@
         <w:t>Anforderungsmanagement</w:t>
       </w:r>
       <w:bookmarkEnd w:id="19"/>
-      <w:proofErr w:type="spellEnd"/>
     </w:p>
     <w:p>
       <w:pPr>
@@ -3764,15 +3539,7 @@
     </w:p>
     <w:p>
       <w:r>
-        <w:t xml:space="preserve">Aus den definierten Anforderungen wird die Systemarchitektur entwickelt. Darauf aufbauend werden die </w:t>
-      </w:r>
-      <w:proofErr w:type="gramStart"/>
-      <w:r>
-        <w:t>Test Cases</w:t>
-      </w:r>
-      <w:proofErr w:type="gramEnd"/>
-      <w:r>
-        <w:t xml:space="preserve"> aus den Anforderungen hergeleitet, wobei insbesondere die in den User Stories formulierten Akzeptanzkriterien berücksichtigt werden.</w:t>
+        <w:t>Aus den definierten Anforderungen wird die Systemarchitektur entwickelt. Darauf aufbauend werden die Test Cases aus den Anforderungen hergeleitet, wobei insbesondere die in den User Stories formulierten Akzeptanzkriterien berücksichtigt werden.</w:t>
       </w:r>
     </w:p>
     <w:p>
@@ -4130,13 +3897,8 @@
           </w:tcPr>
           <w:p>
             <w:r>
-              <w:t xml:space="preserve">TBD, in Review, </w:t>
-            </w:r>
-            <w:proofErr w:type="spellStart"/>
-            <w:r>
-              <w:t>Reviewed</w:t>
-            </w:r>
-            <w:proofErr w:type="spellEnd"/>
+              <w:t>TBD, in Review, Reviewed</w:t>
+            </w:r>
           </w:p>
         </w:tc>
       </w:tr>
@@ -4146,11 +3908,9 @@
             <w:tcW w:w="1250" w:type="dxa"/>
           </w:tcPr>
           <w:p>
-            <w:proofErr w:type="spellStart"/>
             <w:r>
               <w:t>Verification</w:t>
             </w:r>
-            <w:proofErr w:type="spellEnd"/>
           </w:p>
         </w:tc>
         <w:tc>
@@ -4175,15 +3935,7 @@
     </w:tbl>
     <w:p>
       <w:r>
-        <w:t xml:space="preserve">User Stories und Anforderungen werden in einer Excel Tabelle „Stories_Req.xlsx“ verwaltet. In der Tabelle wird auch die </w:t>
-      </w:r>
-      <w:proofErr w:type="spellStart"/>
-      <w:r>
-        <w:t>Traceability</w:t>
-      </w:r>
-      <w:proofErr w:type="spellEnd"/>
-      <w:r>
-        <w:t xml:space="preserve"> manuell hergestellt.</w:t>
+        <w:t>User Stories und Anforderungen werden in einer Excel Tabelle „Stories_Req.xlsx“ verwaltet. In der Tabelle wird auch die Traceability manuell hergestellt.</w:t>
       </w:r>
     </w:p>
     <w:p>
@@ -4296,28 +4048,31 @@
         </w:rPr>
       </w:pPr>
       <w:bookmarkStart w:id="22" w:name="_Toc227674027"/>
-      <w:proofErr w:type="spellStart"/>
       <w:r>
         <w:rPr>
           <w:lang w:val="en-US"/>
         </w:rPr>
-        <w:t>Architektur</w:t>
-      </w:r>
-      <w:proofErr w:type="spellEnd"/>
-      <w:r>
+        <w:t>Architektur &amp; Design</w:t>
+      </w:r>
+      <w:bookmarkEnd w:id="22"/>
+    </w:p>
+    <w:p>
+      <w:pPr>
+        <w:pStyle w:val="Listenabsatz"/>
+        <w:numPr>
+          <w:ilvl w:val="0"/>
+          <w:numId w:val="8"/>
+        </w:numPr>
         <w:rPr>
           <w:lang w:val="en-US"/>
         </w:rPr>
-        <w:t xml:space="preserve"> &amp; Design</w:t>
-      </w:r>
-      <w:bookmarkEnd w:id="22"/>
-    </w:p>
-    <w:p>
-      <w:pPr>
+      </w:pPr>
+      <w:r>
         <w:rPr>
           <w:lang w:val="en-US"/>
         </w:rPr>
-      </w:pPr>
+        <w:t>LUCID CHARTS</w:t>
+      </w:r>
     </w:p>
     <w:p>
       <w:pPr>
@@ -4374,15 +4129,7 @@
     </w:p>
     <w:p>
       <w:r>
-        <w:t>Die Elemente der Architektur haben einen Namen und eine eindeutige Identifizierung entsprechend folgende Namenskonvention: &lt;</w:t>
-      </w:r>
-      <w:proofErr w:type="spellStart"/>
-      <w:r>
-        <w:t>ArchEl_x</w:t>
-      </w:r>
-      <w:proofErr w:type="spellEnd"/>
-      <w:r>
-        <w:t>&gt;. Die Identifizierung wird verwendet, um Anforderungen mit den Architekturelementen zu verlinken. Die Verlinkung wird in der Excel Tabelle „Stories_Req.xlsx“ dokumentiert.</w:t>
+        <w:t>Die Elemente der Architektur haben einen Namen und eine eindeutige Identifizierung entsprechend folgende Namenskonvention: &lt;ArchEl_x&gt;. Die Identifizierung wird verwendet, um Anforderungen mit den Architekturelementen zu verlinken. Die Verlinkung wird in der Excel Tabelle „Stories_Req.xlsx“ dokumentiert.</w:t>
       </w:r>
     </w:p>
     <w:p>
@@ -4590,29 +4337,13 @@
         </w:rPr>
       </w:pPr>
       <w:bookmarkStart w:id="29" w:name="_Toc227674031"/>
-      <w:proofErr w:type="spellStart"/>
       <w:r>
         <w:rPr>
           <w:lang w:val="en-US"/>
         </w:rPr>
-        <w:t>Verifizierung</w:t>
-      </w:r>
-      <w:proofErr w:type="spellEnd"/>
-      <w:r>
-        <w:rPr>
-          <w:lang w:val="en-US"/>
-        </w:rPr>
-        <w:t xml:space="preserve"> und </w:t>
-      </w:r>
-      <w:proofErr w:type="spellStart"/>
-      <w:r>
-        <w:rPr>
-          <w:lang w:val="en-US"/>
-        </w:rPr>
-        <w:t>Validierung</w:t>
+        <w:t>Verifizierung und Validierung</w:t>
       </w:r>
       <w:bookmarkEnd w:id="29"/>
-      <w:proofErr w:type="spellEnd"/>
     </w:p>
     <w:p>
       <w:pPr>
@@ -4630,31 +4361,18 @@
       </w:pPr>
       <w:bookmarkStart w:id="30" w:name="_Toc165127836"/>
       <w:bookmarkStart w:id="31" w:name="_Toc227674032"/>
-      <w:proofErr w:type="spellStart"/>
       <w:r>
         <w:rPr>
           <w:lang w:val="en-US"/>
         </w:rPr>
-        <w:t>Formelle</w:t>
-      </w:r>
-      <w:proofErr w:type="spellEnd"/>
-      <w:r>
-        <w:rPr>
-          <w:lang w:val="en-US"/>
-        </w:rPr>
-        <w:t xml:space="preserve"> Test Cases</w:t>
+        <w:t>Formelle Test Cases</w:t>
       </w:r>
       <w:bookmarkEnd w:id="30"/>
       <w:bookmarkEnd w:id="31"/>
     </w:p>
     <w:p>
-      <w:proofErr w:type="gramStart"/>
-      <w:r>
-        <w:t>Test Cases</w:t>
-      </w:r>
-      <w:proofErr w:type="gramEnd"/>
-      <w:r>
-        <w:t xml:space="preserve"> w</w:t>
+      <w:r>
+        <w:t>Test Cases w</w:t>
       </w:r>
       <w:r>
         <w:t>e</w:t>
@@ -4668,23 +4386,7 @@
     </w:p>
     <w:p>
       <w:r>
-        <w:t xml:space="preserve">Die </w:t>
-      </w:r>
-      <w:proofErr w:type="gramStart"/>
-      <w:r>
-        <w:t>Test Cases</w:t>
-      </w:r>
-      <w:proofErr w:type="gramEnd"/>
-      <w:r>
-        <w:t xml:space="preserve"> werden geschrieben mit Hilfe </w:t>
-      </w:r>
-      <w:proofErr w:type="gramStart"/>
-      <w:r>
-        <w:t>vom folgendem Template</w:t>
-      </w:r>
-      <w:proofErr w:type="gramEnd"/>
-      <w:r>
-        <w:t>:</w:t>
+        <w:t>Die Test Cases werden geschrieben mit Hilfe vom folgendem Template:</w:t>
       </w:r>
     </w:p>
     <w:p>
@@ -4731,15 +4433,7 @@
     </w:p>
     <w:p>
       <w:r>
-        <w:t xml:space="preserve">Die </w:t>
-      </w:r>
-      <w:proofErr w:type="gramStart"/>
-      <w:r>
-        <w:t>Test Cases</w:t>
-      </w:r>
-      <w:proofErr w:type="gramEnd"/>
-      <w:r>
-        <w:t xml:space="preserve"> werden in de</w:t>
+        <w:t>Die Test Cases werden in de</w:t>
       </w:r>
       <w:r>
         <w:t>r Excel Tabelle „Stories_Req.xlsx“ dokumentiert.</w:t>
@@ -4897,7 +4591,6 @@
                 <w:lang w:val="en-US"/>
               </w:rPr>
             </w:pPr>
-            <w:proofErr w:type="spellStart"/>
             <w:r>
               <w:rPr>
                 <w:lang w:val="en-US"/>
@@ -4916,7 +4609,6 @@
               </w:rPr>
               <w:t>Sprint_Backlog</w:t>
             </w:r>
-            <w:proofErr w:type="spellEnd"/>
           </w:p>
         </w:tc>
         <w:tc>
@@ -5819,13 +5511,8 @@
                 <w:lang w:val="en-US"/>
               </w:rPr>
             </w:pPr>
-            <w:proofErr w:type="spellStart"/>
-            <w:r>
-              <w:t>Scrum</w:t>
-            </w:r>
-            <w:proofErr w:type="spellEnd"/>
-            <w:r>
-              <w:t xml:space="preserve"> Master</w:t>
+            <w:r>
+              <w:t>Scrum Master</w:t>
             </w:r>
           </w:p>
         </w:tc>
@@ -6554,6 +6241,118 @@
     </w:lvl>
   </w:abstractNum>
   <w:abstractNum w:abstractNumId="3" w15:restartNumberingAfterBreak="0">
+    <w:nsid w:val="4378106C"/>
+    <w:multiLevelType w:val="hybridMultilevel"/>
+    <w:tmpl w:val="D550E9AE"/>
+    <w:lvl w:ilvl="0" w:tplc="8438E084">
+      <w:numFmt w:val="bullet"/>
+      <w:lvlText w:val=""/>
+      <w:lvlJc w:val="left"/>
+      <w:pPr>
+        <w:ind w:left="720" w:hanging="360"/>
+      </w:pPr>
+      <w:rPr>
+        <w:rFonts w:ascii="Wingdings" w:eastAsiaTheme="minorHAnsi" w:hAnsi="Wingdings" w:cstheme="minorBidi" w:hint="default"/>
+      </w:rPr>
+    </w:lvl>
+    <w:lvl w:ilvl="1" w:tplc="04070003" w:tentative="1">
+      <w:start w:val="1"/>
+      <w:numFmt w:val="bullet"/>
+      <w:lvlText w:val="o"/>
+      <w:lvlJc w:val="left"/>
+      <w:pPr>
+        <w:ind w:left="1440" w:hanging="360"/>
+      </w:pPr>
+      <w:rPr>
+        <w:rFonts w:ascii="Courier New" w:hAnsi="Courier New" w:cs="Courier New" w:hint="default"/>
+      </w:rPr>
+    </w:lvl>
+    <w:lvl w:ilvl="2" w:tplc="04070005" w:tentative="1">
+      <w:start w:val="1"/>
+      <w:numFmt w:val="bullet"/>
+      <w:lvlText w:val=""/>
+      <w:lvlJc w:val="left"/>
+      <w:pPr>
+        <w:ind w:left="2160" w:hanging="360"/>
+      </w:pPr>
+      <w:rPr>
+        <w:rFonts w:ascii="Wingdings" w:hAnsi="Wingdings" w:hint="default"/>
+      </w:rPr>
+    </w:lvl>
+    <w:lvl w:ilvl="3" w:tplc="04070001" w:tentative="1">
+      <w:start w:val="1"/>
+      <w:numFmt w:val="bullet"/>
+      <w:lvlText w:val=""/>
+      <w:lvlJc w:val="left"/>
+      <w:pPr>
+        <w:ind w:left="2880" w:hanging="360"/>
+      </w:pPr>
+      <w:rPr>
+        <w:rFonts w:ascii="Symbol" w:hAnsi="Symbol" w:hint="default"/>
+      </w:rPr>
+    </w:lvl>
+    <w:lvl w:ilvl="4" w:tplc="04070003" w:tentative="1">
+      <w:start w:val="1"/>
+      <w:numFmt w:val="bullet"/>
+      <w:lvlText w:val="o"/>
+      <w:lvlJc w:val="left"/>
+      <w:pPr>
+        <w:ind w:left="3600" w:hanging="360"/>
+      </w:pPr>
+      <w:rPr>
+        <w:rFonts w:ascii="Courier New" w:hAnsi="Courier New" w:cs="Courier New" w:hint="default"/>
+      </w:rPr>
+    </w:lvl>
+    <w:lvl w:ilvl="5" w:tplc="04070005" w:tentative="1">
+      <w:start w:val="1"/>
+      <w:numFmt w:val="bullet"/>
+      <w:lvlText w:val=""/>
+      <w:lvlJc w:val="left"/>
+      <w:pPr>
+        <w:ind w:left="4320" w:hanging="360"/>
+      </w:pPr>
+      <w:rPr>
+        <w:rFonts w:ascii="Wingdings" w:hAnsi="Wingdings" w:hint="default"/>
+      </w:rPr>
+    </w:lvl>
+    <w:lvl w:ilvl="6" w:tplc="04070001" w:tentative="1">
+      <w:start w:val="1"/>
+      <w:numFmt w:val="bullet"/>
+      <w:lvlText w:val=""/>
+      <w:lvlJc w:val="left"/>
+      <w:pPr>
+        <w:ind w:left="5040" w:hanging="360"/>
+      </w:pPr>
+      <w:rPr>
+        <w:rFonts w:ascii="Symbol" w:hAnsi="Symbol" w:hint="default"/>
+      </w:rPr>
+    </w:lvl>
+    <w:lvl w:ilvl="7" w:tplc="04070003" w:tentative="1">
+      <w:start w:val="1"/>
+      <w:numFmt w:val="bullet"/>
+      <w:lvlText w:val="o"/>
+      <w:lvlJc w:val="left"/>
+      <w:pPr>
+        <w:ind w:left="5760" w:hanging="360"/>
+      </w:pPr>
+      <w:rPr>
+        <w:rFonts w:ascii="Courier New" w:hAnsi="Courier New" w:cs="Courier New" w:hint="default"/>
+      </w:rPr>
+    </w:lvl>
+    <w:lvl w:ilvl="8" w:tplc="04070005" w:tentative="1">
+      <w:start w:val="1"/>
+      <w:numFmt w:val="bullet"/>
+      <w:lvlText w:val=""/>
+      <w:lvlJc w:val="left"/>
+      <w:pPr>
+        <w:ind w:left="6480" w:hanging="360"/>
+      </w:pPr>
+      <w:rPr>
+        <w:rFonts w:ascii="Wingdings" w:hAnsi="Wingdings" w:hint="default"/>
+      </w:rPr>
+    </w:lvl>
+  </w:abstractNum>
+  <w:abstractNum w:abstractNumId="4" w15:restartNumberingAfterBreak="0">
     <w:nsid w:val="524A3869"/>
     <w:multiLevelType w:val="hybridMultilevel"/>
     <w:tmpl w:val="234EDC54"/>
@@ -6666,7 +6465,7 @@
       </w:rPr>
     </w:lvl>
   </w:abstractNum>
-  <w:abstractNum w:abstractNumId="4" w15:restartNumberingAfterBreak="0">
+  <w:abstractNum w:abstractNumId="5" w15:restartNumberingAfterBreak="0">
     <w:nsid w:val="5E791327"/>
     <w:multiLevelType w:val="hybridMultilevel"/>
     <w:tmpl w:val="61508D90"/>
@@ -6755,7 +6554,7 @@
       </w:pPr>
     </w:lvl>
   </w:abstractNum>
-  <w:abstractNum w:abstractNumId="5" w15:restartNumberingAfterBreak="0">
+  <w:abstractNum w:abstractNumId="6" w15:restartNumberingAfterBreak="0">
     <w:nsid w:val="661F6CFE"/>
     <w:multiLevelType w:val="hybridMultilevel"/>
     <w:tmpl w:val="16CE4A62"/>
@@ -6844,7 +6643,7 @@
       </w:pPr>
     </w:lvl>
   </w:abstractNum>
-  <w:abstractNum w:abstractNumId="6" w15:restartNumberingAfterBreak="0">
+  <w:abstractNum w:abstractNumId="7" w15:restartNumberingAfterBreak="0">
     <w:nsid w:val="7F4A062F"/>
     <w:multiLevelType w:val="hybridMultilevel"/>
     <w:tmpl w:val="7F82FEBE"/>
@@ -6937,7 +6736,7 @@
     <w:abstractNumId w:val="1"/>
   </w:num>
   <w:num w:numId="2" w16cid:durableId="759570397">
-    <w:abstractNumId w:val="6"/>
+    <w:abstractNumId w:val="7"/>
   </w:num>
   <w:num w:numId="3" w16cid:durableId="1187403510">
     <w:abstractNumId w:val="2"/>
@@ -6946,13 +6745,16 @@
     <w:abstractNumId w:val="0"/>
   </w:num>
   <w:num w:numId="5" w16cid:durableId="1852407121">
+    <w:abstractNumId w:val="6"/>
+  </w:num>
+  <w:num w:numId="6" w16cid:durableId="898172429">
+    <w:abstractNumId w:val="4"/>
+  </w:num>
+  <w:num w:numId="7" w16cid:durableId="138424886">
     <w:abstractNumId w:val="5"/>
   </w:num>
-  <w:num w:numId="6" w16cid:durableId="898172429">
+  <w:num w:numId="8" w16cid:durableId="41945580">
     <w:abstractNumId w:val="3"/>
-  </w:num>
-  <w:num w:numId="7" w16cid:durableId="138424886">
-    <w:abstractNumId w:val="4"/>
   </w:num>
 </w:numbering>
 </file>
@@ -7820,6 +7622,13 @@
     <w:pitch w:val="variable"/>
     <w:sig w:usb0="E0002EFF" w:usb1="C000785B" w:usb2="00000009" w:usb3="00000000" w:csb0="000001FF" w:csb1="00000000"/>
   </w:font>
+  <w:font w:name="Wingdings">
+    <w:panose1 w:val="05000000000000000000"/>
+    <w:charset w:val="02"/>
+    <w:family w:val="auto"/>
+    <w:pitch w:val="variable"/>
+    <w:sig w:usb0="00000000" w:usb1="10000000" w:usb2="00000000" w:usb3="00000000" w:csb0="80000000" w:csb1="00000000"/>
+  </w:font>
   <w:font w:name="Calibri">
     <w:panose1 w:val="020F0502020204030204"/>
     <w:charset w:val="00"/>
@@ -7833,13 +7642,6 @@
     <w:family w:val="modern"/>
     <w:pitch w:val="fixed"/>
     <w:sig w:usb0="E0002EFF" w:usb1="C0007843" w:usb2="00000009" w:usb3="00000000" w:csb0="000001FF" w:csb1="00000000"/>
-  </w:font>
-  <w:font w:name="Wingdings">
-    <w:panose1 w:val="05000000000000000000"/>
-    <w:charset w:val="02"/>
-    <w:family w:val="auto"/>
-    <w:pitch w:val="variable"/>
-    <w:sig w:usb0="00000000" w:usb1="10000000" w:usb2="00000000" w:usb3="00000000" w:csb0="80000000" w:csb1="00000000"/>
   </w:font>
   <w:font w:name="Symbol">
     <w:panose1 w:val="05050102010706020507"/>
@@ -7899,7 +7701,9 @@
     <w:rsid w:val="00A16EBD"/>
     <w:rsid w:val="00A50927"/>
     <w:rsid w:val="00B02220"/>
+    <w:rsid w:val="00BF3C5B"/>
     <w:rsid w:val="00D438A6"/>
+    <w:rsid w:val="00E3430F"/>
     <w:rsid w:val="00E46FFA"/>
     <w:rsid w:val="00E66FC6"/>
     <w:rsid w:val="00F72BAA"/>

</xml_diff>

<commit_message>
Entwicklungsplan überarbeitet, aktualisierte Versionen der Programme: "TouchGFX 4.25.0 Environment" und "STM32CubeIDE 1.19.0", keine andere Versionen, sonst Kompatibilitätsproblem
</commit_message>
<xml_diff>
--- a/doc/Gruppe1_Audio_BPM_Erkennung_Entwicklungsplan.docx
+++ b/doc/Gruppe1_Audio_BPM_Erkennung_Entwicklungsplan.docx
@@ -59,6 +59,7 @@
         </w:rPr>
         <w:t xml:space="preserve">Audio BPM </w:t>
       </w:r>
+      <w:proofErr w:type="spellStart"/>
       <w:r>
         <w:rPr>
           <w:color w:val="FF0000"/>
@@ -68,6 +69,7 @@
         </w:rPr>
         <w:t>Erkennung</w:t>
       </w:r>
+      <w:proofErr w:type="spellEnd"/>
     </w:p>
     <w:p>
       <w:pPr>
@@ -1967,11 +1969,21 @@
         <w:pStyle w:val="berschrift1"/>
       </w:pPr>
       <w:bookmarkStart w:id="0" w:name="_Toc227674012"/>
+      <w:proofErr w:type="spellStart"/>
       <w:r>
         <w:lastRenderedPageBreak/>
-        <w:t>Document History</w:t>
+        <w:t>Document</w:t>
+      </w:r>
+      <w:proofErr w:type="spellEnd"/>
+      <w:r>
+        <w:t xml:space="preserve"> </w:t>
+      </w:r>
+      <w:proofErr w:type="spellStart"/>
+      <w:r>
+        <w:t>History</w:t>
       </w:r>
       <w:bookmarkEnd w:id="0"/>
+      <w:proofErr w:type="spellEnd"/>
     </w:p>
     <w:p/>
     <w:tbl>
@@ -2011,9 +2023,11 @@
             <w:tcW w:w="6232" w:type="dxa"/>
           </w:tcPr>
           <w:p>
+            <w:proofErr w:type="spellStart"/>
             <w:r>
               <w:t>Changes</w:t>
             </w:r>
+            <w:proofErr w:type="spellEnd"/>
           </w:p>
         </w:tc>
       </w:tr>
@@ -2034,7 +2048,7 @@
           </w:tcPr>
           <w:p>
             <w:r>
-              <w:t>Gruppe 1</w:t>
+              <w:t>Johannes Winter</w:t>
             </w:r>
           </w:p>
         </w:tc>
@@ -2075,7 +2089,7 @@
           </w:tcPr>
           <w:p>
             <w:r>
-              <w:t>Gruppe 1</w:t>
+              <w:t>Johannes Winter</w:t>
             </w:r>
           </w:p>
         </w:tc>
@@ -2107,7 +2121,7 @@
           </w:tcPr>
           <w:p>
             <w:r>
-              <w:t>Gruppe 1</w:t>
+              <w:t>Johannes Winter</w:t>
             </w:r>
           </w:p>
         </w:tc>
@@ -2117,7 +2131,7 @@
           </w:tcPr>
           <w:p>
             <w:r>
-              <w:t>Kapitel Architektur &amp; Design und Verifizierung und Validierung ergänzt</w:t>
+              <w:t>TBD</w:t>
             </w:r>
           </w:p>
         </w:tc>
@@ -2190,9 +2204,14 @@
       </w:pPr>
       <w:bookmarkStart w:id="1" w:name="_Toc227674013"/>
       <w:r>
-        <w:t>Template History</w:t>
+        <w:t xml:space="preserve">Template </w:t>
+      </w:r>
+      <w:proofErr w:type="spellStart"/>
+      <w:r>
+        <w:t>History</w:t>
       </w:r>
       <w:bookmarkEnd w:id="1"/>
+      <w:proofErr w:type="spellEnd"/>
     </w:p>
     <w:p/>
     <w:tbl>
@@ -2232,9 +2251,11 @@
             <w:tcW w:w="6232" w:type="dxa"/>
           </w:tcPr>
           <w:p>
+            <w:proofErr w:type="spellStart"/>
             <w:r>
               <w:t>Changes</w:t>
             </w:r>
+            <w:proofErr w:type="spellEnd"/>
           </w:p>
         </w:tc>
       </w:tr>
@@ -2426,6 +2447,7 @@
         </w:rPr>
       </w:pPr>
       <w:bookmarkStart w:id="3" w:name="_Toc227674015"/>
+      <w:proofErr w:type="spellStart"/>
       <w:r>
         <w:rPr>
           <w:lang w:val="en-US"/>
@@ -2433,6 +2455,7 @@
         <w:t>Umfang</w:t>
       </w:r>
       <w:bookmarkEnd w:id="3"/>
+      <w:proofErr w:type="spellEnd"/>
     </w:p>
     <w:p>
       <w:r>
@@ -2460,6 +2483,20 @@
     <w:p>
       <w:pPr>
         <w:rPr>
+          <w:color w:val="EE0000"/>
+        </w:rPr>
+      </w:pPr>
+      <w:r>
+        <w:rPr>
+          <w:color w:val="EE0000"/>
+        </w:rPr>
+        <w:t>TBD</w:t>
+      </w:r>
+    </w:p>
+    <w:p/>
+    <w:p>
+      <w:pPr>
+        <w:rPr>
           <w:lang w:val="en-US"/>
         </w:rPr>
       </w:pPr>
@@ -2472,17 +2509,24 @@
     </w:p>
     <w:p>
       <w:pPr>
+        <w:rPr>
+          <w:lang w:val="en-US"/>
+        </w:rPr>
+      </w:pPr>
+    </w:p>
+    <w:p>
+      <w:pPr>
         <w:pStyle w:val="berschrift1"/>
         <w:rPr>
           <w:lang w:val="en-US"/>
         </w:rPr>
       </w:pPr>
       <w:bookmarkStart w:id="4" w:name="_Toc227674016"/>
+      <w:proofErr w:type="spellStart"/>
       <w:r>
         <w:rPr>
           <w:lang w:val="en-US"/>
         </w:rPr>
-        <w:lastRenderedPageBreak/>
         <w:t>Organi</w:t>
       </w:r>
       <w:r>
@@ -2495,9 +2539,24 @@
         <w:rPr>
           <w:lang w:val="en-US"/>
         </w:rPr>
-        <w:t>ation des Projektes</w:t>
+        <w:t>ation</w:t>
+      </w:r>
+      <w:proofErr w:type="spellEnd"/>
+      <w:r>
+        <w:rPr>
+          <w:lang w:val="en-US"/>
+        </w:rPr>
+        <w:t xml:space="preserve"> des </w:t>
+      </w:r>
+      <w:proofErr w:type="spellStart"/>
+      <w:r>
+        <w:rPr>
+          <w:lang w:val="en-US"/>
+        </w:rPr>
+        <w:t>Projektes</w:t>
       </w:r>
       <w:bookmarkEnd w:id="4"/>
+      <w:proofErr w:type="spellEnd"/>
     </w:p>
     <w:p>
       <w:pPr>
@@ -2512,15 +2571,28 @@
       </w:pPr>
       <w:bookmarkStart w:id="5" w:name="_Toc163900061"/>
       <w:bookmarkStart w:id="6" w:name="_Toc227674017"/>
-      <w:r>
-        <w:t>Organization des Teams</w:t>
+      <w:proofErr w:type="spellStart"/>
+      <w:r>
+        <w:t>Organization</w:t>
+      </w:r>
+      <w:proofErr w:type="spellEnd"/>
+      <w:r>
+        <w:t xml:space="preserve"> des Teams</w:t>
       </w:r>
       <w:bookmarkEnd w:id="5"/>
       <w:bookmarkEnd w:id="6"/>
     </w:p>
     <w:p>
       <w:r>
-        <w:t>Das Projekt wird die agile Methode Scrum für die Entwicklung verwenden. Siehe Abschnitt „Scrum“.</w:t>
+        <w:t xml:space="preserve">Das Projekt wird die agile Methode </w:t>
+      </w:r>
+      <w:proofErr w:type="spellStart"/>
+      <w:r>
+        <w:t>Scrum</w:t>
+      </w:r>
+      <w:proofErr w:type="spellEnd"/>
+      <w:r>
+        <w:t xml:space="preserve"> für die Entwicklung verwenden.</w:t>
       </w:r>
     </w:p>
     <w:p>
@@ -2537,7 +2609,15 @@
     </w:p>
     <w:p>
       <w:r>
-        <w:t>Das Team besteht aus folgenden Mitgliedern mit den entsprechenden Rollen und Verantwortlichkeiten:</w:t>
+        <w:t xml:space="preserve">Das Team besteht </w:t>
+      </w:r>
+      <w:proofErr w:type="gramStart"/>
+      <w:r>
+        <w:t>aus folgenden</w:t>
+      </w:r>
+      <w:proofErr w:type="gramEnd"/>
+      <w:r>
+        <w:t xml:space="preserve"> Mitgliedern mit den entsprechenden Rollen und Verantwortlichkeiten:</w:t>
       </w:r>
     </w:p>
     <w:tbl>
@@ -2634,8 +2714,13 @@
             <w:hideMark/>
           </w:tcPr>
           <w:p>
-            <w:r>
-              <w:t>Scrum Master</w:t>
+            <w:proofErr w:type="spellStart"/>
+            <w:r>
+              <w:t>Scrum</w:t>
+            </w:r>
+            <w:proofErr w:type="spellEnd"/>
+            <w:r>
+              <w:t xml:space="preserve"> Master</w:t>
             </w:r>
           </w:p>
         </w:tc>
@@ -2715,11 +2800,16 @@
             <w:hideMark/>
           </w:tcPr>
           <w:p>
+            <w:proofErr w:type="gramStart"/>
             <w:r>
               <w:t>SW</w:t>
             </w:r>
             <w:r>
-              <w:t xml:space="preserve"> Test / Debugging</w:t>
+              <w:t xml:space="preserve"> Test</w:t>
+            </w:r>
+            <w:proofErr w:type="gramEnd"/>
+            <w:r>
+              <w:t xml:space="preserve"> / Debugging</w:t>
             </w:r>
           </w:p>
         </w:tc>
@@ -2810,6 +2900,17 @@
             <w:r>
               <w:t>SW-Entwickler</w:t>
             </w:r>
+            <w:r>
+              <w:t>/</w:t>
+            </w:r>
+            <w:proofErr w:type="spellStart"/>
+            <w:r>
+              <w:t>Git</w:t>
+            </w:r>
+            <w:proofErr w:type="spellEnd"/>
+            <w:r>
+              <w:t xml:space="preserve"> Beauftragter</w:t>
+            </w:r>
           </w:p>
         </w:tc>
         <w:tc>
@@ -2824,14 +2925,18 @@
             <w:hideMark/>
           </w:tcPr>
           <w:p>
+            <w:proofErr w:type="gramStart"/>
             <w:r>
               <w:t>SW Architektur</w:t>
             </w:r>
-          </w:p>
-          <w:p>
+            <w:proofErr w:type="gramEnd"/>
+          </w:p>
+          <w:p>
+            <w:proofErr w:type="gramStart"/>
             <w:r>
               <w:t>SW Implementierung</w:t>
             </w:r>
+            <w:proofErr w:type="gramEnd"/>
           </w:p>
         </w:tc>
       </w:tr>
@@ -2868,6 +2973,9 @@
             <w:r>
               <w:t>SW-Entwickler</w:t>
             </w:r>
+            <w:r>
+              <w:t>/Entwicklungsplaner</w:t>
+            </w:r>
           </w:p>
         </w:tc>
         <w:tc>
@@ -2882,12 +2990,14 @@
             <w:hideMark/>
           </w:tcPr>
           <w:p>
+            <w:proofErr w:type="gramStart"/>
             <w:r>
               <w:t>SW</w:t>
             </w:r>
             <w:r>
               <w:t xml:space="preserve"> Implementierung</w:t>
             </w:r>
+            <w:proofErr w:type="gramEnd"/>
           </w:p>
           <w:p>
             <w:r>
@@ -2932,73 +3042,90 @@
     </w:p>
     <w:p>
       <w:r>
-        <w:t xml:space="preserve">Die Arbeitszeit ist in Sprints unterteilt. Jeder Sprint hat eine Dauer von </w:t>
-      </w:r>
-      <w:r>
-        <w:t>einer</w:t>
-      </w:r>
-      <w:r>
-        <w:t xml:space="preserve"> Woch</w:t>
-      </w:r>
-      <w:r>
-        <w:t>e</w:t>
-      </w:r>
-      <w:r>
-        <w:t>.</w:t>
-      </w:r>
-    </w:p>
-    <w:p>
-      <w:r>
-        <w:t>Die Sprint Planung wird an jedem Donnerstag durchgeführt.</w:t>
-      </w:r>
-    </w:p>
-    <w:p>
-      <w:r>
-        <w:t xml:space="preserve">Bei der Sprint Planung werden die Sprint Ziele definiert, die effektive Kapazität der einzelnen Teammitglieder, die Aktivitäten und die entsprechende „Definition of Done“. </w:t>
-      </w:r>
-    </w:p>
-    <w:p>
-      <w:r>
-        <w:t>Die Aufwandsabschätzung der Aktivitäten erfolgt basierend auf vorherige Erfahrung mit ähnlichen Tätigkeiten und mit Schätzung in der Gruppe.</w:t>
-      </w:r>
-    </w:p>
-    <w:p>
-      <w:r>
-        <w:t>Die Daily Sprints werden täglich durchgeführt, der amtierende Scrum Muster berichtet an Herr Pagliarulo, falls es Blockers gibt, die im Team nicht gelöst werden können.</w:t>
-      </w:r>
-    </w:p>
-    <w:p>
-      <w:r>
-        <w:t>Ein Sprint Review und eine Sprint Retrospektive finden an dem letzten Donnerst</w:t>
-      </w:r>
-      <w:r>
-        <w:t>ag</w:t>
-      </w:r>
-      <w:r>
-        <w:t xml:space="preserve"> des Sprints statt.</w:t>
-      </w:r>
-    </w:p>
-    <w:p>
-      <w:r>
-        <w:t>In dem Sprint Review werden dem Produkt Owner und den anderen Gruppen die erzielten Ergebnisse präsentiert. Aus der Retrospektive werden Aktionen für Verbesserungen in nächsten Sprints hergeleitet.</w:t>
-      </w:r>
-    </w:p>
-    <w:p>
-      <w:r>
-        <w:t>Die Planung des Sprints wird mit der Excel Tabelle „Prozessortechnik_</w:t>
-      </w:r>
-      <w:r>
-        <w:t>Sprint_Backlog</w:t>
-      </w:r>
-      <w:r>
-        <w:t>“ [1] vorgenommen.</w:t>
-      </w:r>
-    </w:p>
-    <w:p>
-      <w:r>
-        <w:t>Die Tabelle ermöglicht auch die Darstellung von dem Burndown Chart und dient auch als Ablage für Sprint Review, Sprint Retrospektive und Blocker/Interrupt Verwaltung.</w:t>
-      </w:r>
-    </w:p>
+        <w:t>Die Arbeitszeit ist in Sprints unterteilt, wobei jeder Sprint eine Dauer von einer Woche hat.</w:t>
+      </w:r>
+    </w:p>
+    <w:p>
+      <w:r>
+        <w:t>Die Sprintplanung findet jeden Donnerstag</w:t>
+      </w:r>
+      <w:r>
+        <w:t xml:space="preserve"> </w:t>
+      </w:r>
+      <w:r>
+        <w:t xml:space="preserve">statt. In diesem Rahmen werden die Sprintziele definiert, die effektive Kapazität der einzelnen Teammitglieder festgelegt sowie die geplanten Aktivitäten und die entsprechende „Definition </w:t>
+      </w:r>
+      <w:proofErr w:type="spellStart"/>
+      <w:r>
+        <w:t>of</w:t>
+      </w:r>
+      <w:proofErr w:type="spellEnd"/>
+      <w:r>
+        <w:t xml:space="preserve"> Done“ bestimmt.</w:t>
+      </w:r>
+    </w:p>
+    <w:p>
+      <w:r>
+        <w:t>Die Aufwandsabschätzung der Aktivitäten erfolgt auf Basis vorheriger Erfahrungen mit ähnlichen Aufgaben sowie durch gemeinsame Schätzungen im Team.</w:t>
+      </w:r>
+    </w:p>
+    <w:p>
+      <w:r>
+        <w:t xml:space="preserve">Die Daily </w:t>
+      </w:r>
+      <w:proofErr w:type="spellStart"/>
+      <w:r>
+        <w:t>Scrums</w:t>
+      </w:r>
+      <w:proofErr w:type="spellEnd"/>
+      <w:r>
+        <w:t xml:space="preserve"> werden täglich durchgeführt. Der amtierende </w:t>
+      </w:r>
+      <w:proofErr w:type="spellStart"/>
+      <w:r>
+        <w:t>Scrum</w:t>
+      </w:r>
+      <w:proofErr w:type="spellEnd"/>
+      <w:r>
+        <w:t xml:space="preserve"> Master berichtet an Herrn Pagliarulo, falls Blocker auftreten, die nicht innerhalb des Teams gelöst werden können.</w:t>
+      </w:r>
+    </w:p>
+    <w:p>
+      <w:r>
+        <w:t xml:space="preserve">Ein Sprint Review sowie eine Sprint Retrospektive finden am letzten Donnerstag des Sprints statt. Im Sprint Review werden dem </w:t>
+      </w:r>
+      <w:proofErr w:type="spellStart"/>
+      <w:r>
+        <w:t>Product</w:t>
+      </w:r>
+      <w:proofErr w:type="spellEnd"/>
+      <w:r>
+        <w:t xml:space="preserve"> Owner und anderen Gruppen die erzielten Ergebnisse präsentiert. Aus der Retrospektive werden Maßnahmen zur Verbesserung für die kommenden Sprints abgeleitet.</w:t>
+      </w:r>
+    </w:p>
+    <w:p>
+      <w:r>
+        <w:t>Die Sprintplanung wird mithilfe der Excel-Tabelle „</w:t>
+      </w:r>
+      <w:proofErr w:type="spellStart"/>
+      <w:r>
+        <w:t>Prozessortechnik_Sprint_Backlog</w:t>
+      </w:r>
+      <w:proofErr w:type="spellEnd"/>
+      <w:r>
+        <w:t xml:space="preserve">“ [1] durchgeführt. Diese Tabelle ermöglicht zudem die Darstellung eines </w:t>
+      </w:r>
+      <w:proofErr w:type="spellStart"/>
+      <w:r>
+        <w:t>Burndown</w:t>
+      </w:r>
+      <w:proofErr w:type="spellEnd"/>
+      <w:r>
+        <w:t>-Charts und dient als Ablage für Sprint Reviews, Sprint Retrospektiven sowie zur Verwaltung von Blockern und Interrupts.</w:t>
+      </w:r>
+    </w:p>
+    <w:p/>
+    <w:p/>
     <w:p>
       <w:pPr>
         <w:pStyle w:val="berschrift2"/>
@@ -3028,7 +3155,7 @@
           <w:noProof/>
         </w:rPr>
         <w:drawing>
-          <wp:inline distT="0" distB="0" distL="0" distR="0" wp14:anchorId="192B646E" wp14:editId="0919A02B">
+          <wp:inline distT="0" distB="0" distL="0" distR="0" wp14:anchorId="192B646E" wp14:editId="16C4C391">
             <wp:extent cx="5753100" cy="577850"/>
             <wp:effectExtent l="0" t="0" r="0" b="0"/>
             <wp:docPr id="488241168" name="Grafik 1"/>
@@ -3077,13 +3204,21 @@
         </w:drawing>
       </w:r>
       <w:r>
-        <w:t>Die Kanban Board wird ebenso in der Excel Tabelle „</w:t>
-      </w:r>
-      <w:r>
-        <w:t>Prozessortechnik_Sprint_Backlog</w:t>
-      </w:r>
-      <w:r>
-        <w:t>“ realisiert.</w:t>
+        <w:t>Das</w:t>
+      </w:r>
+      <w:r>
+        <w:t xml:space="preserve"> Kanban Board wird </w:t>
+      </w:r>
+      <w:r>
+        <w:t xml:space="preserve">mit der Project Funktion von </w:t>
+      </w:r>
+      <w:proofErr w:type="spellStart"/>
+      <w:r>
+        <w:t>Github</w:t>
+      </w:r>
+      <w:proofErr w:type="spellEnd"/>
+      <w:r>
+        <w:t xml:space="preserve"> erstellt.</w:t>
       </w:r>
     </w:p>
     <w:p>
@@ -3125,7 +3260,15 @@
     </w:p>
     <w:p>
       <w:r>
-        <w:t>GitHub wird ebenso als Versionierungsprogramm verwendet.</w:t>
+        <w:t xml:space="preserve">GitHub wird ebenso als </w:t>
+      </w:r>
+      <w:proofErr w:type="spellStart"/>
+      <w:r>
+        <w:t>Versionierungsprogramm</w:t>
+      </w:r>
+      <w:proofErr w:type="spellEnd"/>
+      <w:r>
+        <w:t xml:space="preserve"> verwendet.</w:t>
       </w:r>
     </w:p>
     <w:p>
@@ -3143,13 +3286,29 @@
         </w:rPr>
       </w:pPr>
       <w:bookmarkStart w:id="15" w:name="_Toc227674022"/>
+      <w:proofErr w:type="spellStart"/>
       <w:r>
         <w:rPr>
           <w:lang w:val="en-US"/>
         </w:rPr>
-        <w:t>Anwendung &amp; Ziele</w:t>
+        <w:t>Anwendung</w:t>
+      </w:r>
+      <w:proofErr w:type="spellEnd"/>
+      <w:r>
+        <w:rPr>
+          <w:lang w:val="en-US"/>
+        </w:rPr>
+        <w:t xml:space="preserve"> &amp; </w:t>
+      </w:r>
+      <w:proofErr w:type="spellStart"/>
+      <w:r>
+        <w:rPr>
+          <w:lang w:val="en-US"/>
+        </w:rPr>
+        <w:t>Ziele</w:t>
       </w:r>
       <w:bookmarkEnd w:id="15"/>
+      <w:proofErr w:type="spellEnd"/>
     </w:p>
     <w:p>
       <w:pPr>
@@ -3227,7 +3386,7 @@
         <w:t>Die Entwicklung startet in KW1</w:t>
       </w:r>
       <w:r>
-        <w:t>7</w:t>
+        <w:t>6</w:t>
       </w:r>
       <w:r>
         <w:t xml:space="preserve"> und endet in KW2</w:t>
@@ -3289,7 +3448,15 @@
           </w:tcPr>
           <w:p>
             <w:r>
-              <w:t>Alle User Stories und Anforderungen entsprechend dieses Planes durchgesprochen (reviewed) und freigegeben</w:t>
+              <w:t>Alle User Stories und Anforderungen entsprechend dieses Planes durchgesprochen (</w:t>
+            </w:r>
+            <w:proofErr w:type="spellStart"/>
+            <w:r>
+              <w:t>reviewed</w:t>
+            </w:r>
+            <w:proofErr w:type="spellEnd"/>
+            <w:r>
+              <w:t>) und freigegeben</w:t>
             </w:r>
           </w:p>
           <w:p/>
@@ -3300,7 +3467,10 @@
           </w:tcPr>
           <w:p>
             <w:r>
-              <w:t>KW18</w:t>
+              <w:t>KW1</w:t>
+            </w:r>
+            <w:r>
+              <w:t>8</w:t>
             </w:r>
           </w:p>
         </w:tc>
@@ -3327,11 +3497,33 @@
                 <w:lang w:val="en-US"/>
               </w:rPr>
             </w:pPr>
-            <w:r>
-              <w:rPr>
-                <w:lang w:val="en-US"/>
-              </w:rPr>
-              <w:t>Sammelstatus Anforderungen/User Stories</w:t>
+            <w:proofErr w:type="spellStart"/>
+            <w:r>
+              <w:rPr>
+                <w:lang w:val="en-US"/>
+              </w:rPr>
+              <w:t>Sammelstatus</w:t>
+            </w:r>
+            <w:proofErr w:type="spellEnd"/>
+            <w:r>
+              <w:rPr>
+                <w:lang w:val="en-US"/>
+              </w:rPr>
+              <w:t xml:space="preserve"> </w:t>
+            </w:r>
+            <w:proofErr w:type="spellStart"/>
+            <w:r>
+              <w:rPr>
+                <w:lang w:val="en-US"/>
+              </w:rPr>
+              <w:t>Anforderungen</w:t>
+            </w:r>
+            <w:proofErr w:type="spellEnd"/>
+            <w:r>
+              <w:rPr>
+                <w:lang w:val="en-US"/>
+              </w:rPr>
+              <w:t>/User Stories</w:t>
             </w:r>
           </w:p>
         </w:tc>
@@ -3354,7 +3546,10 @@
           </w:tcPr>
           <w:p>
             <w:r>
-              <w:t>KW19</w:t>
+              <w:t>KW</w:t>
+            </w:r>
+            <w:r>
+              <w:t>20</w:t>
             </w:r>
           </w:p>
         </w:tc>
@@ -3381,12 +3576,28 @@
                 <w:lang w:val="en-US"/>
               </w:rPr>
             </w:pPr>
-            <w:r>
-              <w:rPr>
-                <w:lang w:val="en-US"/>
-              </w:rPr>
-              <w:t>Sammelstatus Status Architektur</w:t>
-            </w:r>
+            <w:proofErr w:type="spellStart"/>
+            <w:r>
+              <w:rPr>
+                <w:lang w:val="en-US"/>
+              </w:rPr>
+              <w:t>Sammelstatus</w:t>
+            </w:r>
+            <w:proofErr w:type="spellEnd"/>
+            <w:r>
+              <w:rPr>
+                <w:lang w:val="en-US"/>
+              </w:rPr>
+              <w:t xml:space="preserve"> Status </w:t>
+            </w:r>
+            <w:proofErr w:type="spellStart"/>
+            <w:r>
+              <w:rPr>
+                <w:lang w:val="en-US"/>
+              </w:rPr>
+              <w:t>Architektur</w:t>
+            </w:r>
+            <w:proofErr w:type="spellEnd"/>
           </w:p>
         </w:tc>
       </w:tr>
@@ -3436,12 +3647,42 @@
                 <w:lang w:val="en-US"/>
               </w:rPr>
             </w:pPr>
-            <w:r>
-              <w:rPr>
-                <w:lang w:val="en-US"/>
-              </w:rPr>
-              <w:t>Sammelstatus Module zu implementieren</w:t>
-            </w:r>
+            <w:proofErr w:type="spellStart"/>
+            <w:r>
+              <w:rPr>
+                <w:lang w:val="en-US"/>
+              </w:rPr>
+              <w:t>Sammelstatus</w:t>
+            </w:r>
+            <w:proofErr w:type="spellEnd"/>
+            <w:r>
+              <w:rPr>
+                <w:lang w:val="en-US"/>
+              </w:rPr>
+              <w:t xml:space="preserve"> Module </w:t>
+            </w:r>
+            <w:proofErr w:type="spellStart"/>
+            <w:r>
+              <w:rPr>
+                <w:lang w:val="en-US"/>
+              </w:rPr>
+              <w:t>zu</w:t>
+            </w:r>
+            <w:proofErr w:type="spellEnd"/>
+            <w:r>
+              <w:rPr>
+                <w:lang w:val="en-US"/>
+              </w:rPr>
+              <w:t xml:space="preserve"> </w:t>
+            </w:r>
+            <w:proofErr w:type="spellStart"/>
+            <w:r>
+              <w:rPr>
+                <w:lang w:val="en-US"/>
+              </w:rPr>
+              <w:t>implementieren</w:t>
+            </w:r>
+            <w:proofErr w:type="spellEnd"/>
           </w:p>
         </w:tc>
       </w:tr>
@@ -3463,7 +3704,10 @@
           </w:tcPr>
           <w:p>
             <w:r>
-              <w:t>KW24</w:t>
+              <w:t>KW2</w:t>
+            </w:r>
+            <w:r>
+              <w:t>5</w:t>
             </w:r>
           </w:p>
         </w:tc>
@@ -3490,11 +3734,19 @@
                 <w:lang w:val="en-US"/>
               </w:rPr>
             </w:pPr>
-            <w:r>
-              <w:rPr>
-                <w:lang w:val="en-US"/>
-              </w:rPr>
-              <w:t>Sammelstatus Test Cases</w:t>
+            <w:proofErr w:type="spellStart"/>
+            <w:r>
+              <w:rPr>
+                <w:lang w:val="en-US"/>
+              </w:rPr>
+              <w:t>Sammelstatus</w:t>
+            </w:r>
+            <w:proofErr w:type="spellEnd"/>
+            <w:r>
+              <w:rPr>
+                <w:lang w:val="en-US"/>
+              </w:rPr>
+              <w:t xml:space="preserve"> Test Cases</w:t>
             </w:r>
           </w:p>
         </w:tc>
@@ -3517,6 +3769,7 @@
         </w:rPr>
       </w:pPr>
       <w:bookmarkStart w:id="19" w:name="_Toc227674025"/>
+      <w:proofErr w:type="spellStart"/>
       <w:r>
         <w:rPr>
           <w:lang w:val="en-US"/>
@@ -3524,6 +3777,7 @@
         <w:t>Anforderungsmanagement</w:t>
       </w:r>
       <w:bookmarkEnd w:id="19"/>
+      <w:proofErr w:type="spellEnd"/>
     </w:p>
     <w:p>
       <w:pPr>
@@ -3534,12 +3788,12 @@
     </w:p>
     <w:p>
       <w:r>
-        <w:t>In dem Projekt werden zunächst die Stakeholder identifiziert und ihre Bedürfnisse mithilfe von User Stories erfasst. Auf Basis dieser User Stories werden anschließend die Anforderungen abgeleitet.</w:t>
-      </w:r>
-    </w:p>
-    <w:p>
-      <w:r>
-        <w:t>Aus den definierten Anforderungen wird die Systemarchitektur entwickelt. Darauf aufbauend werden die Test Cases aus den Anforderungen hergeleitet, wobei insbesondere die in den User Stories formulierten Akzeptanzkriterien berücksichtigt werden.</w:t>
+        <w:t>In dem Projekt werden zunächst die Stakeholder identifiziert und ihre Bedürfnisse in Form von User Stories erfasst. Auf Grundlage dieser User Stories werden anschließend die Anforderungen abgeleitet.</w:t>
+      </w:r>
+    </w:p>
+    <w:p>
+      <w:r>
+        <w:t>Basierend auf den definierten Anforderungen wird die Systemarchitektur entwickelt. Darauf aufbauend werden die Testfälle aus den Anforderungen abgeleitet, wobei insbesondere die in den User Stories formulierten Akzeptanzkriterien berücksichtigt werden.</w:t>
       </w:r>
     </w:p>
     <w:p>
@@ -3677,12 +3931,12 @@
     </w:p>
     <w:p>
       <w:r>
-        <w:t xml:space="preserve">Anforderungen werden aus den User Stories hergeleitet. </w:t>
-      </w:r>
-    </w:p>
-    <w:p>
-      <w:r>
-        <w:t>Anforderungen werden mit Hilfe der folgenden Schablone geschrieben:</w:t>
+        <w:t>Die Anforderungen werden aus den User Stories abgeleitet und mithilfe einer standardisierten Schablone dokumentiert.</w:t>
+      </w:r>
+    </w:p>
+    <w:p>
+      <w:r>
+        <w:t>Für jede Anforderung werden folgende Attribute verwendet:</w:t>
       </w:r>
     </w:p>
     <w:p>
@@ -3805,7 +4059,21 @@
                 <w:b/>
                 <w:bCs/>
               </w:rPr>
-              <w:t>DSP_G5_WWW</w:t>
+              <w:t>DSP_G</w:t>
+            </w:r>
+            <w:r>
+              <w:rPr>
+                <w:b/>
+                <w:bCs/>
+              </w:rPr>
+              <w:t>1</w:t>
+            </w:r>
+            <w:r>
+              <w:rPr>
+                <w:b/>
+                <w:bCs/>
+              </w:rPr>
+              <w:t>_WWW</w:t>
             </w:r>
           </w:p>
         </w:tc>
@@ -3842,6 +4110,7 @@
           </w:tcPr>
           <w:p>
             <w:r>
+              <w:lastRenderedPageBreak/>
               <w:t>Kategorie</w:t>
             </w:r>
           </w:p>
@@ -3886,7 +4155,6 @@
           </w:tcPr>
           <w:p>
             <w:r>
-              <w:lastRenderedPageBreak/>
               <w:t>Review</w:t>
             </w:r>
           </w:p>
@@ -3897,8 +4165,13 @@
           </w:tcPr>
           <w:p>
             <w:r>
-              <w:t>TBD, in Review, Reviewed</w:t>
-            </w:r>
+              <w:t xml:space="preserve">TBD, in Review, </w:t>
+            </w:r>
+            <w:proofErr w:type="spellStart"/>
+            <w:r>
+              <w:t>Reviewed</w:t>
+            </w:r>
+            <w:proofErr w:type="spellEnd"/>
           </w:p>
         </w:tc>
       </w:tr>
@@ -3908,9 +4181,11 @@
             <w:tcW w:w="1250" w:type="dxa"/>
           </w:tcPr>
           <w:p>
+            <w:proofErr w:type="spellStart"/>
             <w:r>
               <w:t>Verification</w:t>
             </w:r>
+            <w:proofErr w:type="spellEnd"/>
           </w:p>
         </w:tc>
         <w:tc>
@@ -3935,13 +4210,16 @@
     </w:tbl>
     <w:p>
       <w:r>
-        <w:t>User Stories und Anforderungen werden in einer Excel Tabelle „Stories_Req.xlsx“ verwaltet. In der Tabelle wird auch die Traceability manuell hergestellt.</w:t>
-      </w:r>
-    </w:p>
-    <w:p>
-      <w:pPr>
-        <w:pStyle w:val="berschrift1"/>
-      </w:pPr>
+        <w:t>User Stories und Anforderungen werden in der Excel-Datei „Stories_Req.xlsx“ verwaltet. Die Nachverfolgbarkeit (</w:t>
+      </w:r>
+      <w:proofErr w:type="spellStart"/>
+      <w:r>
+        <w:t>Traceability</w:t>
+      </w:r>
+      <w:proofErr w:type="spellEnd"/>
+      <w:r>
+        <w:t>) zwischen User Stories und Anforderungen wird ebenfalls in dieser Tabelle manuell gepflegt.</w:t>
+      </w:r>
     </w:p>
     <w:p>
       <w:r>
@@ -4048,140 +4326,311 @@
         </w:rPr>
       </w:pPr>
       <w:bookmarkStart w:id="22" w:name="_Toc227674027"/>
+      <w:proofErr w:type="spellStart"/>
       <w:r>
         <w:rPr>
           <w:lang w:val="en-US"/>
         </w:rPr>
-        <w:t>Architektur &amp; Design</w:t>
-      </w:r>
+        <w:t>Architektur</w:t>
+      </w:r>
+      <w:proofErr w:type="spellEnd"/>
+      <w:r>
+        <w:rPr>
+          <w:lang w:val="en-US"/>
+        </w:rPr>
+        <w:t xml:space="preserve"> &amp; Design</w:t>
+      </w:r>
+      <w:bookmarkStart w:id="23" w:name="_Toc165127832"/>
+      <w:bookmarkStart w:id="24" w:name="_Toc227674028"/>
       <w:bookmarkEnd w:id="22"/>
     </w:p>
     <w:p>
       <w:pPr>
-        <w:pStyle w:val="Listenabsatz"/>
+        <w:rPr>
+          <w:lang w:val="en-US"/>
+        </w:rPr>
+      </w:pPr>
+    </w:p>
+    <w:p>
+      <w:pPr>
+        <w:pStyle w:val="berschrift2"/>
+      </w:pPr>
+      <w:r>
+        <w:t>Architektur</w:t>
+      </w:r>
+      <w:bookmarkStart w:id="25" w:name="_Toc165127833"/>
+      <w:bookmarkStart w:id="26" w:name="_Toc227674029"/>
+      <w:bookmarkEnd w:id="23"/>
+      <w:bookmarkEnd w:id="24"/>
+    </w:p>
+    <w:p>
+      <w:pPr>
+        <w:rPr>
+          <w:rFonts w:asciiTheme="majorHAnsi" w:eastAsiaTheme="majorEastAsia" w:hAnsiTheme="majorHAnsi" w:cstheme="majorBidi"/>
+          <w:sz w:val="26"/>
+          <w:szCs w:val="26"/>
+        </w:rPr>
+      </w:pPr>
+      <w:r>
+        <w:rPr>
+          <w:lang w:eastAsia="de-DE"/>
+        </w:rPr>
+        <w:t>Die Systemarchitektur wird auf verschiedenen Abstraktionsebenen beschrieben:</w:t>
+      </w:r>
+    </w:p>
+    <w:p>
+      <w:pPr>
         <w:numPr>
           <w:ilvl w:val="0"/>
-          <w:numId w:val="8"/>
+          <w:numId w:val="9"/>
         </w:numPr>
-        <w:rPr>
-          <w:lang w:val="en-US"/>
-        </w:rPr>
-      </w:pPr>
-      <w:r>
-        <w:rPr>
-          <w:lang w:val="en-US"/>
-        </w:rPr>
-        <w:t>LUCID CHARTS</w:t>
-      </w:r>
-    </w:p>
-    <w:p>
-      <w:pPr>
-        <w:pStyle w:val="berschrift2"/>
-      </w:pPr>
-      <w:bookmarkStart w:id="23" w:name="_Toc165127832"/>
-      <w:bookmarkStart w:id="24" w:name="_Toc227674028"/>
-      <w:r>
-        <w:t>Architektur</w:t>
-      </w:r>
-      <w:bookmarkEnd w:id="23"/>
-      <w:bookmarkEnd w:id="24"/>
-    </w:p>
-    <w:p>
-      <w:r>
-        <w:t>Die Architektur wird auf unterschiedlichen Abstraktionsebenen beschrieben:</w:t>
-      </w:r>
-    </w:p>
-    <w:p>
-      <w:pPr>
-        <w:pStyle w:val="Listenabsatz"/>
+        <w:spacing w:before="100" w:beforeAutospacing="1" w:after="100" w:afterAutospacing="1" w:line="240" w:lineRule="auto"/>
+        <w:rPr>
+          <w:rFonts w:eastAsia="Times New Roman" w:cstheme="minorHAnsi"/>
+          <w:lang w:eastAsia="de-DE"/>
+        </w:rPr>
+      </w:pPr>
+      <w:r>
+        <w:rPr>
+          <w:rFonts w:eastAsia="Times New Roman" w:cstheme="minorHAnsi"/>
+          <w:lang w:eastAsia="de-DE"/>
+        </w:rPr>
+        <w:t xml:space="preserve">funktionale Ebene </w:t>
+      </w:r>
+    </w:p>
+    <w:p>
+      <w:pPr>
         <w:numPr>
           <w:ilvl w:val="0"/>
-          <w:numId w:val="6"/>
+          <w:numId w:val="9"/>
         </w:numPr>
-      </w:pPr>
-      <w:r>
-        <w:t>Funktional</w:t>
-      </w:r>
-    </w:p>
-    <w:p>
-      <w:pPr>
-        <w:pStyle w:val="Listenabsatz"/>
+        <w:spacing w:before="100" w:beforeAutospacing="1" w:after="100" w:afterAutospacing="1" w:line="240" w:lineRule="auto"/>
+        <w:rPr>
+          <w:rFonts w:eastAsia="Times New Roman" w:cstheme="minorHAnsi"/>
+          <w:lang w:eastAsia="de-DE"/>
+        </w:rPr>
+      </w:pPr>
+      <w:r>
+        <w:rPr>
+          <w:rFonts w:eastAsia="Times New Roman" w:cstheme="minorHAnsi"/>
+          <w:lang w:eastAsia="de-DE"/>
+        </w:rPr>
+        <w:t xml:space="preserve">logische Ebene </w:t>
+      </w:r>
+    </w:p>
+    <w:p>
+      <w:pPr>
         <w:numPr>
           <w:ilvl w:val="0"/>
-          <w:numId w:val="6"/>
+          <w:numId w:val="9"/>
         </w:numPr>
-      </w:pPr>
-      <w:r>
-        <w:t>Logisch</w:t>
-      </w:r>
-    </w:p>
-    <w:p>
-      <w:pPr>
-        <w:pStyle w:val="Listenabsatz"/>
+        <w:spacing w:before="100" w:beforeAutospacing="1" w:after="100" w:afterAutospacing="1" w:line="240" w:lineRule="auto"/>
+        <w:rPr>
+          <w:rFonts w:eastAsia="Times New Roman" w:cstheme="minorHAnsi"/>
+          <w:lang w:eastAsia="de-DE"/>
+        </w:rPr>
+      </w:pPr>
+      <w:r>
+        <w:rPr>
+          <w:rFonts w:eastAsia="Times New Roman" w:cstheme="minorHAnsi"/>
+          <w:lang w:eastAsia="de-DE"/>
+        </w:rPr>
+        <w:t xml:space="preserve">physikalische Ebene </w:t>
+      </w:r>
+    </w:p>
+    <w:p>
+      <w:pPr>
+        <w:spacing w:before="100" w:beforeAutospacing="1" w:after="100" w:afterAutospacing="1" w:line="240" w:lineRule="auto"/>
+        <w:rPr>
+          <w:rFonts w:eastAsia="Times New Roman" w:cstheme="minorHAnsi"/>
+          <w:lang w:eastAsia="de-DE"/>
+        </w:rPr>
+      </w:pPr>
+      <w:r>
+        <w:rPr>
+          <w:rFonts w:eastAsia="Times New Roman" w:cstheme="minorHAnsi"/>
+          <w:lang w:eastAsia="de-DE"/>
+        </w:rPr>
+        <w:t>Die einzelnen Architekturelemente werden eindeutig benannt und gemäß folgender Namenskonvention identifiziert: &lt;</w:t>
+      </w:r>
+      <w:proofErr w:type="spellStart"/>
+      <w:r>
+        <w:rPr>
+          <w:rFonts w:eastAsia="Times New Roman" w:cstheme="minorHAnsi"/>
+          <w:lang w:eastAsia="de-DE"/>
+        </w:rPr>
+        <w:t>ArchEl_x</w:t>
+      </w:r>
+      <w:proofErr w:type="spellEnd"/>
+      <w:r>
+        <w:rPr>
+          <w:rFonts w:eastAsia="Times New Roman" w:cstheme="minorHAnsi"/>
+          <w:lang w:eastAsia="de-DE"/>
+        </w:rPr>
+        <w:t>&gt;. Diese Identifikatoren dienen dazu, Anforderungen eindeutig mit den jeweiligen Architekturelementen zu verknüpfen. Die Zuordnung wird in der Excel-Datei „Stories_Req.xlsx“ dokumentiert.</w:t>
+      </w:r>
+    </w:p>
+    <w:p>
+      <w:pPr>
+        <w:pStyle w:val="berschrift3"/>
+        <w:rPr>
+          <w:rFonts w:eastAsia="Times New Roman"/>
+          <w:lang w:eastAsia="de-DE"/>
+        </w:rPr>
+      </w:pPr>
+      <w:r>
+        <w:rPr>
+          <w:rFonts w:eastAsia="Times New Roman"/>
+          <w:lang w:eastAsia="de-DE"/>
+        </w:rPr>
+        <w:t>Modellierung</w:t>
+      </w:r>
+    </w:p>
+    <w:p>
+      <w:pPr>
+        <w:spacing w:before="100" w:beforeAutospacing="1" w:after="100" w:afterAutospacing="1" w:line="240" w:lineRule="auto"/>
+        <w:rPr>
+          <w:rFonts w:eastAsia="Times New Roman" w:cstheme="minorHAnsi"/>
+          <w:lang w:eastAsia="de-DE"/>
+        </w:rPr>
+      </w:pPr>
+      <w:r>
+        <w:rPr>
+          <w:rFonts w:eastAsia="Times New Roman" w:cstheme="minorHAnsi"/>
+          <w:lang w:eastAsia="de-DE"/>
+        </w:rPr>
+        <w:t>Für die Darstellung der Architektur wird die UML-Modellierungssprache verwendet. Dabei kommen folgende Diagrammtypen zum Einsatz:</w:t>
+      </w:r>
+    </w:p>
+    <w:p>
+      <w:pPr>
         <w:numPr>
           <w:ilvl w:val="0"/>
-          <w:numId w:val="6"/>
+          <w:numId w:val="10"/>
         </w:numPr>
-      </w:pPr>
-      <w:r>
-        <w:t>Physikalisch</w:t>
-      </w:r>
-    </w:p>
-    <w:p>
-      <w:r>
-        <w:t>Die Elemente der Architektur haben einen Namen und eine eindeutige Identifizierung entsprechend folgende Namenskonvention: &lt;ArchEl_x&gt;. Die Identifizierung wird verwendet, um Anforderungen mit den Architekturelementen zu verlinken. Die Verlinkung wird in der Excel Tabelle „Stories_Req.xlsx“ dokumentiert.</w:t>
-      </w:r>
-    </w:p>
-    <w:p>
-      <w:r>
-        <w:t xml:space="preserve">Für die Darstellung der Architektur wird die </w:t>
-      </w:r>
-      <w:r>
-        <w:t>UML-Modellierungssprache</w:t>
-      </w:r>
-      <w:r>
-        <w:t xml:space="preserve"> verwendet.</w:t>
-      </w:r>
-    </w:p>
-    <w:p>
-      <w:r>
-        <w:t>Für die Struktur werden Klassendiagramme verwendet.</w:t>
-      </w:r>
-    </w:p>
-    <w:p>
-      <w:r>
-        <w:t>Für das dynamische Verhalten werden Aktivitätsdiagramme und Sequenzdiagramme verwendet.</w:t>
-      </w:r>
-    </w:p>
-    <w:p>
-      <w:r>
-        <w:t>Zustandsbasiertes Verhalten wird durch Hilfe von Zustandsdiagrammen modelliert.</w:t>
-      </w:r>
-    </w:p>
-    <w:p>
-      <w:r>
-        <w:t>Für die Erstellung der Diagramme wird das Tool IBM Rational Rhapsody.</w:t>
+        <w:spacing w:before="100" w:beforeAutospacing="1" w:after="100" w:afterAutospacing="1" w:line="240" w:lineRule="auto"/>
+        <w:rPr>
+          <w:rFonts w:eastAsia="Times New Roman" w:cstheme="minorHAnsi"/>
+          <w:lang w:eastAsia="de-DE"/>
+        </w:rPr>
+      </w:pPr>
+      <w:r>
+        <w:rPr>
+          <w:rFonts w:eastAsia="Times New Roman" w:cstheme="minorHAnsi"/>
+          <w:lang w:eastAsia="de-DE"/>
+        </w:rPr>
+        <w:t xml:space="preserve">Klassendiagramme zur Beschreibung der Struktur </w:t>
+      </w:r>
+    </w:p>
+    <w:p>
+      <w:pPr>
+        <w:numPr>
+          <w:ilvl w:val="0"/>
+          <w:numId w:val="10"/>
+        </w:numPr>
+        <w:spacing w:before="100" w:beforeAutospacing="1" w:after="100" w:afterAutospacing="1" w:line="240" w:lineRule="auto"/>
+        <w:rPr>
+          <w:rFonts w:eastAsia="Times New Roman" w:cstheme="minorHAnsi"/>
+          <w:lang w:eastAsia="de-DE"/>
+        </w:rPr>
+      </w:pPr>
+      <w:r>
+        <w:rPr>
+          <w:rFonts w:eastAsia="Times New Roman" w:cstheme="minorHAnsi"/>
+          <w:lang w:eastAsia="de-DE"/>
+        </w:rPr>
+        <w:t xml:space="preserve">Aktivitätsdiagramme und Sequenzdiagramme zur Darstellung des dynamischen Verhaltens </w:t>
+      </w:r>
+    </w:p>
+    <w:p>
+      <w:pPr>
+        <w:numPr>
+          <w:ilvl w:val="0"/>
+          <w:numId w:val="10"/>
+        </w:numPr>
+        <w:spacing w:before="100" w:beforeAutospacing="1" w:after="100" w:afterAutospacing="1" w:line="240" w:lineRule="auto"/>
+        <w:rPr>
+          <w:rFonts w:eastAsia="Times New Roman" w:cstheme="minorHAnsi"/>
+          <w:lang w:eastAsia="de-DE"/>
+        </w:rPr>
+      </w:pPr>
+      <w:r>
+        <w:rPr>
+          <w:rFonts w:eastAsia="Times New Roman" w:cstheme="minorHAnsi"/>
+          <w:lang w:eastAsia="de-DE"/>
+        </w:rPr>
+        <w:t xml:space="preserve">Zustandsdiagramme zur Modellierung zustandsbasierter Abläufe </w:t>
+      </w:r>
+    </w:p>
+    <w:p>
+      <w:pPr>
+        <w:spacing w:before="100" w:beforeAutospacing="1" w:after="100" w:afterAutospacing="1" w:line="240" w:lineRule="auto"/>
+        <w:rPr>
+          <w:rFonts w:eastAsia="Times New Roman" w:cstheme="minorHAnsi"/>
+          <w:lang w:eastAsia="de-DE"/>
+        </w:rPr>
+      </w:pPr>
+      <w:r>
+        <w:rPr>
+          <w:rFonts w:eastAsia="Times New Roman" w:cstheme="minorHAnsi"/>
+          <w:lang w:eastAsia="de-DE"/>
+        </w:rPr>
+        <w:t>Die Erstellung der Diagramme erfolgt mit dem Tool „Lucidchart“.</w:t>
       </w:r>
     </w:p>
     <w:p>
       <w:pPr>
         <w:pStyle w:val="berschrift2"/>
-      </w:pPr>
-      <w:bookmarkStart w:id="25" w:name="_Toc165127833"/>
-      <w:bookmarkStart w:id="26" w:name="_Toc227674029"/>
-      <w:r>
+        <w:rPr>
+          <w:rFonts w:asciiTheme="minorHAnsi" w:hAnsiTheme="minorHAnsi" w:cstheme="minorHAnsi"/>
+        </w:rPr>
+      </w:pPr>
+      <w:r>
+        <w:rPr>
+          <w:rFonts w:asciiTheme="minorHAnsi" w:hAnsiTheme="minorHAnsi" w:cstheme="minorHAnsi"/>
+        </w:rPr>
+        <w:lastRenderedPageBreak/>
         <w:t>Designentscheidungen</w:t>
       </w:r>
       <w:bookmarkEnd w:id="25"/>
       <w:bookmarkEnd w:id="26"/>
     </w:p>
     <w:p>
-      <w:r>
+      <w:pPr>
+        <w:rPr>
+          <w:color w:val="EE0000"/>
+        </w:rPr>
+      </w:pPr>
+      <w:r>
+        <w:rPr>
+          <w:color w:val="EE0000"/>
+        </w:rPr>
+        <w:t>TBD</w:t>
+      </w:r>
+    </w:p>
+    <w:p>
+      <w:pPr>
+        <w:rPr>
+          <w:rFonts w:cstheme="minorHAnsi"/>
+        </w:rPr>
+      </w:pPr>
+      <w:r>
+        <w:rPr>
+          <w:rFonts w:cstheme="minorHAnsi"/>
+        </w:rPr>
         <w:t>Designentscheidungen werden mit Hilfe von Entscheidungsmatrix begründet und dokumentiert.</w:t>
       </w:r>
     </w:p>
     <w:p>
-      <w:r>
+      <w:pPr>
+        <w:rPr>
+          <w:rFonts w:cstheme="minorHAnsi"/>
+        </w:rPr>
+      </w:pPr>
+      <w:r>
+        <w:rPr>
+          <w:rFonts w:cstheme="minorHAnsi"/>
+        </w:rPr>
         <w:t>Folgende Kriterien für die Gegenüberstellung von Alternativen werden berücksichtigt:</w:t>
       </w:r>
     </w:p>
@@ -4192,8 +4641,14 @@
           <w:ilvl w:val="0"/>
           <w:numId w:val="7"/>
         </w:numPr>
-      </w:pPr>
-      <w:r>
+        <w:rPr>
+          <w:rFonts w:cstheme="minorHAnsi"/>
+        </w:rPr>
+      </w:pPr>
+      <w:r>
+        <w:rPr>
+          <w:rFonts w:cstheme="minorHAnsi"/>
+        </w:rPr>
         <w:t>Verfügbarkeit</w:t>
       </w:r>
     </w:p>
@@ -4204,8 +4659,14 @@
           <w:ilvl w:val="0"/>
           <w:numId w:val="7"/>
         </w:numPr>
-      </w:pPr>
-      <w:r>
+        <w:rPr>
+          <w:rFonts w:cstheme="minorHAnsi"/>
+        </w:rPr>
+      </w:pPr>
+      <w:r>
+        <w:rPr>
+          <w:rFonts w:cstheme="minorHAnsi"/>
+        </w:rPr>
         <w:t>Integrierbarkeit</w:t>
       </w:r>
     </w:p>
@@ -4216,9 +4677,14 @@
           <w:ilvl w:val="0"/>
           <w:numId w:val="7"/>
         </w:numPr>
-      </w:pPr>
-      <w:r>
-        <w:lastRenderedPageBreak/>
+        <w:rPr>
+          <w:rFonts w:cstheme="minorHAnsi"/>
+        </w:rPr>
+      </w:pPr>
+      <w:r>
+        <w:rPr>
+          <w:rFonts w:cstheme="minorHAnsi"/>
+        </w:rPr>
         <w:t>Erweiterbarkeit</w:t>
       </w:r>
     </w:p>
@@ -4229,8 +4695,14 @@
           <w:ilvl w:val="0"/>
           <w:numId w:val="7"/>
         </w:numPr>
-      </w:pPr>
-      <w:r>
+        <w:rPr>
+          <w:rFonts w:cstheme="minorHAnsi"/>
+        </w:rPr>
+      </w:pPr>
+      <w:r>
+        <w:rPr>
+          <w:rFonts w:cstheme="minorHAnsi"/>
+        </w:rPr>
         <w:t>Aufwand</w:t>
       </w:r>
     </w:p>
@@ -4241,8 +4713,14 @@
           <w:ilvl w:val="0"/>
           <w:numId w:val="7"/>
         </w:numPr>
-      </w:pPr>
-      <w:r>
+        <w:rPr>
+          <w:rFonts w:cstheme="minorHAnsi"/>
+        </w:rPr>
+      </w:pPr>
+      <w:r>
+        <w:rPr>
+          <w:rFonts w:cstheme="minorHAnsi"/>
+        </w:rPr>
         <w:t>Dokumentation</w:t>
       </w:r>
     </w:p>
@@ -4253,8 +4731,14 @@
           <w:ilvl w:val="0"/>
           <w:numId w:val="7"/>
         </w:numPr>
-      </w:pPr>
-      <w:r>
+        <w:rPr>
+          <w:rFonts w:cstheme="minorHAnsi"/>
+        </w:rPr>
+      </w:pPr>
+      <w:r>
+        <w:rPr>
+          <w:rFonts w:cstheme="minorHAnsi"/>
+        </w:rPr>
         <w:t>Lizenz</w:t>
       </w:r>
     </w:p>
@@ -4337,20 +4821,44 @@
         </w:rPr>
       </w:pPr>
       <w:bookmarkStart w:id="29" w:name="_Toc227674031"/>
+      <w:proofErr w:type="spellStart"/>
       <w:r>
         <w:rPr>
           <w:lang w:val="en-US"/>
         </w:rPr>
-        <w:t>Verifizierung und Validierung</w:t>
+        <w:t>Verifizierung</w:t>
+      </w:r>
+      <w:proofErr w:type="spellEnd"/>
+      <w:r>
+        <w:rPr>
+          <w:lang w:val="en-US"/>
+        </w:rPr>
+        <w:t xml:space="preserve"> und </w:t>
+      </w:r>
+      <w:proofErr w:type="spellStart"/>
+      <w:r>
+        <w:rPr>
+          <w:lang w:val="en-US"/>
+        </w:rPr>
+        <w:t>Validierung</w:t>
       </w:r>
       <w:bookmarkEnd w:id="29"/>
-    </w:p>
-    <w:p>
-      <w:pPr>
-        <w:rPr>
+      <w:proofErr w:type="spellEnd"/>
+    </w:p>
+    <w:p>
+      <w:pPr>
+        <w:rPr>
+          <w:color w:val="EE0000"/>
           <w:lang w:val="en-US"/>
         </w:rPr>
       </w:pPr>
+      <w:r>
+        <w:rPr>
+          <w:color w:val="EE0000"/>
+          <w:lang w:val="en-US"/>
+        </w:rPr>
+        <w:t>TBD</w:t>
+      </w:r>
     </w:p>
     <w:p>
       <w:pPr>
@@ -4361,18 +4869,31 @@
       </w:pPr>
       <w:bookmarkStart w:id="30" w:name="_Toc165127836"/>
       <w:bookmarkStart w:id="31" w:name="_Toc227674032"/>
+      <w:proofErr w:type="spellStart"/>
       <w:r>
         <w:rPr>
           <w:lang w:val="en-US"/>
         </w:rPr>
-        <w:t>Formelle Test Cases</w:t>
+        <w:t>Formelle</w:t>
+      </w:r>
+      <w:proofErr w:type="spellEnd"/>
+      <w:r>
+        <w:rPr>
+          <w:lang w:val="en-US"/>
+        </w:rPr>
+        <w:t xml:space="preserve"> Test Cases</w:t>
       </w:r>
       <w:bookmarkEnd w:id="30"/>
       <w:bookmarkEnd w:id="31"/>
     </w:p>
     <w:p>
-      <w:r>
-        <w:t>Test Cases w</w:t>
+      <w:proofErr w:type="gramStart"/>
+      <w:r>
+        <w:t>Test Cases</w:t>
+      </w:r>
+      <w:proofErr w:type="gramEnd"/>
+      <w:r>
+        <w:t xml:space="preserve"> w</w:t>
       </w:r>
       <w:r>
         <w:t>e</w:t>
@@ -4386,7 +4907,23 @@
     </w:p>
     <w:p>
       <w:r>
-        <w:t>Die Test Cases werden geschrieben mit Hilfe vom folgendem Template:</w:t>
+        <w:t xml:space="preserve">Die </w:t>
+      </w:r>
+      <w:proofErr w:type="gramStart"/>
+      <w:r>
+        <w:t>Test Cases</w:t>
+      </w:r>
+      <w:proofErr w:type="gramEnd"/>
+      <w:r>
+        <w:t xml:space="preserve"> werden geschrieben mit Hilfe </w:t>
+      </w:r>
+      <w:proofErr w:type="gramStart"/>
+      <w:r>
+        <w:t>vom folgendem Template</w:t>
+      </w:r>
+      <w:proofErr w:type="gramEnd"/>
+      <w:r>
+        <w:t>:</w:t>
       </w:r>
     </w:p>
     <w:p>
@@ -4394,6 +4931,7 @@
         <w:rPr>
           <w:noProof/>
         </w:rPr>
+        <w:lastRenderedPageBreak/>
         <w:drawing>
           <wp:inline distT="0" distB="0" distL="0" distR="0" wp14:anchorId="4A66F466" wp14:editId="6ABAC492">
             <wp:extent cx="5760720" cy="387985"/>
@@ -4433,7 +4971,15 @@
     </w:p>
     <w:p>
       <w:r>
-        <w:t>Die Test Cases werden in de</w:t>
+        <w:t xml:space="preserve">Die </w:t>
+      </w:r>
+      <w:proofErr w:type="gramStart"/>
+      <w:r>
+        <w:t>Test Cases</w:t>
+      </w:r>
+      <w:proofErr w:type="gramEnd"/>
+      <w:r>
+        <w:t xml:space="preserve"> werden in de</w:t>
       </w:r>
       <w:r>
         <w:t>r Excel Tabelle „Stories_Req.xlsx“ dokumentiert.</w:t>
@@ -4455,7 +5001,6 @@
         <w:rPr>
           <w:lang w:val="en-US"/>
         </w:rPr>
-        <w:lastRenderedPageBreak/>
         <w:br w:type="page"/>
       </w:r>
     </w:p>
@@ -4591,6 +5136,7 @@
                 <w:lang w:val="en-US"/>
               </w:rPr>
             </w:pPr>
+            <w:proofErr w:type="spellStart"/>
             <w:r>
               <w:rPr>
                 <w:lang w:val="en-US"/>
@@ -4609,6 +5155,7 @@
               </w:rPr>
               <w:t>Sprint_Backlog</w:t>
             </w:r>
+            <w:proofErr w:type="spellEnd"/>
           </w:p>
         </w:tc>
         <w:tc>
@@ -5425,14 +5972,14 @@
         <w:tblLook w:val="04A0" w:firstRow="1" w:lastRow="0" w:firstColumn="1" w:lastColumn="0" w:noHBand="0" w:noVBand="1"/>
       </w:tblPr>
       <w:tblGrid>
-        <w:gridCol w:w="2263"/>
-        <w:gridCol w:w="2835"/>
-        <w:gridCol w:w="3964"/>
+        <w:gridCol w:w="2244"/>
+        <w:gridCol w:w="2892"/>
+        <w:gridCol w:w="3926"/>
       </w:tblGrid>
       <w:tr>
         <w:tc>
           <w:tcPr>
-            <w:tcW w:w="2263" w:type="dxa"/>
+            <w:tcW w:w="2244" w:type="dxa"/>
           </w:tcPr>
           <w:p>
             <w:pPr>
@@ -5450,7 +5997,7 @@
         </w:tc>
         <w:tc>
           <w:tcPr>
-            <w:tcW w:w="2835" w:type="dxa"/>
+            <w:tcW w:w="2892" w:type="dxa"/>
           </w:tcPr>
           <w:p>
             <w:pPr>
@@ -5468,7 +6015,7 @@
         </w:tc>
         <w:tc>
           <w:tcPr>
-            <w:tcW w:w="3964" w:type="dxa"/>
+            <w:tcW w:w="3926" w:type="dxa"/>
           </w:tcPr>
           <w:p>
             <w:pPr>
@@ -5488,7 +6035,7 @@
       <w:tr>
         <w:tc>
           <w:tcPr>
-            <w:tcW w:w="2263" w:type="dxa"/>
+            <w:tcW w:w="2244" w:type="dxa"/>
           </w:tcPr>
           <w:p>
             <w:pPr>
@@ -5503,7 +6050,7 @@
         </w:tc>
         <w:tc>
           <w:tcPr>
-            <w:tcW w:w="2835" w:type="dxa"/>
+            <w:tcW w:w="2892" w:type="dxa"/>
           </w:tcPr>
           <w:p>
             <w:pPr>
@@ -5511,14 +6058,19 @@
                 <w:lang w:val="en-US"/>
               </w:rPr>
             </w:pPr>
-            <w:r>
-              <w:t>Scrum Master</w:t>
-            </w:r>
-          </w:p>
-        </w:tc>
-        <w:tc>
-          <w:tcPr>
-            <w:tcW w:w="3964" w:type="dxa"/>
+            <w:proofErr w:type="spellStart"/>
+            <w:r>
+              <w:t>Scrum</w:t>
+            </w:r>
+            <w:proofErr w:type="spellEnd"/>
+            <w:r>
+              <w:t xml:space="preserve"> Master</w:t>
+            </w:r>
+          </w:p>
+        </w:tc>
+        <w:tc>
+          <w:tcPr>
+            <w:tcW w:w="3926" w:type="dxa"/>
           </w:tcPr>
           <w:p>
             <w:pPr>
@@ -5526,13 +6078,19 @@
                 <w:lang w:val="en-US"/>
               </w:rPr>
             </w:pPr>
+            <w:r>
+              <w:rPr>
+                <w:lang w:val="en-US"/>
+              </w:rPr>
+              <w:t>maunz.felix-23@stud.dhbw-ravensburg.de</w:t>
+            </w:r>
           </w:p>
         </w:tc>
       </w:tr>
       <w:tr>
         <w:tc>
           <w:tcPr>
-            <w:tcW w:w="2263" w:type="dxa"/>
+            <w:tcW w:w="2244" w:type="dxa"/>
           </w:tcPr>
           <w:p>
             <w:pPr>
@@ -5547,7 +6105,7 @@
         </w:tc>
         <w:tc>
           <w:tcPr>
-            <w:tcW w:w="2835" w:type="dxa"/>
+            <w:tcW w:w="2892" w:type="dxa"/>
           </w:tcPr>
           <w:p>
             <w:pPr>
@@ -5562,7 +6120,7 @@
         </w:tc>
         <w:tc>
           <w:tcPr>
-            <w:tcW w:w="3964" w:type="dxa"/>
+            <w:tcW w:w="3926" w:type="dxa"/>
           </w:tcPr>
           <w:p>
             <w:pPr>
@@ -5570,13 +6128,19 @@
                 <w:lang w:val="en-US"/>
               </w:rPr>
             </w:pPr>
+            <w:r>
+              <w:rPr>
+                <w:lang w:val="en-US"/>
+              </w:rPr>
+              <w:t>graf.alexander-23@stud.dhbw-ravensburg.de</w:t>
+            </w:r>
           </w:p>
         </w:tc>
       </w:tr>
       <w:tr>
         <w:tc>
           <w:tcPr>
-            <w:tcW w:w="2263" w:type="dxa"/>
+            <w:tcW w:w="2244" w:type="dxa"/>
           </w:tcPr>
           <w:p>
             <w:pPr>
@@ -5591,7 +6155,7 @@
         </w:tc>
         <w:tc>
           <w:tcPr>
-            <w:tcW w:w="2835" w:type="dxa"/>
+            <w:tcW w:w="2892" w:type="dxa"/>
           </w:tcPr>
           <w:p>
             <w:pPr>
@@ -5606,7 +6170,7 @@
         </w:tc>
         <w:tc>
           <w:tcPr>
-            <w:tcW w:w="3964" w:type="dxa"/>
+            <w:tcW w:w="3926" w:type="dxa"/>
           </w:tcPr>
           <w:p>
             <w:pPr>
@@ -5614,13 +6178,19 @@
                 <w:lang w:val="en-US"/>
               </w:rPr>
             </w:pPr>
+            <w:r>
+              <w:rPr>
+                <w:lang w:val="en-US"/>
+              </w:rPr>
+              <w:t>david.roesch-23@stud.dhbw-ravensburg.de</w:t>
+            </w:r>
           </w:p>
         </w:tc>
       </w:tr>
       <w:tr>
         <w:tc>
           <w:tcPr>
-            <w:tcW w:w="2263" w:type="dxa"/>
+            <w:tcW w:w="2244" w:type="dxa"/>
           </w:tcPr>
           <w:p>
             <w:pPr>
@@ -5635,7 +6205,7 @@
         </w:tc>
         <w:tc>
           <w:tcPr>
-            <w:tcW w:w="2835" w:type="dxa"/>
+            <w:tcW w:w="2892" w:type="dxa"/>
           </w:tcPr>
           <w:p>
             <w:pPr>
@@ -5646,11 +6216,22 @@
             <w:r>
               <w:t>SW-Entwickler</w:t>
             </w:r>
-          </w:p>
-        </w:tc>
-        <w:tc>
-          <w:tcPr>
-            <w:tcW w:w="3964" w:type="dxa"/>
+            <w:r>
+              <w:t>/</w:t>
+            </w:r>
+            <w:proofErr w:type="spellStart"/>
+            <w:r>
+              <w:t>Git</w:t>
+            </w:r>
+            <w:proofErr w:type="spellEnd"/>
+            <w:r>
+              <w:t xml:space="preserve"> Beauftragter</w:t>
+            </w:r>
+          </w:p>
+        </w:tc>
+        <w:tc>
+          <w:tcPr>
+            <w:tcW w:w="3926" w:type="dxa"/>
           </w:tcPr>
           <w:p>
             <w:pPr>
@@ -5658,13 +6239,19 @@
                 <w:lang w:val="en-US"/>
               </w:rPr>
             </w:pPr>
+            <w:r>
+              <w:rPr>
+                <w:lang w:val="en-US"/>
+              </w:rPr>
+              <w:t>jacob.jaeger-23@stud.dhbw-ravensburg.de</w:t>
+            </w:r>
           </w:p>
         </w:tc>
       </w:tr>
       <w:tr>
         <w:tc>
           <w:tcPr>
-            <w:tcW w:w="2263" w:type="dxa"/>
+            <w:tcW w:w="2244" w:type="dxa"/>
           </w:tcPr>
           <w:p>
             <w:pPr>
@@ -5679,7 +6266,7 @@
         </w:tc>
         <w:tc>
           <w:tcPr>
-            <w:tcW w:w="2835" w:type="dxa"/>
+            <w:tcW w:w="2892" w:type="dxa"/>
           </w:tcPr>
           <w:p>
             <w:pPr>
@@ -5690,11 +6277,19 @@
             <w:r>
               <w:t>SW-Entwickler</w:t>
             </w:r>
-          </w:p>
-        </w:tc>
-        <w:tc>
-          <w:tcPr>
-            <w:tcW w:w="3964" w:type="dxa"/>
+            <w:r>
+              <w:t>/</w:t>
+            </w:r>
+            <w:proofErr w:type="spellStart"/>
+            <w:r>
+              <w:t>Entwicklungplaner</w:t>
+            </w:r>
+            <w:proofErr w:type="spellEnd"/>
+          </w:p>
+        </w:tc>
+        <w:tc>
+          <w:tcPr>
+            <w:tcW w:w="3926" w:type="dxa"/>
           </w:tcPr>
           <w:p>
             <w:pPr>
@@ -5702,82 +6297,12 @@
                 <w:lang w:val="en-US"/>
               </w:rPr>
             </w:pPr>
-          </w:p>
-        </w:tc>
-      </w:tr>
-      <w:tr>
-        <w:tc>
-          <w:tcPr>
-            <w:tcW w:w="2263" w:type="dxa"/>
-          </w:tcPr>
-          <w:p>
-            <w:pPr>
-              <w:rPr>
-                <w:lang w:val="en-US"/>
-              </w:rPr>
-            </w:pPr>
-          </w:p>
-        </w:tc>
-        <w:tc>
-          <w:tcPr>
-            <w:tcW w:w="2835" w:type="dxa"/>
-          </w:tcPr>
-          <w:p>
-            <w:pPr>
-              <w:rPr>
-                <w:lang w:val="en-US"/>
-              </w:rPr>
-            </w:pPr>
-          </w:p>
-        </w:tc>
-        <w:tc>
-          <w:tcPr>
-            <w:tcW w:w="3964" w:type="dxa"/>
-          </w:tcPr>
-          <w:p>
-            <w:pPr>
-              <w:rPr>
-                <w:lang w:val="en-US"/>
-              </w:rPr>
-            </w:pPr>
-          </w:p>
-        </w:tc>
-      </w:tr>
-      <w:tr>
-        <w:tc>
-          <w:tcPr>
-            <w:tcW w:w="2263" w:type="dxa"/>
-          </w:tcPr>
-          <w:p>
-            <w:pPr>
-              <w:rPr>
-                <w:lang w:val="en-US"/>
-              </w:rPr>
-            </w:pPr>
-          </w:p>
-        </w:tc>
-        <w:tc>
-          <w:tcPr>
-            <w:tcW w:w="2835" w:type="dxa"/>
-          </w:tcPr>
-          <w:p>
-            <w:pPr>
-              <w:rPr>
-                <w:lang w:val="en-US"/>
-              </w:rPr>
-            </w:pPr>
-          </w:p>
-        </w:tc>
-        <w:tc>
-          <w:tcPr>
-            <w:tcW w:w="3964" w:type="dxa"/>
-          </w:tcPr>
-          <w:p>
-            <w:pPr>
-              <w:rPr>
-                <w:lang w:val="en-US"/>
-              </w:rPr>
-            </w:pPr>
+            <w:r>
+              <w:rPr>
+                <w:lang w:val="en-US"/>
+              </w:rPr>
+              <w:t>winter.johannes-23@stud.dhbw-ravensburg.de</w:t>
+            </w:r>
           </w:p>
         </w:tc>
       </w:tr>
@@ -6241,6 +6766,304 @@
     </w:lvl>
   </w:abstractNum>
   <w:abstractNum w:abstractNumId="3" w15:restartNumberingAfterBreak="0">
+    <w:nsid w:val="21C65400"/>
+    <w:multiLevelType w:val="multilevel"/>
+    <w:tmpl w:val="A7BEC7CA"/>
+    <w:lvl w:ilvl="0">
+      <w:start w:val="1"/>
+      <w:numFmt w:val="bullet"/>
+      <w:lvlText w:val=""/>
+      <w:lvlJc w:val="left"/>
+      <w:pPr>
+        <w:tabs>
+          <w:tab w:val="num" w:pos="720"/>
+        </w:tabs>
+        <w:ind w:left="720" w:hanging="360"/>
+      </w:pPr>
+      <w:rPr>
+        <w:rFonts w:ascii="Symbol" w:hAnsi="Symbol" w:hint="default"/>
+        <w:sz w:val="20"/>
+      </w:rPr>
+    </w:lvl>
+    <w:lvl w:ilvl="1" w:tentative="1">
+      <w:start w:val="1"/>
+      <w:numFmt w:val="bullet"/>
+      <w:lvlText w:val="o"/>
+      <w:lvlJc w:val="left"/>
+      <w:pPr>
+        <w:tabs>
+          <w:tab w:val="num" w:pos="1440"/>
+        </w:tabs>
+        <w:ind w:left="1440" w:hanging="360"/>
+      </w:pPr>
+      <w:rPr>
+        <w:rFonts w:ascii="Courier New" w:hAnsi="Courier New" w:hint="default"/>
+        <w:sz w:val="20"/>
+      </w:rPr>
+    </w:lvl>
+    <w:lvl w:ilvl="2" w:tentative="1">
+      <w:start w:val="1"/>
+      <w:numFmt w:val="bullet"/>
+      <w:lvlText w:val=""/>
+      <w:lvlJc w:val="left"/>
+      <w:pPr>
+        <w:tabs>
+          <w:tab w:val="num" w:pos="2160"/>
+        </w:tabs>
+        <w:ind w:left="2160" w:hanging="360"/>
+      </w:pPr>
+      <w:rPr>
+        <w:rFonts w:ascii="Wingdings" w:hAnsi="Wingdings" w:hint="default"/>
+        <w:sz w:val="20"/>
+      </w:rPr>
+    </w:lvl>
+    <w:lvl w:ilvl="3" w:tentative="1">
+      <w:start w:val="1"/>
+      <w:numFmt w:val="bullet"/>
+      <w:lvlText w:val=""/>
+      <w:lvlJc w:val="left"/>
+      <w:pPr>
+        <w:tabs>
+          <w:tab w:val="num" w:pos="2880"/>
+        </w:tabs>
+        <w:ind w:left="2880" w:hanging="360"/>
+      </w:pPr>
+      <w:rPr>
+        <w:rFonts w:ascii="Wingdings" w:hAnsi="Wingdings" w:hint="default"/>
+        <w:sz w:val="20"/>
+      </w:rPr>
+    </w:lvl>
+    <w:lvl w:ilvl="4" w:tentative="1">
+      <w:start w:val="1"/>
+      <w:numFmt w:val="bullet"/>
+      <w:lvlText w:val=""/>
+      <w:lvlJc w:val="left"/>
+      <w:pPr>
+        <w:tabs>
+          <w:tab w:val="num" w:pos="3600"/>
+        </w:tabs>
+        <w:ind w:left="3600" w:hanging="360"/>
+      </w:pPr>
+      <w:rPr>
+        <w:rFonts w:ascii="Wingdings" w:hAnsi="Wingdings" w:hint="default"/>
+        <w:sz w:val="20"/>
+      </w:rPr>
+    </w:lvl>
+    <w:lvl w:ilvl="5" w:tentative="1">
+      <w:start w:val="1"/>
+      <w:numFmt w:val="bullet"/>
+      <w:lvlText w:val=""/>
+      <w:lvlJc w:val="left"/>
+      <w:pPr>
+        <w:tabs>
+          <w:tab w:val="num" w:pos="4320"/>
+        </w:tabs>
+        <w:ind w:left="4320" w:hanging="360"/>
+      </w:pPr>
+      <w:rPr>
+        <w:rFonts w:ascii="Wingdings" w:hAnsi="Wingdings" w:hint="default"/>
+        <w:sz w:val="20"/>
+      </w:rPr>
+    </w:lvl>
+    <w:lvl w:ilvl="6" w:tentative="1">
+      <w:start w:val="1"/>
+      <w:numFmt w:val="bullet"/>
+      <w:lvlText w:val=""/>
+      <w:lvlJc w:val="left"/>
+      <w:pPr>
+        <w:tabs>
+          <w:tab w:val="num" w:pos="5040"/>
+        </w:tabs>
+        <w:ind w:left="5040" w:hanging="360"/>
+      </w:pPr>
+      <w:rPr>
+        <w:rFonts w:ascii="Wingdings" w:hAnsi="Wingdings" w:hint="default"/>
+        <w:sz w:val="20"/>
+      </w:rPr>
+    </w:lvl>
+    <w:lvl w:ilvl="7" w:tentative="1">
+      <w:start w:val="1"/>
+      <w:numFmt w:val="bullet"/>
+      <w:lvlText w:val=""/>
+      <w:lvlJc w:val="left"/>
+      <w:pPr>
+        <w:tabs>
+          <w:tab w:val="num" w:pos="5760"/>
+        </w:tabs>
+        <w:ind w:left="5760" w:hanging="360"/>
+      </w:pPr>
+      <w:rPr>
+        <w:rFonts w:ascii="Wingdings" w:hAnsi="Wingdings" w:hint="default"/>
+        <w:sz w:val="20"/>
+      </w:rPr>
+    </w:lvl>
+    <w:lvl w:ilvl="8" w:tentative="1">
+      <w:start w:val="1"/>
+      <w:numFmt w:val="bullet"/>
+      <w:lvlText w:val=""/>
+      <w:lvlJc w:val="left"/>
+      <w:pPr>
+        <w:tabs>
+          <w:tab w:val="num" w:pos="6480"/>
+        </w:tabs>
+        <w:ind w:left="6480" w:hanging="360"/>
+      </w:pPr>
+      <w:rPr>
+        <w:rFonts w:ascii="Wingdings" w:hAnsi="Wingdings" w:hint="default"/>
+        <w:sz w:val="20"/>
+      </w:rPr>
+    </w:lvl>
+  </w:abstractNum>
+  <w:abstractNum w:abstractNumId="4" w15:restartNumberingAfterBreak="0">
+    <w:nsid w:val="393734A3"/>
+    <w:multiLevelType w:val="multilevel"/>
+    <w:tmpl w:val="206C2A76"/>
+    <w:lvl w:ilvl="0">
+      <w:start w:val="1"/>
+      <w:numFmt w:val="bullet"/>
+      <w:lvlText w:val=""/>
+      <w:lvlJc w:val="left"/>
+      <w:pPr>
+        <w:tabs>
+          <w:tab w:val="num" w:pos="720"/>
+        </w:tabs>
+        <w:ind w:left="720" w:hanging="360"/>
+      </w:pPr>
+      <w:rPr>
+        <w:rFonts w:ascii="Symbol" w:hAnsi="Symbol" w:hint="default"/>
+        <w:sz w:val="20"/>
+      </w:rPr>
+    </w:lvl>
+    <w:lvl w:ilvl="1" w:tentative="1">
+      <w:start w:val="1"/>
+      <w:numFmt w:val="bullet"/>
+      <w:lvlText w:val="o"/>
+      <w:lvlJc w:val="left"/>
+      <w:pPr>
+        <w:tabs>
+          <w:tab w:val="num" w:pos="1440"/>
+        </w:tabs>
+        <w:ind w:left="1440" w:hanging="360"/>
+      </w:pPr>
+      <w:rPr>
+        <w:rFonts w:ascii="Courier New" w:hAnsi="Courier New" w:hint="default"/>
+        <w:sz w:val="20"/>
+      </w:rPr>
+    </w:lvl>
+    <w:lvl w:ilvl="2" w:tentative="1">
+      <w:start w:val="1"/>
+      <w:numFmt w:val="bullet"/>
+      <w:lvlText w:val=""/>
+      <w:lvlJc w:val="left"/>
+      <w:pPr>
+        <w:tabs>
+          <w:tab w:val="num" w:pos="2160"/>
+        </w:tabs>
+        <w:ind w:left="2160" w:hanging="360"/>
+      </w:pPr>
+      <w:rPr>
+        <w:rFonts w:ascii="Wingdings" w:hAnsi="Wingdings" w:hint="default"/>
+        <w:sz w:val="20"/>
+      </w:rPr>
+    </w:lvl>
+    <w:lvl w:ilvl="3" w:tentative="1">
+      <w:start w:val="1"/>
+      <w:numFmt w:val="bullet"/>
+      <w:lvlText w:val=""/>
+      <w:lvlJc w:val="left"/>
+      <w:pPr>
+        <w:tabs>
+          <w:tab w:val="num" w:pos="2880"/>
+        </w:tabs>
+        <w:ind w:left="2880" w:hanging="360"/>
+      </w:pPr>
+      <w:rPr>
+        <w:rFonts w:ascii="Wingdings" w:hAnsi="Wingdings" w:hint="default"/>
+        <w:sz w:val="20"/>
+      </w:rPr>
+    </w:lvl>
+    <w:lvl w:ilvl="4" w:tentative="1">
+      <w:start w:val="1"/>
+      <w:numFmt w:val="bullet"/>
+      <w:lvlText w:val=""/>
+      <w:lvlJc w:val="left"/>
+      <w:pPr>
+        <w:tabs>
+          <w:tab w:val="num" w:pos="3600"/>
+        </w:tabs>
+        <w:ind w:left="3600" w:hanging="360"/>
+      </w:pPr>
+      <w:rPr>
+        <w:rFonts w:ascii="Wingdings" w:hAnsi="Wingdings" w:hint="default"/>
+        <w:sz w:val="20"/>
+      </w:rPr>
+    </w:lvl>
+    <w:lvl w:ilvl="5" w:tentative="1">
+      <w:start w:val="1"/>
+      <w:numFmt w:val="bullet"/>
+      <w:lvlText w:val=""/>
+      <w:lvlJc w:val="left"/>
+      <w:pPr>
+        <w:tabs>
+          <w:tab w:val="num" w:pos="4320"/>
+        </w:tabs>
+        <w:ind w:left="4320" w:hanging="360"/>
+      </w:pPr>
+      <w:rPr>
+        <w:rFonts w:ascii="Wingdings" w:hAnsi="Wingdings" w:hint="default"/>
+        <w:sz w:val="20"/>
+      </w:rPr>
+    </w:lvl>
+    <w:lvl w:ilvl="6" w:tentative="1">
+      <w:start w:val="1"/>
+      <w:numFmt w:val="bullet"/>
+      <w:lvlText w:val=""/>
+      <w:lvlJc w:val="left"/>
+      <w:pPr>
+        <w:tabs>
+          <w:tab w:val="num" w:pos="5040"/>
+        </w:tabs>
+        <w:ind w:left="5040" w:hanging="360"/>
+      </w:pPr>
+      <w:rPr>
+        <w:rFonts w:ascii="Wingdings" w:hAnsi="Wingdings" w:hint="default"/>
+        <w:sz w:val="20"/>
+      </w:rPr>
+    </w:lvl>
+    <w:lvl w:ilvl="7" w:tentative="1">
+      <w:start w:val="1"/>
+      <w:numFmt w:val="bullet"/>
+      <w:lvlText w:val=""/>
+      <w:lvlJc w:val="left"/>
+      <w:pPr>
+        <w:tabs>
+          <w:tab w:val="num" w:pos="5760"/>
+        </w:tabs>
+        <w:ind w:left="5760" w:hanging="360"/>
+      </w:pPr>
+      <w:rPr>
+        <w:rFonts w:ascii="Wingdings" w:hAnsi="Wingdings" w:hint="default"/>
+        <w:sz w:val="20"/>
+      </w:rPr>
+    </w:lvl>
+    <w:lvl w:ilvl="8" w:tentative="1">
+      <w:start w:val="1"/>
+      <w:numFmt w:val="bullet"/>
+      <w:lvlText w:val=""/>
+      <w:lvlJc w:val="left"/>
+      <w:pPr>
+        <w:tabs>
+          <w:tab w:val="num" w:pos="6480"/>
+        </w:tabs>
+        <w:ind w:left="6480" w:hanging="360"/>
+      </w:pPr>
+      <w:rPr>
+        <w:rFonts w:ascii="Wingdings" w:hAnsi="Wingdings" w:hint="default"/>
+        <w:sz w:val="20"/>
+      </w:rPr>
+    </w:lvl>
+  </w:abstractNum>
+  <w:abstractNum w:abstractNumId="5" w15:restartNumberingAfterBreak="0">
     <w:nsid w:val="4378106C"/>
     <w:multiLevelType w:val="hybridMultilevel"/>
     <w:tmpl w:val="D550E9AE"/>
@@ -6352,7 +7175,7 @@
       </w:rPr>
     </w:lvl>
   </w:abstractNum>
-  <w:abstractNum w:abstractNumId="4" w15:restartNumberingAfterBreak="0">
+  <w:abstractNum w:abstractNumId="6" w15:restartNumberingAfterBreak="0">
     <w:nsid w:val="524A3869"/>
     <w:multiLevelType w:val="hybridMultilevel"/>
     <w:tmpl w:val="234EDC54"/>
@@ -6465,7 +7288,7 @@
       </w:rPr>
     </w:lvl>
   </w:abstractNum>
-  <w:abstractNum w:abstractNumId="5" w15:restartNumberingAfterBreak="0">
+  <w:abstractNum w:abstractNumId="7" w15:restartNumberingAfterBreak="0">
     <w:nsid w:val="5E791327"/>
     <w:multiLevelType w:val="hybridMultilevel"/>
     <w:tmpl w:val="61508D90"/>
@@ -6554,7 +7377,7 @@
       </w:pPr>
     </w:lvl>
   </w:abstractNum>
-  <w:abstractNum w:abstractNumId="6" w15:restartNumberingAfterBreak="0">
+  <w:abstractNum w:abstractNumId="8" w15:restartNumberingAfterBreak="0">
     <w:nsid w:val="661F6CFE"/>
     <w:multiLevelType w:val="hybridMultilevel"/>
     <w:tmpl w:val="16CE4A62"/>
@@ -6643,7 +7466,7 @@
       </w:pPr>
     </w:lvl>
   </w:abstractNum>
-  <w:abstractNum w:abstractNumId="7" w15:restartNumberingAfterBreak="0">
+  <w:abstractNum w:abstractNumId="9" w15:restartNumberingAfterBreak="0">
     <w:nsid w:val="7F4A062F"/>
     <w:multiLevelType w:val="hybridMultilevel"/>
     <w:tmpl w:val="7F82FEBE"/>
@@ -6736,7 +7559,7 @@
     <w:abstractNumId w:val="1"/>
   </w:num>
   <w:num w:numId="2" w16cid:durableId="759570397">
-    <w:abstractNumId w:val="7"/>
+    <w:abstractNumId w:val="9"/>
   </w:num>
   <w:num w:numId="3" w16cid:durableId="1187403510">
     <w:abstractNumId w:val="2"/>
@@ -6745,16 +7568,22 @@
     <w:abstractNumId w:val="0"/>
   </w:num>
   <w:num w:numId="5" w16cid:durableId="1852407121">
+    <w:abstractNumId w:val="8"/>
+  </w:num>
+  <w:num w:numId="6" w16cid:durableId="898172429">
     <w:abstractNumId w:val="6"/>
   </w:num>
-  <w:num w:numId="6" w16cid:durableId="898172429">
-    <w:abstractNumId w:val="4"/>
+  <w:num w:numId="7" w16cid:durableId="138424886">
+    <w:abstractNumId w:val="7"/>
   </w:num>
-  <w:num w:numId="7" w16cid:durableId="138424886">
+  <w:num w:numId="8" w16cid:durableId="41945580">
     <w:abstractNumId w:val="5"/>
   </w:num>
-  <w:num w:numId="8" w16cid:durableId="41945580">
+  <w:num w:numId="9" w16cid:durableId="394163015">
     <w:abstractNumId w:val="3"/>
+  </w:num>
+  <w:num w:numId="10" w16cid:durableId="515997057">
+    <w:abstractNumId w:val="4"/>
   </w:num>
 </w:numbering>
 </file>
@@ -7201,10 +8030,31 @@
       <w:szCs w:val="26"/>
     </w:rPr>
   </w:style>
+  <w:style w:type="paragraph" w:styleId="berschrift3">
+    <w:name w:val="heading 3"/>
+    <w:basedOn w:val="Standard"/>
+    <w:next w:val="Standard"/>
+    <w:link w:val="berschrift3Zchn"/>
+    <w:uiPriority w:val="9"/>
+    <w:unhideWhenUsed/>
+    <w:qFormat/>
+    <w:rsid w:val="005F41D2"/>
+    <w:pPr>
+      <w:keepNext/>
+      <w:keepLines/>
+      <w:spacing w:before="40" w:after="0"/>
+      <w:outlineLvl w:val="2"/>
+    </w:pPr>
+    <w:rPr>
+      <w:rFonts w:asciiTheme="majorHAnsi" w:eastAsiaTheme="majorEastAsia" w:hAnsiTheme="majorHAnsi" w:cstheme="majorBidi"/>
+      <w:color w:val="1F4D78" w:themeColor="accent1" w:themeShade="7F"/>
+      <w:sz w:val="24"/>
+      <w:szCs w:val="24"/>
+    </w:rPr>
+  </w:style>
   <w:style w:type="character" w:default="1" w:styleId="Absatz-Standardschriftart">
     <w:name w:val="Default Paragraph Font"/>
     <w:uiPriority w:val="1"/>
-    <w:semiHidden/>
     <w:unhideWhenUsed/>
   </w:style>
   <w:style w:type="table" w:default="1" w:styleId="NormaleTabelle">
@@ -7435,6 +8285,19 @@
       <w:ind w:left="220"/>
     </w:pPr>
   </w:style>
+  <w:style w:type="character" w:customStyle="1" w:styleId="berschrift3Zchn">
+    <w:name w:val="Überschrift 3 Zchn"/>
+    <w:basedOn w:val="Absatz-Standardschriftart"/>
+    <w:link w:val="berschrift3"/>
+    <w:uiPriority w:val="9"/>
+    <w:rsid w:val="005F41D2"/>
+    <w:rPr>
+      <w:rFonts w:asciiTheme="majorHAnsi" w:eastAsiaTheme="majorEastAsia" w:hAnsiTheme="majorHAnsi" w:cstheme="majorBidi"/>
+      <w:color w:val="1F4D78" w:themeColor="accent1" w:themeShade="7F"/>
+      <w:sz w:val="24"/>
+      <w:szCs w:val="24"/>
+    </w:rPr>
+  </w:style>
 </w:styles>
 </file>
 
@@ -7622,6 +8485,20 @@
     <w:pitch w:val="variable"/>
     <w:sig w:usb0="E0002EFF" w:usb1="C000785B" w:usb2="00000009" w:usb3="00000000" w:csb0="000001FF" w:csb1="00000000"/>
   </w:font>
+  <w:font w:name="Symbol">
+    <w:panose1 w:val="05050102010706020507"/>
+    <w:charset w:val="02"/>
+    <w:family w:val="roman"/>
+    <w:pitch w:val="variable"/>
+    <w:sig w:usb0="00000000" w:usb1="10000000" w:usb2="00000000" w:usb3="00000000" w:csb0="80000000" w:csb1="00000000"/>
+  </w:font>
+  <w:font w:name="Courier New">
+    <w:panose1 w:val="02070309020205020404"/>
+    <w:charset w:val="00"/>
+    <w:family w:val="modern"/>
+    <w:pitch w:val="fixed"/>
+    <w:sig w:usb0="E0002EFF" w:usb1="C0007843" w:usb2="00000009" w:usb3="00000000" w:csb0="000001FF" w:csb1="00000000"/>
+  </w:font>
   <w:font w:name="Wingdings">
     <w:panose1 w:val="05000000000000000000"/>
     <w:charset w:val="02"/>
@@ -7635,20 +8512,6 @@
     <w:family w:val="swiss"/>
     <w:pitch w:val="variable"/>
     <w:sig w:usb0="E4002EFF" w:usb1="C200247B" w:usb2="00000009" w:usb3="00000000" w:csb0="000001FF" w:csb1="00000000"/>
-  </w:font>
-  <w:font w:name="Courier New">
-    <w:panose1 w:val="02070309020205020404"/>
-    <w:charset w:val="00"/>
-    <w:family w:val="modern"/>
-    <w:pitch w:val="fixed"/>
-    <w:sig w:usb0="E0002EFF" w:usb1="C0007843" w:usb2="00000009" w:usb3="00000000" w:csb0="000001FF" w:csb1="00000000"/>
-  </w:font>
-  <w:font w:name="Symbol">
-    <w:panose1 w:val="05050102010706020507"/>
-    <w:charset w:val="02"/>
-    <w:family w:val="roman"/>
-    <w:pitch w:val="variable"/>
-    <w:sig w:usb0="00000000" w:usb1="10000000" w:usb2="00000000" w:usb3="00000000" w:csb0="80000000" w:csb1="00000000"/>
   </w:font>
   <w:font w:name="Calibri Light">
     <w:panose1 w:val="020F0302020204030204"/>
@@ -7702,6 +8565,8 @@
     <w:rsid w:val="00A50927"/>
     <w:rsid w:val="00B02220"/>
     <w:rsid w:val="00BF3C5B"/>
+    <w:rsid w:val="00C75C2C"/>
+    <w:rsid w:val="00D31902"/>
     <w:rsid w:val="00D438A6"/>
     <w:rsid w:val="00E3430F"/>
     <w:rsid w:val="00E46FFA"/>

</xml_diff>

<commit_message>
Projekt hinzugefügt mit GUI. Versionen der Programme beachten!
</commit_message>
<xml_diff>
--- a/doc/Gruppe1_Audio_BPM_Erkennung_Entwicklungsplan.docx
+++ b/doc/Gruppe1_Audio_BPM_Erkennung_Entwicklungsplan.docx
@@ -251,7 +251,7 @@
           <w:r>
             <w:fldChar w:fldCharType="separate"/>
           </w:r>
-          <w:hyperlink w:anchor="_Toc227674012" w:history="1">
+          <w:hyperlink w:anchor="_Toc227915534" w:history="1">
             <w:r>
               <w:rPr>
                 <w:rStyle w:val="Hyperlink"/>
@@ -278,7 +278,7 @@
                 <w:noProof/>
                 <w:webHidden/>
               </w:rPr>
-              <w:instrText xml:space="preserve"> PAGEREF _Toc227674012 \h </w:instrText>
+              <w:instrText xml:space="preserve"> PAGEREF _Toc227915534 \h </w:instrText>
             </w:r>
             <w:r>
               <w:rPr>
@@ -325,7 +325,7 @@
               <w14:ligatures w14:val="standardContextual"/>
             </w:rPr>
           </w:pPr>
-          <w:hyperlink w:anchor="_Toc227674013" w:history="1">
+          <w:hyperlink w:anchor="_Toc227915535" w:history="1">
             <w:r>
               <w:rPr>
                 <w:rStyle w:val="Hyperlink"/>
@@ -352,7 +352,7 @@
                 <w:noProof/>
                 <w:webHidden/>
               </w:rPr>
-              <w:instrText xml:space="preserve"> PAGEREF _Toc227674013 \h </w:instrText>
+              <w:instrText xml:space="preserve"> PAGEREF _Toc227915535 \h </w:instrText>
             </w:r>
             <w:r>
               <w:rPr>
@@ -399,7 +399,7 @@
               <w14:ligatures w14:val="standardContextual"/>
             </w:rPr>
           </w:pPr>
-          <w:hyperlink w:anchor="_Toc227674014" w:history="1">
+          <w:hyperlink w:anchor="_Toc227915536" w:history="1">
             <w:r>
               <w:rPr>
                 <w:rStyle w:val="Hyperlink"/>
@@ -427,7 +427,7 @@
                 <w:noProof/>
                 <w:webHidden/>
               </w:rPr>
-              <w:instrText xml:space="preserve"> PAGEREF _Toc227674014 \h </w:instrText>
+              <w:instrText xml:space="preserve"> PAGEREF _Toc227915536 \h </w:instrText>
             </w:r>
             <w:r>
               <w:rPr>
@@ -474,7 +474,7 @@
               <w14:ligatures w14:val="standardContextual"/>
             </w:rPr>
           </w:pPr>
-          <w:hyperlink w:anchor="_Toc227674015" w:history="1">
+          <w:hyperlink w:anchor="_Toc227915537" w:history="1">
             <w:r>
               <w:rPr>
                 <w:rStyle w:val="Hyperlink"/>
@@ -502,7 +502,7 @@
                 <w:noProof/>
                 <w:webHidden/>
               </w:rPr>
-              <w:instrText xml:space="preserve"> PAGEREF _Toc227674015 \h </w:instrText>
+              <w:instrText xml:space="preserve"> PAGEREF _Toc227915537 \h </w:instrText>
             </w:r>
             <w:r>
               <w:rPr>
@@ -549,7 +549,7 @@
               <w14:ligatures w14:val="standardContextual"/>
             </w:rPr>
           </w:pPr>
-          <w:hyperlink w:anchor="_Toc227674016" w:history="1">
+          <w:hyperlink w:anchor="_Toc227915538" w:history="1">
             <w:r>
               <w:rPr>
                 <w:rStyle w:val="Hyperlink"/>
@@ -577,7 +577,7 @@
                 <w:noProof/>
                 <w:webHidden/>
               </w:rPr>
-              <w:instrText xml:space="preserve"> PAGEREF _Toc227674016 \h </w:instrText>
+              <w:instrText xml:space="preserve"> PAGEREF _Toc227915538 \h </w:instrText>
             </w:r>
             <w:r>
               <w:rPr>
@@ -624,7 +624,7 @@
               <w14:ligatures w14:val="standardContextual"/>
             </w:rPr>
           </w:pPr>
-          <w:hyperlink w:anchor="_Toc227674017" w:history="1">
+          <w:hyperlink w:anchor="_Toc227915539" w:history="1">
             <w:r>
               <w:rPr>
                 <w:rStyle w:val="Hyperlink"/>
@@ -651,7 +651,7 @@
                 <w:noProof/>
                 <w:webHidden/>
               </w:rPr>
-              <w:instrText xml:space="preserve"> PAGEREF _Toc227674017 \h </w:instrText>
+              <w:instrText xml:space="preserve"> PAGEREF _Toc227915539 \h </w:instrText>
             </w:r>
             <w:r>
               <w:rPr>
@@ -698,7 +698,7 @@
               <w14:ligatures w14:val="standardContextual"/>
             </w:rPr>
           </w:pPr>
-          <w:hyperlink w:anchor="_Toc227674018" w:history="1">
+          <w:hyperlink w:anchor="_Toc227915540" w:history="1">
             <w:r>
               <w:rPr>
                 <w:rStyle w:val="Hyperlink"/>
@@ -725,7 +725,7 @@
                 <w:noProof/>
                 <w:webHidden/>
               </w:rPr>
-              <w:instrText xml:space="preserve"> PAGEREF _Toc227674018 \h </w:instrText>
+              <w:instrText xml:space="preserve"> PAGEREF _Toc227915540 \h </w:instrText>
             </w:r>
             <w:r>
               <w:rPr>
@@ -772,7 +772,7 @@
               <w14:ligatures w14:val="standardContextual"/>
             </w:rPr>
           </w:pPr>
-          <w:hyperlink w:anchor="_Toc227674019" w:history="1">
+          <w:hyperlink w:anchor="_Toc227915541" w:history="1">
             <w:r>
               <w:rPr>
                 <w:rStyle w:val="Hyperlink"/>
@@ -800,7 +800,7 @@
                 <w:noProof/>
                 <w:webHidden/>
               </w:rPr>
-              <w:instrText xml:space="preserve"> PAGEREF _Toc227674019 \h </w:instrText>
+              <w:instrText xml:space="preserve"> PAGEREF _Toc227915541 \h </w:instrText>
             </w:r>
             <w:r>
               <w:rPr>
@@ -847,7 +847,7 @@
               <w14:ligatures w14:val="standardContextual"/>
             </w:rPr>
           </w:pPr>
-          <w:hyperlink w:anchor="_Toc227674020" w:history="1">
+          <w:hyperlink w:anchor="_Toc227915542" w:history="1">
             <w:r>
               <w:rPr>
                 <w:rStyle w:val="Hyperlink"/>
@@ -874,7 +874,7 @@
                 <w:noProof/>
                 <w:webHidden/>
               </w:rPr>
-              <w:instrText xml:space="preserve"> PAGEREF _Toc227674020 \h </w:instrText>
+              <w:instrText xml:space="preserve"> PAGEREF _Toc227915542 \h </w:instrText>
             </w:r>
             <w:r>
               <w:rPr>
@@ -921,7 +921,7 @@
               <w14:ligatures w14:val="standardContextual"/>
             </w:rPr>
           </w:pPr>
-          <w:hyperlink w:anchor="_Toc227674021" w:history="1">
+          <w:hyperlink w:anchor="_Toc227915543" w:history="1">
             <w:r>
               <w:rPr>
                 <w:rStyle w:val="Hyperlink"/>
@@ -948,7 +948,7 @@
                 <w:noProof/>
                 <w:webHidden/>
               </w:rPr>
-              <w:instrText xml:space="preserve"> PAGEREF _Toc227674021 \h </w:instrText>
+              <w:instrText xml:space="preserve"> PAGEREF _Toc227915543 \h </w:instrText>
             </w:r>
             <w:r>
               <w:rPr>
@@ -995,7 +995,7 @@
               <w14:ligatures w14:val="standardContextual"/>
             </w:rPr>
           </w:pPr>
-          <w:hyperlink w:anchor="_Toc227674022" w:history="1">
+          <w:hyperlink w:anchor="_Toc227915544" w:history="1">
             <w:r>
               <w:rPr>
                 <w:rStyle w:val="Hyperlink"/>
@@ -1023,7 +1023,7 @@
                 <w:noProof/>
                 <w:webHidden/>
               </w:rPr>
-              <w:instrText xml:space="preserve"> PAGEREF _Toc227674022 \h </w:instrText>
+              <w:instrText xml:space="preserve"> PAGEREF _Toc227915544 \h </w:instrText>
             </w:r>
             <w:r>
               <w:rPr>
@@ -1070,7 +1070,7 @@
               <w14:ligatures w14:val="standardContextual"/>
             </w:rPr>
           </w:pPr>
-          <w:hyperlink w:anchor="_Toc227674023" w:history="1">
+          <w:hyperlink w:anchor="_Toc227915545" w:history="1">
             <w:r>
               <w:rPr>
                 <w:rStyle w:val="Hyperlink"/>
@@ -1097,7 +1097,7 @@
                 <w:noProof/>
                 <w:webHidden/>
               </w:rPr>
-              <w:instrText xml:space="preserve"> PAGEREF _Toc227674023 \h </w:instrText>
+              <w:instrText xml:space="preserve"> PAGEREF _Toc227915545 \h </w:instrText>
             </w:r>
             <w:r>
               <w:rPr>
@@ -1144,7 +1144,7 @@
               <w14:ligatures w14:val="standardContextual"/>
             </w:rPr>
           </w:pPr>
-          <w:hyperlink w:anchor="_Toc227674024" w:history="1">
+          <w:hyperlink w:anchor="_Toc227915546" w:history="1">
             <w:r>
               <w:rPr>
                 <w:rStyle w:val="Hyperlink"/>
@@ -1171,7 +1171,7 @@
                 <w:noProof/>
                 <w:webHidden/>
               </w:rPr>
-              <w:instrText xml:space="preserve"> PAGEREF _Toc227674024 \h </w:instrText>
+              <w:instrText xml:space="preserve"> PAGEREF _Toc227915546 \h </w:instrText>
             </w:r>
             <w:r>
               <w:rPr>
@@ -1218,7 +1218,7 @@
               <w14:ligatures w14:val="standardContextual"/>
             </w:rPr>
           </w:pPr>
-          <w:hyperlink w:anchor="_Toc227674025" w:history="1">
+          <w:hyperlink w:anchor="_Toc227915547" w:history="1">
             <w:r>
               <w:rPr>
                 <w:rStyle w:val="Hyperlink"/>
@@ -1246,7 +1246,7 @@
                 <w:noProof/>
                 <w:webHidden/>
               </w:rPr>
-              <w:instrText xml:space="preserve"> PAGEREF _Toc227674025 \h </w:instrText>
+              <w:instrText xml:space="preserve"> PAGEREF _Toc227915547 \h </w:instrText>
             </w:r>
             <w:r>
               <w:rPr>
@@ -1293,7 +1293,7 @@
               <w14:ligatures w14:val="standardContextual"/>
             </w:rPr>
           </w:pPr>
-          <w:hyperlink w:anchor="_Toc227674026" w:history="1">
+          <w:hyperlink w:anchor="_Toc227915548" w:history="1">
             <w:r>
               <w:rPr>
                 <w:rStyle w:val="Hyperlink"/>
@@ -1320,7 +1320,7 @@
                 <w:noProof/>
                 <w:webHidden/>
               </w:rPr>
-              <w:instrText xml:space="preserve"> PAGEREF _Toc227674026 \h </w:instrText>
+              <w:instrText xml:space="preserve"> PAGEREF _Toc227915548 \h </w:instrText>
             </w:r>
             <w:r>
               <w:rPr>
@@ -1367,7 +1367,7 @@
               <w14:ligatures w14:val="standardContextual"/>
             </w:rPr>
           </w:pPr>
-          <w:hyperlink w:anchor="_Toc227674027" w:history="1">
+          <w:hyperlink w:anchor="_Toc227915549" w:history="1">
             <w:r>
               <w:rPr>
                 <w:rStyle w:val="Hyperlink"/>
@@ -1395,7 +1395,7 @@
                 <w:noProof/>
                 <w:webHidden/>
               </w:rPr>
-              <w:instrText xml:space="preserve"> PAGEREF _Toc227674027 \h </w:instrText>
+              <w:instrText xml:space="preserve"> PAGEREF _Toc227915549 \h </w:instrText>
             </w:r>
             <w:r>
               <w:rPr>
@@ -1442,7 +1442,7 @@
               <w14:ligatures w14:val="standardContextual"/>
             </w:rPr>
           </w:pPr>
-          <w:hyperlink w:anchor="_Toc227674028" w:history="1">
+          <w:hyperlink w:anchor="_Toc227915550" w:history="1">
             <w:r>
               <w:rPr>
                 <w:rStyle w:val="Hyperlink"/>
@@ -1469,7 +1469,77 @@
                 <w:noProof/>
                 <w:webHidden/>
               </w:rPr>
-              <w:instrText xml:space="preserve"> PAGEREF _Toc227674028 \h </w:instrText>
+              <w:instrText xml:space="preserve"> PAGEREF _Toc227915550 \h </w:instrText>
+            </w:r>
+            <w:r>
+              <w:rPr>
+                <w:noProof/>
+                <w:webHidden/>
+              </w:rPr>
+            </w:r>
+            <w:r>
+              <w:rPr>
+                <w:noProof/>
+                <w:webHidden/>
+              </w:rPr>
+              <w:fldChar w:fldCharType="separate"/>
+            </w:r>
+            <w:r>
+              <w:rPr>
+                <w:noProof/>
+                <w:webHidden/>
+              </w:rPr>
+              <w:t>8</w:t>
+            </w:r>
+            <w:r>
+              <w:rPr>
+                <w:noProof/>
+                <w:webHidden/>
+              </w:rPr>
+              <w:fldChar w:fldCharType="end"/>
+            </w:r>
+          </w:hyperlink>
+        </w:p>
+        <w:p>
+          <w:pPr>
+            <w:pStyle w:val="Verzeichnis3"/>
+            <w:tabs>
+              <w:tab w:val="right" w:leader="dot" w:pos="9062"/>
+            </w:tabs>
+            <w:rPr>
+              <w:noProof/>
+            </w:rPr>
+          </w:pPr>
+          <w:hyperlink w:anchor="_Toc227915551" w:history="1">
+            <w:r>
+              <w:rPr>
+                <w:rStyle w:val="Hyperlink"/>
+                <w:rFonts w:eastAsia="Times New Roman"/>
+                <w:noProof/>
+                <w:lang w:eastAsia="de-DE"/>
+              </w:rPr>
+              <w:t>Modellierung</w:t>
+            </w:r>
+            <w:r>
+              <w:rPr>
+                <w:noProof/>
+                <w:webHidden/>
+              </w:rPr>
+              <w:tab/>
+            </w:r>
+            <w:r>
+              <w:rPr>
+                <w:noProof/>
+                <w:webHidden/>
+              </w:rPr>
+              <w:fldChar w:fldCharType="begin"/>
+            </w:r>
+            <w:r>
+              <w:rPr>
+                <w:noProof/>
+                <w:webHidden/>
+              </w:rPr>
+              <w:instrText xml:space="preserve"> PAGEREF _Toc227915551 \h </w:instrText>
             </w:r>
             <w:r>
               <w:rPr>
@@ -1516,10 +1586,11 @@
               <w14:ligatures w14:val="standardContextual"/>
             </w:rPr>
           </w:pPr>
-          <w:hyperlink w:anchor="_Toc227674029" w:history="1">
+          <w:hyperlink w:anchor="_Toc227915552" w:history="1">
             <w:r>
               <w:rPr>
                 <w:rStyle w:val="Hyperlink"/>
+                <w:rFonts w:cstheme="minorHAnsi"/>
                 <w:noProof/>
               </w:rPr>
               <w:t>Designentscheidungen</w:t>
@@ -1543,7 +1614,7 @@
                 <w:noProof/>
                 <w:webHidden/>
               </w:rPr>
-              <w:instrText xml:space="preserve"> PAGEREF _Toc227674029 \h </w:instrText>
+              <w:instrText xml:space="preserve"> PAGEREF _Toc227915552 \h </w:instrText>
             </w:r>
             <w:r>
               <w:rPr>
@@ -1563,7 +1634,7 @@
                 <w:noProof/>
                 <w:webHidden/>
               </w:rPr>
-              <w:t>8</w:t>
+              <w:t>9</w:t>
             </w:r>
             <w:r>
               <w:rPr>
@@ -1590,7 +1661,7 @@
               <w14:ligatures w14:val="standardContextual"/>
             </w:rPr>
           </w:pPr>
-          <w:hyperlink w:anchor="_Toc227674030" w:history="1">
+          <w:hyperlink w:anchor="_Toc227915553" w:history="1">
             <w:r>
               <w:rPr>
                 <w:rStyle w:val="Hyperlink"/>
@@ -1617,7 +1688,7 @@
                 <w:noProof/>
                 <w:webHidden/>
               </w:rPr>
-              <w:instrText xml:space="preserve"> PAGEREF _Toc227674030 \h </w:instrText>
+              <w:instrText xml:space="preserve"> PAGEREF _Toc227915553 \h </w:instrText>
             </w:r>
             <w:r>
               <w:rPr>
@@ -1664,7 +1735,7 @@
               <w14:ligatures w14:val="standardContextual"/>
             </w:rPr>
           </w:pPr>
-          <w:hyperlink w:anchor="_Toc227674031" w:history="1">
+          <w:hyperlink w:anchor="_Toc227915554" w:history="1">
             <w:r>
               <w:rPr>
                 <w:rStyle w:val="Hyperlink"/>
@@ -1692,7 +1763,7 @@
                 <w:noProof/>
                 <w:webHidden/>
               </w:rPr>
-              <w:instrText xml:space="preserve"> PAGEREF _Toc227674031 \h </w:instrText>
+              <w:instrText xml:space="preserve"> PAGEREF _Toc227915554 \h </w:instrText>
             </w:r>
             <w:r>
               <w:rPr>
@@ -1739,7 +1810,7 @@
               <w14:ligatures w14:val="standardContextual"/>
             </w:rPr>
           </w:pPr>
-          <w:hyperlink w:anchor="_Toc227674032" w:history="1">
+          <w:hyperlink w:anchor="_Toc227915555" w:history="1">
             <w:r>
               <w:rPr>
                 <w:rStyle w:val="Hyperlink"/>
@@ -1767,7 +1838,7 @@
                 <w:noProof/>
                 <w:webHidden/>
               </w:rPr>
-              <w:instrText xml:space="preserve"> PAGEREF _Toc227674032 \h </w:instrText>
+              <w:instrText xml:space="preserve"> PAGEREF _Toc227915555 \h </w:instrText>
             </w:r>
             <w:r>
               <w:rPr>
@@ -1814,7 +1885,7 @@
               <w14:ligatures w14:val="standardContextual"/>
             </w:rPr>
           </w:pPr>
-          <w:hyperlink w:anchor="_Toc227674033" w:history="1">
+          <w:hyperlink w:anchor="_Toc227915556" w:history="1">
             <w:r>
               <w:rPr>
                 <w:rStyle w:val="Hyperlink"/>
@@ -1842,7 +1913,7 @@
                 <w:noProof/>
                 <w:webHidden/>
               </w:rPr>
-              <w:instrText xml:space="preserve"> PAGEREF _Toc227674033 \h </w:instrText>
+              <w:instrText xml:space="preserve"> PAGEREF _Toc227915556 \h </w:instrText>
             </w:r>
             <w:r>
               <w:rPr>
@@ -1889,7 +1960,7 @@
               <w14:ligatures w14:val="standardContextual"/>
             </w:rPr>
           </w:pPr>
-          <w:hyperlink w:anchor="_Toc227674034" w:history="1">
+          <w:hyperlink w:anchor="_Toc227915557" w:history="1">
             <w:r>
               <w:rPr>
                 <w:rStyle w:val="Hyperlink"/>
@@ -1917,7 +1988,7 @@
                 <w:noProof/>
                 <w:webHidden/>
               </w:rPr>
-              <w:instrText xml:space="preserve"> PAGEREF _Toc227674034 \h </w:instrText>
+              <w:instrText xml:space="preserve"> PAGEREF _Toc227915557 \h </w:instrText>
             </w:r>
             <w:r>
               <w:rPr>
@@ -1968,7 +2039,7 @@
       <w:pPr>
         <w:pStyle w:val="berschrift1"/>
       </w:pPr>
-      <w:bookmarkStart w:id="0" w:name="_Toc227674012"/>
+      <w:bookmarkStart w:id="0" w:name="_Toc227915534"/>
       <w:proofErr w:type="spellStart"/>
       <w:r>
         <w:lastRenderedPageBreak/>
@@ -2202,7 +2273,7 @@
       <w:pPr>
         <w:pStyle w:val="berschrift1"/>
       </w:pPr>
-      <w:bookmarkStart w:id="1" w:name="_Toc227674013"/>
+      <w:bookmarkStart w:id="1" w:name="_Toc227915535"/>
       <w:r>
         <w:t xml:space="preserve">Template </w:t>
       </w:r>
@@ -2405,7 +2476,7 @@
           <w:lang w:val="en-US"/>
         </w:rPr>
       </w:pPr>
-      <w:bookmarkStart w:id="2" w:name="_Toc227674014"/>
+      <w:bookmarkStart w:id="2" w:name="_Toc227915536"/>
       <w:r>
         <w:rPr>
           <w:lang w:val="en-US"/>
@@ -2446,7 +2517,7 @@
           <w:lang w:val="en-US"/>
         </w:rPr>
       </w:pPr>
-      <w:bookmarkStart w:id="3" w:name="_Toc227674015"/>
+      <w:bookmarkStart w:id="3" w:name="_Toc227915537"/>
       <w:proofErr w:type="spellStart"/>
       <w:r>
         <w:rPr>
@@ -2521,7 +2592,7 @@
           <w:lang w:val="en-US"/>
         </w:rPr>
       </w:pPr>
-      <w:bookmarkStart w:id="4" w:name="_Toc227674016"/>
+      <w:bookmarkStart w:id="4" w:name="_Toc227915538"/>
       <w:proofErr w:type="spellStart"/>
       <w:r>
         <w:rPr>
@@ -2570,7 +2641,7 @@
         <w:pStyle w:val="berschrift2"/>
       </w:pPr>
       <w:bookmarkStart w:id="5" w:name="_Toc163900061"/>
-      <w:bookmarkStart w:id="6" w:name="_Toc227674017"/>
+      <w:bookmarkStart w:id="6" w:name="_Toc227915539"/>
       <w:proofErr w:type="spellStart"/>
       <w:r>
         <w:t>Organization</w:t>
@@ -2600,7 +2671,7 @@
         <w:pStyle w:val="berschrift2"/>
       </w:pPr>
       <w:bookmarkStart w:id="7" w:name="_Toc163900062"/>
-      <w:bookmarkStart w:id="8" w:name="_Toc227674018"/>
+      <w:bookmarkStart w:id="8" w:name="_Toc227915540"/>
       <w:r>
         <w:t>Team/Verantwortlichkeiten</w:t>
       </w:r>
@@ -3024,7 +3095,7 @@
         </w:rPr>
       </w:pPr>
       <w:bookmarkStart w:id="9" w:name="_Toc163900063"/>
-      <w:bookmarkStart w:id="10" w:name="_Toc227674019"/>
+      <w:bookmarkStart w:id="10" w:name="_Toc227915541"/>
       <w:r>
         <w:rPr>
           <w:lang w:val="en-US"/>
@@ -3131,7 +3202,7 @@
         <w:pStyle w:val="berschrift2"/>
       </w:pPr>
       <w:bookmarkStart w:id="11" w:name="_Toc163900064"/>
-      <w:bookmarkStart w:id="12" w:name="_Toc227674020"/>
+      <w:bookmarkStart w:id="12" w:name="_Toc227915542"/>
       <w:r>
         <w:lastRenderedPageBreak/>
         <w:t>Kanban Board</w:t>
@@ -3155,7 +3226,7 @@
           <w:noProof/>
         </w:rPr>
         <w:drawing>
-          <wp:inline distT="0" distB="0" distL="0" distR="0" wp14:anchorId="192B646E" wp14:editId="16C4C391">
+          <wp:inline distT="0" distB="0" distL="0" distR="0" wp14:anchorId="192B646E" wp14:editId="1403F49A">
             <wp:extent cx="5753100" cy="577850"/>
             <wp:effectExtent l="0" t="0" r="0" b="0"/>
             <wp:docPr id="488241168" name="Grafik 1"/>
@@ -3226,7 +3297,7 @@
         <w:pStyle w:val="berschrift2"/>
       </w:pPr>
       <w:bookmarkStart w:id="13" w:name="_Toc163900065"/>
-      <w:bookmarkStart w:id="14" w:name="_Toc227674021"/>
+      <w:bookmarkStart w:id="14" w:name="_Toc227915543"/>
       <w:r>
         <w:t>Projektablage</w:t>
       </w:r>
@@ -3285,7 +3356,7 @@
           <w:lang w:val="en-US"/>
         </w:rPr>
       </w:pPr>
-      <w:bookmarkStart w:id="15" w:name="_Toc227674022"/>
+      <w:bookmarkStart w:id="15" w:name="_Toc227915544"/>
       <w:proofErr w:type="spellStart"/>
       <w:r>
         <w:rPr>
@@ -3322,7 +3393,7 @@
         <w:pStyle w:val="berschrift2"/>
       </w:pPr>
       <w:bookmarkStart w:id="16" w:name="_Toc165127826"/>
-      <w:bookmarkStart w:id="17" w:name="_Toc227674023"/>
+      <w:bookmarkStart w:id="17" w:name="_Toc227915545"/>
       <w:r>
         <w:t>Be</w:t>
       </w:r>
@@ -3375,7 +3446,7 @@
       <w:pPr>
         <w:pStyle w:val="berschrift2"/>
       </w:pPr>
-      <w:bookmarkStart w:id="18" w:name="_Toc227674024"/>
+      <w:bookmarkStart w:id="18" w:name="_Toc227915546"/>
       <w:r>
         <w:t>Ziele</w:t>
       </w:r>
@@ -3768,7 +3839,7 @@
           <w:lang w:val="en-US"/>
         </w:rPr>
       </w:pPr>
-      <w:bookmarkStart w:id="19" w:name="_Toc227674025"/>
+      <w:bookmarkStart w:id="19" w:name="_Toc227915547"/>
       <w:proofErr w:type="spellStart"/>
       <w:r>
         <w:rPr>
@@ -3922,7 +3993,7 @@
         <w:pStyle w:val="berschrift2"/>
       </w:pPr>
       <w:bookmarkStart w:id="20" w:name="_Toc165127830"/>
-      <w:bookmarkStart w:id="21" w:name="_Toc227674026"/>
+      <w:bookmarkStart w:id="21" w:name="_Toc227915548"/>
       <w:r>
         <w:t>Anforderungsmanagement</w:t>
       </w:r>
@@ -4325,7 +4396,7 @@
           <w:lang w:val="en-US"/>
         </w:rPr>
       </w:pPr>
-      <w:bookmarkStart w:id="22" w:name="_Toc227674027"/>
+      <w:bookmarkStart w:id="22" w:name="_Toc227915549"/>
       <w:proofErr w:type="spellStart"/>
       <w:r>
         <w:rPr>
@@ -4341,7 +4412,6 @@
         <w:t xml:space="preserve"> &amp; Design</w:t>
       </w:r>
       <w:bookmarkStart w:id="23" w:name="_Toc165127832"/>
-      <w:bookmarkStart w:id="24" w:name="_Toc227674028"/>
       <w:bookmarkEnd w:id="22"/>
     </w:p>
     <w:p>
@@ -4355,11 +4425,11 @@
       <w:pPr>
         <w:pStyle w:val="berschrift2"/>
       </w:pPr>
+      <w:bookmarkStart w:id="24" w:name="_Toc227915550"/>
       <w:r>
         <w:t>Architektur</w:t>
       </w:r>
       <w:bookmarkStart w:id="25" w:name="_Toc165127833"/>
-      <w:bookmarkStart w:id="26" w:name="_Toc227674029"/>
       <w:bookmarkEnd w:id="23"/>
       <w:bookmarkEnd w:id="24"/>
     </w:p>
@@ -4478,6 +4548,7 @@
           <w:lang w:eastAsia="de-DE"/>
         </w:rPr>
       </w:pPr>
+      <w:bookmarkStart w:id="26" w:name="_Toc227915551"/>
       <w:r>
         <w:rPr>
           <w:rFonts w:eastAsia="Times New Roman"/>
@@ -4485,6 +4556,7 @@
         </w:rPr>
         <w:t>Modellierung</w:t>
       </w:r>
+      <w:bookmarkEnd w:id="26"/>
     </w:p>
     <w:p>
       <w:pPr>
@@ -4585,6 +4657,7 @@
           <w:rFonts w:asciiTheme="minorHAnsi" w:hAnsiTheme="minorHAnsi" w:cstheme="minorHAnsi"/>
         </w:rPr>
       </w:pPr>
+      <w:bookmarkStart w:id="27" w:name="_Toc227915552"/>
       <w:r>
         <w:rPr>
           <w:rFonts w:asciiTheme="minorHAnsi" w:hAnsiTheme="minorHAnsi" w:cstheme="minorHAnsi"/>
@@ -4593,7 +4666,7 @@
         <w:t>Designentscheidungen</w:t>
       </w:r>
       <w:bookmarkEnd w:id="25"/>
-      <w:bookmarkEnd w:id="26"/>
+      <w:bookmarkEnd w:id="27"/>
     </w:p>
     <w:p>
       <w:pPr>
@@ -4799,13 +4872,13 @@
       <w:pPr>
         <w:pStyle w:val="berschrift2"/>
       </w:pPr>
-      <w:bookmarkStart w:id="27" w:name="_Toc165127834"/>
-      <w:bookmarkStart w:id="28" w:name="_Toc227674030"/>
+      <w:bookmarkStart w:id="28" w:name="_Toc165127834"/>
+      <w:bookmarkStart w:id="29" w:name="_Toc227915553"/>
       <w:r>
         <w:t>Wiederverwendung von Open Source Libraries</w:t>
       </w:r>
-      <w:bookmarkEnd w:id="27"/>
       <w:bookmarkEnd w:id="28"/>
+      <w:bookmarkEnd w:id="29"/>
     </w:p>
     <w:p>
       <w:r>
@@ -4820,7 +4893,7 @@
           <w:lang w:val="en-US"/>
         </w:rPr>
       </w:pPr>
-      <w:bookmarkStart w:id="29" w:name="_Toc227674031"/>
+      <w:bookmarkStart w:id="30" w:name="_Toc227915554"/>
       <w:proofErr w:type="spellStart"/>
       <w:r>
         <w:rPr>
@@ -4842,7 +4915,7 @@
         </w:rPr>
         <w:t>Validierung</w:t>
       </w:r>
-      <w:bookmarkEnd w:id="29"/>
+      <w:bookmarkEnd w:id="30"/>
       <w:proofErr w:type="spellEnd"/>
     </w:p>
     <w:p>
@@ -4867,8 +4940,8 @@
           <w:lang w:val="en-US"/>
         </w:rPr>
       </w:pPr>
-      <w:bookmarkStart w:id="30" w:name="_Toc165127836"/>
-      <w:bookmarkStart w:id="31" w:name="_Toc227674032"/>
+      <w:bookmarkStart w:id="31" w:name="_Toc165127836"/>
+      <w:bookmarkStart w:id="32" w:name="_Toc227915555"/>
       <w:proofErr w:type="spellStart"/>
       <w:r>
         <w:rPr>
@@ -4883,8 +4956,8 @@
         </w:rPr>
         <w:t xml:space="preserve"> Test Cases</w:t>
       </w:r>
-      <w:bookmarkEnd w:id="30"/>
       <w:bookmarkEnd w:id="31"/>
+      <w:bookmarkEnd w:id="32"/>
     </w:p>
     <w:p>
       <w:proofErr w:type="gramStart"/>
@@ -5011,7 +5084,7 @@
           <w:lang w:val="en-US"/>
         </w:rPr>
       </w:pPr>
-      <w:bookmarkStart w:id="32" w:name="_Toc227674033"/>
+      <w:bookmarkStart w:id="33" w:name="_Toc227915556"/>
       <w:r>
         <w:rPr>
           <w:lang w:val="en-US"/>
@@ -5019,7 +5092,7 @@
         <w:lastRenderedPageBreak/>
         <w:t>References</w:t>
       </w:r>
-      <w:bookmarkEnd w:id="32"/>
+      <w:bookmarkEnd w:id="33"/>
     </w:p>
     <w:tbl>
       <w:tblPr>
@@ -5955,7 +6028,7 @@
           <w:lang w:val="en-US"/>
         </w:rPr>
       </w:pPr>
-      <w:bookmarkStart w:id="33" w:name="_Toc227674034"/>
+      <w:bookmarkStart w:id="34" w:name="_Toc227915557"/>
       <w:r>
         <w:rPr>
           <w:lang w:val="en-US"/>
@@ -5963,7 +6036,7 @@
         <w:lastRenderedPageBreak/>
         <w:t>Distribution list</w:t>
       </w:r>
-      <w:bookmarkEnd w:id="33"/>
+      <w:bookmarkEnd w:id="34"/>
     </w:p>
     <w:tbl>
       <w:tblPr>
@@ -8055,6 +8128,7 @@
   <w:style w:type="character" w:default="1" w:styleId="Absatz-Standardschriftart">
     <w:name w:val="Default Paragraph Font"/>
     <w:uiPriority w:val="1"/>
+    <w:semiHidden/>
     <w:unhideWhenUsed/>
   </w:style>
   <w:style w:type="table" w:default="1" w:styleId="NormaleTabelle">
@@ -8297,6 +8371,19 @@
       <w:sz w:val="24"/>
       <w:szCs w:val="24"/>
     </w:rPr>
+  </w:style>
+  <w:style w:type="paragraph" w:styleId="Verzeichnis3">
+    <w:name w:val="toc 3"/>
+    <w:basedOn w:val="Standard"/>
+    <w:next w:val="Standard"/>
+    <w:autoRedefine/>
+    <w:uiPriority w:val="39"/>
+    <w:unhideWhenUsed/>
+    <w:rsid w:val="006E54E0"/>
+    <w:pPr>
+      <w:spacing w:after="100"/>
+      <w:ind w:left="440"/>
+    </w:pPr>
   </w:style>
 </w:styles>
 </file>
@@ -8558,6 +8645,7 @@
     <w:rsid w:val="004F715D"/>
     <w:rsid w:val="005543CF"/>
     <w:rsid w:val="00835503"/>
+    <w:rsid w:val="0089440F"/>
     <w:rsid w:val="00996D87"/>
     <w:rsid w:val="009C1FFD"/>
     <w:rsid w:val="009D51D8"/>
@@ -8565,6 +8653,7 @@
     <w:rsid w:val="00A50927"/>
     <w:rsid w:val="00B02220"/>
     <w:rsid w:val="00BF3C5B"/>
+    <w:rsid w:val="00C549A8"/>
     <w:rsid w:val="00C75C2C"/>
     <w:rsid w:val="00D31902"/>
     <w:rsid w:val="00D438A6"/>

</xml_diff>

<commit_message>
Entwicklungsplan 90% fertig. TODO: Links, Umfang, Verzeichnisse aktualisieren, Review (Rollen und Verwantwortlichkeiten)
</commit_message>
<xml_diff>
--- a/doc/Gruppe1_Audio_BPM_Erkennung_Entwicklungsplan.docx
+++ b/doc/Gruppe1_Audio_BPM_Erkennung_Entwicklungsplan.docx
@@ -44,42 +44,59 @@
       <w:pPr>
         <w:jc w:val="center"/>
         <w:rPr>
+          <w:sz w:val="52"/>
+          <w:szCs w:val="52"/>
+          <w:lang w:val="en-US"/>
+        </w:rPr>
+      </w:pPr>
+      <w:r>
+        <w:rPr>
+          <w:sz w:val="52"/>
+          <w:szCs w:val="52"/>
+          <w:lang w:val="en-US"/>
+        </w:rPr>
+        <w:t xml:space="preserve">Audio BPM </w:t>
+      </w:r>
+      <w:proofErr w:type="spellStart"/>
+      <w:r>
+        <w:rPr>
+          <w:sz w:val="52"/>
+          <w:szCs w:val="52"/>
+          <w:lang w:val="en-US"/>
+        </w:rPr>
+        <w:t>Erkennung</w:t>
+      </w:r>
+      <w:proofErr w:type="spellEnd"/>
+    </w:p>
+    <w:p>
+      <w:pPr>
+        <w:rPr>
           <w:color w:val="FF0000"/>
           <w:sz w:val="52"/>
           <w:szCs w:val="52"/>
           <w:lang w:val="en-US"/>
         </w:rPr>
       </w:pPr>
-      <w:r>
-        <w:rPr>
-          <w:color w:val="FF0000"/>
-          <w:sz w:val="52"/>
-          <w:szCs w:val="52"/>
+    </w:p>
+    <w:p>
+      <w:pPr>
+        <w:spacing w:after="100" w:afterAutospacing="1"/>
+        <w:rPr>
           <w:lang w:val="en-US"/>
         </w:rPr>
-        <w:t xml:space="preserve">Audio BPM </w:t>
-      </w:r>
-      <w:proofErr w:type="spellStart"/>
-      <w:r>
-        <w:rPr>
-          <w:color w:val="FF0000"/>
-          <w:sz w:val="52"/>
-          <w:szCs w:val="52"/>
+      </w:pPr>
+      <w:r>
+        <w:rPr>
           <w:lang w:val="en-US"/>
         </w:rPr>
-        <w:t>Erkennung</w:t>
-      </w:r>
-      <w:proofErr w:type="spellEnd"/>
-    </w:p>
-    <w:p>
-      <w:pPr>
-        <w:rPr>
-          <w:color w:val="FF0000"/>
-          <w:sz w:val="52"/>
-          <w:szCs w:val="52"/>
+        <w:t>Date:</w:t>
+      </w:r>
+      <w:r>
+        <w:rPr>
           <w:lang w:val="en-US"/>
         </w:rPr>
-      </w:pPr>
+        <w:t xml:space="preserve"> 30.04.2026</w:t>
+      </w:r>
     </w:p>
     <w:p>
       <w:pPr>
@@ -92,21 +109,13 @@
         <w:rPr>
           <w:lang w:val="en-US"/>
         </w:rPr>
-        <w:t>Date:</w:t>
-      </w:r>
-    </w:p>
-    <w:p>
-      <w:pPr>
-        <w:spacing w:after="100" w:afterAutospacing="1"/>
+        <w:t>Autor:</w:t>
+      </w:r>
+      <w:r>
         <w:rPr>
           <w:lang w:val="en-US"/>
         </w:rPr>
-      </w:pPr>
-      <w:r>
-        <w:rPr>
-          <w:lang w:val="en-US"/>
-        </w:rPr>
-        <w:t>Autor:</w:t>
+        <w:t xml:space="preserve"> Johannes Winter</w:t>
       </w:r>
     </w:p>
     <w:p>
@@ -142,7 +151,7 @@
             <w:rPr>
               <w:lang w:val="en-US"/>
             </w:rPr>
-            <w:t>Draft</w:t>
+            <w:t>Submitted</w:t>
           </w:r>
         </w:sdtContent>
       </w:sdt>
@@ -251,7 +260,7 @@
           <w:r>
             <w:fldChar w:fldCharType="separate"/>
           </w:r>
-          <w:hyperlink w:anchor="_Toc227915534" w:history="1">
+          <w:hyperlink w:anchor="_Toc228175833" w:history="1">
             <w:r>
               <w:rPr>
                 <w:rStyle w:val="Hyperlink"/>
@@ -278,7 +287,7 @@
                 <w:noProof/>
                 <w:webHidden/>
               </w:rPr>
-              <w:instrText xml:space="preserve"> PAGEREF _Toc227915534 \h </w:instrText>
+              <w:instrText xml:space="preserve"> PAGEREF _Toc228175833 \h </w:instrText>
             </w:r>
             <w:r>
               <w:rPr>
@@ -325,7 +334,7 @@
               <w14:ligatures w14:val="standardContextual"/>
             </w:rPr>
           </w:pPr>
-          <w:hyperlink w:anchor="_Toc227915535" w:history="1">
+          <w:hyperlink w:anchor="_Toc228175834" w:history="1">
             <w:r>
               <w:rPr>
                 <w:rStyle w:val="Hyperlink"/>
@@ -352,7 +361,7 @@
                 <w:noProof/>
                 <w:webHidden/>
               </w:rPr>
-              <w:instrText xml:space="preserve"> PAGEREF _Toc227915535 \h </w:instrText>
+              <w:instrText xml:space="preserve"> PAGEREF _Toc228175834 \h </w:instrText>
             </w:r>
             <w:r>
               <w:rPr>
@@ -399,7 +408,7 @@
               <w14:ligatures w14:val="standardContextual"/>
             </w:rPr>
           </w:pPr>
-          <w:hyperlink w:anchor="_Toc227915536" w:history="1">
+          <w:hyperlink w:anchor="_Toc228175835" w:history="1">
             <w:r>
               <w:rPr>
                 <w:rStyle w:val="Hyperlink"/>
@@ -427,7 +436,7 @@
                 <w:noProof/>
                 <w:webHidden/>
               </w:rPr>
-              <w:instrText xml:space="preserve"> PAGEREF _Toc227915536 \h </w:instrText>
+              <w:instrText xml:space="preserve"> PAGEREF _Toc228175835 \h </w:instrText>
             </w:r>
             <w:r>
               <w:rPr>
@@ -474,7 +483,7 @@
               <w14:ligatures w14:val="standardContextual"/>
             </w:rPr>
           </w:pPr>
-          <w:hyperlink w:anchor="_Toc227915537" w:history="1">
+          <w:hyperlink w:anchor="_Toc228175836" w:history="1">
             <w:r>
               <w:rPr>
                 <w:rStyle w:val="Hyperlink"/>
@@ -502,7 +511,7 @@
                 <w:noProof/>
                 <w:webHidden/>
               </w:rPr>
-              <w:instrText xml:space="preserve"> PAGEREF _Toc227915537 \h </w:instrText>
+              <w:instrText xml:space="preserve"> PAGEREF _Toc228175836 \h </w:instrText>
             </w:r>
             <w:r>
               <w:rPr>
@@ -549,7 +558,7 @@
               <w14:ligatures w14:val="standardContextual"/>
             </w:rPr>
           </w:pPr>
-          <w:hyperlink w:anchor="_Toc227915538" w:history="1">
+          <w:hyperlink w:anchor="_Toc228175837" w:history="1">
             <w:r>
               <w:rPr>
                 <w:rStyle w:val="Hyperlink"/>
@@ -577,7 +586,7 @@
                 <w:noProof/>
                 <w:webHidden/>
               </w:rPr>
-              <w:instrText xml:space="preserve"> PAGEREF _Toc227915538 \h </w:instrText>
+              <w:instrText xml:space="preserve"> PAGEREF _Toc228175837 \h </w:instrText>
             </w:r>
             <w:r>
               <w:rPr>
@@ -624,7 +633,7 @@
               <w14:ligatures w14:val="standardContextual"/>
             </w:rPr>
           </w:pPr>
-          <w:hyperlink w:anchor="_Toc227915539" w:history="1">
+          <w:hyperlink w:anchor="_Toc228175838" w:history="1">
             <w:r>
               <w:rPr>
                 <w:rStyle w:val="Hyperlink"/>
@@ -651,7 +660,7 @@
                 <w:noProof/>
                 <w:webHidden/>
               </w:rPr>
-              <w:instrText xml:space="preserve"> PAGEREF _Toc227915539 \h </w:instrText>
+              <w:instrText xml:space="preserve"> PAGEREF _Toc228175838 \h </w:instrText>
             </w:r>
             <w:r>
               <w:rPr>
@@ -698,7 +707,7 @@
               <w14:ligatures w14:val="standardContextual"/>
             </w:rPr>
           </w:pPr>
-          <w:hyperlink w:anchor="_Toc227915540" w:history="1">
+          <w:hyperlink w:anchor="_Toc228175839" w:history="1">
             <w:r>
               <w:rPr>
                 <w:rStyle w:val="Hyperlink"/>
@@ -725,7 +734,7 @@
                 <w:noProof/>
                 <w:webHidden/>
               </w:rPr>
-              <w:instrText xml:space="preserve"> PAGEREF _Toc227915540 \h </w:instrText>
+              <w:instrText xml:space="preserve"> PAGEREF _Toc228175839 \h </w:instrText>
             </w:r>
             <w:r>
               <w:rPr>
@@ -772,7 +781,7 @@
               <w14:ligatures w14:val="standardContextual"/>
             </w:rPr>
           </w:pPr>
-          <w:hyperlink w:anchor="_Toc227915541" w:history="1">
+          <w:hyperlink w:anchor="_Toc228175840" w:history="1">
             <w:r>
               <w:rPr>
                 <w:rStyle w:val="Hyperlink"/>
@@ -800,7 +809,7 @@
                 <w:noProof/>
                 <w:webHidden/>
               </w:rPr>
-              <w:instrText xml:space="preserve"> PAGEREF _Toc227915541 \h </w:instrText>
+              <w:instrText xml:space="preserve"> PAGEREF _Toc228175840 \h </w:instrText>
             </w:r>
             <w:r>
               <w:rPr>
@@ -847,7 +856,7 @@
               <w14:ligatures w14:val="standardContextual"/>
             </w:rPr>
           </w:pPr>
-          <w:hyperlink w:anchor="_Toc227915542" w:history="1">
+          <w:hyperlink w:anchor="_Toc228175841" w:history="1">
             <w:r>
               <w:rPr>
                 <w:rStyle w:val="Hyperlink"/>
@@ -874,7 +883,7 @@
                 <w:noProof/>
                 <w:webHidden/>
               </w:rPr>
-              <w:instrText xml:space="preserve"> PAGEREF _Toc227915542 \h </w:instrText>
+              <w:instrText xml:space="preserve"> PAGEREF _Toc228175841 \h </w:instrText>
             </w:r>
             <w:r>
               <w:rPr>
@@ -921,7 +930,7 @@
               <w14:ligatures w14:val="standardContextual"/>
             </w:rPr>
           </w:pPr>
-          <w:hyperlink w:anchor="_Toc227915543" w:history="1">
+          <w:hyperlink w:anchor="_Toc228175842" w:history="1">
             <w:r>
               <w:rPr>
                 <w:rStyle w:val="Hyperlink"/>
@@ -948,7 +957,7 @@
                 <w:noProof/>
                 <w:webHidden/>
               </w:rPr>
-              <w:instrText xml:space="preserve"> PAGEREF _Toc227915543 \h </w:instrText>
+              <w:instrText xml:space="preserve"> PAGEREF _Toc228175842 \h </w:instrText>
             </w:r>
             <w:r>
               <w:rPr>
@@ -995,7 +1004,7 @@
               <w14:ligatures w14:val="standardContextual"/>
             </w:rPr>
           </w:pPr>
-          <w:hyperlink w:anchor="_Toc227915544" w:history="1">
+          <w:hyperlink w:anchor="_Toc228175843" w:history="1">
             <w:r>
               <w:rPr>
                 <w:rStyle w:val="Hyperlink"/>
@@ -1023,7 +1032,7 @@
                 <w:noProof/>
                 <w:webHidden/>
               </w:rPr>
-              <w:instrText xml:space="preserve"> PAGEREF _Toc227915544 \h </w:instrText>
+              <w:instrText xml:space="preserve"> PAGEREF _Toc228175843 \h </w:instrText>
             </w:r>
             <w:r>
               <w:rPr>
@@ -1070,7 +1079,7 @@
               <w14:ligatures w14:val="standardContextual"/>
             </w:rPr>
           </w:pPr>
-          <w:hyperlink w:anchor="_Toc227915545" w:history="1">
+          <w:hyperlink w:anchor="_Toc228175844" w:history="1">
             <w:r>
               <w:rPr>
                 <w:rStyle w:val="Hyperlink"/>
@@ -1097,7 +1106,7 @@
                 <w:noProof/>
                 <w:webHidden/>
               </w:rPr>
-              <w:instrText xml:space="preserve"> PAGEREF _Toc227915545 \h </w:instrText>
+              <w:instrText xml:space="preserve"> PAGEREF _Toc228175844 \h </w:instrText>
             </w:r>
             <w:r>
               <w:rPr>
@@ -1144,7 +1153,7 @@
               <w14:ligatures w14:val="standardContextual"/>
             </w:rPr>
           </w:pPr>
-          <w:hyperlink w:anchor="_Toc227915546" w:history="1">
+          <w:hyperlink w:anchor="_Toc228175845" w:history="1">
             <w:r>
               <w:rPr>
                 <w:rStyle w:val="Hyperlink"/>
@@ -1171,7 +1180,7 @@
                 <w:noProof/>
                 <w:webHidden/>
               </w:rPr>
-              <w:instrText xml:space="preserve"> PAGEREF _Toc227915546 \h </w:instrText>
+              <w:instrText xml:space="preserve"> PAGEREF _Toc228175845 \h </w:instrText>
             </w:r>
             <w:r>
               <w:rPr>
@@ -1191,7 +1200,7 @@
                 <w:noProof/>
                 <w:webHidden/>
               </w:rPr>
-              <w:t>6</w:t>
+              <w:t>7</w:t>
             </w:r>
             <w:r>
               <w:rPr>
@@ -1218,7 +1227,7 @@
               <w14:ligatures w14:val="standardContextual"/>
             </w:rPr>
           </w:pPr>
-          <w:hyperlink w:anchor="_Toc227915547" w:history="1">
+          <w:hyperlink w:anchor="_Toc228175846" w:history="1">
             <w:r>
               <w:rPr>
                 <w:rStyle w:val="Hyperlink"/>
@@ -1246,7 +1255,7 @@
                 <w:noProof/>
                 <w:webHidden/>
               </w:rPr>
-              <w:instrText xml:space="preserve"> PAGEREF _Toc227915547 \h </w:instrText>
+              <w:instrText xml:space="preserve"> PAGEREF _Toc228175846 \h </w:instrText>
             </w:r>
             <w:r>
               <w:rPr>
@@ -1293,7 +1302,7 @@
               <w14:ligatures w14:val="standardContextual"/>
             </w:rPr>
           </w:pPr>
-          <w:hyperlink w:anchor="_Toc227915548" w:history="1">
+          <w:hyperlink w:anchor="_Toc228175847" w:history="1">
             <w:r>
               <w:rPr>
                 <w:rStyle w:val="Hyperlink"/>
@@ -1320,7 +1329,7 @@
                 <w:noProof/>
                 <w:webHidden/>
               </w:rPr>
-              <w:instrText xml:space="preserve"> PAGEREF _Toc227915548 \h </w:instrText>
+              <w:instrText xml:space="preserve"> PAGEREF _Toc228175847 \h </w:instrText>
             </w:r>
             <w:r>
               <w:rPr>
@@ -1367,7 +1376,7 @@
               <w14:ligatures w14:val="standardContextual"/>
             </w:rPr>
           </w:pPr>
-          <w:hyperlink w:anchor="_Toc227915549" w:history="1">
+          <w:hyperlink w:anchor="_Toc228175848" w:history="1">
             <w:r>
               <w:rPr>
                 <w:rStyle w:val="Hyperlink"/>
@@ -1395,7 +1404,7 @@
                 <w:noProof/>
                 <w:webHidden/>
               </w:rPr>
-              <w:instrText xml:space="preserve"> PAGEREF _Toc227915549 \h </w:instrText>
+              <w:instrText xml:space="preserve"> PAGEREF _Toc228175848 \h </w:instrText>
             </w:r>
             <w:r>
               <w:rPr>
@@ -1442,7 +1451,7 @@
               <w14:ligatures w14:val="standardContextual"/>
             </w:rPr>
           </w:pPr>
-          <w:hyperlink w:anchor="_Toc227915550" w:history="1">
+          <w:hyperlink w:anchor="_Toc228175849" w:history="1">
             <w:r>
               <w:rPr>
                 <w:rStyle w:val="Hyperlink"/>
@@ -1469,7 +1478,7 @@
                 <w:noProof/>
                 <w:webHidden/>
               </w:rPr>
-              <w:instrText xml:space="preserve"> PAGEREF _Toc227915550 \h </w:instrText>
+              <w:instrText xml:space="preserve"> PAGEREF _Toc228175849 \h </w:instrText>
             </w:r>
             <w:r>
               <w:rPr>
@@ -1507,10 +1516,16 @@
               <w:tab w:val="right" w:leader="dot" w:pos="9062"/>
             </w:tabs>
             <w:rPr>
+              <w:rFonts w:eastAsiaTheme="minorEastAsia"/>
               <w:noProof/>
+              <w:kern w:val="2"/>
+              <w:sz w:val="24"/>
+              <w:szCs w:val="24"/>
+              <w:lang w:eastAsia="de-DE"/>
+              <w14:ligatures w14:val="standardContextual"/>
             </w:rPr>
           </w:pPr>
-          <w:hyperlink w:anchor="_Toc227915551" w:history="1">
+          <w:hyperlink w:anchor="_Toc228175850" w:history="1">
             <w:r>
               <w:rPr>
                 <w:rStyle w:val="Hyperlink"/>
@@ -1539,7 +1554,7 @@
                 <w:noProof/>
                 <w:webHidden/>
               </w:rPr>
-              <w:instrText xml:space="preserve"> PAGEREF _Toc227915551 \h </w:instrText>
+              <w:instrText xml:space="preserve"> PAGEREF _Toc228175850 \h </w:instrText>
             </w:r>
             <w:r>
               <w:rPr>
@@ -1559,7 +1574,7 @@
                 <w:noProof/>
                 <w:webHidden/>
               </w:rPr>
-              <w:t>8</w:t>
+              <w:t>9</w:t>
             </w:r>
             <w:r>
               <w:rPr>
@@ -1586,7 +1601,7 @@
               <w14:ligatures w14:val="standardContextual"/>
             </w:rPr>
           </w:pPr>
-          <w:hyperlink w:anchor="_Toc227915552" w:history="1">
+          <w:hyperlink w:anchor="_Toc228175851" w:history="1">
             <w:r>
               <w:rPr>
                 <w:rStyle w:val="Hyperlink"/>
@@ -1614,7 +1629,7 @@
                 <w:noProof/>
                 <w:webHidden/>
               </w:rPr>
-              <w:instrText xml:space="preserve"> PAGEREF _Toc227915552 \h </w:instrText>
+              <w:instrText xml:space="preserve"> PAGEREF _Toc228175851 \h </w:instrText>
             </w:r>
             <w:r>
               <w:rPr>
@@ -1661,7 +1676,7 @@
               <w14:ligatures w14:val="standardContextual"/>
             </w:rPr>
           </w:pPr>
-          <w:hyperlink w:anchor="_Toc227915553" w:history="1">
+          <w:hyperlink w:anchor="_Toc228175852" w:history="1">
             <w:r>
               <w:rPr>
                 <w:rStyle w:val="Hyperlink"/>
@@ -1688,7 +1703,7 @@
                 <w:noProof/>
                 <w:webHidden/>
               </w:rPr>
-              <w:instrText xml:space="preserve"> PAGEREF _Toc227915553 \h </w:instrText>
+              <w:instrText xml:space="preserve"> PAGEREF _Toc228175852 \h </w:instrText>
             </w:r>
             <w:r>
               <w:rPr>
@@ -1708,7 +1723,7 @@
                 <w:noProof/>
                 <w:webHidden/>
               </w:rPr>
-              <w:t>9</w:t>
+              <w:t>10</w:t>
             </w:r>
             <w:r>
               <w:rPr>
@@ -1735,7 +1750,7 @@
               <w14:ligatures w14:val="standardContextual"/>
             </w:rPr>
           </w:pPr>
-          <w:hyperlink w:anchor="_Toc227915554" w:history="1">
+          <w:hyperlink w:anchor="_Toc228175853" w:history="1">
             <w:r>
               <w:rPr>
                 <w:rStyle w:val="Hyperlink"/>
@@ -1763,7 +1778,7 @@
                 <w:noProof/>
                 <w:webHidden/>
               </w:rPr>
-              <w:instrText xml:space="preserve"> PAGEREF _Toc227915554 \h </w:instrText>
+              <w:instrText xml:space="preserve"> PAGEREF _Toc228175853 \h </w:instrText>
             </w:r>
             <w:r>
               <w:rPr>
@@ -1783,7 +1798,7 @@
                 <w:noProof/>
                 <w:webHidden/>
               </w:rPr>
-              <w:t>9</w:t>
+              <w:t>10</w:t>
             </w:r>
             <w:r>
               <w:rPr>
@@ -1810,7 +1825,7 @@
               <w14:ligatures w14:val="standardContextual"/>
             </w:rPr>
           </w:pPr>
-          <w:hyperlink w:anchor="_Toc227915555" w:history="1">
+          <w:hyperlink w:anchor="_Toc228175854" w:history="1">
             <w:r>
               <w:rPr>
                 <w:rStyle w:val="Hyperlink"/>
@@ -1838,7 +1853,7 @@
                 <w:noProof/>
                 <w:webHidden/>
               </w:rPr>
-              <w:instrText xml:space="preserve"> PAGEREF _Toc227915555 \h </w:instrText>
+              <w:instrText xml:space="preserve"> PAGEREF _Toc228175854 \h </w:instrText>
             </w:r>
             <w:r>
               <w:rPr>
@@ -1858,7 +1873,7 @@
                 <w:noProof/>
                 <w:webHidden/>
               </w:rPr>
-              <w:t>9</w:t>
+              <w:t>10</w:t>
             </w:r>
             <w:r>
               <w:rPr>
@@ -1885,7 +1900,7 @@
               <w14:ligatures w14:val="standardContextual"/>
             </w:rPr>
           </w:pPr>
-          <w:hyperlink w:anchor="_Toc227915556" w:history="1">
+          <w:hyperlink w:anchor="_Toc228175855" w:history="1">
             <w:r>
               <w:rPr>
                 <w:rStyle w:val="Hyperlink"/>
@@ -1913,7 +1928,7 @@
                 <w:noProof/>
                 <w:webHidden/>
               </w:rPr>
-              <w:instrText xml:space="preserve"> PAGEREF _Toc227915556 \h </w:instrText>
+              <w:instrText xml:space="preserve"> PAGEREF _Toc228175855 \h </w:instrText>
             </w:r>
             <w:r>
               <w:rPr>
@@ -1960,7 +1975,7 @@
               <w14:ligatures w14:val="standardContextual"/>
             </w:rPr>
           </w:pPr>
-          <w:hyperlink w:anchor="_Toc227915557" w:history="1">
+          <w:hyperlink w:anchor="_Toc228175856" w:history="1">
             <w:r>
               <w:rPr>
                 <w:rStyle w:val="Hyperlink"/>
@@ -1988,7 +2003,7 @@
                 <w:noProof/>
                 <w:webHidden/>
               </w:rPr>
-              <w:instrText xml:space="preserve"> PAGEREF _Toc227915557 \h </w:instrText>
+              <w:instrText xml:space="preserve"> PAGEREF _Toc228175856 \h </w:instrText>
             </w:r>
             <w:r>
               <w:rPr>
@@ -2039,7 +2054,7 @@
       <w:pPr>
         <w:pStyle w:val="berschrift1"/>
       </w:pPr>
-      <w:bookmarkStart w:id="0" w:name="_Toc227915534"/>
+      <w:bookmarkStart w:id="0" w:name="_Toc228175833"/>
       <w:proofErr w:type="spellStart"/>
       <w:r>
         <w:lastRenderedPageBreak/>
@@ -2273,7 +2288,7 @@
       <w:pPr>
         <w:pStyle w:val="berschrift1"/>
       </w:pPr>
-      <w:bookmarkStart w:id="1" w:name="_Toc227915535"/>
+      <w:bookmarkStart w:id="1" w:name="_Toc228175834"/>
       <w:r>
         <w:t xml:space="preserve">Template </w:t>
       </w:r>
@@ -2476,7 +2491,7 @@
           <w:lang w:val="en-US"/>
         </w:rPr>
       </w:pPr>
-      <w:bookmarkStart w:id="2" w:name="_Toc227915536"/>
+      <w:bookmarkStart w:id="2" w:name="_Toc228175835"/>
       <w:r>
         <w:rPr>
           <w:lang w:val="en-US"/>
@@ -2517,7 +2532,7 @@
           <w:lang w:val="en-US"/>
         </w:rPr>
       </w:pPr>
-      <w:bookmarkStart w:id="3" w:name="_Toc227915537"/>
+      <w:bookmarkStart w:id="3" w:name="_Toc228175836"/>
       <w:proofErr w:type="spellStart"/>
       <w:r>
         <w:rPr>
@@ -2592,7 +2607,7 @@
           <w:lang w:val="en-US"/>
         </w:rPr>
       </w:pPr>
-      <w:bookmarkStart w:id="4" w:name="_Toc227915538"/>
+      <w:bookmarkStart w:id="4" w:name="_Toc228175837"/>
       <w:proofErr w:type="spellStart"/>
       <w:r>
         <w:rPr>
@@ -2641,7 +2656,7 @@
         <w:pStyle w:val="berschrift2"/>
       </w:pPr>
       <w:bookmarkStart w:id="5" w:name="_Toc163900061"/>
-      <w:bookmarkStart w:id="6" w:name="_Toc227915539"/>
+      <w:bookmarkStart w:id="6" w:name="_Toc228175838"/>
       <w:proofErr w:type="spellStart"/>
       <w:r>
         <w:t>Organization</w:t>
@@ -2671,7 +2686,7 @@
         <w:pStyle w:val="berschrift2"/>
       </w:pPr>
       <w:bookmarkStart w:id="7" w:name="_Toc163900062"/>
-      <w:bookmarkStart w:id="8" w:name="_Toc227915540"/>
+      <w:bookmarkStart w:id="8" w:name="_Toc228175839"/>
       <w:r>
         <w:t>Team/Verantwortlichkeiten</w:t>
       </w:r>
@@ -2871,16 +2886,11 @@
             <w:hideMark/>
           </w:tcPr>
           <w:p>
-            <w:proofErr w:type="gramStart"/>
-            <w:r>
-              <w:t>SW</w:t>
-            </w:r>
-            <w:r>
-              <w:t xml:space="preserve"> Test</w:t>
-            </w:r>
-            <w:proofErr w:type="gramEnd"/>
-            <w:r>
-              <w:t xml:space="preserve"> / Debugging</w:t>
+            <w:r>
+              <w:t>SW-Test</w:t>
+            </w:r>
+            <w:r>
+              <w:t>, Architektur</w:t>
             </w:r>
           </w:p>
         </w:tc>
@@ -2916,7 +2926,15 @@
           </w:tcPr>
           <w:p>
             <w:r>
-              <w:t>HW-Beschaffung/SW Tester</w:t>
+              <w:t>HW-Beschaffung/</w:t>
+            </w:r>
+            <w:proofErr w:type="spellStart"/>
+            <w:r>
+              <w:t>Product</w:t>
+            </w:r>
+            <w:proofErr w:type="spellEnd"/>
+            <w:r>
+              <w:t xml:space="preserve"> Owner</w:t>
             </w:r>
           </w:p>
         </w:tc>
@@ -2933,7 +2951,15 @@
           </w:tcPr>
           <w:p>
             <w:r>
-              <w:t>Integration</w:t>
+              <w:t>Abnahme der Anwendung</w:t>
+            </w:r>
+            <w:r>
+              <w:t>,</w:t>
+            </w:r>
+          </w:p>
+          <w:p>
+            <w:r>
+              <w:t>Genehmigung des Entwicklungsplans</w:t>
             </w:r>
           </w:p>
         </w:tc>
@@ -2974,13 +3000,8 @@
             <w:r>
               <w:t>/</w:t>
             </w:r>
-            <w:proofErr w:type="spellStart"/>
-            <w:r>
-              <w:t>Git</w:t>
-            </w:r>
-            <w:proofErr w:type="spellEnd"/>
-            <w:r>
-              <w:t xml:space="preserve"> Beauftragter</w:t>
+            <w:r>
+              <w:t>Repository-Verantwortlicher</w:t>
             </w:r>
           </w:p>
         </w:tc>
@@ -2996,18 +3017,14 @@
             <w:hideMark/>
           </w:tcPr>
           <w:p>
-            <w:proofErr w:type="gramStart"/>
-            <w:r>
-              <w:t>SW Architektur</w:t>
-            </w:r>
-            <w:proofErr w:type="gramEnd"/>
-          </w:p>
-          <w:p>
-            <w:proofErr w:type="gramStart"/>
-            <w:r>
-              <w:t>SW Implementierung</w:t>
-            </w:r>
-            <w:proofErr w:type="gramEnd"/>
+            <w:r>
+              <w:t>SW-Implementierung,</w:t>
+            </w:r>
+          </w:p>
+          <w:p>
+            <w:r>
+              <w:t>Code-Repository-Management</w:t>
+            </w:r>
           </w:p>
         </w:tc>
       </w:tr>
@@ -3061,23 +3078,14 @@
             <w:hideMark/>
           </w:tcPr>
           <w:p>
-            <w:proofErr w:type="gramStart"/>
-            <w:r>
-              <w:t>SW</w:t>
-            </w:r>
-            <w:r>
-              <w:t xml:space="preserve"> Implementierung</w:t>
-            </w:r>
-            <w:proofErr w:type="gramEnd"/>
-          </w:p>
-          <w:p>
-            <w:r>
-              <w:t xml:space="preserve">Vorbereitung </w:t>
-            </w:r>
-            <w:r>
-              <w:t>der Entwicklungsumgebung</w:t>
-            </w:r>
-          </w:p>
+            <w:r>
+              <w:t>SW-Inbetriebnahme</w:t>
+            </w:r>
+            <w:r>
+              <w:t>, Entwicklungsplanung</w:t>
+            </w:r>
+          </w:p>
+          <w:p/>
         </w:tc>
       </w:tr>
     </w:tbl>
@@ -3095,7 +3103,7 @@
         </w:rPr>
       </w:pPr>
       <w:bookmarkStart w:id="9" w:name="_Toc163900063"/>
-      <w:bookmarkStart w:id="10" w:name="_Toc227915541"/>
+      <w:bookmarkStart w:id="10" w:name="_Toc228175840"/>
       <w:r>
         <w:rPr>
           <w:lang w:val="en-US"/>
@@ -3176,15 +3184,27 @@
     </w:p>
     <w:p>
       <w:r>
-        <w:t>Die Sprintplanung wird mithilfe der Excel-Tabelle „</w:t>
+        <w:t xml:space="preserve">Die Sprintplanung wird mithilfe </w:t>
+      </w:r>
+      <w:r>
+        <w:t xml:space="preserve">von </w:t>
       </w:r>
       <w:proofErr w:type="spellStart"/>
       <w:r>
-        <w:t>Prozessortechnik_Sprint_Backlog</w:t>
+        <w:t>Github</w:t>
       </w:r>
       <w:proofErr w:type="spellEnd"/>
       <w:r>
-        <w:t xml:space="preserve">“ [1] durchgeführt. Diese Tabelle ermöglicht zudem die Darstellung eines </w:t>
+        <w:t xml:space="preserve"> </w:t>
+      </w:r>
+      <w:r>
+        <w:t>durchgeführt. Diese</w:t>
+      </w:r>
+      <w:r>
+        <w:t xml:space="preserve">s Tool </w:t>
+      </w:r>
+      <w:r>
+        <w:t xml:space="preserve">ermöglicht zudem die Darstellung eines </w:t>
       </w:r>
       <w:proofErr w:type="spellStart"/>
       <w:r>
@@ -3202,9 +3222,8 @@
         <w:pStyle w:val="berschrift2"/>
       </w:pPr>
       <w:bookmarkStart w:id="11" w:name="_Toc163900064"/>
-      <w:bookmarkStart w:id="12" w:name="_Toc227915542"/>
-      <w:r>
-        <w:lastRenderedPageBreak/>
+      <w:bookmarkStart w:id="12" w:name="_Toc228175841"/>
+      <w:r>
         <w:t>Kanban Board</w:t>
       </w:r>
       <w:bookmarkEnd w:id="11"/>
@@ -3212,24 +3231,63 @@
     </w:p>
     <w:p>
       <w:r>
-        <w:t>Der Status des Projektes wird mit Hilfe einer Kanban Board dargestellt.</w:t>
-      </w:r>
-    </w:p>
-    <w:p>
-      <w:r>
-        <w:t>Folgende Spalten werden in der Kanban Board dargestellt.</w:t>
-      </w:r>
-    </w:p>
-    <w:p>
-      <w:r>
+        <w:t>Der Status des Projekts wird mithilfe eines Kanban-Boards dargestellt, das zur Visualisierung des Arbeitsfortschritts sowie zur Organisation der Aufgaben dient.</w:t>
+      </w:r>
+    </w:p>
+    <w:p>
+      <w:r>
+        <w:t>Das Kanban-Board wird dabei zur Abbildung des Sprint-Backlogs verwendet. Die User Stories werden während eines Sprints entsprechend ihres Fortschritts über die einzelnen Spalten des Boards bewegt.</w:t>
+      </w:r>
+    </w:p>
+    <w:p>
+      <w:r>
+        <w:t>Das Board ist in mehrere Spalten unterteilt, die den jeweiligen Bearbeitungsstatus widerspiegeln</w:t>
+      </w:r>
+      <w:r>
+        <w:t xml:space="preserve"> (Backlog, </w:t>
+      </w:r>
+      <w:proofErr w:type="spellStart"/>
+      <w:r>
+        <w:t>Requirements</w:t>
+      </w:r>
+      <w:proofErr w:type="spellEnd"/>
+      <w:r>
+        <w:t xml:space="preserve"> Definition, Architecture Design, Implementation, </w:t>
+      </w:r>
+      <w:proofErr w:type="spellStart"/>
+      <w:proofErr w:type="gramStart"/>
+      <w:r>
+        <w:t>Verification</w:t>
+      </w:r>
+      <w:proofErr w:type="spellEnd"/>
+      <w:r>
+        <w:t xml:space="preserve"> ,</w:t>
+      </w:r>
+      <w:proofErr w:type="gramEnd"/>
+      <w:r>
+        <w:t xml:space="preserve"> Done).</w:t>
+      </w:r>
+    </w:p>
+    <w:p>
+      <w:r>
+        <w:t>Die Aufgaben werden in Form von Karten dargestellt und je nach Fortschritt zwischen den Spalten verschoben. Dadurch ist jederzeit ersichtlich, in welchem Zustand sich die einzelnen Arbeitsschritte befinden.</w:t>
+      </w:r>
+    </w:p>
+    <w:p>
+      <w:pPr>
         <w:rPr>
           <w:noProof/>
         </w:rPr>
+      </w:pPr>
+      <w:r>
+        <w:rPr>
+          <w:noProof/>
+        </w:rPr>
         <w:drawing>
-          <wp:inline distT="0" distB="0" distL="0" distR="0" wp14:anchorId="192B646E" wp14:editId="1403F49A">
-            <wp:extent cx="5753100" cy="577850"/>
-            <wp:effectExtent l="0" t="0" r="0" b="0"/>
-            <wp:docPr id="488241168" name="Grafik 1"/>
+          <wp:inline distT="0" distB="0" distL="0" distR="0" wp14:anchorId="2A17CCF0" wp14:editId="43B43751">
+            <wp:extent cx="5760720" cy="450247"/>
+            <wp:effectExtent l="0" t="0" r="0" b="6985"/>
+            <wp:docPr id="387874253" name="Grafik 4"/>
             <wp:cNvGraphicFramePr>
               <a:graphicFrameLocks xmlns:a="http://schemas.openxmlformats.org/drawingml/2006/main" noChangeAspect="1"/>
             </wp:cNvGraphicFramePr>
@@ -3237,12 +3295,12 @@
               <a:graphicData uri="http://schemas.openxmlformats.org/drawingml/2006/picture">
                 <pic:pic xmlns:pic="http://schemas.openxmlformats.org/drawingml/2006/picture">
                   <pic:nvPicPr>
-                    <pic:cNvPr id="0" name="Grafik 1"/>
+                    <pic:cNvPr id="0" name="Picture 3"/>
                     <pic:cNvPicPr>
                       <a:picLocks noChangeAspect="1" noChangeArrowheads="1"/>
                     </pic:cNvPicPr>
                   </pic:nvPicPr>
-                  <pic:blipFill>
+                  <pic:blipFill rotWithShape="1">
                     <a:blip r:embed="rId8" cstate="print">
                       <a:extLst>
                         <a:ext uri="{28A0092B-C50C-407E-A947-70E740481C1C}">
@@ -3250,7 +3308,7 @@
                         </a:ext>
                       </a:extLst>
                     </a:blip>
-                    <a:srcRect/>
+                    <a:srcRect b="58224"/>
                     <a:stretch>
                       <a:fillRect/>
                     </a:stretch>
@@ -3258,7 +3316,7 @@
                   <pic:spPr bwMode="auto">
                     <a:xfrm>
                       <a:off x="0" y="0"/>
-                      <a:ext cx="5753100" cy="577850"/>
+                      <a:ext cx="5760720" cy="450247"/>
                     </a:xfrm>
                     <a:prstGeom prst="rect">
                       <a:avLst/>
@@ -3267,6 +3325,11 @@
                     <a:ln>
                       <a:noFill/>
                     </a:ln>
+                    <a:extLst>
+                      <a:ext uri="{53640926-AAD7-44D8-BBD7-CCE9431645EC}">
+                        <a14:shadowObscured xmlns:a14="http://schemas.microsoft.com/office/drawing/2010/main"/>
+                      </a:ext>
+                    </a:extLst>
                   </pic:spPr>
                 </pic:pic>
               </a:graphicData>
@@ -3274,6 +3337,8 @@
           </wp:inline>
         </w:drawing>
       </w:r>
+    </w:p>
+    <w:p>
       <w:r>
         <w:t>Das</w:t>
       </w:r>
@@ -3292,12 +3357,13 @@
         <w:t xml:space="preserve"> erstellt.</w:t>
       </w:r>
     </w:p>
+    <w:p/>
     <w:p>
       <w:pPr>
         <w:pStyle w:val="berschrift2"/>
       </w:pPr>
       <w:bookmarkStart w:id="13" w:name="_Toc163900065"/>
-      <w:bookmarkStart w:id="14" w:name="_Toc227915543"/>
+      <w:bookmarkStart w:id="14" w:name="_Toc228175842"/>
       <w:r>
         <w:t>Projektablage</w:t>
       </w:r>
@@ -3339,24 +3405,31 @@
       </w:r>
       <w:proofErr w:type="spellEnd"/>
       <w:r>
-        <w:t xml:space="preserve"> verwendet.</w:t>
-      </w:r>
-    </w:p>
-    <w:p>
-      <w:pPr>
+        <w:t xml:space="preserve"> </w:t>
+      </w:r>
+      <w:r>
+        <w:t>(</w:t>
+      </w:r>
+      <w:proofErr w:type="spellStart"/>
+      <w:r>
+        <w:t>Git</w:t>
+      </w:r>
+      <w:proofErr w:type="spellEnd"/>
+      <w:r>
+        <w:t xml:space="preserve">) </w:t>
+      </w:r>
+      <w:r>
+        <w:t>verwendet.</w:t>
+      </w:r>
+    </w:p>
+    <w:p>
+      <w:pPr>
+        <w:pStyle w:val="berschrift1"/>
         <w:rPr>
           <w:lang w:val="en-US"/>
         </w:rPr>
       </w:pPr>
-    </w:p>
-    <w:p>
-      <w:pPr>
-        <w:pStyle w:val="berschrift1"/>
-        <w:rPr>
-          <w:lang w:val="en-US"/>
-        </w:rPr>
-      </w:pPr>
-      <w:bookmarkStart w:id="15" w:name="_Toc227915544"/>
+      <w:bookmarkStart w:id="15" w:name="_Toc228175843"/>
       <w:proofErr w:type="spellStart"/>
       <w:r>
         <w:rPr>
@@ -3393,7 +3466,7 @@
         <w:pStyle w:val="berschrift2"/>
       </w:pPr>
       <w:bookmarkStart w:id="16" w:name="_Toc165127826"/>
-      <w:bookmarkStart w:id="17" w:name="_Toc227915545"/>
+      <w:bookmarkStart w:id="17" w:name="_Toc228175844"/>
       <w:r>
         <w:t>Be</w:t>
       </w:r>
@@ -3443,10 +3516,16 @@
       </w:r>
     </w:p>
     <w:p>
+      <w:r>
+        <w:br w:type="page"/>
+      </w:r>
+    </w:p>
+    <w:p/>
+    <w:p>
       <w:pPr>
         <w:pStyle w:val="berschrift2"/>
       </w:pPr>
-      <w:bookmarkStart w:id="18" w:name="_Toc227915546"/>
+      <w:bookmarkStart w:id="18" w:name="_Toc228175845"/>
       <w:r>
         <w:t>Ziele</w:t>
       </w:r>
@@ -3476,14 +3555,15 @@
         <w:tblLook w:val="04A0" w:firstRow="1" w:lastRow="0" w:firstColumn="1" w:lastColumn="0" w:noHBand="0" w:noVBand="1"/>
       </w:tblPr>
       <w:tblGrid>
-        <w:gridCol w:w="3681"/>
-        <w:gridCol w:w="1276"/>
-        <w:gridCol w:w="4105"/>
+        <w:gridCol w:w="2487"/>
+        <w:gridCol w:w="2044"/>
+        <w:gridCol w:w="2469"/>
+        <w:gridCol w:w="2062"/>
       </w:tblGrid>
       <w:tr>
         <w:tc>
           <w:tcPr>
-            <w:tcW w:w="3681" w:type="dxa"/>
+            <w:tcW w:w="2487" w:type="dxa"/>
           </w:tcPr>
           <w:p>
             <w:r>
@@ -3493,7 +3573,7 @@
         </w:tc>
         <w:tc>
           <w:tcPr>
-            <w:tcW w:w="1276" w:type="dxa"/>
+            <w:tcW w:w="2044" w:type="dxa"/>
           </w:tcPr>
           <w:p>
             <w:r>
@@ -3503,11 +3583,21 @@
         </w:tc>
         <w:tc>
           <w:tcPr>
-            <w:tcW w:w="4105" w:type="dxa"/>
+            <w:tcW w:w="2469" w:type="dxa"/>
           </w:tcPr>
           <w:p>
             <w:r>
               <w:t>Metrik</w:t>
+            </w:r>
+          </w:p>
+        </w:tc>
+        <w:tc>
+          <w:tcPr>
+            <w:tcW w:w="2062" w:type="dxa"/>
+          </w:tcPr>
+          <w:p>
+            <w:r>
+              <w:t>Abnahmekriterium</w:t>
             </w:r>
           </w:p>
         </w:tc>
@@ -3515,11 +3605,11 @@
       <w:tr>
         <w:tc>
           <w:tcPr>
-            <w:tcW w:w="3681" w:type="dxa"/>
-          </w:tcPr>
-          <w:p>
-            <w:r>
-              <w:t>Alle User Stories und Anforderungen entsprechend dieses Planes durchgesprochen (</w:t>
+            <w:tcW w:w="2487" w:type="dxa"/>
+          </w:tcPr>
+          <w:p>
+            <w:r>
+              <w:t xml:space="preserve">User Stories </w:t>
             </w:r>
             <w:proofErr w:type="spellStart"/>
             <w:r>
@@ -3527,27 +3617,33 @@
             </w:r>
             <w:proofErr w:type="spellEnd"/>
             <w:r>
-              <w:t>) und freigegeben</w:t>
-            </w:r>
-          </w:p>
-          <w:p/>
-        </w:tc>
-        <w:tc>
-          <w:tcPr>
-            <w:tcW w:w="1276" w:type="dxa"/>
-          </w:tcPr>
-          <w:p>
-            <w:r>
-              <w:t>KW1</w:t>
-            </w:r>
-            <w:r>
-              <w:t>8</w:t>
-            </w:r>
-          </w:p>
-        </w:tc>
-        <w:tc>
-          <w:tcPr>
-            <w:tcW w:w="4105" w:type="dxa"/>
+              <w:t xml:space="preserve"> und freigegeben</w:t>
+            </w:r>
+          </w:p>
+        </w:tc>
+        <w:tc>
+          <w:tcPr>
+            <w:tcW w:w="2044" w:type="dxa"/>
+          </w:tcPr>
+          <w:p>
+            <w:r>
+              <w:t>KW18</w:t>
+            </w:r>
+          </w:p>
+        </w:tc>
+        <w:tc>
+          <w:tcPr>
+            <w:tcW w:w="2469" w:type="dxa"/>
+          </w:tcPr>
+          <w:p>
+            <w:r>
+              <w:t>Freigegebene Stories (%)</w:t>
+            </w:r>
+          </w:p>
+        </w:tc>
+        <w:tc>
+          <w:tcPr>
+            <w:tcW w:w="2062" w:type="dxa"/>
           </w:tcPr>
           <w:p>
             <w:pPr>
@@ -3556,12 +3652,64 @@
               </w:rPr>
             </w:pPr>
             <w:r>
-              <w:rPr>
-                <w:lang w:val="en-US"/>
-              </w:rPr>
-              <w:t>Sprint Burndown chart / Kanban Board</w:t>
-            </w:r>
-          </w:p>
+              <w:t xml:space="preserve">100% </w:t>
+            </w:r>
+            <w:proofErr w:type="spellStart"/>
+            <w:r>
+              <w:t>reviewed</w:t>
+            </w:r>
+            <w:proofErr w:type="spellEnd"/>
+            <w:r>
+              <w:t xml:space="preserve"> &amp; </w:t>
+            </w:r>
+            <w:proofErr w:type="spellStart"/>
+            <w:r>
+              <w:t>approved</w:t>
+            </w:r>
+            <w:proofErr w:type="spellEnd"/>
+          </w:p>
+        </w:tc>
+      </w:tr>
+      <w:tr>
+        <w:tc>
+          <w:tcPr>
+            <w:tcW w:w="2487" w:type="dxa"/>
+          </w:tcPr>
+          <w:p>
+            <w:r>
+              <w:t>Architektur definiert und freigegeben</w:t>
+            </w:r>
+          </w:p>
+        </w:tc>
+        <w:tc>
+          <w:tcPr>
+            <w:tcW w:w="2044" w:type="dxa"/>
+          </w:tcPr>
+          <w:p>
+            <w:r>
+              <w:t>KW20</w:t>
+            </w:r>
+          </w:p>
+        </w:tc>
+        <w:tc>
+          <w:tcPr>
+            <w:tcW w:w="2469" w:type="dxa"/>
+          </w:tcPr>
+          <w:p>
+            <w:pPr>
+              <w:rPr>
+                <w:lang w:val="en-US"/>
+              </w:rPr>
+            </w:pPr>
+            <w:r>
+              <w:t>Anzahl offener Architekturfragen</w:t>
+            </w:r>
+          </w:p>
+        </w:tc>
+        <w:tc>
+          <w:tcPr>
+            <w:tcW w:w="2062" w:type="dxa"/>
+          </w:tcPr>
           <w:p>
             <w:pPr>
               <w:rPr>
@@ -3573,74 +3721,57 @@
               <w:rPr>
                 <w:lang w:val="en-US"/>
               </w:rPr>
-              <w:t>Sammelstatus</w:t>
+              <w:t>Architektur</w:t>
             </w:r>
             <w:proofErr w:type="spellEnd"/>
             <w:r>
               <w:rPr>
                 <w:lang w:val="en-US"/>
               </w:rPr>
-              <w:t xml:space="preserve"> </w:t>
+              <w:t xml:space="preserve">-Doku </w:t>
             </w:r>
             <w:proofErr w:type="spellStart"/>
             <w:r>
               <w:rPr>
                 <w:lang w:val="en-US"/>
               </w:rPr>
-              <w:t>Anforderungen</w:t>
+              <w:t>freigegeben</w:t>
             </w:r>
             <w:proofErr w:type="spellEnd"/>
-            <w:r>
-              <w:rPr>
-                <w:lang w:val="en-US"/>
-              </w:rPr>
-              <w:t>/User Stories</w:t>
-            </w:r>
           </w:p>
         </w:tc>
       </w:tr>
       <w:tr>
         <w:tc>
           <w:tcPr>
-            <w:tcW w:w="3681" w:type="dxa"/>
-          </w:tcPr>
-          <w:p>
-            <w:r>
-              <w:t>Architektur entsprechend dieses Planes durchgesprochen vervollständigt und freigegeben</w:t>
-            </w:r>
+            <w:tcW w:w="2487" w:type="dxa"/>
+          </w:tcPr>
+          <w:p>
+            <w:r>
+              <w:t xml:space="preserve">Implementierung </w:t>
+            </w:r>
+            <w:proofErr w:type="spellStart"/>
+            <w:r>
+              <w:t>abgschlossen</w:t>
+            </w:r>
+            <w:proofErr w:type="spellEnd"/>
           </w:p>
           <w:p/>
         </w:tc>
         <w:tc>
           <w:tcPr>
-            <w:tcW w:w="1276" w:type="dxa"/>
-          </w:tcPr>
-          <w:p>
-            <w:r>
-              <w:t>KW</w:t>
-            </w:r>
-            <w:r>
-              <w:t>20</w:t>
-            </w:r>
-          </w:p>
-        </w:tc>
-        <w:tc>
-          <w:tcPr>
-            <w:tcW w:w="4105" w:type="dxa"/>
-          </w:tcPr>
-          <w:p>
-            <w:pPr>
-              <w:rPr>
-                <w:lang w:val="en-US"/>
-              </w:rPr>
-            </w:pPr>
-            <w:r>
-              <w:rPr>
-                <w:lang w:val="en-US"/>
-              </w:rPr>
-              <w:t>Sprint Burndown chart / Kanban Board</w:t>
-            </w:r>
-          </w:p>
+            <w:tcW w:w="2044" w:type="dxa"/>
+          </w:tcPr>
+          <w:p>
+            <w:r>
+              <w:t>KW23</w:t>
+            </w:r>
+          </w:p>
+        </w:tc>
+        <w:tc>
+          <w:tcPr>
+            <w:tcW w:w="2469" w:type="dxa"/>
+          </w:tcPr>
           <w:p>
             <w:pPr>
               <w:rPr>
@@ -3652,68 +3783,106 @@
               <w:rPr>
                 <w:lang w:val="en-US"/>
               </w:rPr>
-              <w:t>Sammelstatus</w:t>
+              <w:t>abgeschlossene</w:t>
             </w:r>
             <w:proofErr w:type="spellEnd"/>
             <w:r>
               <w:rPr>
                 <w:lang w:val="en-US"/>
               </w:rPr>
-              <w:t xml:space="preserve"> Status </w:t>
+              <w:t xml:space="preserve"> Stories</w:t>
+            </w:r>
+          </w:p>
+        </w:tc>
+        <w:tc>
+          <w:tcPr>
+            <w:tcW w:w="2062" w:type="dxa"/>
+          </w:tcPr>
+          <w:p>
+            <w:pPr>
+              <w:rPr>
+                <w:lang w:val="en-US"/>
+              </w:rPr>
+            </w:pPr>
+            <w:r>
+              <w:rPr>
+                <w:lang w:val="en-US"/>
+              </w:rPr>
+              <w:t>Alle Stories „</w:t>
+            </w:r>
+            <w:proofErr w:type="gramStart"/>
+            <w:r>
+              <w:rPr>
+                <w:lang w:val="en-US"/>
+              </w:rPr>
+              <w:t>Done“</w:t>
+            </w:r>
+            <w:proofErr w:type="gramEnd"/>
+            <w:r>
+              <w:rPr>
+                <w:lang w:val="en-US"/>
+              </w:rPr>
+              <w:t xml:space="preserve">, </w:t>
             </w:r>
             <w:proofErr w:type="spellStart"/>
             <w:r>
               <w:rPr>
                 <w:lang w:val="en-US"/>
               </w:rPr>
-              <w:t>Architektur</w:t>
+              <w:t>keine</w:t>
             </w:r>
             <w:proofErr w:type="spellEnd"/>
+            <w:r>
+              <w:rPr>
+                <w:lang w:val="en-US"/>
+              </w:rPr>
+              <w:t xml:space="preserve"> </w:t>
+            </w:r>
+            <w:proofErr w:type="spellStart"/>
+            <w:r>
+              <w:rPr>
+                <w:lang w:val="en-US"/>
+              </w:rPr>
+              <w:t>kritischen</w:t>
+            </w:r>
+            <w:proofErr w:type="spellEnd"/>
+            <w:r>
+              <w:rPr>
+                <w:lang w:val="en-US"/>
+              </w:rPr>
+              <w:t xml:space="preserve"> Bugs</w:t>
+            </w:r>
           </w:p>
         </w:tc>
       </w:tr>
       <w:tr>
         <w:tc>
           <w:tcPr>
-            <w:tcW w:w="3681" w:type="dxa"/>
-          </w:tcPr>
-          <w:p>
-            <w:r>
-              <w:t>Implementierung entsprechend dieses Planes durchgeführt</w:t>
-            </w:r>
-          </w:p>
-          <w:p/>
-        </w:tc>
-        <w:tc>
-          <w:tcPr>
-            <w:tcW w:w="1276" w:type="dxa"/>
-          </w:tcPr>
-          <w:p>
-            <w:r>
-              <w:lastRenderedPageBreak/>
-              <w:t>KW23</w:t>
-            </w:r>
-          </w:p>
-        </w:tc>
-        <w:tc>
-          <w:tcPr>
-            <w:tcW w:w="4105" w:type="dxa"/>
+            <w:tcW w:w="2487" w:type="dxa"/>
+          </w:tcPr>
+          <w:p>
+            <w:r>
+              <w:t xml:space="preserve">Verifikation durchgeführt </w:t>
+            </w:r>
+          </w:p>
+        </w:tc>
+        <w:tc>
+          <w:tcPr>
+            <w:tcW w:w="2044" w:type="dxa"/>
+          </w:tcPr>
+          <w:p>
+            <w:r>
+              <w:t>KW25</w:t>
+            </w:r>
+          </w:p>
+        </w:tc>
+        <w:tc>
+          <w:tcPr>
+            <w:tcW w:w="2469" w:type="dxa"/>
           </w:tcPr>
           <w:p>
             <w:pPr>
-              <w:rPr>
-                <w:lang w:val="en-US"/>
-              </w:rPr>
-            </w:pPr>
-            <w:r>
-              <w:rPr>
-                <w:lang w:val="en-US"/>
-              </w:rPr>
-              <w:t>Sprint Burndown chart / Kanban Board</w:t>
-            </w:r>
-          </w:p>
-          <w:p>
-            <w:pPr>
+              <w:jc w:val="both"/>
               <w:rPr>
                 <w:lang w:val="en-US"/>
               </w:rPr>
@@ -3723,102 +3892,53 @@
               <w:rPr>
                 <w:lang w:val="en-US"/>
               </w:rPr>
-              <w:t>Sammelstatus</w:t>
+              <w:t>B</w:t>
+            </w:r>
+            <w:r>
+              <w:rPr>
+                <w:lang w:val="en-US"/>
+              </w:rPr>
+              <w:t>estandene</w:t>
             </w:r>
             <w:proofErr w:type="spellEnd"/>
             <w:r>
               <w:rPr>
                 <w:lang w:val="en-US"/>
               </w:rPr>
-              <w:t xml:space="preserve"> Module </w:t>
+              <w:t xml:space="preserve"> Tests</w:t>
+            </w:r>
+            <w:r>
+              <w:rPr>
+                <w:lang w:val="en-US"/>
+              </w:rPr>
+              <w:t xml:space="preserve"> (%)</w:t>
+            </w:r>
+          </w:p>
+        </w:tc>
+        <w:tc>
+          <w:tcPr>
+            <w:tcW w:w="2062" w:type="dxa"/>
+          </w:tcPr>
+          <w:p>
+            <w:pPr>
+              <w:rPr>
+                <w:lang w:val="en-US"/>
+              </w:rPr>
+            </w:pPr>
+            <w:r>
+              <w:rPr>
+                <w:lang w:val="en-US"/>
+              </w:rPr>
+              <w:t xml:space="preserve">≥95% Tests </w:t>
             </w:r>
             <w:proofErr w:type="spellStart"/>
             <w:r>
               <w:rPr>
                 <w:lang w:val="en-US"/>
               </w:rPr>
-              <w:t>zu</w:t>
+              <w:t>bestanden</w:t>
             </w:r>
             <w:proofErr w:type="spellEnd"/>
-            <w:r>
-              <w:rPr>
-                <w:lang w:val="en-US"/>
-              </w:rPr>
-              <w:t xml:space="preserve"> </w:t>
-            </w:r>
-            <w:proofErr w:type="spellStart"/>
-            <w:r>
-              <w:rPr>
-                <w:lang w:val="en-US"/>
-              </w:rPr>
-              <w:t>implementieren</w:t>
-            </w:r>
-            <w:proofErr w:type="spellEnd"/>
-          </w:p>
-        </w:tc>
-      </w:tr>
-      <w:tr>
-        <w:tc>
-          <w:tcPr>
-            <w:tcW w:w="3681" w:type="dxa"/>
-          </w:tcPr>
-          <w:p>
-            <w:r>
-              <w:t>Verifikation entsprechend dieses Planes durchgeführt</w:t>
-            </w:r>
-          </w:p>
-          <w:p/>
-        </w:tc>
-        <w:tc>
-          <w:tcPr>
-            <w:tcW w:w="1276" w:type="dxa"/>
-          </w:tcPr>
-          <w:p>
-            <w:r>
-              <w:t>KW2</w:t>
-            </w:r>
-            <w:r>
-              <w:t>5</w:t>
-            </w:r>
-          </w:p>
-        </w:tc>
-        <w:tc>
-          <w:tcPr>
-            <w:tcW w:w="4105" w:type="dxa"/>
-          </w:tcPr>
-          <w:p>
-            <w:pPr>
-              <w:rPr>
-                <w:lang w:val="en-US"/>
-              </w:rPr>
-            </w:pPr>
-            <w:r>
-              <w:rPr>
-                <w:lang w:val="en-US"/>
-              </w:rPr>
-              <w:t>Sprint Burndown chart / Kanban Board</w:t>
-            </w:r>
-          </w:p>
-          <w:p>
-            <w:pPr>
-              <w:rPr>
-                <w:lang w:val="en-US"/>
-              </w:rPr>
-            </w:pPr>
-            <w:proofErr w:type="spellStart"/>
-            <w:r>
-              <w:rPr>
-                <w:lang w:val="en-US"/>
-              </w:rPr>
-              <w:t>Sammelstatus</w:t>
-            </w:r>
-            <w:proofErr w:type="spellEnd"/>
-            <w:r>
-              <w:rPr>
-                <w:lang w:val="en-US"/>
-              </w:rPr>
-              <w:t xml:space="preserve"> Test Cases</w:t>
-            </w:r>
           </w:p>
         </w:tc>
       </w:tr>
@@ -3839,7 +3959,7 @@
           <w:lang w:val="en-US"/>
         </w:rPr>
       </w:pPr>
-      <w:bookmarkStart w:id="19" w:name="_Toc227915547"/>
+      <w:bookmarkStart w:id="19" w:name="_Toc228175846"/>
       <w:proofErr w:type="spellStart"/>
       <w:r>
         <w:rPr>
@@ -3859,15 +3979,13 @@
     </w:p>
     <w:p>
       <w:r>
-        <w:t>In dem Projekt werden zunächst die Stakeholder identifiziert und ihre Bedürfnisse in Form von User Stories erfasst. Auf Grundlage dieser User Stories werden anschließend die Anforderungen abgeleitet.</w:t>
-      </w:r>
-    </w:p>
-    <w:p>
-      <w:r>
-        <w:t>Basierend auf den definierten Anforderungen wird die Systemarchitektur entwickelt. Darauf aufbauend werden die Testfälle aus den Anforderungen abgeleitet, wobei insbesondere die in den User Stories formulierten Akzeptanzkriterien berücksichtigt werden.</w:t>
-      </w:r>
-    </w:p>
-    <w:p>
+        <w:t>Im Projekt werden zunächst die Stakeholder identifiziert und ihre Bedürfnisse in Form von User Stories erfasst. Aus diesen User Stories werden die funktionalen und nicht-funktionalen Anforderungen systematisch abgeleitet.</w:t>
+      </w:r>
+    </w:p>
+    <w:p>
+      <w:r>
+        <w:t>Auf Basis der definierten Anforderungen wird anschließend die Systemarchitektur entworfen und spezifiziert. Darauf aufbauend werden die Testfälle entwickelt, wobei insbesondere die in den User Stories formulierten Akzeptanzkriterien als Grundlage für die Verifikation herangezogen werden.</w:t>
+      </w:r>
       <w:r>
         <w:rPr>
           <w:noProof/>
@@ -3989,12 +4107,18 @@
     </w:tbl>
     <w:p/>
     <w:p>
+      <w:r>
+        <w:br w:type="page"/>
+      </w:r>
+    </w:p>
+    <w:p>
       <w:pPr>
         <w:pStyle w:val="berschrift2"/>
       </w:pPr>
       <w:bookmarkStart w:id="20" w:name="_Toc165127830"/>
-      <w:bookmarkStart w:id="21" w:name="_Toc227915548"/>
-      <w:r>
+      <w:bookmarkStart w:id="21" w:name="_Toc228175847"/>
+      <w:r>
+        <w:lastRenderedPageBreak/>
         <w:t>Anforderungsmanagement</w:t>
       </w:r>
       <w:bookmarkEnd w:id="20"/>
@@ -4181,7 +4305,6 @@
           </w:tcPr>
           <w:p>
             <w:r>
-              <w:lastRenderedPageBreak/>
               <w:t>Kategorie</w:t>
             </w:r>
           </w:p>
@@ -4281,7 +4404,31 @@
     </w:tbl>
     <w:p>
       <w:r>
-        <w:t>User Stories und Anforderungen werden in der Excel-Datei „Stories_Req.xlsx“ verwaltet. Die Nachverfolgbarkeit (</w:t>
+        <w:t>User Stories und Anforderungen werden in der Excel-Datei „</w:t>
+      </w:r>
+      <w:r>
+        <w:rPr>
+          <w:rFonts w:eastAsia="Times New Roman" w:cstheme="minorHAnsi"/>
+          <w:lang w:eastAsia="de-DE"/>
+        </w:rPr>
+        <w:t>Stories_Req</w:t>
+      </w:r>
+      <w:r>
+        <w:rPr>
+          <w:rFonts w:eastAsia="Times New Roman" w:cstheme="minorHAnsi"/>
+          <w:lang w:eastAsia="de-DE"/>
+        </w:rPr>
+        <w:t>_Design_Test_Template</w:t>
+      </w:r>
+      <w:r>
+        <w:rPr>
+          <w:rFonts w:eastAsia="Times New Roman" w:cstheme="minorHAnsi"/>
+          <w:lang w:eastAsia="de-DE"/>
+        </w:rPr>
+        <w:t>.xlsx</w:t>
+      </w:r>
+      <w:r>
+        <w:t>“ verwaltet. Die Nachverfolgbarkeit (</w:t>
       </w:r>
       <w:proofErr w:type="spellStart"/>
       <w:r>
@@ -4396,7 +4543,7 @@
           <w:lang w:val="en-US"/>
         </w:rPr>
       </w:pPr>
-      <w:bookmarkStart w:id="22" w:name="_Toc227915549"/>
+      <w:bookmarkStart w:id="22" w:name="_Toc228175848"/>
       <w:proofErr w:type="spellStart"/>
       <w:r>
         <w:rPr>
@@ -4425,7 +4572,7 @@
       <w:pPr>
         <w:pStyle w:val="berschrift2"/>
       </w:pPr>
-      <w:bookmarkStart w:id="24" w:name="_Toc227915550"/>
+      <w:bookmarkStart w:id="24" w:name="_Toc228175849"/>
       <w:r>
         <w:t>Architektur</w:t>
       </w:r>
@@ -4537,7 +4684,21 @@
           <w:rFonts w:eastAsia="Times New Roman" w:cstheme="minorHAnsi"/>
           <w:lang w:eastAsia="de-DE"/>
         </w:rPr>
-        <w:t>&gt;. Diese Identifikatoren dienen dazu, Anforderungen eindeutig mit den jeweiligen Architekturelementen zu verknüpfen. Die Zuordnung wird in der Excel-Datei „Stories_Req.xlsx“ dokumentiert.</w:t>
+        <w:t>&gt;. Diese Identifikatoren dienen dazu, Anforderungen eindeutig mit den jeweiligen Architekturelementen zu verknüpfen. Die Zuordnung wird in der Excel-Datei „Stories_Req</w:t>
+      </w:r>
+      <w:r>
+        <w:rPr>
+          <w:rFonts w:eastAsia="Times New Roman" w:cstheme="minorHAnsi"/>
+          <w:lang w:eastAsia="de-DE"/>
+        </w:rPr>
+        <w:t>_Design_Test_Template</w:t>
+      </w:r>
+      <w:r>
+        <w:rPr>
+          <w:rFonts w:eastAsia="Times New Roman" w:cstheme="minorHAnsi"/>
+          <w:lang w:eastAsia="de-DE"/>
+        </w:rPr>
+        <w:t>.xlsx“ dokumentiert.</w:t>
       </w:r>
     </w:p>
     <w:p>
@@ -4548,12 +4709,13 @@
           <w:lang w:eastAsia="de-DE"/>
         </w:rPr>
       </w:pPr>
-      <w:bookmarkStart w:id="26" w:name="_Toc227915551"/>
+      <w:bookmarkStart w:id="26" w:name="_Toc228175850"/>
       <w:r>
         <w:rPr>
           <w:rFonts w:eastAsia="Times New Roman"/>
           <w:lang w:eastAsia="de-DE"/>
         </w:rPr>
+        <w:lastRenderedPageBreak/>
         <w:t>Modellierung</w:t>
       </w:r>
       <w:bookmarkEnd w:id="26"/>
@@ -4647,7 +4809,44 @@
           <w:rFonts w:eastAsia="Times New Roman" w:cstheme="minorHAnsi"/>
           <w:lang w:eastAsia="de-DE"/>
         </w:rPr>
-        <w:t>Die Erstellung der Diagramme erfolgt mit dem Tool „Lucidchart“.</w:t>
+        <w:t>Die Erstellung der Diagramme erfolgt mit dem Tool „</w:t>
+      </w:r>
+      <w:proofErr w:type="spellStart"/>
+      <w:r>
+        <w:rPr>
+          <w:rFonts w:eastAsia="Times New Roman" w:cstheme="minorHAnsi"/>
+          <w:lang w:eastAsia="de-DE"/>
+        </w:rPr>
+        <w:t>Lucidchart</w:t>
+      </w:r>
+      <w:proofErr w:type="spellEnd"/>
+      <w:r>
+        <w:rPr>
+          <w:rFonts w:eastAsia="Times New Roman" w:cstheme="minorHAnsi"/>
+          <w:lang w:eastAsia="de-DE"/>
+        </w:rPr>
+        <w:t>“</w:t>
+      </w:r>
+      <w:r>
+        <w:rPr>
+          <w:rFonts w:eastAsia="Times New Roman" w:cstheme="minorHAnsi"/>
+          <w:lang w:eastAsia="de-DE"/>
+        </w:rPr>
+        <w:t xml:space="preserve"> [</w:t>
+      </w:r>
+      <w:r>
+        <w:rPr>
+          <w:rFonts w:eastAsia="Times New Roman" w:cstheme="minorHAnsi"/>
+          <w:lang w:eastAsia="de-DE"/>
+        </w:rPr>
+        <w:t>3]</w:t>
+      </w:r>
+      <w:r>
+        <w:rPr>
+          <w:rFonts w:eastAsia="Times New Roman" w:cstheme="minorHAnsi"/>
+          <w:lang w:eastAsia="de-DE"/>
+        </w:rPr>
+        <w:t>.</w:t>
       </w:r>
     </w:p>
     <w:p>
@@ -4657,29 +4856,15 @@
           <w:rFonts w:asciiTheme="minorHAnsi" w:hAnsiTheme="minorHAnsi" w:cstheme="minorHAnsi"/>
         </w:rPr>
       </w:pPr>
-      <w:bookmarkStart w:id="27" w:name="_Toc227915552"/>
+      <w:bookmarkStart w:id="27" w:name="_Toc228175851"/>
       <w:r>
         <w:rPr>
           <w:rFonts w:asciiTheme="minorHAnsi" w:hAnsiTheme="minorHAnsi" w:cstheme="minorHAnsi"/>
         </w:rPr>
-        <w:lastRenderedPageBreak/>
         <w:t>Designentscheidungen</w:t>
       </w:r>
       <w:bookmarkEnd w:id="25"/>
       <w:bookmarkEnd w:id="27"/>
-    </w:p>
-    <w:p>
-      <w:pPr>
-        <w:rPr>
-          <w:color w:val="EE0000"/>
-        </w:rPr>
-      </w:pPr>
-      <w:r>
-        <w:rPr>
-          <w:color w:val="EE0000"/>
-        </w:rPr>
-        <w:t>TBD</w:t>
-      </w:r>
     </w:p>
     <w:p>
       <w:pPr>
@@ -4865,7 +5050,37 @@
     </w:p>
     <w:p>
       <w:r>
-        <w:t xml:space="preserve">Die Designentscheidungen werden auch in der Excel Tabelle „Stories_Req.xlsx“ dokumentiert. </w:t>
+        <w:t xml:space="preserve">Die Designentscheidungen werden </w:t>
+      </w:r>
+      <w:r>
+        <w:t>ebenfalls</w:t>
+      </w:r>
+      <w:r>
+        <w:t xml:space="preserve"> in der Excel Tabelle „</w:t>
+      </w:r>
+      <w:r>
+        <w:rPr>
+          <w:rFonts w:eastAsia="Times New Roman" w:cstheme="minorHAnsi"/>
+          <w:lang w:eastAsia="de-DE"/>
+        </w:rPr>
+        <w:t>Stories_Req</w:t>
+      </w:r>
+      <w:r>
+        <w:rPr>
+          <w:rFonts w:eastAsia="Times New Roman" w:cstheme="minorHAnsi"/>
+          <w:lang w:eastAsia="de-DE"/>
+        </w:rPr>
+        <w:t>_Design_Test_Template</w:t>
+      </w:r>
+      <w:r>
+        <w:rPr>
+          <w:rFonts w:eastAsia="Times New Roman" w:cstheme="minorHAnsi"/>
+          <w:lang w:eastAsia="de-DE"/>
+        </w:rPr>
+        <w:t>.xlsx</w:t>
+      </w:r>
+      <w:r>
+        <w:t xml:space="preserve">“ dokumentiert. </w:t>
       </w:r>
     </w:p>
     <w:p>
@@ -4873,8 +5088,9 @@
         <w:pStyle w:val="berschrift2"/>
       </w:pPr>
       <w:bookmarkStart w:id="28" w:name="_Toc165127834"/>
-      <w:bookmarkStart w:id="29" w:name="_Toc227915553"/>
-      <w:r>
+      <w:bookmarkStart w:id="29" w:name="_Toc228175852"/>
+      <w:r>
+        <w:lastRenderedPageBreak/>
         <w:t>Wiederverwendung von Open Source Libraries</w:t>
       </w:r>
       <w:bookmarkEnd w:id="28"/>
@@ -4893,7 +5109,7 @@
           <w:lang w:val="en-US"/>
         </w:rPr>
       </w:pPr>
-      <w:bookmarkStart w:id="30" w:name="_Toc227915554"/>
+      <w:bookmarkStart w:id="30" w:name="_Toc228175853"/>
       <w:proofErr w:type="spellStart"/>
       <w:r>
         <w:rPr>
@@ -4921,27 +5137,19 @@
     <w:p>
       <w:pPr>
         <w:rPr>
-          <w:color w:val="EE0000"/>
           <w:lang w:val="en-US"/>
         </w:rPr>
       </w:pPr>
-      <w:r>
-        <w:rPr>
-          <w:color w:val="EE0000"/>
+    </w:p>
+    <w:p>
+      <w:pPr>
+        <w:pStyle w:val="berschrift2"/>
+        <w:rPr>
           <w:lang w:val="en-US"/>
         </w:rPr>
-        <w:t>TBD</w:t>
-      </w:r>
-    </w:p>
-    <w:p>
-      <w:pPr>
-        <w:pStyle w:val="berschrift2"/>
-        <w:rPr>
-          <w:lang w:val="en-US"/>
-        </w:rPr>
       </w:pPr>
       <w:bookmarkStart w:id="31" w:name="_Toc165127836"/>
-      <w:bookmarkStart w:id="32" w:name="_Toc227915555"/>
+      <w:bookmarkStart w:id="32" w:name="_Toc228175854"/>
       <w:proofErr w:type="spellStart"/>
       <w:r>
         <w:rPr>
@@ -4966,35 +5174,12 @@
       </w:r>
       <w:proofErr w:type="gramEnd"/>
       <w:r>
-        <w:t xml:space="preserve"> w</w:t>
-      </w:r>
-      <w:r>
-        <w:t>e</w:t>
-      </w:r>
-      <w:r>
-        <w:t>rden aus den An</w:t>
-      </w:r>
-      <w:r>
-        <w:t>forderungen hergeleitet und zu den Anforderungen verlinkt.</w:t>
-      </w:r>
-    </w:p>
-    <w:p>
-      <w:r>
-        <w:t xml:space="preserve">Die </w:t>
-      </w:r>
-      <w:proofErr w:type="gramStart"/>
-      <w:r>
-        <w:t>Test Cases</w:t>
-      </w:r>
-      <w:proofErr w:type="gramEnd"/>
-      <w:r>
-        <w:t xml:space="preserve"> werden geschrieben mit Hilfe </w:t>
-      </w:r>
-      <w:proofErr w:type="gramStart"/>
-      <w:r>
-        <w:t>vom folgendem Template</w:t>
-      </w:r>
-      <w:proofErr w:type="gramEnd"/>
+        <w:t xml:space="preserve"> werden aus den Anforderungen abgeleitet und mit diesen verknüpft.</w:t>
+      </w:r>
+      <w:r>
+        <w:br/>
+        <w:t>Die Test Cases werden mithilfe des folgenden Templates erstellt</w:t>
+      </w:r>
       <w:r>
         <w:t>:</w:t>
       </w:r>
@@ -5004,7 +5189,6 @@
         <w:rPr>
           <w:noProof/>
         </w:rPr>
-        <w:lastRenderedPageBreak/>
         <w:drawing>
           <wp:inline distT="0" distB="0" distL="0" distR="0" wp14:anchorId="4A66F466" wp14:editId="6ABAC492">
             <wp:extent cx="5760720" cy="387985"/>
@@ -5044,7 +5228,7 @@
     </w:p>
     <w:p>
       <w:r>
-        <w:t xml:space="preserve">Die </w:t>
+        <w:t xml:space="preserve">Die Dokumentation der </w:t>
       </w:r>
       <w:proofErr w:type="gramStart"/>
       <w:r>
@@ -5052,15 +5236,12 @@
       </w:r>
       <w:proofErr w:type="gramEnd"/>
       <w:r>
-        <w:t xml:space="preserve"> werden in de</w:t>
-      </w:r>
-      <w:r>
-        <w:t>r Excel Tabelle „Stories_Req.xlsx“ dokumentiert.</w:t>
-      </w:r>
-    </w:p>
-    <w:p>
-      <w:r>
-        <w:t>Log Files werden in der Projektablage abgelegt. Die Log Files werden entsprechend Test Case ID benannt, um die Nachverfolgbarkeit zu unterstützen.</w:t>
+        <w:t xml:space="preserve"> erfolgt in der Excel-Tabelle „Stories_Req_Design_Test_Template.xlsx“.</w:t>
+      </w:r>
+    </w:p>
+    <w:p>
+      <w:r>
+        <w:t>Logfiles werden in der Projektablage gespeichert und entsprechend der Test-Case-ID benannt, um die Nachverfolgbarkeit sicherzustellen.</w:t>
       </w:r>
     </w:p>
     <w:p>
@@ -5084,7 +5265,7 @@
           <w:lang w:val="en-US"/>
         </w:rPr>
       </w:pPr>
-      <w:bookmarkStart w:id="33" w:name="_Toc227915556"/>
+      <w:bookmarkStart w:id="33" w:name="_Toc228175855"/>
       <w:r>
         <w:rPr>
           <w:lang w:val="en-US"/>
@@ -5093,6 +5274,992 @@
         <w:t>References</w:t>
       </w:r>
       <w:bookmarkEnd w:id="33"/>
+    </w:p>
+    <w:tbl>
+      <w:tblPr>
+        <w:tblStyle w:val="Tabellenraster"/>
+        <w:tblW w:w="0" w:type="auto"/>
+        <w:tblLayout w:type="fixed"/>
+        <w:tblLook w:val="04A0" w:firstRow="1" w:lastRow="0" w:firstColumn="1" w:lastColumn="0" w:noHBand="0" w:noVBand="1"/>
+      </w:tblPr>
+      <w:tblGrid>
+        <w:gridCol w:w="704"/>
+        <w:gridCol w:w="3402"/>
+        <w:gridCol w:w="4084"/>
+        <w:gridCol w:w="872"/>
+      </w:tblGrid>
+      <w:tr>
+        <w:tc>
+          <w:tcPr>
+            <w:tcW w:w="704" w:type="dxa"/>
+          </w:tcPr>
+          <w:p>
+            <w:pPr>
+              <w:rPr>
+                <w:lang w:val="en-US"/>
+              </w:rPr>
+            </w:pPr>
+            <w:r>
+              <w:rPr>
+                <w:lang w:val="en-US"/>
+              </w:rPr>
+              <w:t>Nr.</w:t>
+            </w:r>
+          </w:p>
+        </w:tc>
+        <w:tc>
+          <w:tcPr>
+            <w:tcW w:w="3402" w:type="dxa"/>
+          </w:tcPr>
+          <w:p>
+            <w:pPr>
+              <w:rPr>
+                <w:lang w:val="en-US"/>
+              </w:rPr>
+            </w:pPr>
+            <w:r>
+              <w:rPr>
+                <w:lang w:val="en-US"/>
+              </w:rPr>
+              <w:t>Name</w:t>
+            </w:r>
+          </w:p>
+        </w:tc>
+        <w:tc>
+          <w:tcPr>
+            <w:tcW w:w="4084" w:type="dxa"/>
+          </w:tcPr>
+          <w:p>
+            <w:pPr>
+              <w:rPr>
+                <w:lang w:val="en-US"/>
+              </w:rPr>
+            </w:pPr>
+            <w:r>
+              <w:rPr>
+                <w:lang w:val="en-US"/>
+              </w:rPr>
+              <w:t>Link</w:t>
+            </w:r>
+          </w:p>
+        </w:tc>
+        <w:tc>
+          <w:tcPr>
+            <w:tcW w:w="872" w:type="dxa"/>
+          </w:tcPr>
+          <w:p>
+            <w:pPr>
+              <w:rPr>
+                <w:lang w:val="en-US"/>
+              </w:rPr>
+            </w:pPr>
+            <w:r>
+              <w:rPr>
+                <w:lang w:val="en-US"/>
+              </w:rPr>
+              <w:t>Revision</w:t>
+            </w:r>
+          </w:p>
+        </w:tc>
+      </w:tr>
+      <w:tr>
+        <w:tc>
+          <w:tcPr>
+            <w:tcW w:w="704" w:type="dxa"/>
+          </w:tcPr>
+          <w:p>
+            <w:pPr>
+              <w:rPr>
+                <w:lang w:val="en-US"/>
+              </w:rPr>
+            </w:pPr>
+            <w:r>
+              <w:rPr>
+                <w:lang w:val="en-US"/>
+              </w:rPr>
+              <w:t>[1]</w:t>
+            </w:r>
+          </w:p>
+        </w:tc>
+        <w:tc>
+          <w:tcPr>
+            <w:tcW w:w="3402" w:type="dxa"/>
+          </w:tcPr>
+          <w:p>
+            <w:pPr>
+              <w:rPr>
+                <w:lang w:val="en-US"/>
+              </w:rPr>
+            </w:pPr>
+            <w:proofErr w:type="spellStart"/>
+            <w:r>
+              <w:rPr>
+                <w:lang w:val="en-US"/>
+              </w:rPr>
+              <w:t>Github</w:t>
+            </w:r>
+            <w:proofErr w:type="spellEnd"/>
+            <w:r>
+              <w:rPr>
+                <w:lang w:val="en-US"/>
+              </w:rPr>
+              <w:t xml:space="preserve"> Sprints</w:t>
+            </w:r>
+          </w:p>
+        </w:tc>
+        <w:tc>
+          <w:tcPr>
+            <w:tcW w:w="4084" w:type="dxa"/>
+          </w:tcPr>
+          <w:p>
+            <w:pPr>
+              <w:rPr>
+                <w:lang w:val="en-US"/>
+              </w:rPr>
+            </w:pPr>
+            <w:r>
+              <w:rPr>
+                <w:color w:val="EE0000"/>
+                <w:lang w:val="en-US"/>
+              </w:rPr>
+              <w:t>TBD</w:t>
+            </w:r>
+          </w:p>
+        </w:tc>
+        <w:tc>
+          <w:tcPr>
+            <w:tcW w:w="872" w:type="dxa"/>
+          </w:tcPr>
+          <w:p>
+            <w:pPr>
+              <w:rPr>
+                <w:lang w:val="en-US"/>
+              </w:rPr>
+            </w:pPr>
+            <w:r>
+              <w:rPr>
+                <w:lang w:val="en-US"/>
+              </w:rPr>
+              <w:t>1.0</w:t>
+            </w:r>
+          </w:p>
+        </w:tc>
+      </w:tr>
+      <w:tr>
+        <w:tc>
+          <w:tcPr>
+            <w:tcW w:w="704" w:type="dxa"/>
+          </w:tcPr>
+          <w:p>
+            <w:pPr>
+              <w:rPr>
+                <w:lang w:val="en-US"/>
+              </w:rPr>
+            </w:pPr>
+            <w:r>
+              <w:rPr>
+                <w:lang w:val="en-US"/>
+              </w:rPr>
+              <w:t>[2]</w:t>
+            </w:r>
+          </w:p>
+        </w:tc>
+        <w:tc>
+          <w:tcPr>
+            <w:tcW w:w="3402" w:type="dxa"/>
+          </w:tcPr>
+          <w:p>
+            <w:pPr>
+              <w:rPr>
+                <w:lang w:val="en-US"/>
+              </w:rPr>
+            </w:pPr>
+            <w:r>
+              <w:rPr>
+                <w:rFonts w:eastAsia="Times New Roman" w:cstheme="minorHAnsi"/>
+                <w:lang w:eastAsia="de-DE"/>
+              </w:rPr>
+              <w:t>Stories_Req</w:t>
+            </w:r>
+            <w:r>
+              <w:rPr>
+                <w:rFonts w:eastAsia="Times New Roman" w:cstheme="minorHAnsi"/>
+                <w:lang w:eastAsia="de-DE"/>
+              </w:rPr>
+              <w:t>_Design_Test_Template</w:t>
+            </w:r>
+            <w:r>
+              <w:rPr>
+                <w:rFonts w:eastAsia="Times New Roman" w:cstheme="minorHAnsi"/>
+                <w:lang w:eastAsia="de-DE"/>
+              </w:rPr>
+              <w:t>.xlsx</w:t>
+            </w:r>
+          </w:p>
+        </w:tc>
+        <w:tc>
+          <w:tcPr>
+            <w:tcW w:w="4084" w:type="dxa"/>
+          </w:tcPr>
+          <w:p>
+            <w:pPr>
+              <w:rPr>
+                <w:lang w:val="en-US"/>
+              </w:rPr>
+            </w:pPr>
+            <w:r>
+              <w:rPr>
+                <w:color w:val="EE0000"/>
+                <w:lang w:val="en-US"/>
+              </w:rPr>
+              <w:t>TBD</w:t>
+            </w:r>
+          </w:p>
+        </w:tc>
+        <w:tc>
+          <w:tcPr>
+            <w:tcW w:w="872" w:type="dxa"/>
+          </w:tcPr>
+          <w:p>
+            <w:pPr>
+              <w:rPr>
+                <w:lang w:val="en-US"/>
+              </w:rPr>
+            </w:pPr>
+            <w:r>
+              <w:rPr>
+                <w:lang w:val="en-US"/>
+              </w:rPr>
+              <w:t>2.0</w:t>
+            </w:r>
+          </w:p>
+        </w:tc>
+      </w:tr>
+      <w:tr>
+        <w:tc>
+          <w:tcPr>
+            <w:tcW w:w="704" w:type="dxa"/>
+          </w:tcPr>
+          <w:p>
+            <w:pPr>
+              <w:rPr>
+                <w:lang w:val="en-US"/>
+              </w:rPr>
+            </w:pPr>
+            <w:r>
+              <w:rPr>
+                <w:lang w:val="en-US"/>
+              </w:rPr>
+              <w:t>[3]</w:t>
+            </w:r>
+          </w:p>
+        </w:tc>
+        <w:tc>
+          <w:tcPr>
+            <w:tcW w:w="3402" w:type="dxa"/>
+          </w:tcPr>
+          <w:p>
+            <w:pPr>
+              <w:rPr>
+                <w:lang w:val="en-US"/>
+              </w:rPr>
+            </w:pPr>
+            <w:proofErr w:type="spellStart"/>
+            <w:r>
+              <w:rPr>
+                <w:rFonts w:eastAsia="Times New Roman" w:cstheme="minorHAnsi"/>
+                <w:lang w:eastAsia="de-DE"/>
+              </w:rPr>
+              <w:t>Lucidchart</w:t>
+            </w:r>
+            <w:proofErr w:type="spellEnd"/>
+          </w:p>
+        </w:tc>
+        <w:tc>
+          <w:tcPr>
+            <w:tcW w:w="4084" w:type="dxa"/>
+          </w:tcPr>
+          <w:p>
+            <w:pPr>
+              <w:rPr>
+                <w:lang w:val="en-US"/>
+              </w:rPr>
+            </w:pPr>
+            <w:r>
+              <w:rPr>
+                <w:lang w:val="en-US"/>
+              </w:rPr>
+              <w:t>https://www.lucidchart.com/pages/de/tutorial/was-ist-ein-uml-diagramm</w:t>
+            </w:r>
+          </w:p>
+        </w:tc>
+        <w:tc>
+          <w:tcPr>
+            <w:tcW w:w="872" w:type="dxa"/>
+          </w:tcPr>
+          <w:p>
+            <w:pPr>
+              <w:rPr>
+                <w:lang w:val="en-US"/>
+              </w:rPr>
+            </w:pPr>
+            <w:r>
+              <w:rPr>
+                <w:lang w:val="en-US"/>
+              </w:rPr>
+              <w:t>3.0</w:t>
+            </w:r>
+          </w:p>
+        </w:tc>
+      </w:tr>
+      <w:tr>
+        <w:tc>
+          <w:tcPr>
+            <w:tcW w:w="704" w:type="dxa"/>
+          </w:tcPr>
+          <w:p>
+            <w:pPr>
+              <w:rPr>
+                <w:lang w:val="en-US"/>
+              </w:rPr>
+            </w:pPr>
+          </w:p>
+        </w:tc>
+        <w:tc>
+          <w:tcPr>
+            <w:tcW w:w="3402" w:type="dxa"/>
+          </w:tcPr>
+          <w:p>
+            <w:pPr>
+              <w:rPr>
+                <w:lang w:val="en-US"/>
+              </w:rPr>
+            </w:pPr>
+          </w:p>
+        </w:tc>
+        <w:tc>
+          <w:tcPr>
+            <w:tcW w:w="4084" w:type="dxa"/>
+          </w:tcPr>
+          <w:p>
+            <w:pPr>
+              <w:rPr>
+                <w:lang w:val="en-US"/>
+              </w:rPr>
+            </w:pPr>
+          </w:p>
+        </w:tc>
+        <w:tc>
+          <w:tcPr>
+            <w:tcW w:w="872" w:type="dxa"/>
+          </w:tcPr>
+          <w:p>
+            <w:pPr>
+              <w:rPr>
+                <w:lang w:val="en-US"/>
+              </w:rPr>
+            </w:pPr>
+          </w:p>
+        </w:tc>
+      </w:tr>
+      <w:tr>
+        <w:tc>
+          <w:tcPr>
+            <w:tcW w:w="704" w:type="dxa"/>
+          </w:tcPr>
+          <w:p>
+            <w:pPr>
+              <w:rPr>
+                <w:lang w:val="en-US"/>
+              </w:rPr>
+            </w:pPr>
+          </w:p>
+        </w:tc>
+        <w:tc>
+          <w:tcPr>
+            <w:tcW w:w="3402" w:type="dxa"/>
+          </w:tcPr>
+          <w:p>
+            <w:pPr>
+              <w:rPr>
+                <w:lang w:val="en-US"/>
+              </w:rPr>
+            </w:pPr>
+          </w:p>
+        </w:tc>
+        <w:tc>
+          <w:tcPr>
+            <w:tcW w:w="4084" w:type="dxa"/>
+          </w:tcPr>
+          <w:p>
+            <w:pPr>
+              <w:rPr>
+                <w:lang w:val="en-US"/>
+              </w:rPr>
+            </w:pPr>
+          </w:p>
+        </w:tc>
+        <w:tc>
+          <w:tcPr>
+            <w:tcW w:w="872" w:type="dxa"/>
+          </w:tcPr>
+          <w:p>
+            <w:pPr>
+              <w:rPr>
+                <w:lang w:val="en-US"/>
+              </w:rPr>
+            </w:pPr>
+          </w:p>
+        </w:tc>
+      </w:tr>
+      <w:tr>
+        <w:tc>
+          <w:tcPr>
+            <w:tcW w:w="704" w:type="dxa"/>
+          </w:tcPr>
+          <w:p>
+            <w:pPr>
+              <w:rPr>
+                <w:lang w:val="en-US"/>
+              </w:rPr>
+            </w:pPr>
+          </w:p>
+        </w:tc>
+        <w:tc>
+          <w:tcPr>
+            <w:tcW w:w="3402" w:type="dxa"/>
+          </w:tcPr>
+          <w:p>
+            <w:pPr>
+              <w:rPr>
+                <w:lang w:val="en-US"/>
+              </w:rPr>
+            </w:pPr>
+          </w:p>
+        </w:tc>
+        <w:tc>
+          <w:tcPr>
+            <w:tcW w:w="4084" w:type="dxa"/>
+          </w:tcPr>
+          <w:p>
+            <w:pPr>
+              <w:rPr>
+                <w:lang w:val="en-US"/>
+              </w:rPr>
+            </w:pPr>
+          </w:p>
+        </w:tc>
+        <w:tc>
+          <w:tcPr>
+            <w:tcW w:w="872" w:type="dxa"/>
+          </w:tcPr>
+          <w:p>
+            <w:pPr>
+              <w:rPr>
+                <w:lang w:val="en-US"/>
+              </w:rPr>
+            </w:pPr>
+          </w:p>
+        </w:tc>
+      </w:tr>
+      <w:tr>
+        <w:tc>
+          <w:tcPr>
+            <w:tcW w:w="704" w:type="dxa"/>
+          </w:tcPr>
+          <w:p>
+            <w:pPr>
+              <w:rPr>
+                <w:lang w:val="en-US"/>
+              </w:rPr>
+            </w:pPr>
+          </w:p>
+        </w:tc>
+        <w:tc>
+          <w:tcPr>
+            <w:tcW w:w="3402" w:type="dxa"/>
+          </w:tcPr>
+          <w:p>
+            <w:pPr>
+              <w:rPr>
+                <w:lang w:val="en-US"/>
+              </w:rPr>
+            </w:pPr>
+          </w:p>
+        </w:tc>
+        <w:tc>
+          <w:tcPr>
+            <w:tcW w:w="4084" w:type="dxa"/>
+          </w:tcPr>
+          <w:p>
+            <w:pPr>
+              <w:rPr>
+                <w:lang w:val="en-US"/>
+              </w:rPr>
+            </w:pPr>
+          </w:p>
+        </w:tc>
+        <w:tc>
+          <w:tcPr>
+            <w:tcW w:w="872" w:type="dxa"/>
+          </w:tcPr>
+          <w:p>
+            <w:pPr>
+              <w:rPr>
+                <w:lang w:val="en-US"/>
+              </w:rPr>
+            </w:pPr>
+          </w:p>
+        </w:tc>
+      </w:tr>
+      <w:tr>
+        <w:tc>
+          <w:tcPr>
+            <w:tcW w:w="704" w:type="dxa"/>
+          </w:tcPr>
+          <w:p>
+            <w:pPr>
+              <w:rPr>
+                <w:lang w:val="en-US"/>
+              </w:rPr>
+            </w:pPr>
+          </w:p>
+        </w:tc>
+        <w:tc>
+          <w:tcPr>
+            <w:tcW w:w="3402" w:type="dxa"/>
+          </w:tcPr>
+          <w:p>
+            <w:pPr>
+              <w:rPr>
+                <w:lang w:val="en-US"/>
+              </w:rPr>
+            </w:pPr>
+          </w:p>
+        </w:tc>
+        <w:tc>
+          <w:tcPr>
+            <w:tcW w:w="4084" w:type="dxa"/>
+          </w:tcPr>
+          <w:p>
+            <w:pPr>
+              <w:rPr>
+                <w:lang w:val="en-US"/>
+              </w:rPr>
+            </w:pPr>
+          </w:p>
+        </w:tc>
+        <w:tc>
+          <w:tcPr>
+            <w:tcW w:w="872" w:type="dxa"/>
+          </w:tcPr>
+          <w:p>
+            <w:pPr>
+              <w:rPr>
+                <w:lang w:val="en-US"/>
+              </w:rPr>
+            </w:pPr>
+          </w:p>
+        </w:tc>
+      </w:tr>
+      <w:tr>
+        <w:tc>
+          <w:tcPr>
+            <w:tcW w:w="704" w:type="dxa"/>
+          </w:tcPr>
+          <w:p>
+            <w:pPr>
+              <w:rPr>
+                <w:lang w:val="en-US"/>
+              </w:rPr>
+            </w:pPr>
+          </w:p>
+        </w:tc>
+        <w:tc>
+          <w:tcPr>
+            <w:tcW w:w="3402" w:type="dxa"/>
+          </w:tcPr>
+          <w:p>
+            <w:pPr>
+              <w:rPr>
+                <w:lang w:val="en-US"/>
+              </w:rPr>
+            </w:pPr>
+          </w:p>
+        </w:tc>
+        <w:tc>
+          <w:tcPr>
+            <w:tcW w:w="4084" w:type="dxa"/>
+          </w:tcPr>
+          <w:p>
+            <w:pPr>
+              <w:rPr>
+                <w:lang w:val="en-US"/>
+              </w:rPr>
+            </w:pPr>
+          </w:p>
+        </w:tc>
+        <w:tc>
+          <w:tcPr>
+            <w:tcW w:w="872" w:type="dxa"/>
+          </w:tcPr>
+          <w:p>
+            <w:pPr>
+              <w:rPr>
+                <w:lang w:val="en-US"/>
+              </w:rPr>
+            </w:pPr>
+          </w:p>
+        </w:tc>
+      </w:tr>
+      <w:tr>
+        <w:tc>
+          <w:tcPr>
+            <w:tcW w:w="704" w:type="dxa"/>
+          </w:tcPr>
+          <w:p>
+            <w:pPr>
+              <w:rPr>
+                <w:lang w:val="en-US"/>
+              </w:rPr>
+            </w:pPr>
+          </w:p>
+        </w:tc>
+        <w:tc>
+          <w:tcPr>
+            <w:tcW w:w="3402" w:type="dxa"/>
+          </w:tcPr>
+          <w:p>
+            <w:pPr>
+              <w:rPr>
+                <w:lang w:val="en-US"/>
+              </w:rPr>
+            </w:pPr>
+          </w:p>
+        </w:tc>
+        <w:tc>
+          <w:tcPr>
+            <w:tcW w:w="4084" w:type="dxa"/>
+          </w:tcPr>
+          <w:p>
+            <w:pPr>
+              <w:rPr>
+                <w:lang w:val="en-US"/>
+              </w:rPr>
+            </w:pPr>
+          </w:p>
+        </w:tc>
+        <w:tc>
+          <w:tcPr>
+            <w:tcW w:w="872" w:type="dxa"/>
+          </w:tcPr>
+          <w:p>
+            <w:pPr>
+              <w:rPr>
+                <w:lang w:val="en-US"/>
+              </w:rPr>
+            </w:pPr>
+          </w:p>
+        </w:tc>
+      </w:tr>
+      <w:tr>
+        <w:tc>
+          <w:tcPr>
+            <w:tcW w:w="704" w:type="dxa"/>
+          </w:tcPr>
+          <w:p>
+            <w:pPr>
+              <w:rPr>
+                <w:lang w:val="en-US"/>
+              </w:rPr>
+            </w:pPr>
+          </w:p>
+        </w:tc>
+        <w:tc>
+          <w:tcPr>
+            <w:tcW w:w="3402" w:type="dxa"/>
+          </w:tcPr>
+          <w:p>
+            <w:pPr>
+              <w:rPr>
+                <w:lang w:val="en-US"/>
+              </w:rPr>
+            </w:pPr>
+          </w:p>
+        </w:tc>
+        <w:tc>
+          <w:tcPr>
+            <w:tcW w:w="4084" w:type="dxa"/>
+          </w:tcPr>
+          <w:p>
+            <w:pPr>
+              <w:rPr>
+                <w:lang w:val="en-US"/>
+              </w:rPr>
+            </w:pPr>
+          </w:p>
+        </w:tc>
+        <w:tc>
+          <w:tcPr>
+            <w:tcW w:w="872" w:type="dxa"/>
+          </w:tcPr>
+          <w:p>
+            <w:pPr>
+              <w:rPr>
+                <w:lang w:val="en-US"/>
+              </w:rPr>
+            </w:pPr>
+          </w:p>
+        </w:tc>
+      </w:tr>
+      <w:tr>
+        <w:tc>
+          <w:tcPr>
+            <w:tcW w:w="704" w:type="dxa"/>
+          </w:tcPr>
+          <w:p>
+            <w:pPr>
+              <w:rPr>
+                <w:lang w:val="en-US"/>
+              </w:rPr>
+            </w:pPr>
+          </w:p>
+        </w:tc>
+        <w:tc>
+          <w:tcPr>
+            <w:tcW w:w="3402" w:type="dxa"/>
+          </w:tcPr>
+          <w:p>
+            <w:pPr>
+              <w:rPr>
+                <w:lang w:val="en-US"/>
+              </w:rPr>
+            </w:pPr>
+          </w:p>
+        </w:tc>
+        <w:tc>
+          <w:tcPr>
+            <w:tcW w:w="4084" w:type="dxa"/>
+          </w:tcPr>
+          <w:p>
+            <w:pPr>
+              <w:rPr>
+                <w:lang w:val="en-US"/>
+              </w:rPr>
+            </w:pPr>
+          </w:p>
+        </w:tc>
+        <w:tc>
+          <w:tcPr>
+            <w:tcW w:w="872" w:type="dxa"/>
+          </w:tcPr>
+          <w:p>
+            <w:pPr>
+              <w:rPr>
+                <w:lang w:val="en-US"/>
+              </w:rPr>
+            </w:pPr>
+          </w:p>
+        </w:tc>
+      </w:tr>
+      <w:tr>
+        <w:tc>
+          <w:tcPr>
+            <w:tcW w:w="704" w:type="dxa"/>
+          </w:tcPr>
+          <w:p>
+            <w:pPr>
+              <w:rPr>
+                <w:lang w:val="en-US"/>
+              </w:rPr>
+            </w:pPr>
+          </w:p>
+        </w:tc>
+        <w:tc>
+          <w:tcPr>
+            <w:tcW w:w="3402" w:type="dxa"/>
+          </w:tcPr>
+          <w:p>
+            <w:pPr>
+              <w:rPr>
+                <w:lang w:val="en-US"/>
+              </w:rPr>
+            </w:pPr>
+          </w:p>
+        </w:tc>
+        <w:tc>
+          <w:tcPr>
+            <w:tcW w:w="4084" w:type="dxa"/>
+          </w:tcPr>
+          <w:p>
+            <w:pPr>
+              <w:rPr>
+                <w:lang w:val="en-US"/>
+              </w:rPr>
+            </w:pPr>
+          </w:p>
+        </w:tc>
+        <w:tc>
+          <w:tcPr>
+            <w:tcW w:w="872" w:type="dxa"/>
+          </w:tcPr>
+          <w:p>
+            <w:pPr>
+              <w:rPr>
+                <w:lang w:val="en-US"/>
+              </w:rPr>
+            </w:pPr>
+          </w:p>
+        </w:tc>
+      </w:tr>
+      <w:tr>
+        <w:tc>
+          <w:tcPr>
+            <w:tcW w:w="704" w:type="dxa"/>
+          </w:tcPr>
+          <w:p>
+            <w:pPr>
+              <w:rPr>
+                <w:lang w:val="en-US"/>
+              </w:rPr>
+            </w:pPr>
+          </w:p>
+        </w:tc>
+        <w:tc>
+          <w:tcPr>
+            <w:tcW w:w="3402" w:type="dxa"/>
+          </w:tcPr>
+          <w:p>
+            <w:pPr>
+              <w:rPr>
+                <w:lang w:val="en-US"/>
+              </w:rPr>
+            </w:pPr>
+          </w:p>
+        </w:tc>
+        <w:tc>
+          <w:tcPr>
+            <w:tcW w:w="4084" w:type="dxa"/>
+          </w:tcPr>
+          <w:p>
+            <w:pPr>
+              <w:rPr>
+                <w:lang w:val="en-US"/>
+              </w:rPr>
+            </w:pPr>
+          </w:p>
+        </w:tc>
+        <w:tc>
+          <w:tcPr>
+            <w:tcW w:w="872" w:type="dxa"/>
+          </w:tcPr>
+          <w:p>
+            <w:pPr>
+              <w:rPr>
+                <w:lang w:val="en-US"/>
+              </w:rPr>
+            </w:pPr>
+          </w:p>
+        </w:tc>
+      </w:tr>
+      <w:tr>
+        <w:tc>
+          <w:tcPr>
+            <w:tcW w:w="704" w:type="dxa"/>
+          </w:tcPr>
+          <w:p>
+            <w:pPr>
+              <w:rPr>
+                <w:lang w:val="en-US"/>
+              </w:rPr>
+            </w:pPr>
+          </w:p>
+        </w:tc>
+        <w:tc>
+          <w:tcPr>
+            <w:tcW w:w="3402" w:type="dxa"/>
+          </w:tcPr>
+          <w:p>
+            <w:pPr>
+              <w:rPr>
+                <w:lang w:val="en-US"/>
+              </w:rPr>
+            </w:pPr>
+          </w:p>
+        </w:tc>
+        <w:tc>
+          <w:tcPr>
+            <w:tcW w:w="4084" w:type="dxa"/>
+          </w:tcPr>
+          <w:p>
+            <w:pPr>
+              <w:rPr>
+                <w:lang w:val="en-US"/>
+              </w:rPr>
+            </w:pPr>
+          </w:p>
+        </w:tc>
+        <w:tc>
+          <w:tcPr>
+            <w:tcW w:w="872" w:type="dxa"/>
+          </w:tcPr>
+          <w:p>
+            <w:pPr>
+              <w:rPr>
+                <w:lang w:val="en-US"/>
+              </w:rPr>
+            </w:pPr>
+          </w:p>
+        </w:tc>
+      </w:tr>
+    </w:tbl>
+    <w:p>
+      <w:pPr>
+        <w:rPr>
+          <w:lang w:val="en-US"/>
+        </w:rPr>
+      </w:pPr>
+    </w:p>
+    <w:p>
+      <w:pPr>
+        <w:rPr>
+          <w:lang w:val="en-US"/>
+        </w:rPr>
+      </w:pPr>
+    </w:p>
+    <w:p>
+      <w:pPr>
+        <w:rPr>
+          <w:rFonts w:asciiTheme="majorHAnsi" w:eastAsiaTheme="majorEastAsia" w:hAnsiTheme="majorHAnsi" w:cstheme="majorBidi"/>
+          <w:color w:val="2E74B5" w:themeColor="accent1" w:themeShade="BF"/>
+          <w:sz w:val="32"/>
+          <w:szCs w:val="32"/>
+          <w:lang w:val="en-US"/>
+        </w:rPr>
+      </w:pPr>
+      <w:r>
+        <w:rPr>
+          <w:lang w:val="en-US"/>
+        </w:rPr>
+        <w:br w:type="page"/>
+      </w:r>
+    </w:p>
+    <w:p>
+      <w:pPr>
+        <w:pStyle w:val="berschrift1"/>
+        <w:rPr>
+          <w:lang w:val="en-US"/>
+        </w:rPr>
+      </w:pPr>
+      <w:bookmarkStart w:id="34" w:name="_Toc228175856"/>
+      <w:r>
+        <w:rPr>
+          <w:lang w:val="en-US"/>
+        </w:rPr>
+        <w:lastRenderedPageBreak/>
+        <w:t>Distribution list</w:t>
+      </w:r>
+      <w:bookmarkEnd w:id="34"/>
     </w:p>
     <w:tbl>
       <w:tblPr>
@@ -5101,15 +6268,14 @@
         <w:tblLook w:val="04A0" w:firstRow="1" w:lastRow="0" w:firstColumn="1" w:lastColumn="0" w:noHBand="0" w:noVBand="1"/>
       </w:tblPr>
       <w:tblGrid>
-        <w:gridCol w:w="846"/>
-        <w:gridCol w:w="3402"/>
-        <w:gridCol w:w="3544"/>
-        <w:gridCol w:w="1270"/>
+        <w:gridCol w:w="2215"/>
+        <w:gridCol w:w="2978"/>
+        <w:gridCol w:w="3869"/>
       </w:tblGrid>
       <w:tr>
         <w:tc>
           <w:tcPr>
-            <w:tcW w:w="846" w:type="dxa"/>
+            <w:tcW w:w="2244" w:type="dxa"/>
           </w:tcPr>
           <w:p>
             <w:pPr>
@@ -5121,13 +6287,13 @@
               <w:rPr>
                 <w:lang w:val="en-US"/>
               </w:rPr>
-              <w:t>Nr.</w:t>
-            </w:r>
-          </w:p>
-        </w:tc>
-        <w:tc>
-          <w:tcPr>
-            <w:tcW w:w="3402" w:type="dxa"/>
+              <w:t>Name</w:t>
+            </w:r>
+          </w:p>
+        </w:tc>
+        <w:tc>
+          <w:tcPr>
+            <w:tcW w:w="2892" w:type="dxa"/>
           </w:tcPr>
           <w:p>
             <w:pPr>
@@ -5139,13 +6305,13 @@
               <w:rPr>
                 <w:lang w:val="en-US"/>
               </w:rPr>
-              <w:t>Name</w:t>
-            </w:r>
-          </w:p>
-        </w:tc>
-        <w:tc>
-          <w:tcPr>
-            <w:tcW w:w="3544" w:type="dxa"/>
+              <w:t>Role</w:t>
+            </w:r>
+          </w:p>
+        </w:tc>
+        <w:tc>
+          <w:tcPr>
+            <w:tcW w:w="3926" w:type="dxa"/>
           </w:tcPr>
           <w:p>
             <w:pPr>
@@ -5157,25 +6323,7 @@
               <w:rPr>
                 <w:lang w:val="en-US"/>
               </w:rPr>
-              <w:t>Link</w:t>
-            </w:r>
-          </w:p>
-        </w:tc>
-        <w:tc>
-          <w:tcPr>
-            <w:tcW w:w="1270" w:type="dxa"/>
-          </w:tcPr>
-          <w:p>
-            <w:pPr>
-              <w:rPr>
-                <w:lang w:val="en-US"/>
-              </w:rPr>
-            </w:pPr>
-            <w:r>
-              <w:rPr>
-                <w:lang w:val="en-US"/>
-              </w:rPr>
-              <w:t>Revision</w:t>
+              <w:t>E-Mail</w:t>
             </w:r>
           </w:p>
         </w:tc>
@@ -5183,7 +6331,7 @@
       <w:tr>
         <w:tc>
           <w:tcPr>
-            <w:tcW w:w="846" w:type="dxa"/>
+            <w:tcW w:w="2244" w:type="dxa"/>
           </w:tcPr>
           <w:p>
             <w:pPr>
@@ -5192,16 +6340,13 @@
               </w:rPr>
             </w:pPr>
             <w:r>
-              <w:rPr>
-                <w:lang w:val="en-US"/>
-              </w:rPr>
-              <w:t>[1]</w:t>
-            </w:r>
-          </w:p>
-        </w:tc>
-        <w:tc>
-          <w:tcPr>
-            <w:tcW w:w="3402" w:type="dxa"/>
+              <w:t>Felix Maunz</w:t>
+            </w:r>
+          </w:p>
+        </w:tc>
+        <w:tc>
+          <w:tcPr>
+            <w:tcW w:w="2892" w:type="dxa"/>
           </w:tcPr>
           <w:p>
             <w:pPr>
@@ -5211,29 +6356,17 @@
             </w:pPr>
             <w:proofErr w:type="spellStart"/>
             <w:r>
-              <w:rPr>
-                <w:lang w:val="en-US"/>
-              </w:rPr>
-              <w:t>Prozessortechnik</w:t>
-            </w:r>
-            <w:r>
-              <w:rPr>
-                <w:lang w:val="en-US"/>
-              </w:rPr>
-              <w:t>_</w:t>
-            </w:r>
-            <w:r>
-              <w:rPr>
-                <w:lang w:val="en-US"/>
-              </w:rPr>
-              <w:t>Sprint_Backlog</w:t>
+              <w:t>Scrum</w:t>
             </w:r>
             <w:proofErr w:type="spellEnd"/>
-          </w:p>
-        </w:tc>
-        <w:tc>
-          <w:tcPr>
-            <w:tcW w:w="3544" w:type="dxa"/>
+            <w:r>
+              <w:t xml:space="preserve"> Master</w:t>
+            </w:r>
+          </w:p>
+        </w:tc>
+        <w:tc>
+          <w:tcPr>
+            <w:tcW w:w="3926" w:type="dxa"/>
           </w:tcPr>
           <w:p>
             <w:pPr>
@@ -5245,25 +6378,7 @@
               <w:rPr>
                 <w:lang w:val="en-US"/>
               </w:rPr>
-              <w:t>TBD</w:t>
-            </w:r>
-          </w:p>
-        </w:tc>
-        <w:tc>
-          <w:tcPr>
-            <w:tcW w:w="1270" w:type="dxa"/>
-          </w:tcPr>
-          <w:p>
-            <w:pPr>
-              <w:rPr>
-                <w:lang w:val="en-US"/>
-              </w:rPr>
-            </w:pPr>
-            <w:r>
-              <w:rPr>
-                <w:lang w:val="en-US"/>
-              </w:rPr>
-              <w:t>1.0</w:t>
+              <w:t>maunz.felix-23@stud.dhbw-ravensburg.de</w:t>
             </w:r>
           </w:p>
         </w:tc>
@@ -5271,7 +6386,7 @@
       <w:tr>
         <w:tc>
           <w:tcPr>
-            <w:tcW w:w="846" w:type="dxa"/>
+            <w:tcW w:w="2244" w:type="dxa"/>
           </w:tcPr>
           <w:p>
             <w:pPr>
@@ -5280,16 +6395,13 @@
               </w:rPr>
             </w:pPr>
             <w:r>
-              <w:rPr>
-                <w:lang w:val="en-US"/>
-              </w:rPr>
-              <w:t>[2]</w:t>
-            </w:r>
-          </w:p>
-        </w:tc>
-        <w:tc>
-          <w:tcPr>
-            <w:tcW w:w="3402" w:type="dxa"/>
+              <w:t>Alexander Graf</w:t>
+            </w:r>
+          </w:p>
+        </w:tc>
+        <w:tc>
+          <w:tcPr>
+            <w:tcW w:w="2892" w:type="dxa"/>
           </w:tcPr>
           <w:p>
             <w:pPr>
@@ -5298,13 +6410,13 @@
               </w:rPr>
             </w:pPr>
             <w:r>
-              <w:t>Stories_Req.xlsx</w:t>
-            </w:r>
-          </w:p>
-        </w:tc>
-        <w:tc>
-          <w:tcPr>
-            <w:tcW w:w="3544" w:type="dxa"/>
+              <w:t>SW-Tester</w:t>
+            </w:r>
+          </w:p>
+        </w:tc>
+        <w:tc>
+          <w:tcPr>
+            <w:tcW w:w="3926" w:type="dxa"/>
           </w:tcPr>
           <w:p>
             <w:pPr>
@@ -5316,25 +6428,7 @@
               <w:rPr>
                 <w:lang w:val="en-US"/>
               </w:rPr>
-              <w:t>TBD</w:t>
-            </w:r>
-          </w:p>
-        </w:tc>
-        <w:tc>
-          <w:tcPr>
-            <w:tcW w:w="1270" w:type="dxa"/>
-          </w:tcPr>
-          <w:p>
-            <w:pPr>
-              <w:rPr>
-                <w:lang w:val="en-US"/>
-              </w:rPr>
-            </w:pPr>
-            <w:r>
-              <w:rPr>
-                <w:lang w:val="en-US"/>
-              </w:rPr>
-              <w:t>2.0</w:t>
+              <w:t>graf.alexander-23@stud.dhbw-ravensburg.de</w:t>
             </w:r>
           </w:p>
         </w:tc>
@@ -5342,7 +6436,7 @@
       <w:tr>
         <w:tc>
           <w:tcPr>
-            <w:tcW w:w="846" w:type="dxa"/>
+            <w:tcW w:w="2244" w:type="dxa"/>
           </w:tcPr>
           <w:p>
             <w:pPr>
@@ -5350,11 +6444,14 @@
                 <w:lang w:val="en-US"/>
               </w:rPr>
             </w:pPr>
-          </w:p>
-        </w:tc>
-        <w:tc>
-          <w:tcPr>
-            <w:tcW w:w="3402" w:type="dxa"/>
+            <w:r>
+              <w:t>David Rösch</w:t>
+            </w:r>
+          </w:p>
+        </w:tc>
+        <w:tc>
+          <w:tcPr>
+            <w:tcW w:w="2892" w:type="dxa"/>
           </w:tcPr>
           <w:p>
             <w:pPr>
@@ -5362,11 +6459,22 @@
                 <w:lang w:val="en-US"/>
               </w:rPr>
             </w:pPr>
-          </w:p>
-        </w:tc>
-        <w:tc>
-          <w:tcPr>
-            <w:tcW w:w="3544" w:type="dxa"/>
+            <w:r>
+              <w:t>HW-Beschaffung/</w:t>
+            </w:r>
+            <w:proofErr w:type="spellStart"/>
+            <w:r>
+              <w:t>Product</w:t>
+            </w:r>
+            <w:proofErr w:type="spellEnd"/>
+            <w:r>
+              <w:t xml:space="preserve"> Owner</w:t>
+            </w:r>
+          </w:p>
+        </w:tc>
+        <w:tc>
+          <w:tcPr>
+            <w:tcW w:w="3926" w:type="dxa"/>
           </w:tcPr>
           <w:p>
             <w:pPr>
@@ -5374,25 +6482,19 @@
                 <w:lang w:val="en-US"/>
               </w:rPr>
             </w:pPr>
-          </w:p>
-        </w:tc>
-        <w:tc>
-          <w:tcPr>
-            <w:tcW w:w="1270" w:type="dxa"/>
-          </w:tcPr>
-          <w:p>
-            <w:pPr>
-              <w:rPr>
-                <w:lang w:val="en-US"/>
-              </w:rPr>
-            </w:pPr>
+            <w:r>
+              <w:rPr>
+                <w:lang w:val="en-US"/>
+              </w:rPr>
+              <w:t>david.roesch-23@stud.dhbw-ravensburg.de</w:t>
+            </w:r>
           </w:p>
         </w:tc>
       </w:tr>
       <w:tr>
         <w:tc>
           <w:tcPr>
-            <w:tcW w:w="846" w:type="dxa"/>
+            <w:tcW w:w="2244" w:type="dxa"/>
           </w:tcPr>
           <w:p>
             <w:pPr>
@@ -5400,11 +6502,14 @@
                 <w:lang w:val="en-US"/>
               </w:rPr>
             </w:pPr>
-          </w:p>
-        </w:tc>
-        <w:tc>
-          <w:tcPr>
-            <w:tcW w:w="3402" w:type="dxa"/>
+            <w:r>
+              <w:t>Jacob Jäger</w:t>
+            </w:r>
+          </w:p>
+        </w:tc>
+        <w:tc>
+          <w:tcPr>
+            <w:tcW w:w="2892" w:type="dxa"/>
           </w:tcPr>
           <w:p>
             <w:pPr>
@@ -5412,11 +6517,17 @@
                 <w:lang w:val="en-US"/>
               </w:rPr>
             </w:pPr>
-          </w:p>
-        </w:tc>
-        <w:tc>
-          <w:tcPr>
-            <w:tcW w:w="3544" w:type="dxa"/>
+            <w:r>
+              <w:t>SW-Entwickler/</w:t>
+            </w:r>
+            <w:r>
+              <w:t>Repository-Verantwortlicher</w:t>
+            </w:r>
+          </w:p>
+        </w:tc>
+        <w:tc>
+          <w:tcPr>
+            <w:tcW w:w="3926" w:type="dxa"/>
           </w:tcPr>
           <w:p>
             <w:pPr>
@@ -5424,25 +6535,19 @@
                 <w:lang w:val="en-US"/>
               </w:rPr>
             </w:pPr>
-          </w:p>
-        </w:tc>
-        <w:tc>
-          <w:tcPr>
-            <w:tcW w:w="1270" w:type="dxa"/>
-          </w:tcPr>
-          <w:p>
-            <w:pPr>
-              <w:rPr>
-                <w:lang w:val="en-US"/>
-              </w:rPr>
-            </w:pPr>
+            <w:r>
+              <w:rPr>
+                <w:lang w:val="en-US"/>
+              </w:rPr>
+              <w:t>jacob.jaeger-23@stud.dhbw-ravensburg.de</w:t>
+            </w:r>
           </w:p>
         </w:tc>
       </w:tr>
       <w:tr>
         <w:tc>
           <w:tcPr>
-            <w:tcW w:w="846" w:type="dxa"/>
+            <w:tcW w:w="2244" w:type="dxa"/>
           </w:tcPr>
           <w:p>
             <w:pPr>
@@ -5450,11 +6555,14 @@
                 <w:lang w:val="en-US"/>
               </w:rPr>
             </w:pPr>
-          </w:p>
-        </w:tc>
-        <w:tc>
-          <w:tcPr>
-            <w:tcW w:w="3402" w:type="dxa"/>
+            <w:r>
+              <w:t>Johannes Winter</w:t>
+            </w:r>
+          </w:p>
+        </w:tc>
+        <w:tc>
+          <w:tcPr>
+            <w:tcW w:w="2892" w:type="dxa"/>
           </w:tcPr>
           <w:p>
             <w:pPr>
@@ -5462,902 +6570,9 @@
                 <w:lang w:val="en-US"/>
               </w:rPr>
             </w:pPr>
-          </w:p>
-        </w:tc>
-        <w:tc>
-          <w:tcPr>
-            <w:tcW w:w="3544" w:type="dxa"/>
-          </w:tcPr>
-          <w:p>
-            <w:pPr>
-              <w:rPr>
-                <w:lang w:val="en-US"/>
-              </w:rPr>
-            </w:pPr>
-          </w:p>
-        </w:tc>
-        <w:tc>
-          <w:tcPr>
-            <w:tcW w:w="1270" w:type="dxa"/>
-          </w:tcPr>
-          <w:p>
-            <w:pPr>
-              <w:rPr>
-                <w:lang w:val="en-US"/>
-              </w:rPr>
-            </w:pPr>
-          </w:p>
-        </w:tc>
-      </w:tr>
-      <w:tr>
-        <w:tc>
-          <w:tcPr>
-            <w:tcW w:w="846" w:type="dxa"/>
-          </w:tcPr>
-          <w:p>
-            <w:pPr>
-              <w:rPr>
-                <w:lang w:val="en-US"/>
-              </w:rPr>
-            </w:pPr>
-          </w:p>
-        </w:tc>
-        <w:tc>
-          <w:tcPr>
-            <w:tcW w:w="3402" w:type="dxa"/>
-          </w:tcPr>
-          <w:p>
-            <w:pPr>
-              <w:rPr>
-                <w:lang w:val="en-US"/>
-              </w:rPr>
-            </w:pPr>
-          </w:p>
-        </w:tc>
-        <w:tc>
-          <w:tcPr>
-            <w:tcW w:w="3544" w:type="dxa"/>
-          </w:tcPr>
-          <w:p>
-            <w:pPr>
-              <w:rPr>
-                <w:lang w:val="en-US"/>
-              </w:rPr>
-            </w:pPr>
-          </w:p>
-        </w:tc>
-        <w:tc>
-          <w:tcPr>
-            <w:tcW w:w="1270" w:type="dxa"/>
-          </w:tcPr>
-          <w:p>
-            <w:pPr>
-              <w:rPr>
-                <w:lang w:val="en-US"/>
-              </w:rPr>
-            </w:pPr>
-          </w:p>
-        </w:tc>
-      </w:tr>
-      <w:tr>
-        <w:tc>
-          <w:tcPr>
-            <w:tcW w:w="846" w:type="dxa"/>
-          </w:tcPr>
-          <w:p>
-            <w:pPr>
-              <w:rPr>
-                <w:lang w:val="en-US"/>
-              </w:rPr>
-            </w:pPr>
-          </w:p>
-        </w:tc>
-        <w:tc>
-          <w:tcPr>
-            <w:tcW w:w="3402" w:type="dxa"/>
-          </w:tcPr>
-          <w:p>
-            <w:pPr>
-              <w:rPr>
-                <w:lang w:val="en-US"/>
-              </w:rPr>
-            </w:pPr>
-          </w:p>
-        </w:tc>
-        <w:tc>
-          <w:tcPr>
-            <w:tcW w:w="3544" w:type="dxa"/>
-          </w:tcPr>
-          <w:p>
-            <w:pPr>
-              <w:rPr>
-                <w:lang w:val="en-US"/>
-              </w:rPr>
-            </w:pPr>
-          </w:p>
-        </w:tc>
-        <w:tc>
-          <w:tcPr>
-            <w:tcW w:w="1270" w:type="dxa"/>
-          </w:tcPr>
-          <w:p>
-            <w:pPr>
-              <w:rPr>
-                <w:lang w:val="en-US"/>
-              </w:rPr>
-            </w:pPr>
-          </w:p>
-        </w:tc>
-      </w:tr>
-      <w:tr>
-        <w:tc>
-          <w:tcPr>
-            <w:tcW w:w="846" w:type="dxa"/>
-          </w:tcPr>
-          <w:p>
-            <w:pPr>
-              <w:rPr>
-                <w:lang w:val="en-US"/>
-              </w:rPr>
-            </w:pPr>
-          </w:p>
-        </w:tc>
-        <w:tc>
-          <w:tcPr>
-            <w:tcW w:w="3402" w:type="dxa"/>
-          </w:tcPr>
-          <w:p>
-            <w:pPr>
-              <w:rPr>
-                <w:lang w:val="en-US"/>
-              </w:rPr>
-            </w:pPr>
-          </w:p>
-        </w:tc>
-        <w:tc>
-          <w:tcPr>
-            <w:tcW w:w="3544" w:type="dxa"/>
-          </w:tcPr>
-          <w:p>
-            <w:pPr>
-              <w:rPr>
-                <w:lang w:val="en-US"/>
-              </w:rPr>
-            </w:pPr>
-          </w:p>
-        </w:tc>
-        <w:tc>
-          <w:tcPr>
-            <w:tcW w:w="1270" w:type="dxa"/>
-          </w:tcPr>
-          <w:p>
-            <w:pPr>
-              <w:rPr>
-                <w:lang w:val="en-US"/>
-              </w:rPr>
-            </w:pPr>
-          </w:p>
-        </w:tc>
-      </w:tr>
-      <w:tr>
-        <w:tc>
-          <w:tcPr>
-            <w:tcW w:w="846" w:type="dxa"/>
-          </w:tcPr>
-          <w:p>
-            <w:pPr>
-              <w:rPr>
-                <w:lang w:val="en-US"/>
-              </w:rPr>
-            </w:pPr>
-          </w:p>
-        </w:tc>
-        <w:tc>
-          <w:tcPr>
-            <w:tcW w:w="3402" w:type="dxa"/>
-          </w:tcPr>
-          <w:p>
-            <w:pPr>
-              <w:rPr>
-                <w:lang w:val="en-US"/>
-              </w:rPr>
-            </w:pPr>
-          </w:p>
-        </w:tc>
-        <w:tc>
-          <w:tcPr>
-            <w:tcW w:w="3544" w:type="dxa"/>
-          </w:tcPr>
-          <w:p>
-            <w:pPr>
-              <w:rPr>
-                <w:lang w:val="en-US"/>
-              </w:rPr>
-            </w:pPr>
-          </w:p>
-        </w:tc>
-        <w:tc>
-          <w:tcPr>
-            <w:tcW w:w="1270" w:type="dxa"/>
-          </w:tcPr>
-          <w:p>
-            <w:pPr>
-              <w:rPr>
-                <w:lang w:val="en-US"/>
-              </w:rPr>
-            </w:pPr>
-          </w:p>
-        </w:tc>
-      </w:tr>
-      <w:tr>
-        <w:tc>
-          <w:tcPr>
-            <w:tcW w:w="846" w:type="dxa"/>
-          </w:tcPr>
-          <w:p>
-            <w:pPr>
-              <w:rPr>
-                <w:lang w:val="en-US"/>
-              </w:rPr>
-            </w:pPr>
-          </w:p>
-        </w:tc>
-        <w:tc>
-          <w:tcPr>
-            <w:tcW w:w="3402" w:type="dxa"/>
-          </w:tcPr>
-          <w:p>
-            <w:pPr>
-              <w:rPr>
-                <w:lang w:val="en-US"/>
-              </w:rPr>
-            </w:pPr>
-          </w:p>
-        </w:tc>
-        <w:tc>
-          <w:tcPr>
-            <w:tcW w:w="3544" w:type="dxa"/>
-          </w:tcPr>
-          <w:p>
-            <w:pPr>
-              <w:rPr>
-                <w:lang w:val="en-US"/>
-              </w:rPr>
-            </w:pPr>
-          </w:p>
-        </w:tc>
-        <w:tc>
-          <w:tcPr>
-            <w:tcW w:w="1270" w:type="dxa"/>
-          </w:tcPr>
-          <w:p>
-            <w:pPr>
-              <w:rPr>
-                <w:lang w:val="en-US"/>
-              </w:rPr>
-            </w:pPr>
-          </w:p>
-        </w:tc>
-      </w:tr>
-      <w:tr>
-        <w:tc>
-          <w:tcPr>
-            <w:tcW w:w="846" w:type="dxa"/>
-          </w:tcPr>
-          <w:p>
-            <w:pPr>
-              <w:rPr>
-                <w:lang w:val="en-US"/>
-              </w:rPr>
-            </w:pPr>
-          </w:p>
-        </w:tc>
-        <w:tc>
-          <w:tcPr>
-            <w:tcW w:w="3402" w:type="dxa"/>
-          </w:tcPr>
-          <w:p>
-            <w:pPr>
-              <w:rPr>
-                <w:lang w:val="en-US"/>
-              </w:rPr>
-            </w:pPr>
-          </w:p>
-        </w:tc>
-        <w:tc>
-          <w:tcPr>
-            <w:tcW w:w="3544" w:type="dxa"/>
-          </w:tcPr>
-          <w:p>
-            <w:pPr>
-              <w:rPr>
-                <w:lang w:val="en-US"/>
-              </w:rPr>
-            </w:pPr>
-          </w:p>
-        </w:tc>
-        <w:tc>
-          <w:tcPr>
-            <w:tcW w:w="1270" w:type="dxa"/>
-          </w:tcPr>
-          <w:p>
-            <w:pPr>
-              <w:rPr>
-                <w:lang w:val="en-US"/>
-              </w:rPr>
-            </w:pPr>
-          </w:p>
-        </w:tc>
-      </w:tr>
-      <w:tr>
-        <w:tc>
-          <w:tcPr>
-            <w:tcW w:w="846" w:type="dxa"/>
-          </w:tcPr>
-          <w:p>
-            <w:pPr>
-              <w:rPr>
-                <w:lang w:val="en-US"/>
-              </w:rPr>
-            </w:pPr>
-          </w:p>
-        </w:tc>
-        <w:tc>
-          <w:tcPr>
-            <w:tcW w:w="3402" w:type="dxa"/>
-          </w:tcPr>
-          <w:p>
-            <w:pPr>
-              <w:rPr>
-                <w:lang w:val="en-US"/>
-              </w:rPr>
-            </w:pPr>
-          </w:p>
-        </w:tc>
-        <w:tc>
-          <w:tcPr>
-            <w:tcW w:w="3544" w:type="dxa"/>
-          </w:tcPr>
-          <w:p>
-            <w:pPr>
-              <w:rPr>
-                <w:lang w:val="en-US"/>
-              </w:rPr>
-            </w:pPr>
-          </w:p>
-        </w:tc>
-        <w:tc>
-          <w:tcPr>
-            <w:tcW w:w="1270" w:type="dxa"/>
-          </w:tcPr>
-          <w:p>
-            <w:pPr>
-              <w:rPr>
-                <w:lang w:val="en-US"/>
-              </w:rPr>
-            </w:pPr>
-          </w:p>
-        </w:tc>
-      </w:tr>
-      <w:tr>
-        <w:tc>
-          <w:tcPr>
-            <w:tcW w:w="846" w:type="dxa"/>
-          </w:tcPr>
-          <w:p>
-            <w:pPr>
-              <w:rPr>
-                <w:lang w:val="en-US"/>
-              </w:rPr>
-            </w:pPr>
-          </w:p>
-        </w:tc>
-        <w:tc>
-          <w:tcPr>
-            <w:tcW w:w="3402" w:type="dxa"/>
-          </w:tcPr>
-          <w:p>
-            <w:pPr>
-              <w:rPr>
-                <w:lang w:val="en-US"/>
-              </w:rPr>
-            </w:pPr>
-          </w:p>
-        </w:tc>
-        <w:tc>
-          <w:tcPr>
-            <w:tcW w:w="3544" w:type="dxa"/>
-          </w:tcPr>
-          <w:p>
-            <w:pPr>
-              <w:rPr>
-                <w:lang w:val="en-US"/>
-              </w:rPr>
-            </w:pPr>
-          </w:p>
-        </w:tc>
-        <w:tc>
-          <w:tcPr>
-            <w:tcW w:w="1270" w:type="dxa"/>
-          </w:tcPr>
-          <w:p>
-            <w:pPr>
-              <w:rPr>
-                <w:lang w:val="en-US"/>
-              </w:rPr>
-            </w:pPr>
-          </w:p>
-        </w:tc>
-      </w:tr>
-      <w:tr>
-        <w:tc>
-          <w:tcPr>
-            <w:tcW w:w="846" w:type="dxa"/>
-          </w:tcPr>
-          <w:p>
-            <w:pPr>
-              <w:rPr>
-                <w:lang w:val="en-US"/>
-              </w:rPr>
-            </w:pPr>
-          </w:p>
-        </w:tc>
-        <w:tc>
-          <w:tcPr>
-            <w:tcW w:w="3402" w:type="dxa"/>
-          </w:tcPr>
-          <w:p>
-            <w:pPr>
-              <w:rPr>
-                <w:lang w:val="en-US"/>
-              </w:rPr>
-            </w:pPr>
-          </w:p>
-        </w:tc>
-        <w:tc>
-          <w:tcPr>
-            <w:tcW w:w="3544" w:type="dxa"/>
-          </w:tcPr>
-          <w:p>
-            <w:pPr>
-              <w:rPr>
-                <w:lang w:val="en-US"/>
-              </w:rPr>
-            </w:pPr>
-          </w:p>
-        </w:tc>
-        <w:tc>
-          <w:tcPr>
-            <w:tcW w:w="1270" w:type="dxa"/>
-          </w:tcPr>
-          <w:p>
-            <w:pPr>
-              <w:rPr>
-                <w:lang w:val="en-US"/>
-              </w:rPr>
-            </w:pPr>
-          </w:p>
-        </w:tc>
-      </w:tr>
-      <w:tr>
-        <w:tc>
-          <w:tcPr>
-            <w:tcW w:w="846" w:type="dxa"/>
-          </w:tcPr>
-          <w:p>
-            <w:pPr>
-              <w:rPr>
-                <w:lang w:val="en-US"/>
-              </w:rPr>
-            </w:pPr>
-          </w:p>
-        </w:tc>
-        <w:tc>
-          <w:tcPr>
-            <w:tcW w:w="3402" w:type="dxa"/>
-          </w:tcPr>
-          <w:p>
-            <w:pPr>
-              <w:rPr>
-                <w:lang w:val="en-US"/>
-              </w:rPr>
-            </w:pPr>
-          </w:p>
-        </w:tc>
-        <w:tc>
-          <w:tcPr>
-            <w:tcW w:w="3544" w:type="dxa"/>
-          </w:tcPr>
-          <w:p>
-            <w:pPr>
-              <w:rPr>
-                <w:lang w:val="en-US"/>
-              </w:rPr>
-            </w:pPr>
-          </w:p>
-        </w:tc>
-        <w:tc>
-          <w:tcPr>
-            <w:tcW w:w="1270" w:type="dxa"/>
-          </w:tcPr>
-          <w:p>
-            <w:pPr>
-              <w:rPr>
-                <w:lang w:val="en-US"/>
-              </w:rPr>
-            </w:pPr>
-          </w:p>
-        </w:tc>
-      </w:tr>
-    </w:tbl>
-    <w:p>
-      <w:pPr>
-        <w:rPr>
-          <w:lang w:val="en-US"/>
-        </w:rPr>
-      </w:pPr>
-    </w:p>
-    <w:p>
-      <w:pPr>
-        <w:rPr>
-          <w:lang w:val="en-US"/>
-        </w:rPr>
-      </w:pPr>
-    </w:p>
-    <w:p>
-      <w:pPr>
-        <w:rPr>
-          <w:rFonts w:asciiTheme="majorHAnsi" w:eastAsiaTheme="majorEastAsia" w:hAnsiTheme="majorHAnsi" w:cstheme="majorBidi"/>
-          <w:color w:val="2E74B5" w:themeColor="accent1" w:themeShade="BF"/>
-          <w:sz w:val="32"/>
-          <w:szCs w:val="32"/>
-          <w:lang w:val="en-US"/>
-        </w:rPr>
-      </w:pPr>
-      <w:r>
-        <w:rPr>
-          <w:lang w:val="en-US"/>
-        </w:rPr>
-        <w:br w:type="page"/>
-      </w:r>
-    </w:p>
-    <w:p>
-      <w:pPr>
-        <w:pStyle w:val="berschrift1"/>
-        <w:rPr>
-          <w:lang w:val="en-US"/>
-        </w:rPr>
-      </w:pPr>
-      <w:bookmarkStart w:id="34" w:name="_Toc227915557"/>
-      <w:r>
-        <w:rPr>
-          <w:lang w:val="en-US"/>
-        </w:rPr>
-        <w:lastRenderedPageBreak/>
-        <w:t>Distribution list</w:t>
-      </w:r>
-      <w:bookmarkEnd w:id="34"/>
-    </w:p>
-    <w:tbl>
-      <w:tblPr>
-        <w:tblStyle w:val="Tabellenraster"/>
-        <w:tblW w:w="0" w:type="auto"/>
-        <w:tblLook w:val="04A0" w:firstRow="1" w:lastRow="0" w:firstColumn="1" w:lastColumn="0" w:noHBand="0" w:noVBand="1"/>
-      </w:tblPr>
-      <w:tblGrid>
-        <w:gridCol w:w="2244"/>
-        <w:gridCol w:w="2892"/>
-        <w:gridCol w:w="3926"/>
-      </w:tblGrid>
-      <w:tr>
-        <w:tc>
-          <w:tcPr>
-            <w:tcW w:w="2244" w:type="dxa"/>
-          </w:tcPr>
-          <w:p>
-            <w:pPr>
-              <w:rPr>
-                <w:lang w:val="en-US"/>
-              </w:rPr>
-            </w:pPr>
-            <w:r>
-              <w:rPr>
-                <w:lang w:val="en-US"/>
-              </w:rPr>
-              <w:t>Name</w:t>
-            </w:r>
-          </w:p>
-        </w:tc>
-        <w:tc>
-          <w:tcPr>
-            <w:tcW w:w="2892" w:type="dxa"/>
-          </w:tcPr>
-          <w:p>
-            <w:pPr>
-              <w:rPr>
-                <w:lang w:val="en-US"/>
-              </w:rPr>
-            </w:pPr>
-            <w:r>
-              <w:rPr>
-                <w:lang w:val="en-US"/>
-              </w:rPr>
-              <w:t>Role</w:t>
-            </w:r>
-          </w:p>
-        </w:tc>
-        <w:tc>
-          <w:tcPr>
-            <w:tcW w:w="3926" w:type="dxa"/>
-          </w:tcPr>
-          <w:p>
-            <w:pPr>
-              <w:rPr>
-                <w:lang w:val="en-US"/>
-              </w:rPr>
-            </w:pPr>
-            <w:r>
-              <w:rPr>
-                <w:lang w:val="en-US"/>
-              </w:rPr>
-              <w:t>E-Mail</w:t>
-            </w:r>
-          </w:p>
-        </w:tc>
-      </w:tr>
-      <w:tr>
-        <w:tc>
-          <w:tcPr>
-            <w:tcW w:w="2244" w:type="dxa"/>
-          </w:tcPr>
-          <w:p>
-            <w:pPr>
-              <w:rPr>
-                <w:lang w:val="en-US"/>
-              </w:rPr>
-            </w:pPr>
-            <w:r>
-              <w:t>Felix Maunz</w:t>
-            </w:r>
-          </w:p>
-        </w:tc>
-        <w:tc>
-          <w:tcPr>
-            <w:tcW w:w="2892" w:type="dxa"/>
-          </w:tcPr>
-          <w:p>
-            <w:pPr>
-              <w:rPr>
-                <w:lang w:val="en-US"/>
-              </w:rPr>
-            </w:pPr>
-            <w:proofErr w:type="spellStart"/>
-            <w:r>
-              <w:t>Scrum</w:t>
-            </w:r>
-            <w:proofErr w:type="spellEnd"/>
-            <w:r>
-              <w:t xml:space="preserve"> Master</w:t>
-            </w:r>
-          </w:p>
-        </w:tc>
-        <w:tc>
-          <w:tcPr>
-            <w:tcW w:w="3926" w:type="dxa"/>
-          </w:tcPr>
-          <w:p>
-            <w:pPr>
-              <w:rPr>
-                <w:lang w:val="en-US"/>
-              </w:rPr>
-            </w:pPr>
-            <w:r>
-              <w:rPr>
-                <w:lang w:val="en-US"/>
-              </w:rPr>
-              <w:t>maunz.felix-23@stud.dhbw-ravensburg.de</w:t>
-            </w:r>
-          </w:p>
-        </w:tc>
-      </w:tr>
-      <w:tr>
-        <w:tc>
-          <w:tcPr>
-            <w:tcW w:w="2244" w:type="dxa"/>
-          </w:tcPr>
-          <w:p>
-            <w:pPr>
-              <w:rPr>
-                <w:lang w:val="en-US"/>
-              </w:rPr>
-            </w:pPr>
-            <w:r>
-              <w:t>Alexander Graf</w:t>
-            </w:r>
-          </w:p>
-        </w:tc>
-        <w:tc>
-          <w:tcPr>
-            <w:tcW w:w="2892" w:type="dxa"/>
-          </w:tcPr>
-          <w:p>
-            <w:pPr>
-              <w:rPr>
-                <w:lang w:val="en-US"/>
-              </w:rPr>
-            </w:pPr>
-            <w:r>
-              <w:t>SW-Tester</w:t>
-            </w:r>
-          </w:p>
-        </w:tc>
-        <w:tc>
-          <w:tcPr>
-            <w:tcW w:w="3926" w:type="dxa"/>
-          </w:tcPr>
-          <w:p>
-            <w:pPr>
-              <w:rPr>
-                <w:lang w:val="en-US"/>
-              </w:rPr>
-            </w:pPr>
-            <w:r>
-              <w:rPr>
-                <w:lang w:val="en-US"/>
-              </w:rPr>
-              <w:t>graf.alexander-23@stud.dhbw-ravensburg.de</w:t>
-            </w:r>
-          </w:p>
-        </w:tc>
-      </w:tr>
-      <w:tr>
-        <w:tc>
-          <w:tcPr>
-            <w:tcW w:w="2244" w:type="dxa"/>
-          </w:tcPr>
-          <w:p>
-            <w:pPr>
-              <w:rPr>
-                <w:lang w:val="en-US"/>
-              </w:rPr>
-            </w:pPr>
-            <w:r>
-              <w:t>David Rösch</w:t>
-            </w:r>
-          </w:p>
-        </w:tc>
-        <w:tc>
-          <w:tcPr>
-            <w:tcW w:w="2892" w:type="dxa"/>
-          </w:tcPr>
-          <w:p>
-            <w:pPr>
-              <w:rPr>
-                <w:lang w:val="en-US"/>
-              </w:rPr>
-            </w:pPr>
-            <w:r>
-              <w:t>HW-Beschaffung/SW Tester</w:t>
-            </w:r>
-          </w:p>
-        </w:tc>
-        <w:tc>
-          <w:tcPr>
-            <w:tcW w:w="3926" w:type="dxa"/>
-          </w:tcPr>
-          <w:p>
-            <w:pPr>
-              <w:rPr>
-                <w:lang w:val="en-US"/>
-              </w:rPr>
-            </w:pPr>
-            <w:r>
-              <w:rPr>
-                <w:lang w:val="en-US"/>
-              </w:rPr>
-              <w:t>david.roesch-23@stud.dhbw-ravensburg.de</w:t>
-            </w:r>
-          </w:p>
-        </w:tc>
-      </w:tr>
-      <w:tr>
-        <w:tc>
-          <w:tcPr>
-            <w:tcW w:w="2244" w:type="dxa"/>
-          </w:tcPr>
-          <w:p>
-            <w:pPr>
-              <w:rPr>
-                <w:lang w:val="en-US"/>
-              </w:rPr>
-            </w:pPr>
-            <w:r>
-              <w:t>Jacob Jäger</w:t>
-            </w:r>
-          </w:p>
-        </w:tc>
-        <w:tc>
-          <w:tcPr>
-            <w:tcW w:w="2892" w:type="dxa"/>
-          </w:tcPr>
-          <w:p>
-            <w:pPr>
-              <w:rPr>
-                <w:lang w:val="en-US"/>
-              </w:rPr>
-            </w:pPr>
-            <w:r>
-              <w:t>SW-Entwickler</w:t>
-            </w:r>
-            <w:r>
-              <w:t>/</w:t>
-            </w:r>
-            <w:proofErr w:type="spellStart"/>
-            <w:r>
-              <w:t>Git</w:t>
-            </w:r>
-            <w:proofErr w:type="spellEnd"/>
-            <w:r>
-              <w:t xml:space="preserve"> Beauftragter</w:t>
-            </w:r>
-          </w:p>
-        </w:tc>
-        <w:tc>
-          <w:tcPr>
-            <w:tcW w:w="3926" w:type="dxa"/>
-          </w:tcPr>
-          <w:p>
-            <w:pPr>
-              <w:rPr>
-                <w:lang w:val="en-US"/>
-              </w:rPr>
-            </w:pPr>
-            <w:r>
-              <w:rPr>
-                <w:lang w:val="en-US"/>
-              </w:rPr>
-              <w:t>jacob.jaeger-23@stud.dhbw-ravensburg.de</w:t>
-            </w:r>
-          </w:p>
-        </w:tc>
-      </w:tr>
-      <w:tr>
-        <w:tc>
-          <w:tcPr>
-            <w:tcW w:w="2244" w:type="dxa"/>
-          </w:tcPr>
-          <w:p>
-            <w:pPr>
-              <w:rPr>
-                <w:lang w:val="en-US"/>
-              </w:rPr>
-            </w:pPr>
-            <w:r>
-              <w:t>Johannes Winter</w:t>
-            </w:r>
-          </w:p>
-        </w:tc>
-        <w:tc>
-          <w:tcPr>
-            <w:tcW w:w="2892" w:type="dxa"/>
-          </w:tcPr>
-          <w:p>
-            <w:pPr>
-              <w:rPr>
-                <w:lang w:val="en-US"/>
-              </w:rPr>
-            </w:pPr>
-            <w:r>
-              <w:t>SW-Entwickler</w:t>
-            </w:r>
-            <w:r>
-              <w:t>/</w:t>
-            </w:r>
-            <w:proofErr w:type="spellStart"/>
-            <w:r>
-              <w:t>Entwicklungplaner</w:t>
-            </w:r>
-            <w:proofErr w:type="spellEnd"/>
+            <w:r>
+              <w:t>SW-Entwickler/Entwicklungsplaner</w:t>
+            </w:r>
           </w:p>
         </w:tc>
         <w:tc>
@@ -6528,7 +6743,7 @@
           <w:rPr>
             <w:lang w:val="en-US"/>
           </w:rPr>
-          <w:t>Draft</w:t>
+          <w:t>Submitted</w:t>
         </w:r>
       </w:sdtContent>
     </w:sdt>
@@ -8128,7 +8343,6 @@
   <w:style w:type="character" w:default="1" w:styleId="Absatz-Standardschriftart">
     <w:name w:val="Default Paragraph Font"/>
     <w:uiPriority w:val="1"/>
-    <w:semiHidden/>
     <w:unhideWhenUsed/>
   </w:style>
   <w:style w:type="table" w:default="1" w:styleId="NormaleTabelle">
@@ -8639,6 +8853,8 @@
   </w:compat>
   <w:rsids>
     <w:rsidRoot w:val="00B02220"/>
+    <w:rsid w:val="000C4669"/>
+    <w:rsid w:val="001708DF"/>
     <w:rsid w:val="0022503B"/>
     <w:rsid w:val="00285192"/>
     <w:rsid w:val="00494141"/>
@@ -8647,11 +8863,13 @@
     <w:rsid w:val="00835503"/>
     <w:rsid w:val="0089440F"/>
     <w:rsid w:val="00996D87"/>
+    <w:rsid w:val="009B61DB"/>
     <w:rsid w:val="009C1FFD"/>
     <w:rsid w:val="009D51D8"/>
     <w:rsid w:val="00A16EBD"/>
     <w:rsid w:val="00A50927"/>
     <w:rsid w:val="00B02220"/>
+    <w:rsid w:val="00B023D0"/>
     <w:rsid w:val="00BF3C5B"/>
     <w:rsid w:val="00C549A8"/>
     <w:rsid w:val="00C75C2C"/>
@@ -9412,6 +9630,26 @@
 </a:theme>
 </file>
 
+<file path=word/webextensions/taskpanes.xml><?xml version="1.0" encoding="utf-8"?>
+<wetp:taskpanes xmlns:wetp="http://schemas.microsoft.com/office/webextensions/taskpanes/2010/11">
+  <wetp:taskpane dockstate="right" visibility="0" width="525" row="0">
+    <wetp:webextensionref xmlns:r="http://schemas.openxmlformats.org/officeDocument/2006/relationships" r:id="rId1"/>
+  </wetp:taskpane>
+</wetp:taskpanes>
+</file>
+
+<file path=word/webextensions/webextension1.xml><?xml version="1.0" encoding="utf-8"?>
+<we:webextension xmlns:we="http://schemas.microsoft.com/office/webextensions/webextension/2010/11" id="{AAE62274-CA02-490F-8E84-D7A971D7B63E}">
+  <we:reference id="WA200005502" version="1.0.0.11" store="Omex" storeType="OMEX"/>
+  <we:alternateReferences>
+    <we:reference id="WA200005502" version="1.0.0.11" store="WA200005502" storeType="OMEX"/>
+  </we:alternateReferences>
+  <we:properties/>
+  <we:bindings/>
+  <we:snapshot xmlns:r="http://schemas.openxmlformats.org/officeDocument/2006/relationships"/>
+</we:webextension>
+</file>
+
 <file path=customXml/item1.xml><?xml version="1.0" encoding="utf-8"?>
 <b:Sources xmlns:b="http://schemas.openxmlformats.org/officeDocument/2006/bibliography" xmlns="http://schemas.openxmlformats.org/officeDocument/2006/bibliography" SelectedStyle="\APASixthEditionOfficeOnline.xsl" StyleName="APA" Version="6"/>
 </file>

</xml_diff>

<commit_message>
Entwicklungsplan erledigt->bereit für Review
</commit_message>
<xml_diff>
--- a/doc/Gruppe1_Audio_BPM_Erkennung_Entwicklungsplan.docx
+++ b/doc/Gruppe1_Audio_BPM_Erkennung_Entwicklungsplan.docx
@@ -151,7 +151,7 @@
             <w:rPr>
               <w:lang w:val="en-US"/>
             </w:rPr>
-            <w:t>Submitted</w:t>
+            <w:t>Final</w:t>
           </w:r>
         </w:sdtContent>
       </w:sdt>
@@ -174,7 +174,13 @@
             <w:spacing w:after="100" w:afterAutospacing="1"/>
           </w:pPr>
           <w:r>
-            <w:t>Version: 1.0</w:t>
+            <w:t xml:space="preserve">Version: </w:t>
+          </w:r>
+          <w:r>
+            <w:t>4</w:t>
+          </w:r>
+          <w:r>
+            <w:t>.0</w:t>
           </w:r>
         </w:p>
       </w:sdtContent>
@@ -260,7 +266,7 @@
           <w:r>
             <w:fldChar w:fldCharType="separate"/>
           </w:r>
-          <w:hyperlink w:anchor="_Toc228175833" w:history="1">
+          <w:hyperlink w:anchor="_Toc228369934" w:history="1">
             <w:r>
               <w:rPr>
                 <w:rStyle w:val="Hyperlink"/>
@@ -287,7 +293,7 @@
                 <w:noProof/>
                 <w:webHidden/>
               </w:rPr>
-              <w:instrText xml:space="preserve"> PAGEREF _Toc228175833 \h </w:instrText>
+              <w:instrText xml:space="preserve"> PAGEREF _Toc228369934 \h </w:instrText>
             </w:r>
             <w:r>
               <w:rPr>
@@ -334,7 +340,7 @@
               <w14:ligatures w14:val="standardContextual"/>
             </w:rPr>
           </w:pPr>
-          <w:hyperlink w:anchor="_Toc228175834" w:history="1">
+          <w:hyperlink w:anchor="_Toc228369935" w:history="1">
             <w:r>
               <w:rPr>
                 <w:rStyle w:val="Hyperlink"/>
@@ -361,7 +367,7 @@
                 <w:noProof/>
                 <w:webHidden/>
               </w:rPr>
-              <w:instrText xml:space="preserve"> PAGEREF _Toc228175834 \h </w:instrText>
+              <w:instrText xml:space="preserve"> PAGEREF _Toc228369935 \h </w:instrText>
             </w:r>
             <w:r>
               <w:rPr>
@@ -408,7 +414,7 @@
               <w14:ligatures w14:val="standardContextual"/>
             </w:rPr>
           </w:pPr>
-          <w:hyperlink w:anchor="_Toc228175835" w:history="1">
+          <w:hyperlink w:anchor="_Toc228369936" w:history="1">
             <w:r>
               <w:rPr>
                 <w:rStyle w:val="Hyperlink"/>
@@ -436,7 +442,7 @@
                 <w:noProof/>
                 <w:webHidden/>
               </w:rPr>
-              <w:instrText xml:space="preserve"> PAGEREF _Toc228175835 \h </w:instrText>
+              <w:instrText xml:space="preserve"> PAGEREF _Toc228369936 \h </w:instrText>
             </w:r>
             <w:r>
               <w:rPr>
@@ -483,7 +489,7 @@
               <w14:ligatures w14:val="standardContextual"/>
             </w:rPr>
           </w:pPr>
-          <w:hyperlink w:anchor="_Toc228175836" w:history="1">
+          <w:hyperlink w:anchor="_Toc228369937" w:history="1">
             <w:r>
               <w:rPr>
                 <w:rStyle w:val="Hyperlink"/>
@@ -511,7 +517,7 @@
                 <w:noProof/>
                 <w:webHidden/>
               </w:rPr>
-              <w:instrText xml:space="preserve"> PAGEREF _Toc228175836 \h </w:instrText>
+              <w:instrText xml:space="preserve"> PAGEREF _Toc228369937 \h </w:instrText>
             </w:r>
             <w:r>
               <w:rPr>
@@ -558,7 +564,7 @@
               <w14:ligatures w14:val="standardContextual"/>
             </w:rPr>
           </w:pPr>
-          <w:hyperlink w:anchor="_Toc228175837" w:history="1">
+          <w:hyperlink w:anchor="_Toc228369938" w:history="1">
             <w:r>
               <w:rPr>
                 <w:rStyle w:val="Hyperlink"/>
@@ -586,7 +592,7 @@
                 <w:noProof/>
                 <w:webHidden/>
               </w:rPr>
-              <w:instrText xml:space="preserve"> PAGEREF _Toc228175837 \h </w:instrText>
+              <w:instrText xml:space="preserve"> PAGEREF _Toc228369938 \h </w:instrText>
             </w:r>
             <w:r>
               <w:rPr>
@@ -633,13 +639,13 @@
               <w14:ligatures w14:val="standardContextual"/>
             </w:rPr>
           </w:pPr>
-          <w:hyperlink w:anchor="_Toc228175838" w:history="1">
+          <w:hyperlink w:anchor="_Toc228369939" w:history="1">
             <w:r>
               <w:rPr>
                 <w:rStyle w:val="Hyperlink"/>
                 <w:noProof/>
               </w:rPr>
-              <w:t>Organization des Teams</w:t>
+              <w:t>Team/Verantwortlichkeiten</w:t>
             </w:r>
             <w:r>
               <w:rPr>
@@ -660,7 +666,7 @@
                 <w:noProof/>
                 <w:webHidden/>
               </w:rPr>
-              <w:instrText xml:space="preserve"> PAGEREF _Toc228175838 \h </w:instrText>
+              <w:instrText xml:space="preserve"> PAGEREF _Toc228369939 \h </w:instrText>
             </w:r>
             <w:r>
               <w:rPr>
@@ -707,13 +713,14 @@
               <w14:ligatures w14:val="standardContextual"/>
             </w:rPr>
           </w:pPr>
-          <w:hyperlink w:anchor="_Toc228175839" w:history="1">
+          <w:hyperlink w:anchor="_Toc228369940" w:history="1">
             <w:r>
               <w:rPr>
                 <w:rStyle w:val="Hyperlink"/>
                 <w:noProof/>
-              </w:rPr>
-              <w:t>Team/Verantwortlichkeiten</w:t>
+                <w:lang w:val="en-US"/>
+              </w:rPr>
+              <w:t>Scrum/Sprints</w:t>
             </w:r>
             <w:r>
               <w:rPr>
@@ -734,7 +741,7 @@
                 <w:noProof/>
                 <w:webHidden/>
               </w:rPr>
-              <w:instrText xml:space="preserve"> PAGEREF _Toc228175839 \h </w:instrText>
+              <w:instrText xml:space="preserve"> PAGEREF _Toc228369940 \h </w:instrText>
             </w:r>
             <w:r>
               <w:rPr>
@@ -781,14 +788,13 @@
               <w14:ligatures w14:val="standardContextual"/>
             </w:rPr>
           </w:pPr>
-          <w:hyperlink w:anchor="_Toc228175840" w:history="1">
+          <w:hyperlink w:anchor="_Toc228369941" w:history="1">
             <w:r>
               <w:rPr>
                 <w:rStyle w:val="Hyperlink"/>
                 <w:noProof/>
-                <w:lang w:val="en-US"/>
-              </w:rPr>
-              <w:t>Scrum/Sprints</w:t>
+              </w:rPr>
+              <w:t>Kanban Board</w:t>
             </w:r>
             <w:r>
               <w:rPr>
@@ -809,7 +815,7 @@
                 <w:noProof/>
                 <w:webHidden/>
               </w:rPr>
-              <w:instrText xml:space="preserve"> PAGEREF _Toc228175840 \h </w:instrText>
+              <w:instrText xml:space="preserve"> PAGEREF _Toc228369941 \h </w:instrText>
             </w:r>
             <w:r>
               <w:rPr>
@@ -829,7 +835,7 @@
                 <w:noProof/>
                 <w:webHidden/>
               </w:rPr>
-              <w:t>5</w:t>
+              <w:t>6</w:t>
             </w:r>
             <w:r>
               <w:rPr>
@@ -856,13 +862,13 @@
               <w14:ligatures w14:val="standardContextual"/>
             </w:rPr>
           </w:pPr>
-          <w:hyperlink w:anchor="_Toc228175841" w:history="1">
+          <w:hyperlink w:anchor="_Toc228369942" w:history="1">
             <w:r>
               <w:rPr>
                 <w:rStyle w:val="Hyperlink"/>
                 <w:noProof/>
               </w:rPr>
-              <w:t>Kanban Board</w:t>
+              <w:t>Projektablage/Versionierung</w:t>
             </w:r>
             <w:r>
               <w:rPr>
@@ -883,7 +889,82 @@
                 <w:noProof/>
                 <w:webHidden/>
               </w:rPr>
-              <w:instrText xml:space="preserve"> PAGEREF _Toc228175841 \h </w:instrText>
+              <w:instrText xml:space="preserve"> PAGEREF _Toc228369942 \h </w:instrText>
+            </w:r>
+            <w:r>
+              <w:rPr>
+                <w:noProof/>
+                <w:webHidden/>
+              </w:rPr>
+            </w:r>
+            <w:r>
+              <w:rPr>
+                <w:noProof/>
+                <w:webHidden/>
+              </w:rPr>
+              <w:fldChar w:fldCharType="separate"/>
+            </w:r>
+            <w:r>
+              <w:rPr>
+                <w:noProof/>
+                <w:webHidden/>
+              </w:rPr>
+              <w:t>6</w:t>
+            </w:r>
+            <w:r>
+              <w:rPr>
+                <w:noProof/>
+                <w:webHidden/>
+              </w:rPr>
+              <w:fldChar w:fldCharType="end"/>
+            </w:r>
+          </w:hyperlink>
+        </w:p>
+        <w:p>
+          <w:pPr>
+            <w:pStyle w:val="Verzeichnis1"/>
+            <w:tabs>
+              <w:tab w:val="right" w:leader="dot" w:pos="9062"/>
+            </w:tabs>
+            <w:rPr>
+              <w:rFonts w:eastAsiaTheme="minorEastAsia"/>
+              <w:noProof/>
+              <w:kern w:val="2"/>
+              <w:sz w:val="24"/>
+              <w:szCs w:val="24"/>
+              <w:lang w:eastAsia="de-DE"/>
+              <w14:ligatures w14:val="standardContextual"/>
+            </w:rPr>
+          </w:pPr>
+          <w:hyperlink w:anchor="_Toc228369943" w:history="1">
+            <w:r>
+              <w:rPr>
+                <w:rStyle w:val="Hyperlink"/>
+                <w:noProof/>
+                <w:lang w:val="en-US"/>
+              </w:rPr>
+              <w:t>Anwendung &amp; Ziele</w:t>
+            </w:r>
+            <w:r>
+              <w:rPr>
+                <w:noProof/>
+                <w:webHidden/>
+              </w:rPr>
+              <w:tab/>
+            </w:r>
+            <w:r>
+              <w:rPr>
+                <w:noProof/>
+                <w:webHidden/>
+              </w:rPr>
+              <w:fldChar w:fldCharType="begin"/>
+            </w:r>
+            <w:r>
+              <w:rPr>
+                <w:noProof/>
+                <w:webHidden/>
+              </w:rPr>
+              <w:instrText xml:space="preserve"> PAGEREF _Toc228369943 \h </w:instrText>
             </w:r>
             <w:r>
               <w:rPr>
@@ -930,13 +1011,13 @@
               <w14:ligatures w14:val="standardContextual"/>
             </w:rPr>
           </w:pPr>
-          <w:hyperlink w:anchor="_Toc228175842" w:history="1">
+          <w:hyperlink w:anchor="_Toc228369944" w:history="1">
             <w:r>
               <w:rPr>
                 <w:rStyle w:val="Hyperlink"/>
                 <w:noProof/>
               </w:rPr>
-              <w:t>Projektablage/Versionierung</w:t>
+              <w:t>Beschreibung der projektspezifischen Anwendung</w:t>
             </w:r>
             <w:r>
               <w:rPr>
@@ -957,7 +1038,7 @@
                 <w:noProof/>
                 <w:webHidden/>
               </w:rPr>
-              <w:instrText xml:space="preserve"> PAGEREF _Toc228175842 \h </w:instrText>
+              <w:instrText xml:space="preserve"> PAGEREF _Toc228369944 \h </w:instrText>
             </w:r>
             <w:r>
               <w:rPr>
@@ -978,6 +1059,80 @@
                 <w:webHidden/>
               </w:rPr>
               <w:t>6</w:t>
+            </w:r>
+            <w:r>
+              <w:rPr>
+                <w:noProof/>
+                <w:webHidden/>
+              </w:rPr>
+              <w:fldChar w:fldCharType="end"/>
+            </w:r>
+          </w:hyperlink>
+        </w:p>
+        <w:p>
+          <w:pPr>
+            <w:pStyle w:val="Verzeichnis2"/>
+            <w:tabs>
+              <w:tab w:val="right" w:leader="dot" w:pos="9062"/>
+            </w:tabs>
+            <w:rPr>
+              <w:rFonts w:eastAsiaTheme="minorEastAsia"/>
+              <w:noProof/>
+              <w:kern w:val="2"/>
+              <w:sz w:val="24"/>
+              <w:szCs w:val="24"/>
+              <w:lang w:eastAsia="de-DE"/>
+              <w14:ligatures w14:val="standardContextual"/>
+            </w:rPr>
+          </w:pPr>
+          <w:hyperlink w:anchor="_Toc228369945" w:history="1">
+            <w:r>
+              <w:rPr>
+                <w:rStyle w:val="Hyperlink"/>
+                <w:noProof/>
+              </w:rPr>
+              <w:t>Ziele</w:t>
+            </w:r>
+            <w:r>
+              <w:rPr>
+                <w:noProof/>
+                <w:webHidden/>
+              </w:rPr>
+              <w:tab/>
+            </w:r>
+            <w:r>
+              <w:rPr>
+                <w:noProof/>
+                <w:webHidden/>
+              </w:rPr>
+              <w:fldChar w:fldCharType="begin"/>
+            </w:r>
+            <w:r>
+              <w:rPr>
+                <w:noProof/>
+                <w:webHidden/>
+              </w:rPr>
+              <w:instrText xml:space="preserve"> PAGEREF _Toc228369945 \h </w:instrText>
+            </w:r>
+            <w:r>
+              <w:rPr>
+                <w:noProof/>
+                <w:webHidden/>
+              </w:rPr>
+            </w:r>
+            <w:r>
+              <w:rPr>
+                <w:noProof/>
+                <w:webHidden/>
+              </w:rPr>
+              <w:fldChar w:fldCharType="separate"/>
+            </w:r>
+            <w:r>
+              <w:rPr>
+                <w:noProof/>
+                <w:webHidden/>
+              </w:rPr>
+              <w:t>7</w:t>
             </w:r>
             <w:r>
               <w:rPr>
@@ -1004,14 +1159,14 @@
               <w14:ligatures w14:val="standardContextual"/>
             </w:rPr>
           </w:pPr>
-          <w:hyperlink w:anchor="_Toc228175843" w:history="1">
+          <w:hyperlink w:anchor="_Toc228369946" w:history="1">
             <w:r>
               <w:rPr>
                 <w:rStyle w:val="Hyperlink"/>
                 <w:noProof/>
                 <w:lang w:val="en-US"/>
               </w:rPr>
-              <w:t>Anwendung &amp; Ziele</w:t>
+              <w:t>Anforderungsmanagement</w:t>
             </w:r>
             <w:r>
               <w:rPr>
@@ -1032,7 +1187,7 @@
                 <w:noProof/>
                 <w:webHidden/>
               </w:rPr>
-              <w:instrText xml:space="preserve"> PAGEREF _Toc228175843 \h </w:instrText>
+              <w:instrText xml:space="preserve"> PAGEREF _Toc228369946 \h </w:instrText>
             </w:r>
             <w:r>
               <w:rPr>
@@ -1052,7 +1207,7 @@
                 <w:noProof/>
                 <w:webHidden/>
               </w:rPr>
-              <w:t>6</w:t>
+              <w:t>7</w:t>
             </w:r>
             <w:r>
               <w:rPr>
@@ -1079,13 +1234,13 @@
               <w14:ligatures w14:val="standardContextual"/>
             </w:rPr>
           </w:pPr>
-          <w:hyperlink w:anchor="_Toc228175844" w:history="1">
+          <w:hyperlink w:anchor="_Toc228369947" w:history="1">
             <w:r>
               <w:rPr>
                 <w:rStyle w:val="Hyperlink"/>
                 <w:noProof/>
               </w:rPr>
-              <w:t>Beschreibung der projektspezifischen Anwendung</w:t>
+              <w:t>Prozessablauf</w:t>
             </w:r>
             <w:r>
               <w:rPr>
@@ -1106,7 +1261,7 @@
                 <w:noProof/>
                 <w:webHidden/>
               </w:rPr>
-              <w:instrText xml:space="preserve"> PAGEREF _Toc228175844 \h </w:instrText>
+              <w:instrText xml:space="preserve"> PAGEREF _Toc228369947 \h </w:instrText>
             </w:r>
             <w:r>
               <w:rPr>
@@ -1126,7 +1281,82 @@
                 <w:noProof/>
                 <w:webHidden/>
               </w:rPr>
-              <w:t>6</w:t>
+              <w:t>8</w:t>
+            </w:r>
+            <w:r>
+              <w:rPr>
+                <w:noProof/>
+                <w:webHidden/>
+              </w:rPr>
+              <w:fldChar w:fldCharType="end"/>
+            </w:r>
+          </w:hyperlink>
+        </w:p>
+        <w:p>
+          <w:pPr>
+            <w:pStyle w:val="Verzeichnis1"/>
+            <w:tabs>
+              <w:tab w:val="right" w:leader="dot" w:pos="9062"/>
+            </w:tabs>
+            <w:rPr>
+              <w:rFonts w:eastAsiaTheme="minorEastAsia"/>
+              <w:noProof/>
+              <w:kern w:val="2"/>
+              <w:sz w:val="24"/>
+              <w:szCs w:val="24"/>
+              <w:lang w:eastAsia="de-DE"/>
+              <w14:ligatures w14:val="standardContextual"/>
+            </w:rPr>
+          </w:pPr>
+          <w:hyperlink w:anchor="_Toc228369948" w:history="1">
+            <w:r>
+              <w:rPr>
+                <w:rStyle w:val="Hyperlink"/>
+                <w:noProof/>
+                <w:lang w:val="en-US"/>
+              </w:rPr>
+              <w:t>Architektur &amp; Design</w:t>
+            </w:r>
+            <w:r>
+              <w:rPr>
+                <w:noProof/>
+                <w:webHidden/>
+              </w:rPr>
+              <w:tab/>
+            </w:r>
+            <w:r>
+              <w:rPr>
+                <w:noProof/>
+                <w:webHidden/>
+              </w:rPr>
+              <w:fldChar w:fldCharType="begin"/>
+            </w:r>
+            <w:r>
+              <w:rPr>
+                <w:noProof/>
+                <w:webHidden/>
+              </w:rPr>
+              <w:instrText xml:space="preserve"> PAGEREF _Toc228369948 \h </w:instrText>
+            </w:r>
+            <w:r>
+              <w:rPr>
+                <w:noProof/>
+                <w:webHidden/>
+              </w:rPr>
+            </w:r>
+            <w:r>
+              <w:rPr>
+                <w:noProof/>
+                <w:webHidden/>
+              </w:rPr>
+              <w:fldChar w:fldCharType="separate"/>
+            </w:r>
+            <w:r>
+              <w:rPr>
+                <w:noProof/>
+                <w:webHidden/>
+              </w:rPr>
+              <w:t>9</w:t>
             </w:r>
             <w:r>
               <w:rPr>
@@ -1153,13 +1383,13 @@
               <w14:ligatures w14:val="standardContextual"/>
             </w:rPr>
           </w:pPr>
-          <w:hyperlink w:anchor="_Toc228175845" w:history="1">
+          <w:hyperlink w:anchor="_Toc228369949" w:history="1">
             <w:r>
               <w:rPr>
                 <w:rStyle w:val="Hyperlink"/>
                 <w:noProof/>
               </w:rPr>
-              <w:t>Ziele</w:t>
+              <w:t>Architektur</w:t>
             </w:r>
             <w:r>
               <w:rPr>
@@ -1180,7 +1410,7 @@
                 <w:noProof/>
                 <w:webHidden/>
               </w:rPr>
-              <w:instrText xml:space="preserve"> PAGEREF _Toc228175845 \h </w:instrText>
+              <w:instrText xml:space="preserve"> PAGEREF _Toc228369949 \h </w:instrText>
             </w:r>
             <w:r>
               <w:rPr>
@@ -1200,7 +1430,232 @@
                 <w:noProof/>
                 <w:webHidden/>
               </w:rPr>
-              <w:t>7</w:t>
+              <w:t>9</w:t>
+            </w:r>
+            <w:r>
+              <w:rPr>
+                <w:noProof/>
+                <w:webHidden/>
+              </w:rPr>
+              <w:fldChar w:fldCharType="end"/>
+            </w:r>
+          </w:hyperlink>
+        </w:p>
+        <w:p>
+          <w:pPr>
+            <w:pStyle w:val="Verzeichnis3"/>
+            <w:tabs>
+              <w:tab w:val="right" w:leader="dot" w:pos="9062"/>
+            </w:tabs>
+            <w:rPr>
+              <w:rFonts w:eastAsiaTheme="minorEastAsia"/>
+              <w:noProof/>
+              <w:kern w:val="2"/>
+              <w:sz w:val="24"/>
+              <w:szCs w:val="24"/>
+              <w:lang w:eastAsia="de-DE"/>
+              <w14:ligatures w14:val="standardContextual"/>
+            </w:rPr>
+          </w:pPr>
+          <w:hyperlink w:anchor="_Toc228369950" w:history="1">
+            <w:r>
+              <w:rPr>
+                <w:rStyle w:val="Hyperlink"/>
+                <w:rFonts w:eastAsia="Times New Roman"/>
+                <w:noProof/>
+                <w:lang w:eastAsia="de-DE"/>
+              </w:rPr>
+              <w:t>Modellierung</w:t>
+            </w:r>
+            <w:r>
+              <w:rPr>
+                <w:noProof/>
+                <w:webHidden/>
+              </w:rPr>
+              <w:tab/>
+            </w:r>
+            <w:r>
+              <w:rPr>
+                <w:noProof/>
+                <w:webHidden/>
+              </w:rPr>
+              <w:fldChar w:fldCharType="begin"/>
+            </w:r>
+            <w:r>
+              <w:rPr>
+                <w:noProof/>
+                <w:webHidden/>
+              </w:rPr>
+              <w:instrText xml:space="preserve"> PAGEREF _Toc228369950 \h </w:instrText>
+            </w:r>
+            <w:r>
+              <w:rPr>
+                <w:noProof/>
+                <w:webHidden/>
+              </w:rPr>
+            </w:r>
+            <w:r>
+              <w:rPr>
+                <w:noProof/>
+                <w:webHidden/>
+              </w:rPr>
+              <w:fldChar w:fldCharType="separate"/>
+            </w:r>
+            <w:r>
+              <w:rPr>
+                <w:noProof/>
+                <w:webHidden/>
+              </w:rPr>
+              <w:t>9</w:t>
+            </w:r>
+            <w:r>
+              <w:rPr>
+                <w:noProof/>
+                <w:webHidden/>
+              </w:rPr>
+              <w:fldChar w:fldCharType="end"/>
+            </w:r>
+          </w:hyperlink>
+        </w:p>
+        <w:p>
+          <w:pPr>
+            <w:pStyle w:val="Verzeichnis2"/>
+            <w:tabs>
+              <w:tab w:val="right" w:leader="dot" w:pos="9062"/>
+            </w:tabs>
+            <w:rPr>
+              <w:rFonts w:eastAsiaTheme="minorEastAsia"/>
+              <w:noProof/>
+              <w:kern w:val="2"/>
+              <w:sz w:val="24"/>
+              <w:szCs w:val="24"/>
+              <w:lang w:eastAsia="de-DE"/>
+              <w14:ligatures w14:val="standardContextual"/>
+            </w:rPr>
+          </w:pPr>
+          <w:hyperlink w:anchor="_Toc228369951" w:history="1">
+            <w:r>
+              <w:rPr>
+                <w:rStyle w:val="Hyperlink"/>
+                <w:rFonts w:cstheme="minorHAnsi"/>
+                <w:noProof/>
+              </w:rPr>
+              <w:t>Designentscheidungen</w:t>
+            </w:r>
+            <w:r>
+              <w:rPr>
+                <w:noProof/>
+                <w:webHidden/>
+              </w:rPr>
+              <w:tab/>
+            </w:r>
+            <w:r>
+              <w:rPr>
+                <w:noProof/>
+                <w:webHidden/>
+              </w:rPr>
+              <w:fldChar w:fldCharType="begin"/>
+            </w:r>
+            <w:r>
+              <w:rPr>
+                <w:noProof/>
+                <w:webHidden/>
+              </w:rPr>
+              <w:instrText xml:space="preserve"> PAGEREF _Toc228369951 \h </w:instrText>
+            </w:r>
+            <w:r>
+              <w:rPr>
+                <w:noProof/>
+                <w:webHidden/>
+              </w:rPr>
+            </w:r>
+            <w:r>
+              <w:rPr>
+                <w:noProof/>
+                <w:webHidden/>
+              </w:rPr>
+              <w:fldChar w:fldCharType="separate"/>
+            </w:r>
+            <w:r>
+              <w:rPr>
+                <w:noProof/>
+                <w:webHidden/>
+              </w:rPr>
+              <w:t>9</w:t>
+            </w:r>
+            <w:r>
+              <w:rPr>
+                <w:noProof/>
+                <w:webHidden/>
+              </w:rPr>
+              <w:fldChar w:fldCharType="end"/>
+            </w:r>
+          </w:hyperlink>
+        </w:p>
+        <w:p>
+          <w:pPr>
+            <w:pStyle w:val="Verzeichnis2"/>
+            <w:tabs>
+              <w:tab w:val="right" w:leader="dot" w:pos="9062"/>
+            </w:tabs>
+            <w:rPr>
+              <w:rFonts w:eastAsiaTheme="minorEastAsia"/>
+              <w:noProof/>
+              <w:kern w:val="2"/>
+              <w:sz w:val="24"/>
+              <w:szCs w:val="24"/>
+              <w:lang w:eastAsia="de-DE"/>
+              <w14:ligatures w14:val="standardContextual"/>
+            </w:rPr>
+          </w:pPr>
+          <w:hyperlink w:anchor="_Toc228369952" w:history="1">
+            <w:r>
+              <w:rPr>
+                <w:rStyle w:val="Hyperlink"/>
+                <w:noProof/>
+              </w:rPr>
+              <w:t>Wiederverwendung von Open Source Libraries</w:t>
+            </w:r>
+            <w:r>
+              <w:rPr>
+                <w:noProof/>
+                <w:webHidden/>
+              </w:rPr>
+              <w:tab/>
+            </w:r>
+            <w:r>
+              <w:rPr>
+                <w:noProof/>
+                <w:webHidden/>
+              </w:rPr>
+              <w:fldChar w:fldCharType="begin"/>
+            </w:r>
+            <w:r>
+              <w:rPr>
+                <w:noProof/>
+                <w:webHidden/>
+              </w:rPr>
+              <w:instrText xml:space="preserve"> PAGEREF _Toc228369952 \h </w:instrText>
+            </w:r>
+            <w:r>
+              <w:rPr>
+                <w:noProof/>
+                <w:webHidden/>
+              </w:rPr>
+            </w:r>
+            <w:r>
+              <w:rPr>
+                <w:noProof/>
+                <w:webHidden/>
+              </w:rPr>
+              <w:fldChar w:fldCharType="separate"/>
+            </w:r>
+            <w:r>
+              <w:rPr>
+                <w:noProof/>
+                <w:webHidden/>
+              </w:rPr>
+              <w:t>10</w:t>
             </w:r>
             <w:r>
               <w:rPr>
@@ -1227,14 +1682,14 @@
               <w14:ligatures w14:val="standardContextual"/>
             </w:rPr>
           </w:pPr>
-          <w:hyperlink w:anchor="_Toc228175846" w:history="1">
+          <w:hyperlink w:anchor="_Toc228369953" w:history="1">
             <w:r>
               <w:rPr>
                 <w:rStyle w:val="Hyperlink"/>
                 <w:noProof/>
                 <w:lang w:val="en-US"/>
               </w:rPr>
-              <w:t>Anforderungsmanagement</w:t>
+              <w:t>Verifizierung und Validierung</w:t>
             </w:r>
             <w:r>
               <w:rPr>
@@ -1255,7 +1710,7 @@
                 <w:noProof/>
                 <w:webHidden/>
               </w:rPr>
-              <w:instrText xml:space="preserve"> PAGEREF _Toc228175846 \h </w:instrText>
+              <w:instrText xml:space="preserve"> PAGEREF _Toc228369953 \h </w:instrText>
             </w:r>
             <w:r>
               <w:rPr>
@@ -1275,7 +1730,7 @@
                 <w:noProof/>
                 <w:webHidden/>
               </w:rPr>
-              <w:t>7</w:t>
+              <w:t>10</w:t>
             </w:r>
             <w:r>
               <w:rPr>
@@ -1302,13 +1757,14 @@
               <w14:ligatures w14:val="standardContextual"/>
             </w:rPr>
           </w:pPr>
-          <w:hyperlink w:anchor="_Toc228175847" w:history="1">
+          <w:hyperlink w:anchor="_Toc228369954" w:history="1">
             <w:r>
               <w:rPr>
                 <w:rStyle w:val="Hyperlink"/>
                 <w:noProof/>
-              </w:rPr>
-              <w:t>Anforderungsmanagement</w:t>
+                <w:lang w:val="en-US"/>
+              </w:rPr>
+              <w:t>Formelle Test Cases</w:t>
             </w:r>
             <w:r>
               <w:rPr>
@@ -1329,7 +1785,7 @@
                 <w:noProof/>
                 <w:webHidden/>
               </w:rPr>
-              <w:instrText xml:space="preserve"> PAGEREF _Toc228175847 \h </w:instrText>
+              <w:instrText xml:space="preserve"> PAGEREF _Toc228369954 \h </w:instrText>
             </w:r>
             <w:r>
               <w:rPr>
@@ -1349,7 +1805,7 @@
                 <w:noProof/>
                 <w:webHidden/>
               </w:rPr>
-              <w:t>7</w:t>
+              <w:t>10</w:t>
             </w:r>
             <w:r>
               <w:rPr>
@@ -1376,14 +1832,14 @@
               <w14:ligatures w14:val="standardContextual"/>
             </w:rPr>
           </w:pPr>
-          <w:hyperlink w:anchor="_Toc228175848" w:history="1">
+          <w:hyperlink w:anchor="_Toc228369955" w:history="1">
             <w:r>
               <w:rPr>
                 <w:rStyle w:val="Hyperlink"/>
                 <w:noProof/>
                 <w:lang w:val="en-US"/>
               </w:rPr>
-              <w:t>Architektur &amp; Design</w:t>
+              <w:t>References</w:t>
             </w:r>
             <w:r>
               <w:rPr>
@@ -1404,7 +1860,7 @@
                 <w:noProof/>
                 <w:webHidden/>
               </w:rPr>
-              <w:instrText xml:space="preserve"> PAGEREF _Toc228175848 \h </w:instrText>
+              <w:instrText xml:space="preserve"> PAGEREF _Toc228369955 \h </w:instrText>
             </w:r>
             <w:r>
               <w:rPr>
@@ -1424,306 +1880,7 @@
                 <w:noProof/>
                 <w:webHidden/>
               </w:rPr>
-              <w:t>8</w:t>
-            </w:r>
-            <w:r>
-              <w:rPr>
-                <w:noProof/>
-                <w:webHidden/>
-              </w:rPr>
-              <w:fldChar w:fldCharType="end"/>
-            </w:r>
-          </w:hyperlink>
-        </w:p>
-        <w:p>
-          <w:pPr>
-            <w:pStyle w:val="Verzeichnis2"/>
-            <w:tabs>
-              <w:tab w:val="right" w:leader="dot" w:pos="9062"/>
-            </w:tabs>
-            <w:rPr>
-              <w:rFonts w:eastAsiaTheme="minorEastAsia"/>
-              <w:noProof/>
-              <w:kern w:val="2"/>
-              <w:sz w:val="24"/>
-              <w:szCs w:val="24"/>
-              <w:lang w:eastAsia="de-DE"/>
-              <w14:ligatures w14:val="standardContextual"/>
-            </w:rPr>
-          </w:pPr>
-          <w:hyperlink w:anchor="_Toc228175849" w:history="1">
-            <w:r>
-              <w:rPr>
-                <w:rStyle w:val="Hyperlink"/>
-                <w:noProof/>
-              </w:rPr>
-              <w:t>Architektur</w:t>
-            </w:r>
-            <w:r>
-              <w:rPr>
-                <w:noProof/>
-                <w:webHidden/>
-              </w:rPr>
-              <w:tab/>
-            </w:r>
-            <w:r>
-              <w:rPr>
-                <w:noProof/>
-                <w:webHidden/>
-              </w:rPr>
-              <w:fldChar w:fldCharType="begin"/>
-            </w:r>
-            <w:r>
-              <w:rPr>
-                <w:noProof/>
-                <w:webHidden/>
-              </w:rPr>
-              <w:instrText xml:space="preserve"> PAGEREF _Toc228175849 \h </w:instrText>
-            </w:r>
-            <w:r>
-              <w:rPr>
-                <w:noProof/>
-                <w:webHidden/>
-              </w:rPr>
-            </w:r>
-            <w:r>
-              <w:rPr>
-                <w:noProof/>
-                <w:webHidden/>
-              </w:rPr>
-              <w:fldChar w:fldCharType="separate"/>
-            </w:r>
-            <w:r>
-              <w:rPr>
-                <w:noProof/>
-                <w:webHidden/>
-              </w:rPr>
-              <w:t>8</w:t>
-            </w:r>
-            <w:r>
-              <w:rPr>
-                <w:noProof/>
-                <w:webHidden/>
-              </w:rPr>
-              <w:fldChar w:fldCharType="end"/>
-            </w:r>
-          </w:hyperlink>
-        </w:p>
-        <w:p>
-          <w:pPr>
-            <w:pStyle w:val="Verzeichnis3"/>
-            <w:tabs>
-              <w:tab w:val="right" w:leader="dot" w:pos="9062"/>
-            </w:tabs>
-            <w:rPr>
-              <w:rFonts w:eastAsiaTheme="minorEastAsia"/>
-              <w:noProof/>
-              <w:kern w:val="2"/>
-              <w:sz w:val="24"/>
-              <w:szCs w:val="24"/>
-              <w:lang w:eastAsia="de-DE"/>
-              <w14:ligatures w14:val="standardContextual"/>
-            </w:rPr>
-          </w:pPr>
-          <w:hyperlink w:anchor="_Toc228175850" w:history="1">
-            <w:r>
-              <w:rPr>
-                <w:rStyle w:val="Hyperlink"/>
-                <w:rFonts w:eastAsia="Times New Roman"/>
-                <w:noProof/>
-                <w:lang w:eastAsia="de-DE"/>
-              </w:rPr>
-              <w:t>Modellierung</w:t>
-            </w:r>
-            <w:r>
-              <w:rPr>
-                <w:noProof/>
-                <w:webHidden/>
-              </w:rPr>
-              <w:tab/>
-            </w:r>
-            <w:r>
-              <w:rPr>
-                <w:noProof/>
-                <w:webHidden/>
-              </w:rPr>
-              <w:fldChar w:fldCharType="begin"/>
-            </w:r>
-            <w:r>
-              <w:rPr>
-                <w:noProof/>
-                <w:webHidden/>
-              </w:rPr>
-              <w:instrText xml:space="preserve"> PAGEREF _Toc228175850 \h </w:instrText>
-            </w:r>
-            <w:r>
-              <w:rPr>
-                <w:noProof/>
-                <w:webHidden/>
-              </w:rPr>
-            </w:r>
-            <w:r>
-              <w:rPr>
-                <w:noProof/>
-                <w:webHidden/>
-              </w:rPr>
-              <w:fldChar w:fldCharType="separate"/>
-            </w:r>
-            <w:r>
-              <w:rPr>
-                <w:noProof/>
-                <w:webHidden/>
-              </w:rPr>
-              <w:t>9</w:t>
-            </w:r>
-            <w:r>
-              <w:rPr>
-                <w:noProof/>
-                <w:webHidden/>
-              </w:rPr>
-              <w:fldChar w:fldCharType="end"/>
-            </w:r>
-          </w:hyperlink>
-        </w:p>
-        <w:p>
-          <w:pPr>
-            <w:pStyle w:val="Verzeichnis2"/>
-            <w:tabs>
-              <w:tab w:val="right" w:leader="dot" w:pos="9062"/>
-            </w:tabs>
-            <w:rPr>
-              <w:rFonts w:eastAsiaTheme="minorEastAsia"/>
-              <w:noProof/>
-              <w:kern w:val="2"/>
-              <w:sz w:val="24"/>
-              <w:szCs w:val="24"/>
-              <w:lang w:eastAsia="de-DE"/>
-              <w14:ligatures w14:val="standardContextual"/>
-            </w:rPr>
-          </w:pPr>
-          <w:hyperlink w:anchor="_Toc228175851" w:history="1">
-            <w:r>
-              <w:rPr>
-                <w:rStyle w:val="Hyperlink"/>
-                <w:rFonts w:cstheme="minorHAnsi"/>
-                <w:noProof/>
-              </w:rPr>
-              <w:t>Designentscheidungen</w:t>
-            </w:r>
-            <w:r>
-              <w:rPr>
-                <w:noProof/>
-                <w:webHidden/>
-              </w:rPr>
-              <w:tab/>
-            </w:r>
-            <w:r>
-              <w:rPr>
-                <w:noProof/>
-                <w:webHidden/>
-              </w:rPr>
-              <w:fldChar w:fldCharType="begin"/>
-            </w:r>
-            <w:r>
-              <w:rPr>
-                <w:noProof/>
-                <w:webHidden/>
-              </w:rPr>
-              <w:instrText xml:space="preserve"> PAGEREF _Toc228175851 \h </w:instrText>
-            </w:r>
-            <w:r>
-              <w:rPr>
-                <w:noProof/>
-                <w:webHidden/>
-              </w:rPr>
-            </w:r>
-            <w:r>
-              <w:rPr>
-                <w:noProof/>
-                <w:webHidden/>
-              </w:rPr>
-              <w:fldChar w:fldCharType="separate"/>
-            </w:r>
-            <w:r>
-              <w:rPr>
-                <w:noProof/>
-                <w:webHidden/>
-              </w:rPr>
-              <w:t>9</w:t>
-            </w:r>
-            <w:r>
-              <w:rPr>
-                <w:noProof/>
-                <w:webHidden/>
-              </w:rPr>
-              <w:fldChar w:fldCharType="end"/>
-            </w:r>
-          </w:hyperlink>
-        </w:p>
-        <w:p>
-          <w:pPr>
-            <w:pStyle w:val="Verzeichnis2"/>
-            <w:tabs>
-              <w:tab w:val="right" w:leader="dot" w:pos="9062"/>
-            </w:tabs>
-            <w:rPr>
-              <w:rFonts w:eastAsiaTheme="minorEastAsia"/>
-              <w:noProof/>
-              <w:kern w:val="2"/>
-              <w:sz w:val="24"/>
-              <w:szCs w:val="24"/>
-              <w:lang w:eastAsia="de-DE"/>
-              <w14:ligatures w14:val="standardContextual"/>
-            </w:rPr>
-          </w:pPr>
-          <w:hyperlink w:anchor="_Toc228175852" w:history="1">
-            <w:r>
-              <w:rPr>
-                <w:rStyle w:val="Hyperlink"/>
-                <w:noProof/>
-              </w:rPr>
-              <w:t>Wiederverwendung von Open Source Libraries</w:t>
-            </w:r>
-            <w:r>
-              <w:rPr>
-                <w:noProof/>
-                <w:webHidden/>
-              </w:rPr>
-              <w:tab/>
-            </w:r>
-            <w:r>
-              <w:rPr>
-                <w:noProof/>
-                <w:webHidden/>
-              </w:rPr>
-              <w:fldChar w:fldCharType="begin"/>
-            </w:r>
-            <w:r>
-              <w:rPr>
-                <w:noProof/>
-                <w:webHidden/>
-              </w:rPr>
-              <w:instrText xml:space="preserve"> PAGEREF _Toc228175852 \h </w:instrText>
-            </w:r>
-            <w:r>
-              <w:rPr>
-                <w:noProof/>
-                <w:webHidden/>
-              </w:rPr>
-            </w:r>
-            <w:r>
-              <w:rPr>
-                <w:noProof/>
-                <w:webHidden/>
-              </w:rPr>
-              <w:fldChar w:fldCharType="separate"/>
-            </w:r>
-            <w:r>
-              <w:rPr>
-                <w:noProof/>
-                <w:webHidden/>
-              </w:rPr>
-              <w:t>10</w:t>
+              <w:t>11</w:t>
             </w:r>
             <w:r>
               <w:rPr>
@@ -1750,14 +1907,14 @@
               <w14:ligatures w14:val="standardContextual"/>
             </w:rPr>
           </w:pPr>
-          <w:hyperlink w:anchor="_Toc228175853" w:history="1">
+          <w:hyperlink w:anchor="_Toc228369956" w:history="1">
             <w:r>
               <w:rPr>
                 <w:rStyle w:val="Hyperlink"/>
                 <w:noProof/>
                 <w:lang w:val="en-US"/>
               </w:rPr>
-              <w:t>Verifizierung und Validierung</w:t>
+              <w:t>Distribution list</w:t>
             </w:r>
             <w:r>
               <w:rPr>
@@ -1778,232 +1935,7 @@
                 <w:noProof/>
                 <w:webHidden/>
               </w:rPr>
-              <w:instrText xml:space="preserve"> PAGEREF _Toc228175853 \h </w:instrText>
-            </w:r>
-            <w:r>
-              <w:rPr>
-                <w:noProof/>
-                <w:webHidden/>
-              </w:rPr>
-            </w:r>
-            <w:r>
-              <w:rPr>
-                <w:noProof/>
-                <w:webHidden/>
-              </w:rPr>
-              <w:fldChar w:fldCharType="separate"/>
-            </w:r>
-            <w:r>
-              <w:rPr>
-                <w:noProof/>
-                <w:webHidden/>
-              </w:rPr>
-              <w:t>10</w:t>
-            </w:r>
-            <w:r>
-              <w:rPr>
-                <w:noProof/>
-                <w:webHidden/>
-              </w:rPr>
-              <w:fldChar w:fldCharType="end"/>
-            </w:r>
-          </w:hyperlink>
-        </w:p>
-        <w:p>
-          <w:pPr>
-            <w:pStyle w:val="Verzeichnis2"/>
-            <w:tabs>
-              <w:tab w:val="right" w:leader="dot" w:pos="9062"/>
-            </w:tabs>
-            <w:rPr>
-              <w:rFonts w:eastAsiaTheme="minorEastAsia"/>
-              <w:noProof/>
-              <w:kern w:val="2"/>
-              <w:sz w:val="24"/>
-              <w:szCs w:val="24"/>
-              <w:lang w:eastAsia="de-DE"/>
-              <w14:ligatures w14:val="standardContextual"/>
-            </w:rPr>
-          </w:pPr>
-          <w:hyperlink w:anchor="_Toc228175854" w:history="1">
-            <w:r>
-              <w:rPr>
-                <w:rStyle w:val="Hyperlink"/>
-                <w:noProof/>
-                <w:lang w:val="en-US"/>
-              </w:rPr>
-              <w:t>Formelle Test Cases</w:t>
-            </w:r>
-            <w:r>
-              <w:rPr>
-                <w:noProof/>
-                <w:webHidden/>
-              </w:rPr>
-              <w:tab/>
-            </w:r>
-            <w:r>
-              <w:rPr>
-                <w:noProof/>
-                <w:webHidden/>
-              </w:rPr>
-              <w:fldChar w:fldCharType="begin"/>
-            </w:r>
-            <w:r>
-              <w:rPr>
-                <w:noProof/>
-                <w:webHidden/>
-              </w:rPr>
-              <w:instrText xml:space="preserve"> PAGEREF _Toc228175854 \h </w:instrText>
-            </w:r>
-            <w:r>
-              <w:rPr>
-                <w:noProof/>
-                <w:webHidden/>
-              </w:rPr>
-            </w:r>
-            <w:r>
-              <w:rPr>
-                <w:noProof/>
-                <w:webHidden/>
-              </w:rPr>
-              <w:fldChar w:fldCharType="separate"/>
-            </w:r>
-            <w:r>
-              <w:rPr>
-                <w:noProof/>
-                <w:webHidden/>
-              </w:rPr>
-              <w:t>10</w:t>
-            </w:r>
-            <w:r>
-              <w:rPr>
-                <w:noProof/>
-                <w:webHidden/>
-              </w:rPr>
-              <w:fldChar w:fldCharType="end"/>
-            </w:r>
-          </w:hyperlink>
-        </w:p>
-        <w:p>
-          <w:pPr>
-            <w:pStyle w:val="Verzeichnis1"/>
-            <w:tabs>
-              <w:tab w:val="right" w:leader="dot" w:pos="9062"/>
-            </w:tabs>
-            <w:rPr>
-              <w:rFonts w:eastAsiaTheme="minorEastAsia"/>
-              <w:noProof/>
-              <w:kern w:val="2"/>
-              <w:sz w:val="24"/>
-              <w:szCs w:val="24"/>
-              <w:lang w:eastAsia="de-DE"/>
-              <w14:ligatures w14:val="standardContextual"/>
-            </w:rPr>
-          </w:pPr>
-          <w:hyperlink w:anchor="_Toc228175855" w:history="1">
-            <w:r>
-              <w:rPr>
-                <w:rStyle w:val="Hyperlink"/>
-                <w:noProof/>
-                <w:lang w:val="en-US"/>
-              </w:rPr>
-              <w:t>References</w:t>
-            </w:r>
-            <w:r>
-              <w:rPr>
-                <w:noProof/>
-                <w:webHidden/>
-              </w:rPr>
-              <w:tab/>
-            </w:r>
-            <w:r>
-              <w:rPr>
-                <w:noProof/>
-                <w:webHidden/>
-              </w:rPr>
-              <w:fldChar w:fldCharType="begin"/>
-            </w:r>
-            <w:r>
-              <w:rPr>
-                <w:noProof/>
-                <w:webHidden/>
-              </w:rPr>
-              <w:instrText xml:space="preserve"> PAGEREF _Toc228175855 \h </w:instrText>
-            </w:r>
-            <w:r>
-              <w:rPr>
-                <w:noProof/>
-                <w:webHidden/>
-              </w:rPr>
-            </w:r>
-            <w:r>
-              <w:rPr>
-                <w:noProof/>
-                <w:webHidden/>
-              </w:rPr>
-              <w:fldChar w:fldCharType="separate"/>
-            </w:r>
-            <w:r>
-              <w:rPr>
-                <w:noProof/>
-                <w:webHidden/>
-              </w:rPr>
-              <w:t>11</w:t>
-            </w:r>
-            <w:r>
-              <w:rPr>
-                <w:noProof/>
-                <w:webHidden/>
-              </w:rPr>
-              <w:fldChar w:fldCharType="end"/>
-            </w:r>
-          </w:hyperlink>
-        </w:p>
-        <w:p>
-          <w:pPr>
-            <w:pStyle w:val="Verzeichnis1"/>
-            <w:tabs>
-              <w:tab w:val="right" w:leader="dot" w:pos="9062"/>
-            </w:tabs>
-            <w:rPr>
-              <w:rFonts w:eastAsiaTheme="minorEastAsia"/>
-              <w:noProof/>
-              <w:kern w:val="2"/>
-              <w:sz w:val="24"/>
-              <w:szCs w:val="24"/>
-              <w:lang w:eastAsia="de-DE"/>
-              <w14:ligatures w14:val="standardContextual"/>
-            </w:rPr>
-          </w:pPr>
-          <w:hyperlink w:anchor="_Toc228175856" w:history="1">
-            <w:r>
-              <w:rPr>
-                <w:rStyle w:val="Hyperlink"/>
-                <w:noProof/>
-                <w:lang w:val="en-US"/>
-              </w:rPr>
-              <w:t>Distribution list</w:t>
-            </w:r>
-            <w:r>
-              <w:rPr>
-                <w:noProof/>
-                <w:webHidden/>
-              </w:rPr>
-              <w:tab/>
-            </w:r>
-            <w:r>
-              <w:rPr>
-                <w:noProof/>
-                <w:webHidden/>
-              </w:rPr>
-              <w:fldChar w:fldCharType="begin"/>
-            </w:r>
-            <w:r>
-              <w:rPr>
-                <w:noProof/>
-                <w:webHidden/>
-              </w:rPr>
-              <w:instrText xml:space="preserve"> PAGEREF _Toc228175856 \h </w:instrText>
+              <w:instrText xml:space="preserve"> PAGEREF _Toc228369956 \h </w:instrText>
             </w:r>
             <w:r>
               <w:rPr>
@@ -2054,7 +1986,7 @@
       <w:pPr>
         <w:pStyle w:val="berschrift1"/>
       </w:pPr>
-      <w:bookmarkStart w:id="0" w:name="_Toc228175833"/>
+      <w:bookmarkStart w:id="0" w:name="_Toc228369934"/>
       <w:proofErr w:type="spellStart"/>
       <w:r>
         <w:lastRenderedPageBreak/>
@@ -2217,7 +2149,7 @@
           </w:tcPr>
           <w:p>
             <w:r>
-              <w:t>TBD</w:t>
+              <w:t>Kapitel Architektur &amp; Design und Verifizierung und Validierung ergänzt.</w:t>
             </w:r>
           </w:p>
         </w:tc>
@@ -2227,19 +2159,31 @@
           <w:tcPr>
             <w:tcW w:w="988" w:type="dxa"/>
           </w:tcPr>
-          <w:p/>
+          <w:p>
+            <w:r>
+              <w:t>4.0</w:t>
+            </w:r>
+          </w:p>
         </w:tc>
         <w:tc>
           <w:tcPr>
             <w:tcW w:w="1842" w:type="dxa"/>
           </w:tcPr>
-          <w:p/>
+          <w:p>
+            <w:r>
+              <w:t>Johannes Winter</w:t>
+            </w:r>
+          </w:p>
         </w:tc>
         <w:tc>
           <w:tcPr>
             <w:tcW w:w="6232" w:type="dxa"/>
           </w:tcPr>
-          <w:p/>
+          <w:p>
+            <w:r>
+              <w:t>Aktualisierung der Rollenverteilung/Verantwortlichkeiten und des Kanban Boards</w:t>
+            </w:r>
+          </w:p>
         </w:tc>
       </w:tr>
       <w:tr>
@@ -2288,7 +2232,7 @@
       <w:pPr>
         <w:pStyle w:val="berschrift1"/>
       </w:pPr>
-      <w:bookmarkStart w:id="1" w:name="_Toc228175834"/>
+      <w:bookmarkStart w:id="1" w:name="_Toc228369935"/>
       <w:r>
         <w:t xml:space="preserve">Template </w:t>
       </w:r>
@@ -2382,19 +2326,31 @@
           <w:tcPr>
             <w:tcW w:w="988" w:type="dxa"/>
           </w:tcPr>
-          <w:p/>
+          <w:p>
+            <w:r>
+              <w:t>2.0</w:t>
+            </w:r>
+          </w:p>
         </w:tc>
         <w:tc>
           <w:tcPr>
             <w:tcW w:w="1842" w:type="dxa"/>
           </w:tcPr>
-          <w:p/>
+          <w:p>
+            <w:r>
+              <w:t>Johannes Winter</w:t>
+            </w:r>
+          </w:p>
         </w:tc>
         <w:tc>
           <w:tcPr>
             <w:tcW w:w="6232" w:type="dxa"/>
           </w:tcPr>
-          <w:p/>
+          <w:p>
+            <w:r>
+              <w:t>Veränderung einiger Überschriften</w:t>
+            </w:r>
+          </w:p>
         </w:tc>
       </w:tr>
       <w:tr>
@@ -2491,7 +2447,7 @@
           <w:lang w:val="en-US"/>
         </w:rPr>
       </w:pPr>
-      <w:bookmarkStart w:id="2" w:name="_Toc228175835"/>
+      <w:bookmarkStart w:id="2" w:name="_Toc228369936"/>
       <w:r>
         <w:rPr>
           <w:lang w:val="en-US"/>
@@ -2520,19 +2476,12 @@
     </w:p>
     <w:p>
       <w:pPr>
+        <w:pStyle w:val="berschrift1"/>
         <w:rPr>
           <w:lang w:val="en-US"/>
         </w:rPr>
       </w:pPr>
-    </w:p>
-    <w:p>
-      <w:pPr>
-        <w:pStyle w:val="berschrift1"/>
-        <w:rPr>
-          <w:lang w:val="en-US"/>
-        </w:rPr>
-      </w:pPr>
-      <w:bookmarkStart w:id="3" w:name="_Toc228175836"/>
+      <w:bookmarkStart w:id="3" w:name="_Toc228369937"/>
       <w:proofErr w:type="spellStart"/>
       <w:r>
         <w:rPr>
@@ -2545,39 +2494,120 @@
     </w:p>
     <w:p>
       <w:r>
-        <w:t xml:space="preserve">Die Entwicklung beschränkt sich auf die </w:t>
-      </w:r>
-      <w:r>
-        <w:t>DSP-Anwendung</w:t>
-      </w:r>
-      <w:r>
-        <w:t>, die in Kapitel „Anwendung &amp; Ziele“ beschrieben ist. Diese Entwicklung ist eine Projektarbeit im Rahmen des Kurses „Prozessortechnik“ an der DHBW Ravensburg i</w:t>
-      </w:r>
-      <w:r>
-        <w:t>m Zeitraum</w:t>
-      </w:r>
-      <w:r>
-        <w:t xml:space="preserve"> Q2-202</w:t>
-      </w:r>
-      <w:r>
-        <w:t>6</w:t>
-      </w:r>
-      <w:r>
-        <w:t>.</w:t>
-      </w:r>
-    </w:p>
+        <w:t>Die Entwicklung umfasst die Realisierung der DSP-Logik gemäß den im Kapitel „Anwendung &amp; Ziele“ definierten Spezifikationen. D</w:t>
+      </w:r>
+      <w:r>
+        <w:t>iese Entwicklung ist eine Projektarbeit</w:t>
+      </w:r>
+      <w:r>
+        <w:t xml:space="preserve"> im Kurs „Prozessortechnik“ an der DHBW Ravensburg</w:t>
+      </w:r>
+      <w:r>
+        <w:t>, die im Zeitraum Q2-2026 durchgeführt wird.</w:t>
+      </w:r>
+    </w:p>
+    <w:p>
+      <w:r>
+        <w:t>Der formale Rahmen der Entwicklung ist auf folgende Artefakte begrenzt:</w:t>
+      </w:r>
+    </w:p>
+    <w:p>
+      <w:pPr>
+        <w:numPr>
+          <w:ilvl w:val="0"/>
+          <w:numId w:val="11"/>
+        </w:numPr>
+      </w:pPr>
+      <w:r>
+        <w:rPr>
+          <w:b/>
+          <w:bCs/>
+        </w:rPr>
+        <w:t>Anforderungsanalyse:</w:t>
+      </w:r>
+      <w:r>
+        <w:t xml:space="preserve"> Definition von 6 User Stories und daraus abgeleiteter funktionaler/nicht-funktionaler Anforderungen.</w:t>
+      </w:r>
+    </w:p>
+    <w:p>
+      <w:pPr>
+        <w:numPr>
+          <w:ilvl w:val="0"/>
+          <w:numId w:val="11"/>
+        </w:numPr>
+      </w:pPr>
+      <w:r>
+        <w:rPr>
+          <w:b/>
+          <w:bCs/>
+        </w:rPr>
+        <w:t>Systementwurf:</w:t>
+      </w:r>
+      <w:r>
+        <w:t xml:space="preserve"> Erstellung der Architekturanteile, die unmittelbar aus den Anforderungen resultieren.</w:t>
+      </w:r>
+    </w:p>
+    <w:p>
+      <w:pPr>
+        <w:numPr>
+          <w:ilvl w:val="0"/>
+          <w:numId w:val="11"/>
+        </w:numPr>
+      </w:pPr>
+      <w:r>
+        <w:rPr>
+          <w:b/>
+          <w:bCs/>
+        </w:rPr>
+        <w:t>Qualitätssicherung:</w:t>
+      </w:r>
+      <w:r>
+        <w:t xml:space="preserve"> Entwicklung von </w:t>
+      </w:r>
+      <w:proofErr w:type="gramStart"/>
+      <w:r>
+        <w:t>Test Cases</w:t>
+      </w:r>
+      <w:proofErr w:type="gramEnd"/>
+      <w:r>
+        <w:t xml:space="preserve"> basierend auf den Anforderungen.</w:t>
+      </w:r>
+    </w:p>
+    <w:p>
+      <w:pPr>
+        <w:numPr>
+          <w:ilvl w:val="0"/>
+          <w:numId w:val="11"/>
+        </w:numPr>
+      </w:pPr>
+      <w:proofErr w:type="spellStart"/>
+      <w:r>
+        <w:rPr>
+          <w:b/>
+          <w:bCs/>
+        </w:rPr>
+        <w:t>Traceability</w:t>
+      </w:r>
+      <w:proofErr w:type="spellEnd"/>
+      <w:r>
+        <w:rPr>
+          <w:b/>
+          <w:bCs/>
+        </w:rPr>
+        <w:t>:</w:t>
+      </w:r>
+      <w:r>
+        <w:t xml:space="preserve"> Dokumentation einer lückenlosen Nachverfolgbarkeit (100%) über alle oben genannten Phasen hinweg.</w:t>
+      </w:r>
+    </w:p>
+    <w:p/>
+    <w:p/>
     <w:p>
       <w:pPr>
         <w:rPr>
           <w:color w:val="EE0000"/>
         </w:rPr>
       </w:pPr>
-      <w:r>
-        <w:rPr>
-          <w:color w:val="EE0000"/>
-        </w:rPr>
-        <w:t>TBD</w:t>
-      </w:r>
     </w:p>
     <w:p/>
     <w:p>
@@ -2607,7 +2637,7 @@
           <w:lang w:val="en-US"/>
         </w:rPr>
       </w:pPr>
-      <w:bookmarkStart w:id="4" w:name="_Toc228175837"/>
+      <w:bookmarkStart w:id="4" w:name="_Toc228369938"/>
       <w:proofErr w:type="spellStart"/>
       <w:r>
         <w:rPr>
@@ -2652,46 +2682,29 @@
       </w:pPr>
     </w:p>
     <w:p>
+      <w:r>
+        <w:t xml:space="preserve">Das Projekt wird die agile Methode </w:t>
+      </w:r>
+      <w:proofErr w:type="spellStart"/>
+      <w:r>
+        <w:t>Scrum</w:t>
+      </w:r>
+      <w:proofErr w:type="spellEnd"/>
+      <w:r>
+        <w:t xml:space="preserve"> für die Entwicklung verwenden.</w:t>
+      </w:r>
+    </w:p>
+    <w:p>
       <w:pPr>
         <w:pStyle w:val="berschrift2"/>
       </w:pPr>
-      <w:bookmarkStart w:id="5" w:name="_Toc163900061"/>
-      <w:bookmarkStart w:id="6" w:name="_Toc228175838"/>
-      <w:proofErr w:type="spellStart"/>
-      <w:r>
-        <w:t>Organization</w:t>
-      </w:r>
-      <w:proofErr w:type="spellEnd"/>
-      <w:r>
-        <w:t xml:space="preserve"> des Teams</w:t>
+      <w:bookmarkStart w:id="5" w:name="_Toc163900062"/>
+      <w:bookmarkStart w:id="6" w:name="_Toc228369939"/>
+      <w:r>
+        <w:t>Team/Verantwortlichkeiten</w:t>
       </w:r>
       <w:bookmarkEnd w:id="5"/>
       <w:bookmarkEnd w:id="6"/>
-    </w:p>
-    <w:p>
-      <w:r>
-        <w:t xml:space="preserve">Das Projekt wird die agile Methode </w:t>
-      </w:r>
-      <w:proofErr w:type="spellStart"/>
-      <w:r>
-        <w:t>Scrum</w:t>
-      </w:r>
-      <w:proofErr w:type="spellEnd"/>
-      <w:r>
-        <w:t xml:space="preserve"> für die Entwicklung verwenden.</w:t>
-      </w:r>
-    </w:p>
-    <w:p>
-      <w:pPr>
-        <w:pStyle w:val="berschrift2"/>
-      </w:pPr>
-      <w:bookmarkStart w:id="7" w:name="_Toc163900062"/>
-      <w:bookmarkStart w:id="8" w:name="_Toc228175839"/>
-      <w:r>
-        <w:t>Team/Verantwortlichkeiten</w:t>
-      </w:r>
-      <w:bookmarkEnd w:id="7"/>
-      <w:bookmarkEnd w:id="8"/>
     </w:p>
     <w:p>
       <w:r>
@@ -2870,7 +2883,10 @@
           </w:tcPr>
           <w:p>
             <w:r>
-              <w:t>SW-Tester</w:t>
+              <w:t>SW</w:t>
+            </w:r>
+            <w:r>
+              <w:t>/HW-Architekt</w:t>
             </w:r>
           </w:p>
         </w:tc>
@@ -2926,7 +2942,7 @@
           </w:tcPr>
           <w:p>
             <w:r>
-              <w:t>HW-Beschaffung/</w:t>
+              <w:t xml:space="preserve">Testingenieur, </w:t>
             </w:r>
             <w:proofErr w:type="spellStart"/>
             <w:r>
@@ -2951,15 +2967,15 @@
           </w:tcPr>
           <w:p>
             <w:r>
-              <w:t>Abnahme der Anwendung</w:t>
-            </w:r>
-            <w:r>
-              <w:t>,</w:t>
+              <w:t>Abnahme der Anwendung,</w:t>
             </w:r>
           </w:p>
           <w:p>
             <w:r>
               <w:t>Genehmigung des Entwicklungsplans</w:t>
+            </w:r>
+            <w:r>
+              <w:t>, Test</w:t>
             </w:r>
           </w:p>
         </w:tc>
@@ -2998,7 +3014,7 @@
               <w:t>SW-Entwickler</w:t>
             </w:r>
             <w:r>
-              <w:t>/</w:t>
+              <w:t xml:space="preserve">, </w:t>
             </w:r>
             <w:r>
               <w:t>Repository-Verantwortlicher</w:t>
@@ -3059,10 +3075,19 @@
           </w:tcPr>
           <w:p>
             <w:r>
-              <w:t>SW-Entwickler</w:t>
-            </w:r>
-            <w:r>
-              <w:t>/Entwicklungsplaner</w:t>
+              <w:t>SW</w:t>
+            </w:r>
+            <w:r>
+              <w:t>-</w:t>
+            </w:r>
+            <w:r>
+              <w:t>Entwickler</w:t>
+            </w:r>
+            <w:r>
+              <w:t xml:space="preserve">, </w:t>
+            </w:r>
+            <w:r>
+              <w:t>Entwicklungsplaner</w:t>
             </w:r>
           </w:p>
         </w:tc>
@@ -3079,7 +3104,10 @@
           </w:tcPr>
           <w:p>
             <w:r>
-              <w:t>SW-Inbetriebnahme</w:t>
+              <w:t>SW-</w:t>
+            </w:r>
+            <w:r>
+              <w:t>Inbetriebnahme</w:t>
             </w:r>
             <w:r>
               <w:t>, Entwicklungsplanung</w:t>
@@ -3102,22 +3130,22 @@
           <w:lang w:val="en-US"/>
         </w:rPr>
       </w:pPr>
-      <w:bookmarkStart w:id="9" w:name="_Toc163900063"/>
-      <w:bookmarkStart w:id="10" w:name="_Toc228175840"/>
+      <w:bookmarkStart w:id="7" w:name="_Toc163900063"/>
+      <w:bookmarkStart w:id="8" w:name="_Toc228369940"/>
       <w:r>
         <w:rPr>
           <w:lang w:val="en-US"/>
         </w:rPr>
         <w:t>Scrum</w:t>
       </w:r>
-      <w:bookmarkEnd w:id="9"/>
+      <w:bookmarkEnd w:id="7"/>
       <w:r>
         <w:rPr>
           <w:lang w:val="en-US"/>
         </w:rPr>
         <w:t>/Sprints</w:t>
       </w:r>
-      <w:bookmarkEnd w:id="10"/>
+      <w:bookmarkEnd w:id="8"/>
     </w:p>
     <w:p>
       <w:r>
@@ -3221,13 +3249,14 @@
       <w:pPr>
         <w:pStyle w:val="berschrift2"/>
       </w:pPr>
-      <w:bookmarkStart w:id="11" w:name="_Toc163900064"/>
-      <w:bookmarkStart w:id="12" w:name="_Toc228175841"/>
-      <w:r>
+      <w:bookmarkStart w:id="9" w:name="_Toc163900064"/>
+      <w:bookmarkStart w:id="10" w:name="_Toc228369941"/>
+      <w:r>
+        <w:lastRenderedPageBreak/>
         <w:t>Kanban Board</w:t>
       </w:r>
-      <w:bookmarkEnd w:id="11"/>
-      <w:bookmarkEnd w:id="12"/>
+      <w:bookmarkEnd w:id="9"/>
+      <w:bookmarkEnd w:id="10"/>
     </w:p>
     <w:p>
       <w:r>
@@ -3255,17 +3284,12 @@
         <w:t xml:space="preserve"> Definition, Architecture Design, Implementation, </w:t>
       </w:r>
       <w:proofErr w:type="spellStart"/>
-      <w:proofErr w:type="gramStart"/>
       <w:r>
         <w:t>Verification</w:t>
       </w:r>
       <w:proofErr w:type="spellEnd"/>
       <w:r>
-        <w:t xml:space="preserve"> ,</w:t>
-      </w:r>
-      <w:proofErr w:type="gramEnd"/>
-      <w:r>
-        <w:t xml:space="preserve"> Done).</w:t>
+        <w:t>, Done).</w:t>
       </w:r>
     </w:p>
     <w:p>
@@ -3362,16 +3386,16 @@
       <w:pPr>
         <w:pStyle w:val="berschrift2"/>
       </w:pPr>
-      <w:bookmarkStart w:id="13" w:name="_Toc163900065"/>
-      <w:bookmarkStart w:id="14" w:name="_Toc228175842"/>
+      <w:bookmarkStart w:id="11" w:name="_Toc163900065"/>
+      <w:bookmarkStart w:id="12" w:name="_Toc228369942"/>
       <w:r>
         <w:t>Projektablage</w:t>
       </w:r>
-      <w:bookmarkEnd w:id="13"/>
+      <w:bookmarkEnd w:id="11"/>
       <w:r>
         <w:t>/Versionierung</w:t>
       </w:r>
-      <w:bookmarkEnd w:id="14"/>
+      <w:bookmarkEnd w:id="12"/>
     </w:p>
     <w:p>
       <w:r>
@@ -3429,7 +3453,7 @@
           <w:lang w:val="en-US"/>
         </w:rPr>
       </w:pPr>
-      <w:bookmarkStart w:id="15" w:name="_Toc228175843"/>
+      <w:bookmarkStart w:id="13" w:name="_Toc228369943"/>
       <w:proofErr w:type="spellStart"/>
       <w:r>
         <w:rPr>
@@ -3451,85 +3475,85 @@
         </w:rPr>
         <w:t>Ziele</w:t>
       </w:r>
+      <w:bookmarkEnd w:id="13"/>
+      <w:proofErr w:type="spellEnd"/>
+    </w:p>
+    <w:p>
+      <w:pPr>
+        <w:rPr>
+          <w:lang w:val="en-US"/>
+        </w:rPr>
+      </w:pPr>
+    </w:p>
+    <w:p>
+      <w:pPr>
+        <w:pStyle w:val="berschrift2"/>
+      </w:pPr>
+      <w:bookmarkStart w:id="14" w:name="_Toc165127826"/>
+      <w:bookmarkStart w:id="15" w:name="_Toc228369944"/>
+      <w:r>
+        <w:t>Be</w:t>
+      </w:r>
+      <w:r>
+        <w:t>schreibung der projektspezifischen Anwendung</w:t>
+      </w:r>
+      <w:bookmarkEnd w:id="14"/>
       <w:bookmarkEnd w:id="15"/>
-      <w:proofErr w:type="spellEnd"/>
-    </w:p>
-    <w:p>
-      <w:pPr>
-        <w:rPr>
-          <w:lang w:val="en-US"/>
-        </w:rPr>
-      </w:pPr>
-    </w:p>
+    </w:p>
+    <w:p>
+      <w:r>
+        <w:t>Die Anwendung ist eine Audio</w:t>
+      </w:r>
+      <w:r>
+        <w:t xml:space="preserve"> </w:t>
+      </w:r>
+      <w:r>
+        <w:t>BPM</w:t>
+      </w:r>
+      <w:r>
+        <w:t xml:space="preserve"> </w:t>
+      </w:r>
+      <w:r>
+        <w:t>Erkennung. Sie wird auf dem Board „STM32F746G-Discovery“ unter Nutzung der DSP-Funktionalität des Mikrocontrollers „Arm Cortex-M7“ realisiert. Für die Aufnahme des Audiosignals werden die auf dem Board integrierten Mikrofone verwendet.</w:t>
+      </w:r>
+    </w:p>
+    <w:p>
+      <w:r>
+        <w:t>Nach dem Start der Anwendung wird das eingehende Audiosignal kontinuierlich erfasst und über den ADC digitalisiert. Anschließen</w:t>
+      </w:r>
+      <w:r>
+        <w:t xml:space="preserve">d </w:t>
+      </w:r>
+      <w:r>
+        <w:t>erfolgt die Verarbeitung mittels digitaler Signalverarbeitung, um aus dem Musiksignal die Beats zu extrahieren und die Beats per Minute (BPM) zu berechnen.</w:t>
+      </w:r>
+      <w:r>
+        <w:t xml:space="preserve"> </w:t>
+      </w:r>
+      <w:r>
+        <w:t>Die ermittelte BPM-Zahl wird in Echtzeit auf dem Display des Boards angezeigt.</w:t>
+      </w:r>
+    </w:p>
+    <w:p>
+      <w:r>
+        <w:t>Die Messung kann beliebig oft wiederholt werden, indem neue Audiosignale (z. B. verschiedene Musikstücke) erfasst und analysiert werden. Dabei dient das Entwicklungsboard als Plattform zur Aufnahme analoger Signale, deren Digitalisierung über den ADC sowie zur anschließenden BPM-Erkennung mittels DSP-Algorithmen.</w:t>
+      </w:r>
+    </w:p>
+    <w:p>
+      <w:r>
+        <w:br w:type="page"/>
+      </w:r>
+    </w:p>
+    <w:p/>
     <w:p>
       <w:pPr>
         <w:pStyle w:val="berschrift2"/>
       </w:pPr>
-      <w:bookmarkStart w:id="16" w:name="_Toc165127826"/>
-      <w:bookmarkStart w:id="17" w:name="_Toc228175844"/>
-      <w:r>
-        <w:t>Be</w:t>
-      </w:r>
-      <w:r>
-        <w:t>schreibung der projektspezifischen Anwendung</w:t>
+      <w:bookmarkStart w:id="16" w:name="_Toc228369945"/>
+      <w:r>
+        <w:t>Ziele</w:t>
       </w:r>
       <w:bookmarkEnd w:id="16"/>
-      <w:bookmarkEnd w:id="17"/>
-    </w:p>
-    <w:p>
-      <w:r>
-        <w:t>Die Anwendung ist eine Audio</w:t>
-      </w:r>
-      <w:r>
-        <w:t xml:space="preserve"> </w:t>
-      </w:r>
-      <w:r>
-        <w:t>BPM</w:t>
-      </w:r>
-      <w:r>
-        <w:t xml:space="preserve"> </w:t>
-      </w:r>
-      <w:r>
-        <w:t>Erkennung. Sie wird auf dem Board „STM32F746G-Discovery“ unter Nutzung der DSP-Funktionalität des Mikrocontrollers „Arm Cortex-M7“ realisiert. Für die Aufnahme des Audiosignals werden die auf dem Board integrierten Mikrofone verwendet.</w:t>
-      </w:r>
-    </w:p>
-    <w:p>
-      <w:r>
-        <w:t>Nach dem Start der Anwendung wird das eingehende Audiosignal kontinuierlich erfasst und über den ADC digitalisiert. Anschließen</w:t>
-      </w:r>
-      <w:r>
-        <w:t xml:space="preserve">d </w:t>
-      </w:r>
-      <w:r>
-        <w:t>erfolgt die Verarbeitung mittels digitaler Signalverarbeitung, um aus dem Musiksignal die Beats zu extrahieren und die Beats per Minute (BPM) zu berechnen.</w:t>
-      </w:r>
-      <w:r>
-        <w:t xml:space="preserve"> </w:t>
-      </w:r>
-      <w:r>
-        <w:t>Die ermittelte BPM-Zahl wird in Echtzeit auf dem Display des Boards angezeigt.</w:t>
-      </w:r>
-    </w:p>
-    <w:p>
-      <w:r>
-        <w:t>Die Messung kann beliebig oft wiederholt werden, indem neue Audiosignale (z. B. verschiedene Musikstücke) erfasst und analysiert werden. Dabei dient das Entwicklungsboard als Plattform zur Aufnahme analoger Signale, deren Digitalisierung über den ADC sowie zur anschließenden BPM-Erkennung mittels DSP-Algorithmen.</w:t>
-      </w:r>
-    </w:p>
-    <w:p>
-      <w:r>
-        <w:br w:type="page"/>
-      </w:r>
-    </w:p>
-    <w:p/>
-    <w:p>
-      <w:pPr>
-        <w:pStyle w:val="berschrift2"/>
-      </w:pPr>
-      <w:bookmarkStart w:id="18" w:name="_Toc228175845"/>
-      <w:r>
-        <w:t>Ziele</w:t>
-      </w:r>
-      <w:bookmarkEnd w:id="18"/>
     </w:p>
     <w:p>
       <w:r>
@@ -3959,7 +3983,7 @@
           <w:lang w:val="en-US"/>
         </w:rPr>
       </w:pPr>
-      <w:bookmarkStart w:id="19" w:name="_Toc228175846"/>
+      <w:bookmarkStart w:id="17" w:name="_Toc228369946"/>
       <w:proofErr w:type="spellStart"/>
       <w:r>
         <w:rPr>
@@ -3967,7 +3991,7 @@
         </w:rPr>
         <w:t>Anforderungsmanagement</w:t>
       </w:r>
-      <w:bookmarkEnd w:id="19"/>
+      <w:bookmarkEnd w:id="17"/>
       <w:proofErr w:type="spellEnd"/>
     </w:p>
     <w:p>
@@ -3986,6 +4010,8 @@
       <w:r>
         <w:t>Auf Basis der definierten Anforderungen wird anschließend die Systemarchitektur entworfen und spezifiziert. Darauf aufbauend werden die Testfälle entwickelt, wobei insbesondere die in den User Stories formulierten Akzeptanzkriterien als Grundlage für die Verifikation herangezogen werden.</w:t>
       </w:r>
+    </w:p>
+    <w:p>
       <w:r>
         <w:rPr>
           <w:noProof/>
@@ -4028,6 +4054,24 @@
         </w:drawing>
       </w:r>
     </w:p>
+    <w:p/>
+    <w:p>
+      <w:r>
+        <w:br w:type="page"/>
+      </w:r>
+    </w:p>
+    <w:p>
+      <w:pPr>
+        <w:pStyle w:val="berschrift2"/>
+      </w:pPr>
+      <w:bookmarkStart w:id="18" w:name="_Toc228369947"/>
+      <w:r>
+        <w:lastRenderedPageBreak/>
+        <w:t>Prozessablauf</w:t>
+      </w:r>
+      <w:bookmarkEnd w:id="18"/>
+    </w:p>
+    <w:p/>
     <w:p>
       <w:r>
         <w:t>Die User Stories werden mit Hilfe der Schablone definiert:</w:t>
@@ -4106,24 +4150,6 @@
       </w:tr>
     </w:tbl>
     <w:p/>
-    <w:p>
-      <w:r>
-        <w:br w:type="page"/>
-      </w:r>
-    </w:p>
-    <w:p>
-      <w:pPr>
-        <w:pStyle w:val="berschrift2"/>
-      </w:pPr>
-      <w:bookmarkStart w:id="20" w:name="_Toc165127830"/>
-      <w:bookmarkStart w:id="21" w:name="_Toc228175847"/>
-      <w:r>
-        <w:lastRenderedPageBreak/>
-        <w:t>Anforderungsmanagement</w:t>
-      </w:r>
-      <w:bookmarkEnd w:id="20"/>
-      <w:bookmarkEnd w:id="21"/>
-    </w:p>
     <w:p>
       <w:r>
         <w:t>Die Anforderungen werden aus den User Stories abgeleitet und mithilfe einer standardisierten Schablone dokumentiert.</w:t>
@@ -4535,7 +4561,11 @@
         </w:drawing>
       </w:r>
     </w:p>
-    <w:p/>
+    <w:p>
+      <w:r>
+        <w:br w:type="page"/>
+      </w:r>
+    </w:p>
     <w:p>
       <w:pPr>
         <w:pStyle w:val="berschrift1"/>
@@ -4543,12 +4573,13 @@
           <w:lang w:val="en-US"/>
         </w:rPr>
       </w:pPr>
-      <w:bookmarkStart w:id="22" w:name="_Toc228175848"/>
+      <w:bookmarkStart w:id="19" w:name="_Toc228369948"/>
       <w:proofErr w:type="spellStart"/>
       <w:r>
         <w:rPr>
           <w:lang w:val="en-US"/>
         </w:rPr>
+        <w:lastRenderedPageBreak/>
         <w:t>Architektur</w:t>
       </w:r>
       <w:proofErr w:type="spellEnd"/>
@@ -4558,8 +4589,8 @@
         </w:rPr>
         <w:t xml:space="preserve"> &amp; Design</w:t>
       </w:r>
-      <w:bookmarkStart w:id="23" w:name="_Toc165127832"/>
-      <w:bookmarkEnd w:id="22"/>
+      <w:bookmarkStart w:id="20" w:name="_Toc165127832"/>
+      <w:bookmarkEnd w:id="19"/>
     </w:p>
     <w:p>
       <w:pPr>
@@ -4572,13 +4603,13 @@
       <w:pPr>
         <w:pStyle w:val="berschrift2"/>
       </w:pPr>
-      <w:bookmarkStart w:id="24" w:name="_Toc228175849"/>
+      <w:bookmarkStart w:id="21" w:name="_Toc228369949"/>
       <w:r>
         <w:t>Architektur</w:t>
       </w:r>
-      <w:bookmarkStart w:id="25" w:name="_Toc165127833"/>
-      <w:bookmarkEnd w:id="23"/>
-      <w:bookmarkEnd w:id="24"/>
+      <w:bookmarkStart w:id="22" w:name="_Toc165127833"/>
+      <w:bookmarkEnd w:id="20"/>
+      <w:bookmarkEnd w:id="21"/>
     </w:p>
     <w:p>
       <w:pPr>
@@ -4709,16 +4740,15 @@
           <w:lang w:eastAsia="de-DE"/>
         </w:rPr>
       </w:pPr>
-      <w:bookmarkStart w:id="26" w:name="_Toc228175850"/>
+      <w:bookmarkStart w:id="23" w:name="_Toc228369950"/>
       <w:r>
         <w:rPr>
           <w:rFonts w:eastAsia="Times New Roman"/>
           <w:lang w:eastAsia="de-DE"/>
         </w:rPr>
-        <w:lastRenderedPageBreak/>
         <w:t>Modellierung</w:t>
       </w:r>
-      <w:bookmarkEnd w:id="26"/>
+      <w:bookmarkEnd w:id="23"/>
     </w:p>
     <w:p>
       <w:pPr>
@@ -4856,15 +4886,15 @@
           <w:rFonts w:asciiTheme="minorHAnsi" w:hAnsiTheme="minorHAnsi" w:cstheme="minorHAnsi"/>
         </w:rPr>
       </w:pPr>
-      <w:bookmarkStart w:id="27" w:name="_Toc228175851"/>
+      <w:bookmarkStart w:id="24" w:name="_Toc228369951"/>
       <w:r>
         <w:rPr>
           <w:rFonts w:asciiTheme="minorHAnsi" w:hAnsiTheme="minorHAnsi" w:cstheme="minorHAnsi"/>
         </w:rPr>
         <w:t>Designentscheidungen</w:t>
       </w:r>
-      <w:bookmarkEnd w:id="25"/>
-      <w:bookmarkEnd w:id="27"/>
+      <w:bookmarkEnd w:id="22"/>
+      <w:bookmarkEnd w:id="24"/>
     </w:p>
     <w:p>
       <w:pPr>
@@ -5000,6 +5030,48 @@
         <w:t>Lizenz</w:t>
       </w:r>
     </w:p>
+    <w:p>
+      <w:pPr>
+        <w:rPr>
+          <w:rFonts w:cstheme="minorHAnsi"/>
+        </w:rPr>
+      </w:pPr>
+    </w:p>
+    <w:p>
+      <w:pPr>
+        <w:rPr>
+          <w:rFonts w:cstheme="minorHAnsi"/>
+        </w:rPr>
+      </w:pPr>
+    </w:p>
+    <w:p>
+      <w:pPr>
+        <w:rPr>
+          <w:rFonts w:cstheme="minorHAnsi"/>
+        </w:rPr>
+      </w:pPr>
+    </w:p>
+    <w:p>
+      <w:pPr>
+        <w:rPr>
+          <w:rFonts w:cstheme="minorHAnsi"/>
+        </w:rPr>
+      </w:pPr>
+    </w:p>
+    <w:p>
+      <w:pPr>
+        <w:rPr>
+          <w:rFonts w:cstheme="minorHAnsi"/>
+        </w:rPr>
+      </w:pPr>
+    </w:p>
+    <w:p>
+      <w:pPr>
+        <w:rPr>
+          <w:rFonts w:cstheme="minorHAnsi"/>
+        </w:rPr>
+      </w:pPr>
+    </w:p>
     <w:p/>
     <w:p>
       <w:r>
@@ -5011,6 +5083,7 @@
         <w:rPr>
           <w:noProof/>
         </w:rPr>
+        <w:lastRenderedPageBreak/>
         <w:drawing>
           <wp:inline distT="0" distB="0" distL="0" distR="0" wp14:anchorId="757690D7" wp14:editId="609F7354">
             <wp:extent cx="5760720" cy="3414395"/>
@@ -5087,87 +5160,86 @@
       <w:pPr>
         <w:pStyle w:val="berschrift2"/>
       </w:pPr>
-      <w:bookmarkStart w:id="28" w:name="_Toc165127834"/>
-      <w:bookmarkStart w:id="29" w:name="_Toc228175852"/>
-      <w:r>
-        <w:lastRenderedPageBreak/>
+      <w:bookmarkStart w:id="25" w:name="_Toc165127834"/>
+      <w:bookmarkStart w:id="26" w:name="_Toc228369952"/>
+      <w:r>
         <w:t>Wiederverwendung von Open Source Libraries</w:t>
+      </w:r>
+      <w:bookmarkEnd w:id="25"/>
+      <w:bookmarkEnd w:id="26"/>
+    </w:p>
+    <w:p>
+      <w:r>
+        <w:t>Wenn in der Architektur Open Source Libraries verwendet werden, werden diese gekennzeichnet und die entsprechenden Lizenzvorgaben/Lizenzidentifikation werden dokumentiert.</w:t>
+      </w:r>
+    </w:p>
+    <w:p/>
+    <w:p>
+      <w:pPr>
+        <w:pStyle w:val="berschrift1"/>
+        <w:rPr>
+          <w:lang w:val="en-US"/>
+        </w:rPr>
+      </w:pPr>
+      <w:bookmarkStart w:id="27" w:name="_Toc228369953"/>
+      <w:proofErr w:type="spellStart"/>
+      <w:r>
+        <w:rPr>
+          <w:lang w:val="en-US"/>
+        </w:rPr>
+        <w:t>Verifizierung</w:t>
+      </w:r>
+      <w:proofErr w:type="spellEnd"/>
+      <w:r>
+        <w:rPr>
+          <w:lang w:val="en-US"/>
+        </w:rPr>
+        <w:t xml:space="preserve"> und </w:t>
+      </w:r>
+      <w:proofErr w:type="spellStart"/>
+      <w:r>
+        <w:rPr>
+          <w:lang w:val="en-US"/>
+        </w:rPr>
+        <w:t>Validierung</w:t>
+      </w:r>
+      <w:bookmarkEnd w:id="27"/>
+      <w:proofErr w:type="spellEnd"/>
+    </w:p>
+    <w:p>
+      <w:pPr>
+        <w:rPr>
+          <w:lang w:val="en-US"/>
+        </w:rPr>
+      </w:pPr>
+    </w:p>
+    <w:p>
+      <w:pPr>
+        <w:pStyle w:val="berschrift2"/>
+        <w:rPr>
+          <w:lang w:val="en-US"/>
+        </w:rPr>
+      </w:pPr>
+      <w:bookmarkStart w:id="28" w:name="_Toc165127836"/>
+      <w:bookmarkStart w:id="29" w:name="_Toc228369954"/>
+      <w:proofErr w:type="spellStart"/>
+      <w:r>
+        <w:rPr>
+          <w:lang w:val="en-US"/>
+        </w:rPr>
+        <w:t>Formelle</w:t>
+      </w:r>
+      <w:proofErr w:type="spellEnd"/>
+      <w:r>
+        <w:rPr>
+          <w:lang w:val="en-US"/>
+        </w:rPr>
+        <w:t xml:space="preserve"> Test Cases</w:t>
       </w:r>
       <w:bookmarkEnd w:id="28"/>
       <w:bookmarkEnd w:id="29"/>
     </w:p>
     <w:p>
-      <w:r>
-        <w:t>Wenn in der Architektur Open Source Libraries verwendet werden, werden diese gekennzeichnet und die entsprechenden Lizenzvorgaben/Lizenzidentifikation werden dokumentiert.</w:t>
-      </w:r>
-    </w:p>
-    <w:p/>
-    <w:p>
-      <w:pPr>
-        <w:pStyle w:val="berschrift1"/>
-        <w:rPr>
-          <w:lang w:val="en-US"/>
-        </w:rPr>
-      </w:pPr>
-      <w:bookmarkStart w:id="30" w:name="_Toc228175853"/>
-      <w:proofErr w:type="spellStart"/>
-      <w:r>
-        <w:rPr>
-          <w:lang w:val="en-US"/>
-        </w:rPr>
-        <w:t>Verifizierung</w:t>
-      </w:r>
-      <w:proofErr w:type="spellEnd"/>
-      <w:r>
-        <w:rPr>
-          <w:lang w:val="en-US"/>
-        </w:rPr>
-        <w:t xml:space="preserve"> und </w:t>
-      </w:r>
-      <w:proofErr w:type="spellStart"/>
-      <w:r>
-        <w:rPr>
-          <w:lang w:val="en-US"/>
-        </w:rPr>
-        <w:t>Validierung</w:t>
-      </w:r>
-      <w:bookmarkEnd w:id="30"/>
-      <w:proofErr w:type="spellEnd"/>
-    </w:p>
-    <w:p>
-      <w:pPr>
-        <w:rPr>
-          <w:lang w:val="en-US"/>
-        </w:rPr>
-      </w:pPr>
-    </w:p>
-    <w:p>
-      <w:pPr>
-        <w:pStyle w:val="berschrift2"/>
-        <w:rPr>
-          <w:lang w:val="en-US"/>
-        </w:rPr>
-      </w:pPr>
-      <w:bookmarkStart w:id="31" w:name="_Toc165127836"/>
-      <w:bookmarkStart w:id="32" w:name="_Toc228175854"/>
-      <w:proofErr w:type="spellStart"/>
-      <w:r>
-        <w:rPr>
-          <w:lang w:val="en-US"/>
-        </w:rPr>
-        <w:t>Formelle</w:t>
-      </w:r>
-      <w:proofErr w:type="spellEnd"/>
-      <w:r>
-        <w:rPr>
-          <w:lang w:val="en-US"/>
-        </w:rPr>
-        <w:t xml:space="preserve"> Test Cases</w:t>
-      </w:r>
-      <w:bookmarkEnd w:id="31"/>
-      <w:bookmarkEnd w:id="32"/>
-    </w:p>
-    <w:p>
       <w:proofErr w:type="gramStart"/>
       <w:r>
         <w:t>Test Cases</w:t>
@@ -5178,10 +5250,7 @@
       </w:r>
       <w:r>
         <w:br/>
-        <w:t>Die Test Cases werden mithilfe des folgenden Templates erstellt</w:t>
-      </w:r>
-      <w:r>
-        <w:t>:</w:t>
+        <w:t>Die Test Cases werden mithilfe des folgenden Templates erstellt:</w:t>
       </w:r>
     </w:p>
     <w:p>
@@ -5246,26 +5315,25 @@
     </w:p>
     <w:p>
       <w:pPr>
+        <w:rPr>
+          <w:lang w:val="en-US"/>
+        </w:rPr>
+      </w:pPr>
+      <w:r>
+        <w:rPr>
+          <w:lang w:val="en-US"/>
+        </w:rPr>
+        <w:br w:type="page"/>
+      </w:r>
+    </w:p>
+    <w:p>
+      <w:pPr>
         <w:pStyle w:val="berschrift1"/>
         <w:rPr>
           <w:lang w:val="en-US"/>
         </w:rPr>
       </w:pPr>
-      <w:r>
-        <w:rPr>
-          <w:lang w:val="en-US"/>
-        </w:rPr>
-        <w:br w:type="page"/>
-      </w:r>
-    </w:p>
-    <w:p>
-      <w:pPr>
-        <w:pStyle w:val="berschrift1"/>
-        <w:rPr>
-          <w:lang w:val="en-US"/>
-        </w:rPr>
-      </w:pPr>
-      <w:bookmarkStart w:id="33" w:name="_Toc228175855"/>
+      <w:bookmarkStart w:id="30" w:name="_Toc228369955"/>
       <w:r>
         <w:rPr>
           <w:lang w:val="en-US"/>
@@ -5273,7 +5341,7 @@
         <w:lastRenderedPageBreak/>
         <w:t>References</w:t>
       </w:r>
-      <w:bookmarkEnd w:id="33"/>
+      <w:bookmarkEnd w:id="30"/>
     </w:p>
     <w:tbl>
       <w:tblPr>
@@ -5417,13 +5485,15 @@
                 <w:lang w:val="en-US"/>
               </w:rPr>
             </w:pPr>
-            <w:r>
-              <w:rPr>
-                <w:color w:val="EE0000"/>
-                <w:lang w:val="en-US"/>
-              </w:rPr>
-              <w:t>TBD</w:t>
-            </w:r>
+            <w:hyperlink r:id="rId16" w:history="1">
+              <w:r>
+                <w:rPr>
+                  <w:rStyle w:val="Hyperlink"/>
+                  <w:lang w:val="en-US"/>
+                </w:rPr>
+                <w:t>https://github.com/WiKinter/BPM-Detection/projects</w:t>
+              </w:r>
+            </w:hyperlink>
           </w:p>
         </w:tc>
         <w:tc>
@@ -5508,11 +5578,31 @@
               </w:rPr>
             </w:pPr>
             <w:r>
-              <w:rPr>
-                <w:color w:val="EE0000"/>
-                <w:lang w:val="en-US"/>
-              </w:rPr>
-              <w:t>TBD</w:t>
+              <w:object w:dxaOrig="1508" w:dyaOrig="983" w14:anchorId="71B334CE">
+                <v:shapetype id="_x0000_t75" coordsize="21600,21600" o:spt="75" o:preferrelative="t" path="m@4@5l@4@11@9@11@9@5xe" filled="f" stroked="f">
+                  <v:stroke joinstyle="miter"/>
+                  <v:formulas>
+                    <v:f eqn="if lineDrawn pixelLineWidth 0"/>
+                    <v:f eqn="sum @0 1 0"/>
+                    <v:f eqn="sum 0 0 @1"/>
+                    <v:f eqn="prod @2 1 2"/>
+                    <v:f eqn="prod @3 21600 pixelWidth"/>
+                    <v:f eqn="prod @3 21600 pixelHeight"/>
+                    <v:f eqn="sum @0 0 1"/>
+                    <v:f eqn="prod @6 1 2"/>
+                    <v:f eqn="prod @7 21600 pixelWidth"/>
+                    <v:f eqn="sum @8 21600 0"/>
+                    <v:f eqn="prod @7 21600 pixelHeight"/>
+                    <v:f eqn="sum @10 21600 0"/>
+                  </v:formulas>
+                  <v:path o:extrusionok="f" gradientshapeok="t" o:connecttype="rect"/>
+                  <o:lock v:ext="edit" aspectratio="t"/>
+                </v:shapetype>
+                <v:shape id="_x0000_i1028" type="#_x0000_t75" style="width:75.5pt;height:49pt" o:ole="">
+                  <v:imagedata r:id="rId17" o:title=""/>
+                </v:shape>
+                <o:OLEObject Type="Embed" ProgID="Excel.Sheet.12" ShapeID="_x0000_i1028" DrawAspect="Icon" ObjectID="_1838983271" r:id="rId18"/>
+              </w:object>
             </w:r>
           </w:p>
         </w:tc>
@@ -5530,7 +5620,13 @@
               <w:rPr>
                 <w:lang w:val="en-US"/>
               </w:rPr>
-              <w:t>2.0</w:t>
+              <w:t>1</w:t>
+            </w:r>
+            <w:r>
+              <w:rPr>
+                <w:lang w:val="en-US"/>
+              </w:rPr>
+              <w:t>.0</w:t>
             </w:r>
           </w:p>
         </w:tc>
@@ -5585,12 +5681,15 @@
                 <w:lang w:val="en-US"/>
               </w:rPr>
             </w:pPr>
-            <w:r>
-              <w:rPr>
-                <w:lang w:val="en-US"/>
-              </w:rPr>
-              <w:t>https://www.lucidchart.com/pages/de/tutorial/was-ist-ein-uml-diagramm</w:t>
-            </w:r>
+            <w:hyperlink r:id="rId19" w:history="1">
+              <w:r>
+                <w:rPr>
+                  <w:rStyle w:val="Hyperlink"/>
+                  <w:lang w:val="en-US"/>
+                </w:rPr>
+                <w:t>https://www.lucidchart.com/pages/de</w:t>
+              </w:r>
+            </w:hyperlink>
           </w:p>
         </w:tc>
         <w:tc>
@@ -5607,7 +5706,13 @@
               <w:rPr>
                 <w:lang w:val="en-US"/>
               </w:rPr>
-              <w:t>3.0</w:t>
+              <w:t>1</w:t>
+            </w:r>
+            <w:r>
+              <w:rPr>
+                <w:lang w:val="en-US"/>
+              </w:rPr>
+              <w:t>.0</w:t>
             </w:r>
           </w:p>
         </w:tc>
@@ -6251,7 +6356,7 @@
           <w:lang w:val="en-US"/>
         </w:rPr>
       </w:pPr>
-      <w:bookmarkStart w:id="34" w:name="_Toc228175856"/>
+      <w:bookmarkStart w:id="31" w:name="_Toc228369956"/>
       <w:r>
         <w:rPr>
           <w:lang w:val="en-US"/>
@@ -6259,7 +6364,7 @@
         <w:lastRenderedPageBreak/>
         <w:t>Distribution list</w:t>
       </w:r>
-      <w:bookmarkEnd w:id="34"/>
+      <w:bookmarkEnd w:id="31"/>
     </w:p>
     <w:tbl>
       <w:tblPr>
@@ -6275,7 +6380,7 @@
       <w:tr>
         <w:tc>
           <w:tcPr>
-            <w:tcW w:w="2244" w:type="dxa"/>
+            <w:tcW w:w="2215" w:type="dxa"/>
           </w:tcPr>
           <w:p>
             <w:pPr>
@@ -6293,7 +6398,7 @@
         </w:tc>
         <w:tc>
           <w:tcPr>
-            <w:tcW w:w="2892" w:type="dxa"/>
+            <w:tcW w:w="2978" w:type="dxa"/>
           </w:tcPr>
           <w:p>
             <w:pPr>
@@ -6311,7 +6416,7 @@
         </w:tc>
         <w:tc>
           <w:tcPr>
-            <w:tcW w:w="3926" w:type="dxa"/>
+            <w:tcW w:w="3869" w:type="dxa"/>
           </w:tcPr>
           <w:p>
             <w:pPr>
@@ -6331,7 +6436,7 @@
       <w:tr>
         <w:tc>
           <w:tcPr>
-            <w:tcW w:w="2244" w:type="dxa"/>
+            <w:tcW w:w="2215" w:type="dxa"/>
           </w:tcPr>
           <w:p>
             <w:pPr>
@@ -6346,7 +6451,7 @@
         </w:tc>
         <w:tc>
           <w:tcPr>
-            <w:tcW w:w="2892" w:type="dxa"/>
+            <w:tcW w:w="2978" w:type="dxa"/>
           </w:tcPr>
           <w:p>
             <w:pPr>
@@ -6366,7 +6471,7 @@
         </w:tc>
         <w:tc>
           <w:tcPr>
-            <w:tcW w:w="3926" w:type="dxa"/>
+            <w:tcW w:w="3869" w:type="dxa"/>
           </w:tcPr>
           <w:p>
             <w:pPr>
@@ -6386,7 +6491,7 @@
       <w:tr>
         <w:tc>
           <w:tcPr>
-            <w:tcW w:w="2244" w:type="dxa"/>
+            <w:tcW w:w="2215" w:type="dxa"/>
           </w:tcPr>
           <w:p>
             <w:pPr>
@@ -6401,7 +6506,7 @@
         </w:tc>
         <w:tc>
           <w:tcPr>
-            <w:tcW w:w="2892" w:type="dxa"/>
+            <w:tcW w:w="2978" w:type="dxa"/>
           </w:tcPr>
           <w:p>
             <w:pPr>
@@ -6410,13 +6515,13 @@
               </w:rPr>
             </w:pPr>
             <w:r>
-              <w:t>SW-Tester</w:t>
-            </w:r>
-          </w:p>
-        </w:tc>
-        <w:tc>
-          <w:tcPr>
-            <w:tcW w:w="3926" w:type="dxa"/>
+              <w:t>SW/HW-Architekt</w:t>
+            </w:r>
+          </w:p>
+        </w:tc>
+        <w:tc>
+          <w:tcPr>
+            <w:tcW w:w="3869" w:type="dxa"/>
           </w:tcPr>
           <w:p>
             <w:pPr>
@@ -6436,7 +6541,7 @@
       <w:tr>
         <w:tc>
           <w:tcPr>
-            <w:tcW w:w="2244" w:type="dxa"/>
+            <w:tcW w:w="2215" w:type="dxa"/>
           </w:tcPr>
           <w:p>
             <w:pPr>
@@ -6451,7 +6556,7 @@
         </w:tc>
         <w:tc>
           <w:tcPr>
-            <w:tcW w:w="2892" w:type="dxa"/>
+            <w:tcW w:w="2978" w:type="dxa"/>
           </w:tcPr>
           <w:p>
             <w:pPr>
@@ -6460,7 +6565,7 @@
               </w:rPr>
             </w:pPr>
             <w:r>
-              <w:t>HW-Beschaffung/</w:t>
+              <w:t xml:space="preserve">Testingenieur, </w:t>
             </w:r>
             <w:proofErr w:type="spellStart"/>
             <w:r>
@@ -6474,7 +6579,7 @@
         </w:tc>
         <w:tc>
           <w:tcPr>
-            <w:tcW w:w="3926" w:type="dxa"/>
+            <w:tcW w:w="3869" w:type="dxa"/>
           </w:tcPr>
           <w:p>
             <w:pPr>
@@ -6494,7 +6599,7 @@
       <w:tr>
         <w:tc>
           <w:tcPr>
-            <w:tcW w:w="2244" w:type="dxa"/>
+            <w:tcW w:w="2215" w:type="dxa"/>
           </w:tcPr>
           <w:p>
             <w:pPr>
@@ -6509,7 +6614,7 @@
         </w:tc>
         <w:tc>
           <w:tcPr>
-            <w:tcW w:w="2892" w:type="dxa"/>
+            <w:tcW w:w="2978" w:type="dxa"/>
           </w:tcPr>
           <w:p>
             <w:pPr>
@@ -6518,7 +6623,7 @@
               </w:rPr>
             </w:pPr>
             <w:r>
-              <w:t>SW-Entwickler/</w:t>
+              <w:t xml:space="preserve">SW-Entwickler, </w:t>
             </w:r>
             <w:r>
               <w:t>Repository-Verantwortlicher</w:t>
@@ -6527,7 +6632,7 @@
         </w:tc>
         <w:tc>
           <w:tcPr>
-            <w:tcW w:w="3926" w:type="dxa"/>
+            <w:tcW w:w="3869" w:type="dxa"/>
           </w:tcPr>
           <w:p>
             <w:pPr>
@@ -6547,7 +6652,7 @@
       <w:tr>
         <w:tc>
           <w:tcPr>
-            <w:tcW w:w="2244" w:type="dxa"/>
+            <w:tcW w:w="2215" w:type="dxa"/>
           </w:tcPr>
           <w:p>
             <w:pPr>
@@ -6562,7 +6667,7 @@
         </w:tc>
         <w:tc>
           <w:tcPr>
-            <w:tcW w:w="2892" w:type="dxa"/>
+            <w:tcW w:w="2978" w:type="dxa"/>
           </w:tcPr>
           <w:p>
             <w:pPr>
@@ -6571,13 +6676,13 @@
               </w:rPr>
             </w:pPr>
             <w:r>
-              <w:t>SW-Entwickler/Entwicklungsplaner</w:t>
-            </w:r>
-          </w:p>
-        </w:tc>
-        <w:tc>
-          <w:tcPr>
-            <w:tcW w:w="3926" w:type="dxa"/>
+              <w:t>SW-Entwickler, Entwicklungsplaner</w:t>
+            </w:r>
+          </w:p>
+        </w:tc>
+        <w:tc>
+          <w:tcPr>
+            <w:tcW w:w="3869" w:type="dxa"/>
           </w:tcPr>
           <w:p>
             <w:pPr>
@@ -6603,7 +6708,7 @@
       </w:pPr>
     </w:p>
     <w:sectPr>
-      <w:headerReference w:type="default" r:id="rId16"/>
+      <w:headerReference w:type="default" r:id="rId20"/>
       <w:pgSz w:w="11906" w:h="16838"/>
       <w:pgMar w:top="1417" w:right="1417" w:bottom="1134" w:left="1417" w:header="708" w:footer="708" w:gutter="0"/>
       <w:cols w:space="708"/>
@@ -6743,7 +6848,7 @@
           <w:rPr>
             <w:lang w:val="en-US"/>
           </w:rPr>
-          <w:t>Submitted</w:t>
+          <w:t>Final</w:t>
         </w:r>
       </w:sdtContent>
     </w:sdt>
@@ -6773,7 +6878,7 @@
       </w:sdtPr>
       <w:sdtContent>
         <w:r>
-          <w:t>Version: 1.0</w:t>
+          <w:t>Version: 4.0</w:t>
         </w:r>
       </w:sdtContent>
     </w:sdt>
@@ -6787,276 +6892,9 @@
 <file path=word/numbering.xml><?xml version="1.0" encoding="utf-8"?>
 <w:numbering xmlns:wpc="http://schemas.microsoft.com/office/word/2010/wordprocessingCanvas" xmlns:cx="http://schemas.microsoft.com/office/drawing/2014/chartex" xmlns:cx1="http://schemas.microsoft.com/office/drawing/2015/9/8/chartex" xmlns:cx2="http://schemas.microsoft.com/office/drawing/2015/10/21/chartex" xmlns:cx3="http://schemas.microsoft.com/office/drawing/2016/5/9/chartex" xmlns:cx4="http://schemas.microsoft.com/office/drawing/2016/5/10/chartex" xmlns:cx5="http://schemas.microsoft.com/office/drawing/2016/5/11/chartex" xmlns:cx6="http://schemas.microsoft.com/office/drawing/2016/5/12/chartex" xmlns:cx7="http://schemas.microsoft.com/office/drawing/2016/5/13/chartex" xmlns:cx8="http://schemas.microsoft.com/office/drawing/2016/5/14/chartex" xmlns:mc="http://schemas.openxmlformats.org/markup-compatibility/2006" xmlns:aink="http://schemas.microsoft.com/office/drawing/2016/ink" xmlns:am3d="http://schemas.microsoft.com/office/drawing/2017/model3d" xmlns:o="urn:schemas-microsoft-com:office:office" xmlns:oel="http://schemas.microsoft.com/office/2019/extlst" xmlns:r="http://schemas.openxmlformats.org/officeDocument/2006/relationships" xmlns:m="http://schemas.openxmlformats.org/officeDocument/2006/math" xmlns:v="urn:schemas-microsoft-com:vml" xmlns:wp14="http://schemas.microsoft.com/office/word/2010/wordprocessingDrawing" xmlns:wp="http://schemas.openxmlformats.org/drawingml/2006/wordprocessingDrawing" xmlns:w10="urn:schemas-microsoft-com:office:word" xmlns:w="http://schemas.openxmlformats.org/wordprocessingml/2006/main" xmlns:w14="http://schemas.microsoft.com/office/word/2010/wordml" xmlns:w15="http://schemas.microsoft.com/office/word/2012/wordml" xmlns:w16cex="http://schemas.microsoft.com/office/word/2018/wordml/cex" xmlns:w16cid="http://schemas.microsoft.com/office/word/2016/wordml/cid" xmlns:w16="http://schemas.microsoft.com/office/word/2018/wordml" xmlns:w16du="http://schemas.microsoft.com/office/word/2023/wordml/word16du" xmlns:w16sdtdh="http://schemas.microsoft.com/office/word/2020/wordml/sdtdatahash" xmlns:w16sdtfl="http://schemas.microsoft.com/office/word/2024/wordml/sdtformatlock" xmlns:w16se="http://schemas.microsoft.com/office/word/2015/wordml/symex" xmlns:wpg="http://schemas.microsoft.com/office/word/2010/wordprocessingGroup" xmlns:wpi="http://schemas.microsoft.com/office/word/2010/wordprocessingInk" xmlns:wne="http://schemas.microsoft.com/office/word/2006/wordml" xmlns:wps="http://schemas.microsoft.com/office/word/2010/wordprocessingShape" mc:Ignorable="w14 w15 w16se w16cid w16 w16cex w16sdtdh w16sdtfl w16du wp14">
   <w:abstractNum w:abstractNumId="0" w15:restartNumberingAfterBreak="0">
-    <w:nsid w:val="130C5482"/>
-    <w:multiLevelType w:val="hybridMultilevel"/>
-    <w:tmpl w:val="630C2684"/>
-    <w:lvl w:ilvl="0" w:tplc="04070011">
-      <w:start w:val="1"/>
-      <w:numFmt w:val="decimal"/>
-      <w:lvlText w:val="%1)"/>
-      <w:lvlJc w:val="left"/>
-      <w:pPr>
-        <w:ind w:left="720" w:hanging="360"/>
-      </w:pPr>
-      <w:rPr>
-        <w:rFonts w:hint="default"/>
-      </w:rPr>
-    </w:lvl>
-    <w:lvl w:ilvl="1" w:tplc="04070019" w:tentative="1">
-      <w:start w:val="1"/>
-      <w:numFmt w:val="lowerLetter"/>
-      <w:lvlText w:val="%2."/>
-      <w:lvlJc w:val="left"/>
-      <w:pPr>
-        <w:ind w:left="1440" w:hanging="360"/>
-      </w:pPr>
-    </w:lvl>
-    <w:lvl w:ilvl="2" w:tplc="0407001B" w:tentative="1">
-      <w:start w:val="1"/>
-      <w:numFmt w:val="lowerRoman"/>
-      <w:lvlText w:val="%3."/>
-      <w:lvlJc w:val="right"/>
-      <w:pPr>
-        <w:ind w:left="2160" w:hanging="180"/>
-      </w:pPr>
-    </w:lvl>
-    <w:lvl w:ilvl="3" w:tplc="0407000F" w:tentative="1">
-      <w:start w:val="1"/>
-      <w:numFmt w:val="decimal"/>
-      <w:lvlText w:val="%4."/>
-      <w:lvlJc w:val="left"/>
-      <w:pPr>
-        <w:ind w:left="2880" w:hanging="360"/>
-      </w:pPr>
-    </w:lvl>
-    <w:lvl w:ilvl="4" w:tplc="04070019" w:tentative="1">
-      <w:start w:val="1"/>
-      <w:numFmt w:val="lowerLetter"/>
-      <w:lvlText w:val="%5."/>
-      <w:lvlJc w:val="left"/>
-      <w:pPr>
-        <w:ind w:left="3600" w:hanging="360"/>
-      </w:pPr>
-    </w:lvl>
-    <w:lvl w:ilvl="5" w:tplc="0407001B" w:tentative="1">
-      <w:start w:val="1"/>
-      <w:numFmt w:val="lowerRoman"/>
-      <w:lvlText w:val="%6."/>
-      <w:lvlJc w:val="right"/>
-      <w:pPr>
-        <w:ind w:left="4320" w:hanging="180"/>
-      </w:pPr>
-    </w:lvl>
-    <w:lvl w:ilvl="6" w:tplc="0407000F" w:tentative="1">
-      <w:start w:val="1"/>
-      <w:numFmt w:val="decimal"/>
-      <w:lvlText w:val="%7."/>
-      <w:lvlJc w:val="left"/>
-      <w:pPr>
-        <w:ind w:left="5040" w:hanging="360"/>
-      </w:pPr>
-    </w:lvl>
-    <w:lvl w:ilvl="7" w:tplc="04070019" w:tentative="1">
-      <w:start w:val="1"/>
-      <w:numFmt w:val="lowerLetter"/>
-      <w:lvlText w:val="%8."/>
-      <w:lvlJc w:val="left"/>
-      <w:pPr>
-        <w:ind w:left="5760" w:hanging="360"/>
-      </w:pPr>
-    </w:lvl>
-    <w:lvl w:ilvl="8" w:tplc="0407001B" w:tentative="1">
-      <w:start w:val="1"/>
-      <w:numFmt w:val="lowerRoman"/>
-      <w:lvlText w:val="%9."/>
-      <w:lvlJc w:val="right"/>
-      <w:pPr>
-        <w:ind w:left="6480" w:hanging="180"/>
-      </w:pPr>
-    </w:lvl>
-  </w:abstractNum>
-  <w:abstractNum w:abstractNumId="1" w15:restartNumberingAfterBreak="0">
-    <w:nsid w:val="17500A64"/>
-    <w:multiLevelType w:val="hybridMultilevel"/>
-    <w:tmpl w:val="4C3292A6"/>
-    <w:lvl w:ilvl="0" w:tplc="04070011">
-      <w:start w:val="1"/>
-      <w:numFmt w:val="decimal"/>
-      <w:lvlText w:val="%1)"/>
-      <w:lvlJc w:val="left"/>
-      <w:pPr>
-        <w:ind w:left="720" w:hanging="360"/>
-      </w:pPr>
-      <w:rPr>
-        <w:rFonts w:hint="default"/>
-      </w:rPr>
-    </w:lvl>
-    <w:lvl w:ilvl="1" w:tplc="04070019" w:tentative="1">
-      <w:start w:val="1"/>
-      <w:numFmt w:val="lowerLetter"/>
-      <w:lvlText w:val="%2."/>
-      <w:lvlJc w:val="left"/>
-      <w:pPr>
-        <w:ind w:left="1440" w:hanging="360"/>
-      </w:pPr>
-    </w:lvl>
-    <w:lvl w:ilvl="2" w:tplc="0407001B" w:tentative="1">
-      <w:start w:val="1"/>
-      <w:numFmt w:val="lowerRoman"/>
-      <w:lvlText w:val="%3."/>
-      <w:lvlJc w:val="right"/>
-      <w:pPr>
-        <w:ind w:left="2160" w:hanging="180"/>
-      </w:pPr>
-    </w:lvl>
-    <w:lvl w:ilvl="3" w:tplc="0407000F" w:tentative="1">
-      <w:start w:val="1"/>
-      <w:numFmt w:val="decimal"/>
-      <w:lvlText w:val="%4."/>
-      <w:lvlJc w:val="left"/>
-      <w:pPr>
-        <w:ind w:left="2880" w:hanging="360"/>
-      </w:pPr>
-    </w:lvl>
-    <w:lvl w:ilvl="4" w:tplc="04070019" w:tentative="1">
-      <w:start w:val="1"/>
-      <w:numFmt w:val="lowerLetter"/>
-      <w:lvlText w:val="%5."/>
-      <w:lvlJc w:val="left"/>
-      <w:pPr>
-        <w:ind w:left="3600" w:hanging="360"/>
-      </w:pPr>
-    </w:lvl>
-    <w:lvl w:ilvl="5" w:tplc="0407001B" w:tentative="1">
-      <w:start w:val="1"/>
-      <w:numFmt w:val="lowerRoman"/>
-      <w:lvlText w:val="%6."/>
-      <w:lvlJc w:val="right"/>
-      <w:pPr>
-        <w:ind w:left="4320" w:hanging="180"/>
-      </w:pPr>
-    </w:lvl>
-    <w:lvl w:ilvl="6" w:tplc="0407000F" w:tentative="1">
-      <w:start w:val="1"/>
-      <w:numFmt w:val="decimal"/>
-      <w:lvlText w:val="%7."/>
-      <w:lvlJc w:val="left"/>
-      <w:pPr>
-        <w:ind w:left="5040" w:hanging="360"/>
-      </w:pPr>
-    </w:lvl>
-    <w:lvl w:ilvl="7" w:tplc="04070019" w:tentative="1">
-      <w:start w:val="1"/>
-      <w:numFmt w:val="lowerLetter"/>
-      <w:lvlText w:val="%8."/>
-      <w:lvlJc w:val="left"/>
-      <w:pPr>
-        <w:ind w:left="5760" w:hanging="360"/>
-      </w:pPr>
-    </w:lvl>
-    <w:lvl w:ilvl="8" w:tplc="0407001B" w:tentative="1">
-      <w:start w:val="1"/>
-      <w:numFmt w:val="lowerRoman"/>
-      <w:lvlText w:val="%9."/>
-      <w:lvlJc w:val="right"/>
-      <w:pPr>
-        <w:ind w:left="6480" w:hanging="180"/>
-      </w:pPr>
-    </w:lvl>
-  </w:abstractNum>
-  <w:abstractNum w:abstractNumId="2" w15:restartNumberingAfterBreak="0">
-    <w:nsid w:val="21BB49E8"/>
-    <w:multiLevelType w:val="hybridMultilevel"/>
-    <w:tmpl w:val="5450DA04"/>
-    <w:lvl w:ilvl="0" w:tplc="04070011">
-      <w:start w:val="1"/>
-      <w:numFmt w:val="decimal"/>
-      <w:lvlText w:val="%1)"/>
-      <w:lvlJc w:val="left"/>
-      <w:pPr>
-        <w:ind w:left="720" w:hanging="360"/>
-      </w:pPr>
-      <w:rPr>
-        <w:rFonts w:hint="default"/>
-      </w:rPr>
-    </w:lvl>
-    <w:lvl w:ilvl="1" w:tplc="04070019" w:tentative="1">
-      <w:start w:val="1"/>
-      <w:numFmt w:val="lowerLetter"/>
-      <w:lvlText w:val="%2."/>
-      <w:lvlJc w:val="left"/>
-      <w:pPr>
-        <w:ind w:left="1440" w:hanging="360"/>
-      </w:pPr>
-    </w:lvl>
-    <w:lvl w:ilvl="2" w:tplc="0407001B" w:tentative="1">
-      <w:start w:val="1"/>
-      <w:numFmt w:val="lowerRoman"/>
-      <w:lvlText w:val="%3."/>
-      <w:lvlJc w:val="right"/>
-      <w:pPr>
-        <w:ind w:left="2160" w:hanging="180"/>
-      </w:pPr>
-    </w:lvl>
-    <w:lvl w:ilvl="3" w:tplc="0407000F" w:tentative="1">
-      <w:start w:val="1"/>
-      <w:numFmt w:val="decimal"/>
-      <w:lvlText w:val="%4."/>
-      <w:lvlJc w:val="left"/>
-      <w:pPr>
-        <w:ind w:left="2880" w:hanging="360"/>
-      </w:pPr>
-    </w:lvl>
-    <w:lvl w:ilvl="4" w:tplc="04070019" w:tentative="1">
-      <w:start w:val="1"/>
-      <w:numFmt w:val="lowerLetter"/>
-      <w:lvlText w:val="%5."/>
-      <w:lvlJc w:val="left"/>
-      <w:pPr>
-        <w:ind w:left="3600" w:hanging="360"/>
-      </w:pPr>
-    </w:lvl>
-    <w:lvl w:ilvl="5" w:tplc="0407001B" w:tentative="1">
-      <w:start w:val="1"/>
-      <w:numFmt w:val="lowerRoman"/>
-      <w:lvlText w:val="%6."/>
-      <w:lvlJc w:val="right"/>
-      <w:pPr>
-        <w:ind w:left="4320" w:hanging="180"/>
-      </w:pPr>
-    </w:lvl>
-    <w:lvl w:ilvl="6" w:tplc="0407000F" w:tentative="1">
-      <w:start w:val="1"/>
-      <w:numFmt w:val="decimal"/>
-      <w:lvlText w:val="%7."/>
-      <w:lvlJc w:val="left"/>
-      <w:pPr>
-        <w:ind w:left="5040" w:hanging="360"/>
-      </w:pPr>
-    </w:lvl>
-    <w:lvl w:ilvl="7" w:tplc="04070019" w:tentative="1">
-      <w:start w:val="1"/>
-      <w:numFmt w:val="lowerLetter"/>
-      <w:lvlText w:val="%8."/>
-      <w:lvlJc w:val="left"/>
-      <w:pPr>
-        <w:ind w:left="5760" w:hanging="360"/>
-      </w:pPr>
-    </w:lvl>
-    <w:lvl w:ilvl="8" w:tplc="0407001B" w:tentative="1">
-      <w:start w:val="1"/>
-      <w:numFmt w:val="lowerRoman"/>
-      <w:lvlText w:val="%9."/>
-      <w:lvlJc w:val="right"/>
-      <w:pPr>
-        <w:ind w:left="6480" w:hanging="180"/>
-      </w:pPr>
-    </w:lvl>
-  </w:abstractNum>
-  <w:abstractNum w:abstractNumId="3" w15:restartNumberingAfterBreak="0">
-    <w:nsid w:val="21C65400"/>
+    <w:nsid w:val="09A7097C"/>
     <w:multiLevelType w:val="multilevel"/>
-    <w:tmpl w:val="A7BEC7CA"/>
+    <w:tmpl w:val="0F9E7FBE"/>
     <w:lvl w:ilvl="0">
       <w:start w:val="1"/>
       <w:numFmt w:val="bullet"/>
@@ -7202,10 +7040,277 @@
       </w:rPr>
     </w:lvl>
   </w:abstractNum>
+  <w:abstractNum w:abstractNumId="1" w15:restartNumberingAfterBreak="0">
+    <w:nsid w:val="130C5482"/>
+    <w:multiLevelType w:val="hybridMultilevel"/>
+    <w:tmpl w:val="630C2684"/>
+    <w:lvl w:ilvl="0" w:tplc="04070011">
+      <w:start w:val="1"/>
+      <w:numFmt w:val="decimal"/>
+      <w:lvlText w:val="%1)"/>
+      <w:lvlJc w:val="left"/>
+      <w:pPr>
+        <w:ind w:left="720" w:hanging="360"/>
+      </w:pPr>
+      <w:rPr>
+        <w:rFonts w:hint="default"/>
+      </w:rPr>
+    </w:lvl>
+    <w:lvl w:ilvl="1" w:tplc="04070019" w:tentative="1">
+      <w:start w:val="1"/>
+      <w:numFmt w:val="lowerLetter"/>
+      <w:lvlText w:val="%2."/>
+      <w:lvlJc w:val="left"/>
+      <w:pPr>
+        <w:ind w:left="1440" w:hanging="360"/>
+      </w:pPr>
+    </w:lvl>
+    <w:lvl w:ilvl="2" w:tplc="0407001B" w:tentative="1">
+      <w:start w:val="1"/>
+      <w:numFmt w:val="lowerRoman"/>
+      <w:lvlText w:val="%3."/>
+      <w:lvlJc w:val="right"/>
+      <w:pPr>
+        <w:ind w:left="2160" w:hanging="180"/>
+      </w:pPr>
+    </w:lvl>
+    <w:lvl w:ilvl="3" w:tplc="0407000F" w:tentative="1">
+      <w:start w:val="1"/>
+      <w:numFmt w:val="decimal"/>
+      <w:lvlText w:val="%4."/>
+      <w:lvlJc w:val="left"/>
+      <w:pPr>
+        <w:ind w:left="2880" w:hanging="360"/>
+      </w:pPr>
+    </w:lvl>
+    <w:lvl w:ilvl="4" w:tplc="04070019" w:tentative="1">
+      <w:start w:val="1"/>
+      <w:numFmt w:val="lowerLetter"/>
+      <w:lvlText w:val="%5."/>
+      <w:lvlJc w:val="left"/>
+      <w:pPr>
+        <w:ind w:left="3600" w:hanging="360"/>
+      </w:pPr>
+    </w:lvl>
+    <w:lvl w:ilvl="5" w:tplc="0407001B" w:tentative="1">
+      <w:start w:val="1"/>
+      <w:numFmt w:val="lowerRoman"/>
+      <w:lvlText w:val="%6."/>
+      <w:lvlJc w:val="right"/>
+      <w:pPr>
+        <w:ind w:left="4320" w:hanging="180"/>
+      </w:pPr>
+    </w:lvl>
+    <w:lvl w:ilvl="6" w:tplc="0407000F" w:tentative="1">
+      <w:start w:val="1"/>
+      <w:numFmt w:val="decimal"/>
+      <w:lvlText w:val="%7."/>
+      <w:lvlJc w:val="left"/>
+      <w:pPr>
+        <w:ind w:left="5040" w:hanging="360"/>
+      </w:pPr>
+    </w:lvl>
+    <w:lvl w:ilvl="7" w:tplc="04070019" w:tentative="1">
+      <w:start w:val="1"/>
+      <w:numFmt w:val="lowerLetter"/>
+      <w:lvlText w:val="%8."/>
+      <w:lvlJc w:val="left"/>
+      <w:pPr>
+        <w:ind w:left="5760" w:hanging="360"/>
+      </w:pPr>
+    </w:lvl>
+    <w:lvl w:ilvl="8" w:tplc="0407001B" w:tentative="1">
+      <w:start w:val="1"/>
+      <w:numFmt w:val="lowerRoman"/>
+      <w:lvlText w:val="%9."/>
+      <w:lvlJc w:val="right"/>
+      <w:pPr>
+        <w:ind w:left="6480" w:hanging="180"/>
+      </w:pPr>
+    </w:lvl>
+  </w:abstractNum>
+  <w:abstractNum w:abstractNumId="2" w15:restartNumberingAfterBreak="0">
+    <w:nsid w:val="17500A64"/>
+    <w:multiLevelType w:val="hybridMultilevel"/>
+    <w:tmpl w:val="4C3292A6"/>
+    <w:lvl w:ilvl="0" w:tplc="04070011">
+      <w:start w:val="1"/>
+      <w:numFmt w:val="decimal"/>
+      <w:lvlText w:val="%1)"/>
+      <w:lvlJc w:val="left"/>
+      <w:pPr>
+        <w:ind w:left="720" w:hanging="360"/>
+      </w:pPr>
+      <w:rPr>
+        <w:rFonts w:hint="default"/>
+      </w:rPr>
+    </w:lvl>
+    <w:lvl w:ilvl="1" w:tplc="04070019" w:tentative="1">
+      <w:start w:val="1"/>
+      <w:numFmt w:val="lowerLetter"/>
+      <w:lvlText w:val="%2."/>
+      <w:lvlJc w:val="left"/>
+      <w:pPr>
+        <w:ind w:left="1440" w:hanging="360"/>
+      </w:pPr>
+    </w:lvl>
+    <w:lvl w:ilvl="2" w:tplc="0407001B" w:tentative="1">
+      <w:start w:val="1"/>
+      <w:numFmt w:val="lowerRoman"/>
+      <w:lvlText w:val="%3."/>
+      <w:lvlJc w:val="right"/>
+      <w:pPr>
+        <w:ind w:left="2160" w:hanging="180"/>
+      </w:pPr>
+    </w:lvl>
+    <w:lvl w:ilvl="3" w:tplc="0407000F" w:tentative="1">
+      <w:start w:val="1"/>
+      <w:numFmt w:val="decimal"/>
+      <w:lvlText w:val="%4."/>
+      <w:lvlJc w:val="left"/>
+      <w:pPr>
+        <w:ind w:left="2880" w:hanging="360"/>
+      </w:pPr>
+    </w:lvl>
+    <w:lvl w:ilvl="4" w:tplc="04070019" w:tentative="1">
+      <w:start w:val="1"/>
+      <w:numFmt w:val="lowerLetter"/>
+      <w:lvlText w:val="%5."/>
+      <w:lvlJc w:val="left"/>
+      <w:pPr>
+        <w:ind w:left="3600" w:hanging="360"/>
+      </w:pPr>
+    </w:lvl>
+    <w:lvl w:ilvl="5" w:tplc="0407001B" w:tentative="1">
+      <w:start w:val="1"/>
+      <w:numFmt w:val="lowerRoman"/>
+      <w:lvlText w:val="%6."/>
+      <w:lvlJc w:val="right"/>
+      <w:pPr>
+        <w:ind w:left="4320" w:hanging="180"/>
+      </w:pPr>
+    </w:lvl>
+    <w:lvl w:ilvl="6" w:tplc="0407000F" w:tentative="1">
+      <w:start w:val="1"/>
+      <w:numFmt w:val="decimal"/>
+      <w:lvlText w:val="%7."/>
+      <w:lvlJc w:val="left"/>
+      <w:pPr>
+        <w:ind w:left="5040" w:hanging="360"/>
+      </w:pPr>
+    </w:lvl>
+    <w:lvl w:ilvl="7" w:tplc="04070019" w:tentative="1">
+      <w:start w:val="1"/>
+      <w:numFmt w:val="lowerLetter"/>
+      <w:lvlText w:val="%8."/>
+      <w:lvlJc w:val="left"/>
+      <w:pPr>
+        <w:ind w:left="5760" w:hanging="360"/>
+      </w:pPr>
+    </w:lvl>
+    <w:lvl w:ilvl="8" w:tplc="0407001B" w:tentative="1">
+      <w:start w:val="1"/>
+      <w:numFmt w:val="lowerRoman"/>
+      <w:lvlText w:val="%9."/>
+      <w:lvlJc w:val="right"/>
+      <w:pPr>
+        <w:ind w:left="6480" w:hanging="180"/>
+      </w:pPr>
+    </w:lvl>
+  </w:abstractNum>
+  <w:abstractNum w:abstractNumId="3" w15:restartNumberingAfterBreak="0">
+    <w:nsid w:val="21BB49E8"/>
+    <w:multiLevelType w:val="hybridMultilevel"/>
+    <w:tmpl w:val="5450DA04"/>
+    <w:lvl w:ilvl="0" w:tplc="04070011">
+      <w:start w:val="1"/>
+      <w:numFmt w:val="decimal"/>
+      <w:lvlText w:val="%1)"/>
+      <w:lvlJc w:val="left"/>
+      <w:pPr>
+        <w:ind w:left="720" w:hanging="360"/>
+      </w:pPr>
+      <w:rPr>
+        <w:rFonts w:hint="default"/>
+      </w:rPr>
+    </w:lvl>
+    <w:lvl w:ilvl="1" w:tplc="04070019" w:tentative="1">
+      <w:start w:val="1"/>
+      <w:numFmt w:val="lowerLetter"/>
+      <w:lvlText w:val="%2."/>
+      <w:lvlJc w:val="left"/>
+      <w:pPr>
+        <w:ind w:left="1440" w:hanging="360"/>
+      </w:pPr>
+    </w:lvl>
+    <w:lvl w:ilvl="2" w:tplc="0407001B" w:tentative="1">
+      <w:start w:val="1"/>
+      <w:numFmt w:val="lowerRoman"/>
+      <w:lvlText w:val="%3."/>
+      <w:lvlJc w:val="right"/>
+      <w:pPr>
+        <w:ind w:left="2160" w:hanging="180"/>
+      </w:pPr>
+    </w:lvl>
+    <w:lvl w:ilvl="3" w:tplc="0407000F" w:tentative="1">
+      <w:start w:val="1"/>
+      <w:numFmt w:val="decimal"/>
+      <w:lvlText w:val="%4."/>
+      <w:lvlJc w:val="left"/>
+      <w:pPr>
+        <w:ind w:left="2880" w:hanging="360"/>
+      </w:pPr>
+    </w:lvl>
+    <w:lvl w:ilvl="4" w:tplc="04070019" w:tentative="1">
+      <w:start w:val="1"/>
+      <w:numFmt w:val="lowerLetter"/>
+      <w:lvlText w:val="%5."/>
+      <w:lvlJc w:val="left"/>
+      <w:pPr>
+        <w:ind w:left="3600" w:hanging="360"/>
+      </w:pPr>
+    </w:lvl>
+    <w:lvl w:ilvl="5" w:tplc="0407001B" w:tentative="1">
+      <w:start w:val="1"/>
+      <w:numFmt w:val="lowerRoman"/>
+      <w:lvlText w:val="%6."/>
+      <w:lvlJc w:val="right"/>
+      <w:pPr>
+        <w:ind w:left="4320" w:hanging="180"/>
+      </w:pPr>
+    </w:lvl>
+    <w:lvl w:ilvl="6" w:tplc="0407000F" w:tentative="1">
+      <w:start w:val="1"/>
+      <w:numFmt w:val="decimal"/>
+      <w:lvlText w:val="%7."/>
+      <w:lvlJc w:val="left"/>
+      <w:pPr>
+        <w:ind w:left="5040" w:hanging="360"/>
+      </w:pPr>
+    </w:lvl>
+    <w:lvl w:ilvl="7" w:tplc="04070019" w:tentative="1">
+      <w:start w:val="1"/>
+      <w:numFmt w:val="lowerLetter"/>
+      <w:lvlText w:val="%8."/>
+      <w:lvlJc w:val="left"/>
+      <w:pPr>
+        <w:ind w:left="5760" w:hanging="360"/>
+      </w:pPr>
+    </w:lvl>
+    <w:lvl w:ilvl="8" w:tplc="0407001B" w:tentative="1">
+      <w:start w:val="1"/>
+      <w:numFmt w:val="lowerRoman"/>
+      <w:lvlText w:val="%9."/>
+      <w:lvlJc w:val="right"/>
+      <w:pPr>
+        <w:ind w:left="6480" w:hanging="180"/>
+      </w:pPr>
+    </w:lvl>
+  </w:abstractNum>
   <w:abstractNum w:abstractNumId="4" w15:restartNumberingAfterBreak="0">
-    <w:nsid w:val="393734A3"/>
+    <w:nsid w:val="21C65400"/>
     <w:multiLevelType w:val="multilevel"/>
-    <w:tmpl w:val="206C2A76"/>
+    <w:tmpl w:val="A7BEC7CA"/>
     <w:lvl w:ilvl="0">
       <w:start w:val="1"/>
       <w:numFmt w:val="bullet"/>
@@ -7352,6 +7457,155 @@
     </w:lvl>
   </w:abstractNum>
   <w:abstractNum w:abstractNumId="5" w15:restartNumberingAfterBreak="0">
+    <w:nsid w:val="393734A3"/>
+    <w:multiLevelType w:val="multilevel"/>
+    <w:tmpl w:val="206C2A76"/>
+    <w:lvl w:ilvl="0">
+      <w:start w:val="1"/>
+      <w:numFmt w:val="bullet"/>
+      <w:lvlText w:val=""/>
+      <w:lvlJc w:val="left"/>
+      <w:pPr>
+        <w:tabs>
+          <w:tab w:val="num" w:pos="720"/>
+        </w:tabs>
+        <w:ind w:left="720" w:hanging="360"/>
+      </w:pPr>
+      <w:rPr>
+        <w:rFonts w:ascii="Symbol" w:hAnsi="Symbol" w:hint="default"/>
+        <w:sz w:val="20"/>
+      </w:rPr>
+    </w:lvl>
+    <w:lvl w:ilvl="1" w:tentative="1">
+      <w:start w:val="1"/>
+      <w:numFmt w:val="bullet"/>
+      <w:lvlText w:val="o"/>
+      <w:lvlJc w:val="left"/>
+      <w:pPr>
+        <w:tabs>
+          <w:tab w:val="num" w:pos="1440"/>
+        </w:tabs>
+        <w:ind w:left="1440" w:hanging="360"/>
+      </w:pPr>
+      <w:rPr>
+        <w:rFonts w:ascii="Courier New" w:hAnsi="Courier New" w:hint="default"/>
+        <w:sz w:val="20"/>
+      </w:rPr>
+    </w:lvl>
+    <w:lvl w:ilvl="2" w:tentative="1">
+      <w:start w:val="1"/>
+      <w:numFmt w:val="bullet"/>
+      <w:lvlText w:val=""/>
+      <w:lvlJc w:val="left"/>
+      <w:pPr>
+        <w:tabs>
+          <w:tab w:val="num" w:pos="2160"/>
+        </w:tabs>
+        <w:ind w:left="2160" w:hanging="360"/>
+      </w:pPr>
+      <w:rPr>
+        <w:rFonts w:ascii="Wingdings" w:hAnsi="Wingdings" w:hint="default"/>
+        <w:sz w:val="20"/>
+      </w:rPr>
+    </w:lvl>
+    <w:lvl w:ilvl="3" w:tentative="1">
+      <w:start w:val="1"/>
+      <w:numFmt w:val="bullet"/>
+      <w:lvlText w:val=""/>
+      <w:lvlJc w:val="left"/>
+      <w:pPr>
+        <w:tabs>
+          <w:tab w:val="num" w:pos="2880"/>
+        </w:tabs>
+        <w:ind w:left="2880" w:hanging="360"/>
+      </w:pPr>
+      <w:rPr>
+        <w:rFonts w:ascii="Wingdings" w:hAnsi="Wingdings" w:hint="default"/>
+        <w:sz w:val="20"/>
+      </w:rPr>
+    </w:lvl>
+    <w:lvl w:ilvl="4" w:tentative="1">
+      <w:start w:val="1"/>
+      <w:numFmt w:val="bullet"/>
+      <w:lvlText w:val=""/>
+      <w:lvlJc w:val="left"/>
+      <w:pPr>
+        <w:tabs>
+          <w:tab w:val="num" w:pos="3600"/>
+        </w:tabs>
+        <w:ind w:left="3600" w:hanging="360"/>
+      </w:pPr>
+      <w:rPr>
+        <w:rFonts w:ascii="Wingdings" w:hAnsi="Wingdings" w:hint="default"/>
+        <w:sz w:val="20"/>
+      </w:rPr>
+    </w:lvl>
+    <w:lvl w:ilvl="5" w:tentative="1">
+      <w:start w:val="1"/>
+      <w:numFmt w:val="bullet"/>
+      <w:lvlText w:val=""/>
+      <w:lvlJc w:val="left"/>
+      <w:pPr>
+        <w:tabs>
+          <w:tab w:val="num" w:pos="4320"/>
+        </w:tabs>
+        <w:ind w:left="4320" w:hanging="360"/>
+      </w:pPr>
+      <w:rPr>
+        <w:rFonts w:ascii="Wingdings" w:hAnsi="Wingdings" w:hint="default"/>
+        <w:sz w:val="20"/>
+      </w:rPr>
+    </w:lvl>
+    <w:lvl w:ilvl="6" w:tentative="1">
+      <w:start w:val="1"/>
+      <w:numFmt w:val="bullet"/>
+      <w:lvlText w:val=""/>
+      <w:lvlJc w:val="left"/>
+      <w:pPr>
+        <w:tabs>
+          <w:tab w:val="num" w:pos="5040"/>
+        </w:tabs>
+        <w:ind w:left="5040" w:hanging="360"/>
+      </w:pPr>
+      <w:rPr>
+        <w:rFonts w:ascii="Wingdings" w:hAnsi="Wingdings" w:hint="default"/>
+        <w:sz w:val="20"/>
+      </w:rPr>
+    </w:lvl>
+    <w:lvl w:ilvl="7" w:tentative="1">
+      <w:start w:val="1"/>
+      <w:numFmt w:val="bullet"/>
+      <w:lvlText w:val=""/>
+      <w:lvlJc w:val="left"/>
+      <w:pPr>
+        <w:tabs>
+          <w:tab w:val="num" w:pos="5760"/>
+        </w:tabs>
+        <w:ind w:left="5760" w:hanging="360"/>
+      </w:pPr>
+      <w:rPr>
+        <w:rFonts w:ascii="Wingdings" w:hAnsi="Wingdings" w:hint="default"/>
+        <w:sz w:val="20"/>
+      </w:rPr>
+    </w:lvl>
+    <w:lvl w:ilvl="8" w:tentative="1">
+      <w:start w:val="1"/>
+      <w:numFmt w:val="bullet"/>
+      <w:lvlText w:val=""/>
+      <w:lvlJc w:val="left"/>
+      <w:pPr>
+        <w:tabs>
+          <w:tab w:val="num" w:pos="6480"/>
+        </w:tabs>
+        <w:ind w:left="6480" w:hanging="360"/>
+      </w:pPr>
+      <w:rPr>
+        <w:rFonts w:ascii="Wingdings" w:hAnsi="Wingdings" w:hint="default"/>
+        <w:sz w:val="20"/>
+      </w:rPr>
+    </w:lvl>
+  </w:abstractNum>
+  <w:abstractNum w:abstractNumId="6" w15:restartNumberingAfterBreak="0">
     <w:nsid w:val="4378106C"/>
     <w:multiLevelType w:val="hybridMultilevel"/>
     <w:tmpl w:val="D550E9AE"/>
@@ -7463,7 +7717,7 @@
       </w:rPr>
     </w:lvl>
   </w:abstractNum>
-  <w:abstractNum w:abstractNumId="6" w15:restartNumberingAfterBreak="0">
+  <w:abstractNum w:abstractNumId="7" w15:restartNumberingAfterBreak="0">
     <w:nsid w:val="524A3869"/>
     <w:multiLevelType w:val="hybridMultilevel"/>
     <w:tmpl w:val="234EDC54"/>
@@ -7576,7 +7830,7 @@
       </w:rPr>
     </w:lvl>
   </w:abstractNum>
-  <w:abstractNum w:abstractNumId="7" w15:restartNumberingAfterBreak="0">
+  <w:abstractNum w:abstractNumId="8" w15:restartNumberingAfterBreak="0">
     <w:nsid w:val="5E791327"/>
     <w:multiLevelType w:val="hybridMultilevel"/>
     <w:tmpl w:val="61508D90"/>
@@ -7665,7 +7919,7 @@
       </w:pPr>
     </w:lvl>
   </w:abstractNum>
-  <w:abstractNum w:abstractNumId="8" w15:restartNumberingAfterBreak="0">
+  <w:abstractNum w:abstractNumId="9" w15:restartNumberingAfterBreak="0">
     <w:nsid w:val="661F6CFE"/>
     <w:multiLevelType w:val="hybridMultilevel"/>
     <w:tmpl w:val="16CE4A62"/>
@@ -7754,7 +8008,7 @@
       </w:pPr>
     </w:lvl>
   </w:abstractNum>
-  <w:abstractNum w:abstractNumId="9" w15:restartNumberingAfterBreak="0">
+  <w:abstractNum w:abstractNumId="10" w15:restartNumberingAfterBreak="0">
     <w:nsid w:val="7F4A062F"/>
     <w:multiLevelType w:val="hybridMultilevel"/>
     <w:tmpl w:val="7F82FEBE"/>
@@ -7844,34 +8098,37 @@
     </w:lvl>
   </w:abstractNum>
   <w:num w:numId="1" w16cid:durableId="1572277153">
+    <w:abstractNumId w:val="2"/>
+  </w:num>
+  <w:num w:numId="2" w16cid:durableId="759570397">
+    <w:abstractNumId w:val="10"/>
+  </w:num>
+  <w:num w:numId="3" w16cid:durableId="1187403510">
+    <w:abstractNumId w:val="3"/>
+  </w:num>
+  <w:num w:numId="4" w16cid:durableId="1350714109">
     <w:abstractNumId w:val="1"/>
   </w:num>
-  <w:num w:numId="2" w16cid:durableId="759570397">
+  <w:num w:numId="5" w16cid:durableId="1852407121">
     <w:abstractNumId w:val="9"/>
   </w:num>
-  <w:num w:numId="3" w16cid:durableId="1187403510">
-    <w:abstractNumId w:val="2"/>
+  <w:num w:numId="6" w16cid:durableId="898172429">
+    <w:abstractNumId w:val="7"/>
   </w:num>
-  <w:num w:numId="4" w16cid:durableId="1350714109">
-    <w:abstractNumId w:val="0"/>
-  </w:num>
-  <w:num w:numId="5" w16cid:durableId="1852407121">
+  <w:num w:numId="7" w16cid:durableId="138424886">
     <w:abstractNumId w:val="8"/>
   </w:num>
-  <w:num w:numId="6" w16cid:durableId="898172429">
+  <w:num w:numId="8" w16cid:durableId="41945580">
     <w:abstractNumId w:val="6"/>
   </w:num>
-  <w:num w:numId="7" w16cid:durableId="138424886">
-    <w:abstractNumId w:val="7"/>
+  <w:num w:numId="9" w16cid:durableId="394163015">
+    <w:abstractNumId w:val="4"/>
   </w:num>
-  <w:num w:numId="8" w16cid:durableId="41945580">
+  <w:num w:numId="10" w16cid:durableId="515997057">
     <w:abstractNumId w:val="5"/>
   </w:num>
-  <w:num w:numId="9" w16cid:durableId="394163015">
-    <w:abstractNumId w:val="3"/>
-  </w:num>
-  <w:num w:numId="10" w16cid:durableId="515997057">
-    <w:abstractNumId w:val="4"/>
+  <w:num w:numId="11" w16cid:durableId="527373319">
+    <w:abstractNumId w:val="0"/>
   </w:num>
 </w:numbering>
 </file>
@@ -8779,19 +9036,19 @@
 
 <file path=word/glossary/fontTable.xml><?xml version="1.0" encoding="utf-8"?>
 <w:fonts xmlns:mc="http://schemas.openxmlformats.org/markup-compatibility/2006" xmlns:r="http://schemas.openxmlformats.org/officeDocument/2006/relationships" xmlns:w="http://schemas.openxmlformats.org/wordprocessingml/2006/main" xmlns:w14="http://schemas.microsoft.com/office/word/2010/wordml" xmlns:w15="http://schemas.microsoft.com/office/word/2012/wordml" xmlns:w16cex="http://schemas.microsoft.com/office/word/2018/wordml/cex" xmlns:w16cid="http://schemas.microsoft.com/office/word/2016/wordml/cid" xmlns:w16="http://schemas.microsoft.com/office/word/2018/wordml" xmlns:w16du="http://schemas.microsoft.com/office/word/2023/wordml/word16du" xmlns:w16sdtdh="http://schemas.microsoft.com/office/word/2020/wordml/sdtdatahash" xmlns:w16sdtfl="http://schemas.microsoft.com/office/word/2024/wordml/sdtformatlock" xmlns:w16se="http://schemas.microsoft.com/office/word/2015/wordml/symex" mc:Ignorable="w14 w15 w16se w16cid w16 w16cex w16sdtdh w16sdtfl w16du">
+  <w:font w:name="Symbol">
+    <w:panose1 w:val="05050102010706020507"/>
+    <w:charset w:val="02"/>
+    <w:family w:val="roman"/>
+    <w:pitch w:val="variable"/>
+    <w:sig w:usb0="00000000" w:usb1="10000000" w:usb2="00000000" w:usb3="00000000" w:csb0="80000000" w:csb1="00000000"/>
+  </w:font>
   <w:font w:name="Times New Roman">
     <w:panose1 w:val="02020603050405020304"/>
     <w:charset w:val="00"/>
     <w:family w:val="roman"/>
     <w:pitch w:val="variable"/>
     <w:sig w:usb0="E0002EFF" w:usb1="C000785B" w:usb2="00000009" w:usb3="00000000" w:csb0="000001FF" w:csb1="00000000"/>
-  </w:font>
-  <w:font w:name="Symbol">
-    <w:panose1 w:val="05050102010706020507"/>
-    <w:charset w:val="02"/>
-    <w:family w:val="roman"/>
-    <w:pitch w:val="variable"/>
-    <w:sig w:usb0="00000000" w:usb1="10000000" w:usb2="00000000" w:usb3="00000000" w:csb0="80000000" w:csb1="00000000"/>
   </w:font>
   <w:font w:name="Courier New">
     <w:panose1 w:val="02070309020205020404"/>
@@ -8857,6 +9114,7 @@
     <w:rsid w:val="001708DF"/>
     <w:rsid w:val="0022503B"/>
     <w:rsid w:val="00285192"/>
+    <w:rsid w:val="003E7898"/>
     <w:rsid w:val="00494141"/>
     <w:rsid w:val="004F715D"/>
     <w:rsid w:val="005543CF"/>
@@ -8878,6 +9136,7 @@
     <w:rsid w:val="00E3430F"/>
     <w:rsid w:val="00E46FFA"/>
     <w:rsid w:val="00E66FC6"/>
+    <w:rsid w:val="00ED04C1"/>
     <w:rsid w:val="00F72BAA"/>
   </w:rsids>
   <m:mathPr>

</xml_diff>

<commit_message>
added block_diagramm for hardware and entwicklungsplan v5
</commit_message>
<xml_diff>
--- a/doc/Gruppe1_Audio_BPM_Erkennung_Entwicklungsplan.docx
+++ b/doc/Gruppe1_Audio_BPM_Erkennung_Entwicklungsplan.docx
@@ -57,7 +57,6 @@
         </w:rPr>
         <w:t xml:space="preserve">Audio BPM </w:t>
       </w:r>
-      <w:proofErr w:type="spellStart"/>
       <w:r>
         <w:rPr>
           <w:sz w:val="52"/>
@@ -66,7 +65,6 @@
         </w:rPr>
         <w:t>Erkennung</w:t>
       </w:r>
-      <w:proofErr w:type="spellEnd"/>
     </w:p>
     <w:p>
       <w:pPr>
@@ -177,7 +175,7 @@
             <w:t xml:space="preserve">Version: </w:t>
           </w:r>
           <w:r>
-            <w:t>4</w:t>
+            <w:t>5</w:t>
           </w:r>
           <w:r>
             <w:t>.0</w:t>
@@ -1987,21 +1985,11 @@
         <w:pStyle w:val="berschrift1"/>
       </w:pPr>
       <w:bookmarkStart w:id="0" w:name="_Toc228369934"/>
-      <w:proofErr w:type="spellStart"/>
       <w:r>
         <w:lastRenderedPageBreak/>
-        <w:t>Document</w:t>
-      </w:r>
-      <w:proofErr w:type="spellEnd"/>
-      <w:r>
-        <w:t xml:space="preserve"> </w:t>
-      </w:r>
-      <w:proofErr w:type="spellStart"/>
-      <w:r>
-        <w:t>History</w:t>
+        <w:t>Document History</w:t>
       </w:r>
       <w:bookmarkEnd w:id="0"/>
-      <w:proofErr w:type="spellEnd"/>
     </w:p>
     <w:p/>
     <w:tbl>
@@ -2041,11 +2029,9 @@
             <w:tcW w:w="6232" w:type="dxa"/>
           </w:tcPr>
           <w:p>
-            <w:proofErr w:type="spellStart"/>
             <w:r>
               <w:t>Changes</w:t>
             </w:r>
-            <w:proofErr w:type="spellEnd"/>
           </w:p>
         </w:tc>
       </w:tr>
@@ -2117,7 +2103,37 @@
           </w:tcPr>
           <w:p>
             <w:r>
-              <w:t>Kapitel Anwendung &amp; Ziele und Anforderungsmanagement ergänzt.</w:t>
+              <w:t xml:space="preserve">Kapitel </w:t>
+            </w:r>
+            <w:r>
+              <w:t>„</w:t>
+            </w:r>
+            <w:r>
+              <w:t>Anwendung &amp; Ziele</w:t>
+            </w:r>
+            <w:r>
+              <w:t>“</w:t>
+            </w:r>
+            <w:r>
+              <w:t xml:space="preserve"> und </w:t>
+            </w:r>
+            <w:r>
+              <w:t>„</w:t>
+            </w:r>
+            <w:r>
+              <w:t>Anforderungsmanagement</w:t>
+            </w:r>
+            <w:r>
+              <w:t>“</w:t>
+            </w:r>
+            <w:r>
+              <w:t xml:space="preserve"> </w:t>
+            </w:r>
+            <w:r>
+              <w:t>„</w:t>
+            </w:r>
+            <w:r>
+              <w:t>ergänzt.</w:t>
             </w:r>
           </w:p>
         </w:tc>
@@ -2149,7 +2165,31 @@
           </w:tcPr>
           <w:p>
             <w:r>
-              <w:t>Kapitel Architektur &amp; Design und Verifizierung und Validierung ergänzt.</w:t>
+              <w:t xml:space="preserve">Kapitel </w:t>
+            </w:r>
+            <w:r>
+              <w:t>„</w:t>
+            </w:r>
+            <w:r>
+              <w:t>Architektur &amp; Design</w:t>
+            </w:r>
+            <w:r>
+              <w:t>“</w:t>
+            </w:r>
+            <w:r>
+              <w:t xml:space="preserve"> und </w:t>
+            </w:r>
+            <w:r>
+              <w:t>„</w:t>
+            </w:r>
+            <w:r>
+              <w:t>Verifizierung und Validierung</w:t>
+            </w:r>
+            <w:r>
+              <w:t>“</w:t>
+            </w:r>
+            <w:r>
+              <w:t xml:space="preserve"> ergänzt.</w:t>
             </w:r>
           </w:p>
         </w:tc>
@@ -2191,19 +2231,40 @@
           <w:tcPr>
             <w:tcW w:w="988" w:type="dxa"/>
           </w:tcPr>
-          <w:p/>
+          <w:p>
+            <w:r>
+              <w:t>5.0</w:t>
+            </w:r>
+          </w:p>
         </w:tc>
         <w:tc>
           <w:tcPr>
             <w:tcW w:w="1842" w:type="dxa"/>
           </w:tcPr>
-          <w:p/>
+          <w:p>
+            <w:r>
+              <w:t>Johannes Winter</w:t>
+            </w:r>
+          </w:p>
         </w:tc>
         <w:tc>
           <w:tcPr>
             <w:tcW w:w="6232" w:type="dxa"/>
           </w:tcPr>
-          <w:p/>
+          <w:p>
+            <w:r>
+              <w:t xml:space="preserve">Veränderung der Anzahl der </w:t>
+            </w:r>
+            <w:r>
+              <w:t>Test-Cases</w:t>
+            </w:r>
+            <w:r>
+              <w:t xml:space="preserve"> und der </w:t>
+            </w:r>
+            <w:r>
+              <w:t>Architektur sowie Veränderung der Milestones in „Ziele“</w:t>
+            </w:r>
+          </w:p>
         </w:tc>
       </w:tr>
       <w:tr>
@@ -2234,14 +2295,9 @@
       </w:pPr>
       <w:bookmarkStart w:id="1" w:name="_Toc228369935"/>
       <w:r>
-        <w:t xml:space="preserve">Template </w:t>
-      </w:r>
-      <w:proofErr w:type="spellStart"/>
-      <w:r>
-        <w:t>History</w:t>
+        <w:t>Template History</w:t>
       </w:r>
       <w:bookmarkEnd w:id="1"/>
-      <w:proofErr w:type="spellEnd"/>
     </w:p>
     <w:p/>
     <w:tbl>
@@ -2281,11 +2337,9 @@
             <w:tcW w:w="6232" w:type="dxa"/>
           </w:tcPr>
           <w:p>
-            <w:proofErr w:type="spellStart"/>
             <w:r>
               <w:t>Changes</w:t>
             </w:r>
-            <w:proofErr w:type="spellEnd"/>
           </w:p>
         </w:tc>
       </w:tr>
@@ -2482,7 +2536,6 @@
         </w:rPr>
       </w:pPr>
       <w:bookmarkStart w:id="3" w:name="_Toc228369937"/>
-      <w:proofErr w:type="spellStart"/>
       <w:r>
         <w:rPr>
           <w:lang w:val="en-US"/>
@@ -2490,7 +2543,6 @@
         <w:t>Umfang</w:t>
       </w:r>
       <w:bookmarkEnd w:id="3"/>
-      <w:proofErr w:type="spellEnd"/>
     </w:p>
     <w:p>
       <w:r>
@@ -2580,21 +2632,12 @@
           <w:numId w:val="11"/>
         </w:numPr>
       </w:pPr>
-      <w:proofErr w:type="spellStart"/>
       <w:r>
         <w:rPr>
           <w:b/>
           <w:bCs/>
         </w:rPr>
-        <w:t>Traceability</w:t>
-      </w:r>
-      <w:proofErr w:type="spellEnd"/>
-      <w:r>
-        <w:rPr>
-          <w:b/>
-          <w:bCs/>
-        </w:rPr>
-        <w:t>:</w:t>
+        <w:t>Traceability:</w:t>
       </w:r>
       <w:r>
         <w:t xml:space="preserve"> Dokumentation einer lückenlosen Nachverfolgbarkeit (100%) über alle oben genannten Phasen hinweg.</w:t>
@@ -2638,7 +2681,6 @@
         </w:rPr>
       </w:pPr>
       <w:bookmarkStart w:id="4" w:name="_Toc228369938"/>
-      <w:proofErr w:type="spellStart"/>
       <w:r>
         <w:rPr>
           <w:lang w:val="en-US"/>
@@ -2655,43 +2697,20 @@
         <w:rPr>
           <w:lang w:val="en-US"/>
         </w:rPr>
-        <w:t>ation</w:t>
-      </w:r>
-      <w:proofErr w:type="spellEnd"/>
-      <w:r>
+        <w:t>ation des Projektes</w:t>
+      </w:r>
+      <w:bookmarkEnd w:id="4"/>
+    </w:p>
+    <w:p>
+      <w:pPr>
         <w:rPr>
           <w:lang w:val="en-US"/>
         </w:rPr>
-        <w:t xml:space="preserve"> des </w:t>
-      </w:r>
-      <w:proofErr w:type="spellStart"/>
-      <w:r>
-        <w:rPr>
-          <w:lang w:val="en-US"/>
-        </w:rPr>
-        <w:t>Projektes</w:t>
-      </w:r>
-      <w:bookmarkEnd w:id="4"/>
-      <w:proofErr w:type="spellEnd"/>
-    </w:p>
-    <w:p>
-      <w:pPr>
-        <w:rPr>
-          <w:lang w:val="en-US"/>
-        </w:rPr>
-      </w:pPr>
-    </w:p>
-    <w:p>
-      <w:r>
-        <w:t xml:space="preserve">Das Projekt wird die agile Methode </w:t>
-      </w:r>
-      <w:proofErr w:type="spellStart"/>
-      <w:r>
-        <w:t>Scrum</w:t>
-      </w:r>
-      <w:proofErr w:type="spellEnd"/>
-      <w:r>
-        <w:t xml:space="preserve"> für die Entwicklung verwenden.</w:t>
+      </w:pPr>
+    </w:p>
+    <w:p>
+      <w:r>
+        <w:t>Das Projekt wird die agile Methode Scrum für die Entwicklung verwenden.</w:t>
       </w:r>
     </w:p>
     <w:p>
@@ -2813,13 +2832,8 @@
             <w:hideMark/>
           </w:tcPr>
           <w:p>
-            <w:proofErr w:type="spellStart"/>
-            <w:r>
-              <w:t>Scrum</w:t>
-            </w:r>
-            <w:proofErr w:type="spellEnd"/>
-            <w:r>
-              <w:t xml:space="preserve"> Master</w:t>
+            <w:r>
+              <w:t>Scrum Master</w:t>
             </w:r>
           </w:p>
         </w:tc>
@@ -2944,13 +2958,8 @@
             <w:r>
               <w:t xml:space="preserve">Testingenieur, </w:t>
             </w:r>
-            <w:proofErr w:type="spellStart"/>
-            <w:r>
-              <w:t>Product</w:t>
-            </w:r>
-            <w:proofErr w:type="spellEnd"/>
-            <w:r>
-              <w:t xml:space="preserve"> Owner</w:t>
+            <w:r>
+              <w:t>Product Owner</w:t>
             </w:r>
           </w:p>
         </w:tc>
@@ -3160,15 +3169,7 @@
         <w:t xml:space="preserve"> </w:t>
       </w:r>
       <w:r>
-        <w:t xml:space="preserve">statt. In diesem Rahmen werden die Sprintziele definiert, die effektive Kapazität der einzelnen Teammitglieder festgelegt sowie die geplanten Aktivitäten und die entsprechende „Definition </w:t>
-      </w:r>
-      <w:proofErr w:type="spellStart"/>
-      <w:r>
-        <w:t>of</w:t>
-      </w:r>
-      <w:proofErr w:type="spellEnd"/>
-      <w:r>
-        <w:t xml:space="preserve"> Done“ bestimmt.</w:t>
+        <w:t>statt. In diesem Rahmen werden die Sprintziele definiert, die effektive Kapazität der einzelnen Teammitglieder festgelegt sowie die geplanten Aktivitäten und die entsprechende „Definition of Done“ bestimmt.</w:t>
       </w:r>
     </w:p>
     <w:p>
@@ -3178,36 +3179,12 @@
     </w:p>
     <w:p>
       <w:r>
-        <w:t xml:space="preserve">Die Daily </w:t>
-      </w:r>
-      <w:proofErr w:type="spellStart"/>
-      <w:r>
-        <w:t>Scrums</w:t>
-      </w:r>
-      <w:proofErr w:type="spellEnd"/>
-      <w:r>
-        <w:t xml:space="preserve"> werden täglich durchgeführt. Der amtierende </w:t>
-      </w:r>
-      <w:proofErr w:type="spellStart"/>
-      <w:r>
-        <w:t>Scrum</w:t>
-      </w:r>
-      <w:proofErr w:type="spellEnd"/>
-      <w:r>
-        <w:t xml:space="preserve"> Master berichtet an Herrn Pagliarulo, falls Blocker auftreten, die nicht innerhalb des Teams gelöst werden können.</w:t>
-      </w:r>
-    </w:p>
-    <w:p>
-      <w:r>
-        <w:t xml:space="preserve">Ein Sprint Review sowie eine Sprint Retrospektive finden am letzten Donnerstag des Sprints statt. Im Sprint Review werden dem </w:t>
-      </w:r>
-      <w:proofErr w:type="spellStart"/>
-      <w:r>
-        <w:t>Product</w:t>
-      </w:r>
-      <w:proofErr w:type="spellEnd"/>
-      <w:r>
-        <w:t xml:space="preserve"> Owner und anderen Gruppen die erzielten Ergebnisse präsentiert. Aus der Retrospektive werden Maßnahmen zur Verbesserung für die kommenden Sprints abgeleitet.</w:t>
+        <w:t>Die Daily Scrums werden täglich durchgeführt. Der amtierende Scrum Master berichtet an Herrn Pagliarulo, falls Blocker auftreten, die nicht innerhalb des Teams gelöst werden können.</w:t>
+      </w:r>
+    </w:p>
+    <w:p>
+      <w:r>
+        <w:t>Ein Sprint Review sowie eine Sprint Retrospektive finden am letzten Donnerstag des Sprints statt. Im Sprint Review werden dem Product Owner und anderen Gruppen die erzielten Ergebnisse präsentiert. Aus der Retrospektive werden Maßnahmen zur Verbesserung für die kommenden Sprints abgeleitet.</w:t>
       </w:r>
     </w:p>
     <w:p>
@@ -3215,15 +3192,7 @@
         <w:t xml:space="preserve">Die Sprintplanung wird mithilfe </w:t>
       </w:r>
       <w:r>
-        <w:t xml:space="preserve">von </w:t>
-      </w:r>
-      <w:proofErr w:type="spellStart"/>
-      <w:r>
-        <w:t>Github</w:t>
-      </w:r>
-      <w:proofErr w:type="spellEnd"/>
-      <w:r>
-        <w:t xml:space="preserve"> </w:t>
+        <w:t xml:space="preserve">von Github </w:t>
       </w:r>
       <w:r>
         <w:t>durchgeführt. Diese</w:t>
@@ -3232,15 +3201,7 @@
         <w:t xml:space="preserve">s Tool </w:t>
       </w:r>
       <w:r>
-        <w:t xml:space="preserve">ermöglicht zudem die Darstellung eines </w:t>
-      </w:r>
-      <w:proofErr w:type="spellStart"/>
-      <w:r>
-        <w:t>Burndown</w:t>
-      </w:r>
-      <w:proofErr w:type="spellEnd"/>
-      <w:r>
-        <w:t>-Charts und dient als Ablage für Sprint Reviews, Sprint Retrospektiven sowie zur Verwaltung von Blockern und Interrupts.</w:t>
+        <w:t>ermöglicht zudem die Darstellung eines Burndown-Charts und dient als Ablage für Sprint Reviews, Sprint Retrospektiven sowie zur Verwaltung von Blockern und Interrupts.</w:t>
       </w:r>
     </w:p>
     <w:p/>
@@ -3273,23 +3234,7 @@
         <w:t>Das Board ist in mehrere Spalten unterteilt, die den jeweiligen Bearbeitungsstatus widerspiegeln</w:t>
       </w:r>
       <w:r>
-        <w:t xml:space="preserve"> (Backlog, </w:t>
-      </w:r>
-      <w:proofErr w:type="spellStart"/>
-      <w:r>
-        <w:t>Requirements</w:t>
-      </w:r>
-      <w:proofErr w:type="spellEnd"/>
-      <w:r>
-        <w:t xml:space="preserve"> Definition, Architecture Design, Implementation, </w:t>
-      </w:r>
-      <w:proofErr w:type="spellStart"/>
-      <w:r>
-        <w:t>Verification</w:t>
-      </w:r>
-      <w:proofErr w:type="spellEnd"/>
-      <w:r>
-        <w:t>, Done).</w:t>
+        <w:t xml:space="preserve"> (Backlog, Requirements Definition, Architecture Design, Implementation, Verification, Done).</w:t>
       </w:r>
     </w:p>
     <w:p>
@@ -3370,15 +3315,7 @@
         <w:t xml:space="preserve"> Kanban Board wird </w:t>
       </w:r>
       <w:r>
-        <w:t xml:space="preserve">mit der Project Funktion von </w:t>
-      </w:r>
-      <w:proofErr w:type="spellStart"/>
-      <w:r>
-        <w:t>Github</w:t>
-      </w:r>
-      <w:proofErr w:type="spellEnd"/>
-      <w:r>
-        <w:t xml:space="preserve"> erstellt.</w:t>
+        <w:t>mit der Project Funktion von Github erstellt.</w:t>
       </w:r>
     </w:p>
     <w:p/>
@@ -3421,26 +3358,10 @@
     </w:p>
     <w:p>
       <w:r>
-        <w:t xml:space="preserve">GitHub wird ebenso als </w:t>
-      </w:r>
-      <w:proofErr w:type="spellStart"/>
-      <w:r>
-        <w:t>Versionierungsprogramm</w:t>
-      </w:r>
-      <w:proofErr w:type="spellEnd"/>
-      <w:r>
-        <w:t xml:space="preserve"> </w:t>
-      </w:r>
-      <w:r>
-        <w:t>(</w:t>
-      </w:r>
-      <w:proofErr w:type="spellStart"/>
-      <w:r>
-        <w:t>Git</w:t>
-      </w:r>
-      <w:proofErr w:type="spellEnd"/>
-      <w:r>
-        <w:t xml:space="preserve">) </w:t>
+        <w:t xml:space="preserve">GitHub wird ebenso als Versionierungsprogramm </w:t>
+      </w:r>
+      <w:r>
+        <w:t xml:space="preserve">(Git) </w:t>
       </w:r>
       <w:r>
         <w:t>verwendet.</w:t>
@@ -3454,29 +3375,13 @@
         </w:rPr>
       </w:pPr>
       <w:bookmarkStart w:id="13" w:name="_Toc228369943"/>
-      <w:proofErr w:type="spellStart"/>
       <w:r>
         <w:rPr>
           <w:lang w:val="en-US"/>
         </w:rPr>
-        <w:t>Anwendung</w:t>
-      </w:r>
-      <w:proofErr w:type="spellEnd"/>
-      <w:r>
-        <w:rPr>
-          <w:lang w:val="en-US"/>
-        </w:rPr>
-        <w:t xml:space="preserve"> &amp; </w:t>
-      </w:r>
-      <w:proofErr w:type="spellStart"/>
-      <w:r>
-        <w:rPr>
-          <w:lang w:val="en-US"/>
-        </w:rPr>
-        <w:t>Ziele</w:t>
+        <w:t>Anwendung &amp; Ziele</w:t>
       </w:r>
       <w:bookmarkEnd w:id="13"/>
-      <w:proofErr w:type="spellEnd"/>
     </w:p>
     <w:p>
       <w:pPr>
@@ -3633,15 +3538,7 @@
           </w:tcPr>
           <w:p>
             <w:r>
-              <w:t xml:space="preserve">User Stories </w:t>
-            </w:r>
-            <w:proofErr w:type="spellStart"/>
-            <w:r>
-              <w:t>reviewed</w:t>
-            </w:r>
-            <w:proofErr w:type="spellEnd"/>
-            <w:r>
-              <w:t xml:space="preserve"> und freigegeben</w:t>
+              <w:t>User Stories reviewed und freigegeben</w:t>
             </w:r>
           </w:p>
         </w:tc>
@@ -3676,21 +3573,8 @@
               </w:rPr>
             </w:pPr>
             <w:r>
-              <w:t xml:space="preserve">100% </w:t>
-            </w:r>
-            <w:proofErr w:type="spellStart"/>
-            <w:r>
-              <w:t>reviewed</w:t>
-            </w:r>
-            <w:proofErr w:type="spellEnd"/>
-            <w:r>
-              <w:t xml:space="preserve"> &amp; </w:t>
-            </w:r>
-            <w:proofErr w:type="spellStart"/>
-            <w:r>
-              <w:t>approved</w:t>
-            </w:r>
-            <w:proofErr w:type="spellEnd"/>
+              <w:t>100% reviewed &amp; approved</w:t>
+            </w:r>
           </w:p>
         </w:tc>
       </w:tr>
@@ -3740,28 +3624,12 @@
                 <w:lang w:val="en-US"/>
               </w:rPr>
             </w:pPr>
-            <w:proofErr w:type="spellStart"/>
-            <w:r>
-              <w:rPr>
-                <w:lang w:val="en-US"/>
-              </w:rPr>
-              <w:t>Architektur</w:t>
-            </w:r>
-            <w:proofErr w:type="spellEnd"/>
-            <w:r>
-              <w:rPr>
-                <w:lang w:val="en-US"/>
-              </w:rPr>
-              <w:t xml:space="preserve">-Doku </w:t>
-            </w:r>
-            <w:proofErr w:type="spellStart"/>
-            <w:r>
-              <w:rPr>
-                <w:lang w:val="en-US"/>
-              </w:rPr>
-              <w:t>freigegeben</w:t>
-            </w:r>
-            <w:proofErr w:type="spellEnd"/>
+            <w:r>
+              <w:rPr>
+                <w:lang w:val="en-US"/>
+              </w:rPr>
+              <w:t>Architektur-Doku freigegeben</w:t>
+            </w:r>
           </w:p>
         </w:tc>
       </w:tr>
@@ -3772,13 +3640,8 @@
           </w:tcPr>
           <w:p>
             <w:r>
-              <w:t xml:space="preserve">Implementierung </w:t>
-            </w:r>
-            <w:proofErr w:type="spellStart"/>
-            <w:r>
-              <w:t>abgschlossen</w:t>
-            </w:r>
-            <w:proofErr w:type="spellEnd"/>
+              <w:t>Implementierung abgschlossen</w:t>
+            </w:r>
           </w:p>
           <w:p/>
         </w:tc>
@@ -3788,7 +3651,10 @@
           </w:tcPr>
           <w:p>
             <w:r>
-              <w:t>KW23</w:t>
+              <w:t>KW2</w:t>
+            </w:r>
+            <w:r>
+              <w:t>4</w:t>
             </w:r>
           </w:p>
         </w:tc>
@@ -3802,19 +3668,11 @@
                 <w:lang w:val="en-US"/>
               </w:rPr>
             </w:pPr>
-            <w:proofErr w:type="spellStart"/>
-            <w:r>
-              <w:rPr>
-                <w:lang w:val="en-US"/>
-              </w:rPr>
-              <w:t>abgeschlossene</w:t>
-            </w:r>
-            <w:proofErr w:type="spellEnd"/>
-            <w:r>
-              <w:rPr>
-                <w:lang w:val="en-US"/>
-              </w:rPr>
-              <w:t xml:space="preserve"> Stories</w:t>
+            <w:r>
+              <w:rPr>
+                <w:lang w:val="en-US"/>
+              </w:rPr>
+              <w:t>abgeschlossene Stories</w:t>
             </w:r>
           </w:p>
         </w:tc>
@@ -3846,35 +3704,7 @@
               <w:rPr>
                 <w:lang w:val="en-US"/>
               </w:rPr>
-              <w:t xml:space="preserve">, </w:t>
-            </w:r>
-            <w:proofErr w:type="spellStart"/>
-            <w:r>
-              <w:rPr>
-                <w:lang w:val="en-US"/>
-              </w:rPr>
-              <w:t>keine</w:t>
-            </w:r>
-            <w:proofErr w:type="spellEnd"/>
-            <w:r>
-              <w:rPr>
-                <w:lang w:val="en-US"/>
-              </w:rPr>
-              <w:t xml:space="preserve"> </w:t>
-            </w:r>
-            <w:proofErr w:type="spellStart"/>
-            <w:r>
-              <w:rPr>
-                <w:lang w:val="en-US"/>
-              </w:rPr>
-              <w:t>kritischen</w:t>
-            </w:r>
-            <w:proofErr w:type="spellEnd"/>
-            <w:r>
-              <w:rPr>
-                <w:lang w:val="en-US"/>
-              </w:rPr>
-              <w:t xml:space="preserve"> Bugs</w:t>
+              <w:t>, keine kritischen Bugs</w:t>
             </w:r>
           </w:p>
         </w:tc>
@@ -3911,7 +3741,6 @@
                 <w:lang w:val="en-US"/>
               </w:rPr>
             </w:pPr>
-            <w:proofErr w:type="spellStart"/>
             <w:r>
               <w:rPr>
                 <w:lang w:val="en-US"/>
@@ -3922,14 +3751,7 @@
               <w:rPr>
                 <w:lang w:val="en-US"/>
               </w:rPr>
-              <w:t>estandene</w:t>
-            </w:r>
-            <w:proofErr w:type="spellEnd"/>
-            <w:r>
-              <w:rPr>
-                <w:lang w:val="en-US"/>
-              </w:rPr>
-              <w:t xml:space="preserve"> Tests</w:t>
+              <w:t>estandene Tests</w:t>
             </w:r>
             <w:r>
               <w:rPr>
@@ -3953,16 +3775,8 @@
               <w:rPr>
                 <w:lang w:val="en-US"/>
               </w:rPr>
-              <w:t xml:space="preserve">≥95% Tests </w:t>
-            </w:r>
-            <w:proofErr w:type="spellStart"/>
-            <w:r>
-              <w:rPr>
-                <w:lang w:val="en-US"/>
-              </w:rPr>
-              <w:t>bestanden</w:t>
-            </w:r>
-            <w:proofErr w:type="spellEnd"/>
+              <w:t>≥95% Tests bestanden</w:t>
+            </w:r>
           </w:p>
         </w:tc>
       </w:tr>
@@ -3984,7 +3798,6 @@
         </w:rPr>
       </w:pPr>
       <w:bookmarkStart w:id="17" w:name="_Toc228369946"/>
-      <w:proofErr w:type="spellStart"/>
       <w:r>
         <w:rPr>
           <w:lang w:val="en-US"/>
@@ -3992,7 +3805,6 @@
         <w:t>Anforderungsmanagement</w:t>
       </w:r>
       <w:bookmarkEnd w:id="17"/>
-      <w:proofErr w:type="spellEnd"/>
     </w:p>
     <w:p>
       <w:pPr>
@@ -4385,13 +4197,8 @@
           </w:tcPr>
           <w:p>
             <w:r>
-              <w:t xml:space="preserve">TBD, in Review, </w:t>
-            </w:r>
-            <w:proofErr w:type="spellStart"/>
-            <w:r>
-              <w:t>Reviewed</w:t>
-            </w:r>
-            <w:proofErr w:type="spellEnd"/>
+              <w:t>TBD, in Review, Reviewed</w:t>
+            </w:r>
           </w:p>
         </w:tc>
       </w:tr>
@@ -4401,11 +4208,9 @@
             <w:tcW w:w="1250" w:type="dxa"/>
           </w:tcPr>
           <w:p>
-            <w:proofErr w:type="spellStart"/>
             <w:r>
               <w:t>Verification</w:t>
             </w:r>
-            <w:proofErr w:type="spellEnd"/>
           </w:p>
         </w:tc>
         <w:tc>
@@ -4454,15 +4259,7 @@
         <w:t>.xlsx</w:t>
       </w:r>
       <w:r>
-        <w:t>“ verwaltet. Die Nachverfolgbarkeit (</w:t>
-      </w:r>
-      <w:proofErr w:type="spellStart"/>
-      <w:r>
-        <w:t>Traceability</w:t>
-      </w:r>
-      <w:proofErr w:type="spellEnd"/>
-      <w:r>
-        <w:t>) zwischen User Stories und Anforderungen wird ebenfalls in dieser Tabelle manuell gepflegt.</w:t>
+        <w:t>“ verwaltet. Die Nachverfolgbarkeit (Traceability) zwischen User Stories und Anforderungen wird ebenfalls in dieser Tabelle manuell gepflegt.</w:t>
       </w:r>
     </w:p>
     <w:p>
@@ -4574,20 +4371,12 @@
         </w:rPr>
       </w:pPr>
       <w:bookmarkStart w:id="19" w:name="_Toc228369948"/>
-      <w:proofErr w:type="spellStart"/>
       <w:r>
         <w:rPr>
           <w:lang w:val="en-US"/>
         </w:rPr>
         <w:lastRenderedPageBreak/>
-        <w:t>Architektur</w:t>
-      </w:r>
-      <w:proofErr w:type="spellEnd"/>
-      <w:r>
-        <w:rPr>
-          <w:lang w:val="en-US"/>
-        </w:rPr>
-        <w:t xml:space="preserve"> &amp; Design</w:t>
+        <w:t>Architektur &amp; Design</w:t>
       </w:r>
       <w:bookmarkStart w:id="20" w:name="_Toc165127832"/>
       <w:bookmarkEnd w:id="19"/>
@@ -4643,7 +4432,7 @@
           <w:rFonts w:eastAsia="Times New Roman" w:cstheme="minorHAnsi"/>
           <w:lang w:eastAsia="de-DE"/>
         </w:rPr>
-        <w:t xml:space="preserve">funktionale Ebene </w:t>
+        <w:t>funktionale Ebene</w:t>
       </w:r>
     </w:p>
     <w:p>
@@ -4663,15 +4452,11 @@
           <w:rFonts w:eastAsia="Times New Roman" w:cstheme="minorHAnsi"/>
           <w:lang w:eastAsia="de-DE"/>
         </w:rPr>
-        <w:t xml:space="preserve">logische Ebene </w:t>
-      </w:r>
-    </w:p>
-    <w:p>
-      <w:pPr>
-        <w:numPr>
-          <w:ilvl w:val="0"/>
-          <w:numId w:val="9"/>
-        </w:numPr>
+        <w:t>physikalische Ebene</w:t>
+      </w:r>
+    </w:p>
+    <w:p>
+      <w:pPr>
         <w:spacing w:before="100" w:beforeAutospacing="1" w:after="100" w:afterAutospacing="1" w:line="240" w:lineRule="auto"/>
         <w:rPr>
           <w:rFonts w:eastAsia="Times New Roman" w:cstheme="minorHAnsi"/>
@@ -4683,39 +4468,7 @@
           <w:rFonts w:eastAsia="Times New Roman" w:cstheme="minorHAnsi"/>
           <w:lang w:eastAsia="de-DE"/>
         </w:rPr>
-        <w:t xml:space="preserve">physikalische Ebene </w:t>
-      </w:r>
-    </w:p>
-    <w:p>
-      <w:pPr>
-        <w:spacing w:before="100" w:beforeAutospacing="1" w:after="100" w:afterAutospacing="1" w:line="240" w:lineRule="auto"/>
-        <w:rPr>
-          <w:rFonts w:eastAsia="Times New Roman" w:cstheme="minorHAnsi"/>
-          <w:lang w:eastAsia="de-DE"/>
-        </w:rPr>
-      </w:pPr>
-      <w:r>
-        <w:rPr>
-          <w:rFonts w:eastAsia="Times New Roman" w:cstheme="minorHAnsi"/>
-          <w:lang w:eastAsia="de-DE"/>
-        </w:rPr>
-        <w:t>Die einzelnen Architekturelemente werden eindeutig benannt und gemäß folgender Namenskonvention identifiziert: &lt;</w:t>
-      </w:r>
-      <w:proofErr w:type="spellStart"/>
-      <w:r>
-        <w:rPr>
-          <w:rFonts w:eastAsia="Times New Roman" w:cstheme="minorHAnsi"/>
-          <w:lang w:eastAsia="de-DE"/>
-        </w:rPr>
-        <w:t>ArchEl_x</w:t>
-      </w:r>
-      <w:proofErr w:type="spellEnd"/>
-      <w:r>
-        <w:rPr>
-          <w:rFonts w:eastAsia="Times New Roman" w:cstheme="minorHAnsi"/>
-          <w:lang w:eastAsia="de-DE"/>
-        </w:rPr>
-        <w:t>&gt;. Diese Identifikatoren dienen dazu, Anforderungen eindeutig mit den jeweiligen Architekturelementen zu verknüpfen. Die Zuordnung wird in der Excel-Datei „Stories_Req</w:t>
+        <w:t>Die einzelnen Architekturelemente werden eindeutig benannt und gemäß folgender Namenskonvention identifiziert: &lt;ArchEl_x&gt;. Diese Identifikatoren dienen dazu, Anforderungen eindeutig mit den jeweiligen Architekturelementen zu verknüpfen. Die Zuordnung wird in der Excel-Datei „Stories_Req</w:t>
       </w:r>
       <w:r>
         <w:rPr>
@@ -4783,7 +4536,21 @@
           <w:rFonts w:eastAsia="Times New Roman" w:cstheme="minorHAnsi"/>
           <w:lang w:eastAsia="de-DE"/>
         </w:rPr>
-        <w:t xml:space="preserve">Klassendiagramme zur Beschreibung der Struktur </w:t>
+        <w:t>Ablaufdiagramm</w:t>
+      </w:r>
+      <w:r>
+        <w:rPr>
+          <w:rFonts w:eastAsia="Times New Roman" w:cstheme="minorHAnsi"/>
+          <w:lang w:eastAsia="de-DE"/>
+        </w:rPr>
+        <w:t xml:space="preserve"> </w:t>
+      </w:r>
+      <w:r>
+        <w:rPr>
+          <w:rFonts w:eastAsia="Times New Roman" w:cstheme="minorHAnsi"/>
+          <w:lang w:eastAsia="de-DE"/>
+        </w:rPr>
+        <w:t xml:space="preserve">zur Darstellung des dynamischen Verhaltens </w:t>
       </w:r>
     </w:p>
     <w:p>
@@ -4803,27 +4570,21 @@
           <w:rFonts w:eastAsia="Times New Roman" w:cstheme="minorHAnsi"/>
           <w:lang w:eastAsia="de-DE"/>
         </w:rPr>
-        <w:t xml:space="preserve">Aktivitätsdiagramme und Sequenzdiagramme zur Darstellung des dynamischen Verhaltens </w:t>
-      </w:r>
-    </w:p>
-    <w:p>
-      <w:pPr>
-        <w:numPr>
-          <w:ilvl w:val="0"/>
-          <w:numId w:val="10"/>
-        </w:numPr>
-        <w:spacing w:before="100" w:beforeAutospacing="1" w:after="100" w:afterAutospacing="1" w:line="240" w:lineRule="auto"/>
+        <w:t>Blockdiagramme</w:t>
+      </w:r>
+      <w:r>
         <w:rPr>
           <w:rFonts w:eastAsia="Times New Roman" w:cstheme="minorHAnsi"/>
           <w:lang w:eastAsia="de-DE"/>
         </w:rPr>
-      </w:pPr>
+        <w:t xml:space="preserve"> zur </w:t>
+      </w:r>
       <w:r>
         <w:rPr>
           <w:rFonts w:eastAsia="Times New Roman" w:cstheme="minorHAnsi"/>
           <w:lang w:eastAsia="de-DE"/>
         </w:rPr>
-        <w:t xml:space="preserve">Zustandsdiagramme zur Modellierung zustandsbasierter Abläufe </w:t>
+        <w:t>Darstellung der HW-Komponenten</w:t>
       </w:r>
     </w:p>
     <w:p>
@@ -4839,17 +4600,8 @@
           <w:rFonts w:eastAsia="Times New Roman" w:cstheme="minorHAnsi"/>
           <w:lang w:eastAsia="de-DE"/>
         </w:rPr>
-        <w:t>Die Erstellung der Diagramme erfolgt mit dem Tool „</w:t>
-      </w:r>
-      <w:proofErr w:type="spellStart"/>
-      <w:r>
-        <w:rPr>
-          <w:rFonts w:eastAsia="Times New Roman" w:cstheme="minorHAnsi"/>
-          <w:lang w:eastAsia="de-DE"/>
-        </w:rPr>
-        <w:t>Lucidchart</w:t>
-      </w:r>
-      <w:proofErr w:type="spellEnd"/>
+        <w:t>Die Erstellung der Diagramme erfolgt mit dem Tool „Lucidchart</w:t>
+      </w:r>
       <w:r>
         <w:rPr>
           <w:rFonts w:eastAsia="Times New Roman" w:cstheme="minorHAnsi"/>
@@ -5027,68 +4779,27 @@
         <w:rPr>
           <w:rFonts w:cstheme="minorHAnsi"/>
         </w:rPr>
-        <w:t>Lizenz</w:t>
-      </w:r>
-    </w:p>
-    <w:p>
-      <w:pPr>
-        <w:rPr>
-          <w:rFonts w:cstheme="minorHAnsi"/>
-        </w:rPr>
-      </w:pPr>
-    </w:p>
-    <w:p>
-      <w:pPr>
-        <w:rPr>
-          <w:rFonts w:cstheme="minorHAnsi"/>
-        </w:rPr>
-      </w:pPr>
-    </w:p>
-    <w:p>
-      <w:pPr>
-        <w:rPr>
-          <w:rFonts w:cstheme="minorHAnsi"/>
-        </w:rPr>
-      </w:pPr>
-    </w:p>
-    <w:p>
-      <w:pPr>
-        <w:rPr>
-          <w:rFonts w:cstheme="minorHAnsi"/>
-        </w:rPr>
-      </w:pPr>
-    </w:p>
-    <w:p>
-      <w:pPr>
-        <w:rPr>
-          <w:rFonts w:cstheme="minorHAnsi"/>
-        </w:rPr>
-      </w:pPr>
-    </w:p>
-    <w:p>
-      <w:pPr>
-        <w:rPr>
-          <w:rFonts w:cstheme="minorHAnsi"/>
-        </w:rPr>
-      </w:pPr>
-    </w:p>
-    <w:p/>
-    <w:p>
-      <w:r>
+        <w:t>Echtzeitfähigkeit</w:t>
+      </w:r>
+    </w:p>
+    <w:p>
+      <w:r>
+        <w:br w:type="page"/>
+      </w:r>
+    </w:p>
+    <w:p>
+      <w:r>
+        <w:lastRenderedPageBreak/>
         <w:t>Für die Entscheidungsmatrix wird folgendes Template verwendet:</w:t>
       </w:r>
     </w:p>
     <w:p>
       <w:r>
-        <w:rPr>
-          <w:noProof/>
-        </w:rPr>
-        <w:lastRenderedPageBreak/>
         <w:drawing>
-          <wp:inline distT="0" distB="0" distL="0" distR="0" wp14:anchorId="757690D7" wp14:editId="609F7354">
-            <wp:extent cx="5760720" cy="3414395"/>
+          <wp:inline distT="0" distB="0" distL="0" distR="0" wp14:anchorId="2E134255" wp14:editId="7FC3B1E3">
+            <wp:extent cx="5760720" cy="2712085"/>
             <wp:effectExtent l="0" t="0" r="0" b="0"/>
-            <wp:docPr id="7" name="Grafik 7"/>
+            <wp:docPr id="2144567607" name="Grafik 1"/>
             <wp:cNvGraphicFramePr>
               <a:graphicFrameLocks xmlns:a="http://schemas.openxmlformats.org/drawingml/2006/main" noChangeAspect="1"/>
             </wp:cNvGraphicFramePr>
@@ -5096,7 +4807,7 @@
               <a:graphicData uri="http://schemas.openxmlformats.org/drawingml/2006/picture">
                 <pic:pic xmlns:pic="http://schemas.openxmlformats.org/drawingml/2006/picture">
                   <pic:nvPicPr>
-                    <pic:cNvPr id="1" name=""/>
+                    <pic:cNvPr id="2144567607" name=""/>
                     <pic:cNvPicPr/>
                   </pic:nvPicPr>
                   <pic:blipFill>
@@ -5108,7 +4819,7 @@
                   <pic:spPr>
                     <a:xfrm>
                       <a:off x="0" y="0"/>
-                      <a:ext cx="5760720" cy="3414395"/>
+                      <a:ext cx="5760720" cy="2712085"/>
                     </a:xfrm>
                     <a:prstGeom prst="rect">
                       <a:avLst/>
@@ -5182,29 +4893,13 @@
         </w:rPr>
       </w:pPr>
       <w:bookmarkStart w:id="27" w:name="_Toc228369953"/>
-      <w:proofErr w:type="spellStart"/>
       <w:r>
         <w:rPr>
           <w:lang w:val="en-US"/>
         </w:rPr>
-        <w:t>Verifizierung</w:t>
-      </w:r>
-      <w:proofErr w:type="spellEnd"/>
-      <w:r>
-        <w:rPr>
-          <w:lang w:val="en-US"/>
-        </w:rPr>
-        <w:t xml:space="preserve"> und </w:t>
-      </w:r>
-      <w:proofErr w:type="spellStart"/>
-      <w:r>
-        <w:rPr>
-          <w:lang w:val="en-US"/>
-        </w:rPr>
-        <w:t>Validierung</w:t>
+        <w:t>Verifizierung und Validierung</w:t>
       </w:r>
       <w:bookmarkEnd w:id="27"/>
-      <w:proofErr w:type="spellEnd"/>
     </w:p>
     <w:p>
       <w:pPr>
@@ -5222,31 +4917,27 @@
       </w:pPr>
       <w:bookmarkStart w:id="28" w:name="_Toc165127836"/>
       <w:bookmarkStart w:id="29" w:name="_Toc228369954"/>
-      <w:proofErr w:type="spellStart"/>
       <w:r>
         <w:rPr>
           <w:lang w:val="en-US"/>
         </w:rPr>
-        <w:t>Formelle</w:t>
-      </w:r>
-      <w:proofErr w:type="spellEnd"/>
-      <w:r>
-        <w:rPr>
-          <w:lang w:val="en-US"/>
-        </w:rPr>
-        <w:t xml:space="preserve"> Test Cases</w:t>
+        <w:t>Formelle Test Cases</w:t>
       </w:r>
       <w:bookmarkEnd w:id="28"/>
       <w:bookmarkEnd w:id="29"/>
     </w:p>
     <w:p>
-      <w:proofErr w:type="gramStart"/>
-      <w:r>
-        <w:t>Test Cases</w:t>
-      </w:r>
-      <w:proofErr w:type="gramEnd"/>
-      <w:r>
-        <w:t xml:space="preserve"> werden aus den Anforderungen abgeleitet und mit diesen verknüpft.</w:t>
+      <w:r>
+        <w:t>Es</w:t>
+      </w:r>
+      <w:r>
+        <w:t xml:space="preserve"> werden</w:t>
+      </w:r>
+      <w:r>
+        <w:t xml:space="preserve"> sechs Test-Cases</w:t>
+      </w:r>
+      <w:r>
+        <w:t xml:space="preserve"> aus den Anforderungen abgeleitet und mit diesen verknüpft.</w:t>
       </w:r>
       <w:r>
         <w:br/>
@@ -5299,11 +4990,9 @@
       <w:r>
         <w:t xml:space="preserve">Die Dokumentation der </w:t>
       </w:r>
-      <w:proofErr w:type="gramStart"/>
-      <w:r>
-        <w:t>Test Cases</w:t>
-      </w:r>
-      <w:proofErr w:type="gramEnd"/>
+      <w:r>
+        <w:t>Test-Cases</w:t>
+      </w:r>
       <w:r>
         <w:t xml:space="preserve"> erfolgt in der Excel-Tabelle „Stories_Req_Design_Test_Template.xlsx“.</w:t>
       </w:r>
@@ -5459,19 +5148,11 @@
                 <w:lang w:val="en-US"/>
               </w:rPr>
             </w:pPr>
-            <w:proofErr w:type="spellStart"/>
-            <w:r>
-              <w:rPr>
-                <w:lang w:val="en-US"/>
-              </w:rPr>
-              <w:t>Github</w:t>
-            </w:r>
-            <w:proofErr w:type="spellEnd"/>
-            <w:r>
-              <w:rPr>
-                <w:lang w:val="en-US"/>
-              </w:rPr>
-              <w:t xml:space="preserve"> Sprints</w:t>
+            <w:r>
+              <w:rPr>
+                <w:lang w:val="en-US"/>
+              </w:rPr>
+              <w:t>Github Sprints</w:t>
             </w:r>
           </w:p>
         </w:tc>
@@ -5598,10 +5279,10 @@
                   <v:path o:extrusionok="f" gradientshapeok="t" o:connecttype="rect"/>
                   <o:lock v:ext="edit" aspectratio="t"/>
                 </v:shapetype>
-                <v:shape id="_x0000_i1028" type="#_x0000_t75" style="width:75.5pt;height:49pt" o:ole="">
+                <v:shape id="_x0000_i1025" type="#_x0000_t75" style="width:75.5pt;height:49pt" o:ole="">
                   <v:imagedata r:id="rId17" o:title=""/>
                 </v:shape>
-                <o:OLEObject Type="Embed" ProgID="Excel.Sheet.12" ShapeID="_x0000_i1028" DrawAspect="Icon" ObjectID="_1838983271" r:id="rId18"/>
+                <o:OLEObject Type="Embed" ProgID="Excel.Sheet.12" ShapeID="_x0000_i1025" DrawAspect="Icon" ObjectID="_1841378596" r:id="rId18"/>
               </w:object>
             </w:r>
           </w:p>
@@ -5660,7 +5341,6 @@
                 <w:lang w:val="en-US"/>
               </w:rPr>
             </w:pPr>
-            <w:proofErr w:type="spellStart"/>
             <w:r>
               <w:rPr>
                 <w:rFonts w:eastAsia="Times New Roman" w:cstheme="minorHAnsi"/>
@@ -5668,7 +5348,6 @@
               </w:rPr>
               <w:t>Lucidchart</w:t>
             </w:r>
-            <w:proofErr w:type="spellEnd"/>
           </w:p>
         </w:tc>
         <w:tc>
@@ -6459,13 +6138,8 @@
                 <w:lang w:val="en-US"/>
               </w:rPr>
             </w:pPr>
-            <w:proofErr w:type="spellStart"/>
-            <w:r>
-              <w:t>Scrum</w:t>
-            </w:r>
-            <w:proofErr w:type="spellEnd"/>
-            <w:r>
-              <w:t xml:space="preserve"> Master</w:t>
+            <w:r>
+              <w:t>Scrum Master</w:t>
             </w:r>
           </w:p>
         </w:tc>
@@ -6565,15 +6239,7 @@
               </w:rPr>
             </w:pPr>
             <w:r>
-              <w:t xml:space="preserve">Testingenieur, </w:t>
-            </w:r>
-            <w:proofErr w:type="spellStart"/>
-            <w:r>
-              <w:t>Product</w:t>
-            </w:r>
-            <w:proofErr w:type="spellEnd"/>
-            <w:r>
-              <w:t xml:space="preserve"> Owner</w:t>
+              <w:t>Testingenieur, Product Owner</w:t>
             </w:r>
           </w:p>
         </w:tc>
@@ -6878,7 +6544,7 @@
       </w:sdtPr>
       <w:sdtContent>
         <w:r>
-          <w:t>Version: 4.0</w:t>
+          <w:t>Version: 5.0</w:t>
         </w:r>
       </w:sdtContent>
     </w:sdt>
@@ -8600,6 +8266,7 @@
   <w:style w:type="character" w:default="1" w:styleId="Absatz-Standardschriftart">
     <w:name w:val="Default Paragraph Font"/>
     <w:uiPriority w:val="1"/>
+    <w:semiHidden/>
     <w:unhideWhenUsed/>
   </w:style>
   <w:style w:type="table" w:default="1" w:styleId="NormaleTabelle">
@@ -9114,10 +8781,13 @@
     <w:rsid w:val="001708DF"/>
     <w:rsid w:val="0022503B"/>
     <w:rsid w:val="00285192"/>
+    <w:rsid w:val="003A3048"/>
     <w:rsid w:val="003E7898"/>
     <w:rsid w:val="00494141"/>
+    <w:rsid w:val="004C1C0F"/>
     <w:rsid w:val="004F715D"/>
     <w:rsid w:val="005543CF"/>
+    <w:rsid w:val="00663E13"/>
     <w:rsid w:val="00835503"/>
     <w:rsid w:val="0089440F"/>
     <w:rsid w:val="00996D87"/>
@@ -9126,6 +8796,7 @@
     <w:rsid w:val="009D51D8"/>
     <w:rsid w:val="00A16EBD"/>
     <w:rsid w:val="00A50927"/>
+    <w:rsid w:val="00A755B2"/>
     <w:rsid w:val="00B02220"/>
     <w:rsid w:val="00B023D0"/>
     <w:rsid w:val="00BF3C5B"/>

</xml_diff>

<commit_message>
Entwicklungsplan - Architektur überarbeitet
</commit_message>
<xml_diff>
--- a/doc/Gruppe1_Audio_BPM_Erkennung_Entwicklungsplan.docx
+++ b/doc/Gruppe1_Audio_BPM_Erkennung_Entwicklungsplan.docx
@@ -57,6 +57,7 @@
         </w:rPr>
         <w:t xml:space="preserve">Audio BPM </w:t>
       </w:r>
+      <w:proofErr w:type="spellStart"/>
       <w:r>
         <w:rPr>
           <w:sz w:val="52"/>
@@ -65,6 +66,7 @@
         </w:rPr>
         <w:t>Erkennung</w:t>
       </w:r>
+      <w:proofErr w:type="spellEnd"/>
     </w:p>
     <w:p>
       <w:pPr>
@@ -2015,11 +2017,21 @@
         <w:pStyle w:val="berschrift1"/>
       </w:pPr>
       <w:bookmarkStart w:id="0" w:name="_Toc232489591"/>
+      <w:proofErr w:type="spellStart"/>
       <w:r>
         <w:lastRenderedPageBreak/>
-        <w:t>Document History</w:t>
+        <w:t>Document</w:t>
+      </w:r>
+      <w:proofErr w:type="spellEnd"/>
+      <w:r>
+        <w:t xml:space="preserve"> </w:t>
+      </w:r>
+      <w:proofErr w:type="spellStart"/>
+      <w:r>
+        <w:t>History</w:t>
       </w:r>
       <w:bookmarkEnd w:id="0"/>
+      <w:proofErr w:type="spellEnd"/>
     </w:p>
     <w:p/>
     <w:tbl>
@@ -2059,9 +2071,11 @@
             <w:tcW w:w="6232" w:type="dxa"/>
           </w:tcPr>
           <w:p>
+            <w:proofErr w:type="spellStart"/>
             <w:r>
               <w:t>Changes</w:t>
             </w:r>
+            <w:proofErr w:type="spellEnd"/>
           </w:p>
         </w:tc>
       </w:tr>
@@ -2324,7 +2338,31 @@
           </w:tcPr>
           <w:p>
             <w:r>
-              <w:t>Veränderung des Kapitel „Scrum//Sprints“ und „Anforderungsmanagment“</w:t>
+              <w:t xml:space="preserve">Veränderung </w:t>
+            </w:r>
+            <w:proofErr w:type="gramStart"/>
+            <w:r>
+              <w:t>des Kapitel</w:t>
+            </w:r>
+            <w:proofErr w:type="gramEnd"/>
+            <w:r>
+              <w:t xml:space="preserve"> „</w:t>
+            </w:r>
+            <w:proofErr w:type="spellStart"/>
+            <w:r>
+              <w:t>Scrum</w:t>
+            </w:r>
+            <w:proofErr w:type="spellEnd"/>
+            <w:r>
+              <w:t>//Sprints“ und „</w:t>
+            </w:r>
+            <w:proofErr w:type="spellStart"/>
+            <w:r>
+              <w:t>Anforderungsmanagment</w:t>
+            </w:r>
+            <w:proofErr w:type="spellEnd"/>
+            <w:r>
+              <w:t>“</w:t>
             </w:r>
           </w:p>
         </w:tc>
@@ -2337,9 +2375,14 @@
       </w:pPr>
       <w:bookmarkStart w:id="1" w:name="_Toc232489592"/>
       <w:r>
-        <w:t>Template History</w:t>
+        <w:t xml:space="preserve">Template </w:t>
+      </w:r>
+      <w:proofErr w:type="spellStart"/>
+      <w:r>
+        <w:t>History</w:t>
       </w:r>
       <w:bookmarkEnd w:id="1"/>
+      <w:proofErr w:type="spellEnd"/>
     </w:p>
     <w:p/>
     <w:tbl>
@@ -2379,9 +2422,11 @@
             <w:tcW w:w="6232" w:type="dxa"/>
           </w:tcPr>
           <w:p>
+            <w:proofErr w:type="spellStart"/>
             <w:r>
               <w:t>Changes</w:t>
             </w:r>
+            <w:proofErr w:type="spellEnd"/>
           </w:p>
         </w:tc>
       </w:tr>
@@ -2498,6 +2543,7 @@
         </w:rPr>
       </w:pPr>
       <w:bookmarkStart w:id="3" w:name="_Toc232489594"/>
+      <w:proofErr w:type="spellStart"/>
       <w:r>
         <w:rPr>
           <w:lang w:val="en-US"/>
@@ -2505,6 +2551,7 @@
         <w:t>Umfang</w:t>
       </w:r>
       <w:bookmarkEnd w:id="3"/>
+      <w:proofErr w:type="spellEnd"/>
     </w:p>
     <w:p>
       <w:r>
@@ -2598,12 +2645,21 @@
           <w:numId w:val="11"/>
         </w:numPr>
       </w:pPr>
+      <w:proofErr w:type="spellStart"/>
       <w:r>
         <w:rPr>
           <w:b/>
           <w:bCs/>
         </w:rPr>
-        <w:t>Traceability:</w:t>
+        <w:t>Traceability</w:t>
+      </w:r>
+      <w:proofErr w:type="spellEnd"/>
+      <w:r>
+        <w:rPr>
+          <w:b/>
+          <w:bCs/>
+        </w:rPr>
+        <w:t>:</w:t>
       </w:r>
       <w:r>
         <w:t xml:space="preserve"> Dokumentation einer lückenlosen Nachverfolgbarkeit (100%) über alle oben genannten Phasen hinweg.</w:t>
@@ -2647,6 +2703,7 @@
         </w:rPr>
       </w:pPr>
       <w:bookmarkStart w:id="4" w:name="_Toc232489595"/>
+      <w:proofErr w:type="spellStart"/>
       <w:r>
         <w:rPr>
           <w:lang w:val="en-US"/>
@@ -2663,9 +2720,24 @@
         <w:rPr>
           <w:lang w:val="en-US"/>
         </w:rPr>
-        <w:t>ation des Projektes</w:t>
+        <w:t>ation</w:t>
+      </w:r>
+      <w:proofErr w:type="spellEnd"/>
+      <w:r>
+        <w:rPr>
+          <w:lang w:val="en-US"/>
+        </w:rPr>
+        <w:t xml:space="preserve"> des </w:t>
+      </w:r>
+      <w:proofErr w:type="spellStart"/>
+      <w:r>
+        <w:rPr>
+          <w:lang w:val="en-US"/>
+        </w:rPr>
+        <w:t>Projektes</w:t>
       </w:r>
       <w:bookmarkEnd w:id="4"/>
+      <w:proofErr w:type="spellEnd"/>
     </w:p>
     <w:p>
       <w:pPr>
@@ -2676,7 +2748,15 @@
     </w:p>
     <w:p>
       <w:r>
-        <w:t>Das Projekt wird die agile Methode Scrum für die Entwicklung verwenden.</w:t>
+        <w:t xml:space="preserve">Das Projekt wird die agile Methode </w:t>
+      </w:r>
+      <w:proofErr w:type="spellStart"/>
+      <w:r>
+        <w:t>Scrum</w:t>
+      </w:r>
+      <w:proofErr w:type="spellEnd"/>
+      <w:r>
+        <w:t xml:space="preserve"> für die Entwicklung verwenden.</w:t>
       </w:r>
     </w:p>
     <w:p>
@@ -2693,7 +2773,15 @@
     </w:p>
     <w:p>
       <w:r>
-        <w:t>Das Team besteht aus folgenden Mitgliedern mit den entsprechenden Rollen und Verantwortlichkeiten:</w:t>
+        <w:t xml:space="preserve">Das Team besteht </w:t>
+      </w:r>
+      <w:proofErr w:type="gramStart"/>
+      <w:r>
+        <w:t>aus folgenden</w:t>
+      </w:r>
+      <w:proofErr w:type="gramEnd"/>
+      <w:r>
+        <w:t xml:space="preserve"> Mitgliedern mit den entsprechenden Rollen und Verantwortlichkeiten:</w:t>
       </w:r>
     </w:p>
     <w:tbl>
@@ -2790,8 +2878,13 @@
             <w:hideMark/>
           </w:tcPr>
           <w:p>
-            <w:r>
-              <w:t>Scrum Master</w:t>
+            <w:proofErr w:type="spellStart"/>
+            <w:r>
+              <w:t>Scrum</w:t>
+            </w:r>
+            <w:proofErr w:type="spellEnd"/>
+            <w:r>
+              <w:t xml:space="preserve"> Master</w:t>
             </w:r>
           </w:p>
         </w:tc>
@@ -2916,8 +3009,13 @@
             <w:r>
               <w:t xml:space="preserve">Testingenieur, </w:t>
             </w:r>
-            <w:r>
-              <w:t>Product Owner</w:t>
+            <w:proofErr w:type="spellStart"/>
+            <w:r>
+              <w:t>Product</w:t>
+            </w:r>
+            <w:proofErr w:type="spellEnd"/>
+            <w:r>
+              <w:t xml:space="preserve"> Owner</w:t>
             </w:r>
           </w:p>
         </w:tc>
@@ -3130,36 +3228,43 @@
         <w:t>statt. In diesem Rahmen werden die Sprintziele</w:t>
       </w:r>
       <w:r>
+        <w:t xml:space="preserve"> in „</w:t>
+      </w:r>
+      <w:r>
+        <w:t>Sprintziele</w:t>
+      </w:r>
+      <w:r>
+        <w:t>.xlsx“</w:t>
+      </w:r>
+      <w:r>
+        <w:t xml:space="preserve"> definiert, die effektive Kapazität der einzelnen Teammitglieder festgelegt sowie die geplanten Aktivitäten und die entsprechende „Definition </w:t>
+      </w:r>
+      <w:proofErr w:type="spellStart"/>
+      <w:r>
+        <w:t>of</w:t>
+      </w:r>
+      <w:proofErr w:type="spellEnd"/>
+      <w:r>
+        <w:t xml:space="preserve"> Done“ bestimmt</w:t>
+      </w:r>
+      <w:r>
+        <w:t xml:space="preserve">. </w:t>
+      </w:r>
+      <w:r>
+        <w:t>Zur Nachverfolgbarkeit wird ein iteratives Burn-</w:t>
+      </w:r>
+      <w:proofErr w:type="spellStart"/>
+      <w:r>
+        <w:t>up</w:t>
+      </w:r>
+      <w:proofErr w:type="spellEnd"/>
+      <w:r>
+        <w:t>-Chart eingesetzt. Dabei entwickelt sich die Anzahl der abgeschlossenen Tasks entlang der geplanten Tasks, die im Projektverlauf dynamisch erweitert</w:t>
+      </w:r>
+      <w:r>
         <w:t xml:space="preserve"> </w:t>
       </w:r>
       <w:r>
-        <w:t xml:space="preserve">in </w:t>
-      </w:r>
-      <w:r>
-        <w:t>„</w:t>
-      </w:r>
-      <w:r>
-        <w:t>Sprintziele</w:t>
-      </w:r>
-      <w:r>
-        <w:t>.xlsx</w:t>
-      </w:r>
-      <w:r>
-        <w:t>“</w:t>
-      </w:r>
-      <w:r>
-        <w:t xml:space="preserve"> definiert, die effektive Kapazität der einzelnen Teammitglieder festgelegt sowie die geplanten Aktivitäten und die entsprechende „Definition of Done“ bestimmt</w:t>
-      </w:r>
-      <w:r>
-        <w:t xml:space="preserve">. </w:t>
-      </w:r>
-      <w:r>
-        <w:t>Zur Nachverfolgbarkeit wird ein iteratives Burn-up-Chart eingesetzt. Dabei entwickelt sich die Anzahl der abgeschlossenen Tasks entlang der geplanten Tasks, die im Projektverlauf dynamisch erweitert</w:t>
-      </w:r>
-      <w:r>
-        <w:t xml:space="preserve"> </w:t>
-      </w:r>
-      <w:r>
         <w:t>werden.</w:t>
       </w:r>
     </w:p>
@@ -3171,12 +3276,28 @@
     </w:p>
     <w:p>
       <w:r>
-        <w:t>Der amtierende Scrum Master berichtet an Herrn Pagliarulo, falls Blocker auftreten, die nicht innerhalb des Teams gelöst werden können.</w:t>
-      </w:r>
-    </w:p>
-    <w:p>
-      <w:r>
-        <w:t>Ein Sprint Review sowie eine Sprint Retrospektive finden am letzten Donnerstag des Sprints statt. Im Sprint Review werden dem Product Owner und anderen Gruppen die erzielten Ergebnisse präsentiert. Aus der Retrospektive werden Maßnahmen zur Verbesserung für die kommenden Sprints abgeleitet.</w:t>
+        <w:t xml:space="preserve">Der amtierende </w:t>
+      </w:r>
+      <w:proofErr w:type="spellStart"/>
+      <w:r>
+        <w:t>Scrum</w:t>
+      </w:r>
+      <w:proofErr w:type="spellEnd"/>
+      <w:r>
+        <w:t xml:space="preserve"> Master berichtet an Herrn Pagliarulo, falls Blocker auftreten, die nicht innerhalb des Teams gelöst werden können.</w:t>
+      </w:r>
+    </w:p>
+    <w:p>
+      <w:r>
+        <w:t xml:space="preserve">Ein Sprint Review sowie eine Sprint Retrospektive finden am letzten Donnerstag des Sprints statt. Im Sprint Review werden dem </w:t>
+      </w:r>
+      <w:proofErr w:type="spellStart"/>
+      <w:r>
+        <w:t>Product</w:t>
+      </w:r>
+      <w:proofErr w:type="spellEnd"/>
+      <w:r>
+        <w:t xml:space="preserve"> Owner und anderen Gruppen die erzielten Ergebnisse präsentiert. Aus der Retrospektive werden Maßnahmen zur Verbesserung für die kommenden Sprints abgeleitet.</w:t>
       </w:r>
       <w:r>
         <w:t xml:space="preserve"> </w:t>
@@ -3228,11 +3349,32 @@
         <w:t>Das Board ist in mehrere Spalten unterteilt, die den jeweiligen Bearbeitungsstatus widerspiegeln</w:t>
       </w:r>
       <w:r>
-        <w:t xml:space="preserve"> (Backlog, Requirements Definition, Architecture Design, Implementation, Verification, Done</w:t>
-      </w:r>
-      <w:r>
-        <w:t>, Sprint Planning</w:t>
-      </w:r>
+        <w:t xml:space="preserve"> (Backlog, </w:t>
+      </w:r>
+      <w:proofErr w:type="spellStart"/>
+      <w:r>
+        <w:t>Requirements</w:t>
+      </w:r>
+      <w:proofErr w:type="spellEnd"/>
+      <w:r>
+        <w:t xml:space="preserve"> Definition, Architecture Design, Implementation, </w:t>
+      </w:r>
+      <w:proofErr w:type="spellStart"/>
+      <w:r>
+        <w:t>Verification</w:t>
+      </w:r>
+      <w:proofErr w:type="spellEnd"/>
+      <w:r>
+        <w:t>, Done</w:t>
+      </w:r>
+      <w:r>
+        <w:t xml:space="preserve">, Sprint </w:t>
+      </w:r>
+      <w:proofErr w:type="spellStart"/>
+      <w:r>
+        <w:t>Planning</w:t>
+      </w:r>
+      <w:proofErr w:type="spellEnd"/>
       <w:r>
         <w:t>).</w:t>
       </w:r>
@@ -3315,7 +3457,15 @@
         <w:t xml:space="preserve"> Kanban Board wird </w:t>
       </w:r>
       <w:r>
-        <w:t>mit der Project Funktion von Github erstellt.</w:t>
+        <w:t xml:space="preserve">mit der Project Funktion von </w:t>
+      </w:r>
+      <w:proofErr w:type="spellStart"/>
+      <w:r>
+        <w:t>Github</w:t>
+      </w:r>
+      <w:proofErr w:type="spellEnd"/>
+      <w:r>
+        <w:t xml:space="preserve"> erstellt.</w:t>
       </w:r>
     </w:p>
     <w:p/>
@@ -3358,10 +3508,26 @@
     </w:p>
     <w:p>
       <w:r>
-        <w:t xml:space="preserve">GitHub wird ebenso als Versionierungsprogramm </w:t>
-      </w:r>
-      <w:r>
-        <w:t xml:space="preserve">(Git) </w:t>
+        <w:t xml:space="preserve">GitHub wird ebenso als </w:t>
+      </w:r>
+      <w:proofErr w:type="spellStart"/>
+      <w:r>
+        <w:t>Versionierungsprogramm</w:t>
+      </w:r>
+      <w:proofErr w:type="spellEnd"/>
+      <w:r>
+        <w:t xml:space="preserve"> </w:t>
+      </w:r>
+      <w:r>
+        <w:t>(</w:t>
+      </w:r>
+      <w:proofErr w:type="spellStart"/>
+      <w:r>
+        <w:t>Git</w:t>
+      </w:r>
+      <w:proofErr w:type="spellEnd"/>
+      <w:r>
+        <w:t xml:space="preserve">) </w:t>
       </w:r>
       <w:r>
         <w:t>verwendet.</w:t>
@@ -3375,13 +3541,29 @@
         </w:rPr>
       </w:pPr>
       <w:bookmarkStart w:id="13" w:name="_Toc232489600"/>
+      <w:proofErr w:type="spellStart"/>
       <w:r>
         <w:rPr>
           <w:lang w:val="en-US"/>
         </w:rPr>
-        <w:t>Anwendung &amp; Ziele</w:t>
+        <w:t>Anwendung</w:t>
+      </w:r>
+      <w:proofErr w:type="spellEnd"/>
+      <w:r>
+        <w:rPr>
+          <w:lang w:val="en-US"/>
+        </w:rPr>
+        <w:t xml:space="preserve"> &amp; </w:t>
+      </w:r>
+      <w:proofErr w:type="spellStart"/>
+      <w:r>
+        <w:rPr>
+          <w:lang w:val="en-US"/>
+        </w:rPr>
+        <w:t>Ziele</w:t>
       </w:r>
       <w:bookmarkEnd w:id="13"/>
+      <w:proofErr w:type="spellEnd"/>
     </w:p>
     <w:p>
       <w:pPr>
@@ -3562,7 +3744,15 @@
           </w:tcPr>
           <w:p>
             <w:r>
-              <w:t>User Stories reviewed und freigegeben</w:t>
+              <w:t xml:space="preserve">User Stories </w:t>
+            </w:r>
+            <w:proofErr w:type="spellStart"/>
+            <w:r>
+              <w:t>reviewed</w:t>
+            </w:r>
+            <w:proofErr w:type="spellEnd"/>
+            <w:r>
+              <w:t xml:space="preserve"> und freigegeben</w:t>
             </w:r>
           </w:p>
         </w:tc>
@@ -3597,8 +3787,21 @@
               </w:rPr>
             </w:pPr>
             <w:r>
-              <w:t>100% reviewed &amp; approved</w:t>
-            </w:r>
+              <w:t xml:space="preserve">100% </w:t>
+            </w:r>
+            <w:proofErr w:type="spellStart"/>
+            <w:r>
+              <w:t>reviewed</w:t>
+            </w:r>
+            <w:proofErr w:type="spellEnd"/>
+            <w:r>
+              <w:t xml:space="preserve"> &amp; </w:t>
+            </w:r>
+            <w:proofErr w:type="spellStart"/>
+            <w:r>
+              <w:t>approved</w:t>
+            </w:r>
+            <w:proofErr w:type="spellEnd"/>
           </w:p>
         </w:tc>
       </w:tr>
@@ -3648,12 +3851,28 @@
                 <w:lang w:val="en-US"/>
               </w:rPr>
             </w:pPr>
-            <w:r>
-              <w:rPr>
-                <w:lang w:val="en-US"/>
-              </w:rPr>
-              <w:t>Architektur-Doku freigegeben</w:t>
-            </w:r>
+            <w:proofErr w:type="spellStart"/>
+            <w:r>
+              <w:rPr>
+                <w:lang w:val="en-US"/>
+              </w:rPr>
+              <w:t>Architektur</w:t>
+            </w:r>
+            <w:proofErr w:type="spellEnd"/>
+            <w:r>
+              <w:rPr>
+                <w:lang w:val="en-US"/>
+              </w:rPr>
+              <w:t xml:space="preserve">-Doku </w:t>
+            </w:r>
+            <w:proofErr w:type="spellStart"/>
+            <w:r>
+              <w:rPr>
+                <w:lang w:val="en-US"/>
+              </w:rPr>
+              <w:t>freigegeben</w:t>
+            </w:r>
+            <w:proofErr w:type="spellEnd"/>
           </w:p>
         </w:tc>
       </w:tr>
@@ -3695,11 +3914,19 @@
                 <w:lang w:val="en-US"/>
               </w:rPr>
             </w:pPr>
-            <w:r>
-              <w:rPr>
-                <w:lang w:val="en-US"/>
-              </w:rPr>
-              <w:t>abgeschlossene Stories</w:t>
+            <w:proofErr w:type="spellStart"/>
+            <w:r>
+              <w:rPr>
+                <w:lang w:val="en-US"/>
+              </w:rPr>
+              <w:t>abgeschlossene</w:t>
+            </w:r>
+            <w:proofErr w:type="spellEnd"/>
+            <w:r>
+              <w:rPr>
+                <w:lang w:val="en-US"/>
+              </w:rPr>
+              <w:t xml:space="preserve"> Stories</w:t>
             </w:r>
           </w:p>
         </w:tc>
@@ -3717,7 +3944,49 @@
               <w:rPr>
                 <w:lang w:val="en-US"/>
               </w:rPr>
-              <w:t>Alle Stories „Done“, keine kritischen Bugs</w:t>
+              <w:t>Alle Stories „</w:t>
+            </w:r>
+            <w:proofErr w:type="gramStart"/>
+            <w:r>
+              <w:rPr>
+                <w:lang w:val="en-US"/>
+              </w:rPr>
+              <w:t>Done“</w:t>
+            </w:r>
+            <w:proofErr w:type="gramEnd"/>
+            <w:r>
+              <w:rPr>
+                <w:lang w:val="en-US"/>
+              </w:rPr>
+              <w:t xml:space="preserve">, </w:t>
+            </w:r>
+            <w:proofErr w:type="spellStart"/>
+            <w:r>
+              <w:rPr>
+                <w:lang w:val="en-US"/>
+              </w:rPr>
+              <w:t>keine</w:t>
+            </w:r>
+            <w:proofErr w:type="spellEnd"/>
+            <w:r>
+              <w:rPr>
+                <w:lang w:val="en-US"/>
+              </w:rPr>
+              <w:t xml:space="preserve"> </w:t>
+            </w:r>
+            <w:proofErr w:type="spellStart"/>
+            <w:r>
+              <w:rPr>
+                <w:lang w:val="en-US"/>
+              </w:rPr>
+              <w:t>kritischen</w:t>
+            </w:r>
+            <w:proofErr w:type="spellEnd"/>
+            <w:r>
+              <w:rPr>
+                <w:lang w:val="en-US"/>
+              </w:rPr>
+              <w:t xml:space="preserve"> Bugs</w:t>
             </w:r>
           </w:p>
         </w:tc>
@@ -3754,6 +4023,7 @@
                 <w:lang w:val="en-US"/>
               </w:rPr>
             </w:pPr>
+            <w:proofErr w:type="spellStart"/>
             <w:r>
               <w:rPr>
                 <w:lang w:val="en-US"/>
@@ -3764,7 +4034,14 @@
               <w:rPr>
                 <w:lang w:val="en-US"/>
               </w:rPr>
-              <w:t>estandene Tests</w:t>
+              <w:t>estandene</w:t>
+            </w:r>
+            <w:proofErr w:type="spellEnd"/>
+            <w:r>
+              <w:rPr>
+                <w:lang w:val="en-US"/>
+              </w:rPr>
+              <w:t xml:space="preserve"> Tests</w:t>
             </w:r>
             <w:r>
               <w:rPr>
@@ -3788,8 +4065,16 @@
               <w:rPr>
                 <w:lang w:val="en-US"/>
               </w:rPr>
-              <w:t>≥95% Tests bestanden</w:t>
-            </w:r>
+              <w:t xml:space="preserve">≥95% Tests </w:t>
+            </w:r>
+            <w:proofErr w:type="spellStart"/>
+            <w:r>
+              <w:rPr>
+                <w:lang w:val="en-US"/>
+              </w:rPr>
+              <w:t>bestanden</w:t>
+            </w:r>
+            <w:proofErr w:type="spellEnd"/>
           </w:p>
         </w:tc>
       </w:tr>
@@ -3809,6 +4094,7 @@
         </w:rPr>
       </w:pPr>
       <w:bookmarkStart w:id="17" w:name="_Toc232489603"/>
+      <w:proofErr w:type="spellStart"/>
       <w:r>
         <w:rPr>
           <w:lang w:val="en-US"/>
@@ -3816,6 +4102,7 @@
         <w:t>Anforderungsmanagement</w:t>
       </w:r>
       <w:bookmarkEnd w:id="17"/>
+      <w:proofErr w:type="spellEnd"/>
     </w:p>
     <w:p>
       <w:pPr>
@@ -4069,16 +4356,7 @@
           <w:sz w:val="24"/>
           <w:szCs w:val="24"/>
         </w:rPr>
-        <w:t>&gt;</w:t>
-      </w:r>
-      <w:r>
-        <w:rPr>
-          <w:b/>
-          <w:bCs/>
-          <w:sz w:val="24"/>
-          <w:szCs w:val="24"/>
-        </w:rPr>
-        <w:t xml:space="preserve"> &lt;</w:t>
+        <w:t>&gt; &lt;</w:t>
       </w:r>
       <w:r>
         <w:rPr>
@@ -4282,8 +4560,13 @@
           </w:tcPr>
           <w:p>
             <w:r>
-              <w:t>TBD, in Review, Reviewed</w:t>
-            </w:r>
+              <w:t xml:space="preserve">TBD, in Review, </w:t>
+            </w:r>
+            <w:proofErr w:type="spellStart"/>
+            <w:r>
+              <w:t>Reviewed</w:t>
+            </w:r>
+            <w:proofErr w:type="spellEnd"/>
           </w:p>
         </w:tc>
       </w:tr>
@@ -4293,9 +4576,11 @@
             <w:tcW w:w="1250" w:type="dxa"/>
           </w:tcPr>
           <w:p>
+            <w:proofErr w:type="spellStart"/>
             <w:r>
               <w:t>Verification</w:t>
             </w:r>
+            <w:proofErr w:type="spellEnd"/>
           </w:p>
         </w:tc>
         <w:tc>
@@ -4347,7 +4632,15 @@
         <w:t xml:space="preserve"> </w:t>
       </w:r>
       <w:r>
-        <w:t>verwaltet. Die Nachverfolgbarkeit (Traceability) zwischen User Stories und Anforderungen wird ebenfalls in dieser Tabelle manuell gepflegt.</w:t>
+        <w:t>verwaltet. Die Nachverfolgbarkeit (</w:t>
+      </w:r>
+      <w:proofErr w:type="spellStart"/>
+      <w:r>
+        <w:t>Traceability</w:t>
+      </w:r>
+      <w:proofErr w:type="spellEnd"/>
+      <w:r>
+        <w:t>) zwischen User Stories und Anforderungen wird ebenfalls in dieser Tabelle manuell gepflegt.</w:t>
       </w:r>
     </w:p>
     <w:p>
@@ -4459,12 +4752,20 @@
         </w:rPr>
       </w:pPr>
       <w:bookmarkStart w:id="19" w:name="_Toc232489605"/>
+      <w:proofErr w:type="spellStart"/>
       <w:r>
         <w:rPr>
           <w:lang w:val="en-US"/>
         </w:rPr>
         <w:lastRenderedPageBreak/>
-        <w:t>Architektur &amp; Design</w:t>
+        <w:t>Architektur</w:t>
+      </w:r>
+      <w:proofErr w:type="spellEnd"/>
+      <w:r>
+        <w:rPr>
+          <w:lang w:val="en-US"/>
+        </w:rPr>
+        <w:t xml:space="preserve"> &amp; Design</w:t>
       </w:r>
       <w:bookmarkStart w:id="20" w:name="_Toc165127832"/>
       <w:bookmarkEnd w:id="19"/>
@@ -4556,34 +4857,50 @@
           <w:rFonts w:eastAsia="Times New Roman" w:cstheme="minorHAnsi"/>
           <w:lang w:eastAsia="de-DE"/>
         </w:rPr>
-        <w:t>Die einzelnen Architekturelemente werden eindeutig benannt und gemäß folgender Namenskonvention identifiziert: &lt;ArchEl_x&gt;. Diese Identifikatoren dienen dazu, Anforderungen eindeutig mit den jeweiligen Architekturelementen zu verknüpfen. Die Zuordnung wird in der Excel-Datei „</w:t>
-      </w:r>
+        <w:t>Die einzelnen Architekturelemente werden eindeutig benannt und gemäß folgender Namenskonvention identifiziert: &lt;</w:t>
+      </w:r>
+      <w:proofErr w:type="spellStart"/>
       <w:r>
         <w:rPr>
           <w:rFonts w:eastAsia="Times New Roman" w:cstheme="minorHAnsi"/>
           <w:lang w:eastAsia="de-DE"/>
         </w:rPr>
-        <w:t>Stories_Req</w:t>
-      </w:r>
+        <w:t>ArchEl_x</w:t>
+      </w:r>
+      <w:proofErr w:type="spellEnd"/>
       <w:r>
         <w:rPr>
           <w:rFonts w:eastAsia="Times New Roman" w:cstheme="minorHAnsi"/>
           <w:lang w:eastAsia="de-DE"/>
         </w:rPr>
-        <w:t>_Design_Test_G1</w:t>
+        <w:t>&gt;. Diese Identifikatoren dienen dazu, Anforderungen eindeutig mit den jeweiligen Architekturelementen zu verknüpfen. Die Zuordnung wird in der Excel-Datei „</w:t>
       </w:r>
       <w:r>
         <w:rPr>
           <w:rFonts w:eastAsia="Times New Roman" w:cstheme="minorHAnsi"/>
           <w:lang w:eastAsia="de-DE"/>
         </w:rPr>
-        <w:t>.xlsx</w:t>
+        <w:t>Stories_Req</w:t>
       </w:r>
       <w:r>
         <w:rPr>
           <w:rFonts w:eastAsia="Times New Roman" w:cstheme="minorHAnsi"/>
           <w:lang w:eastAsia="de-DE"/>
         </w:rPr>
+        <w:t>_Design_Test_G1</w:t>
+      </w:r>
+      <w:r>
+        <w:rPr>
+          <w:rFonts w:eastAsia="Times New Roman" w:cstheme="minorHAnsi"/>
+          <w:lang w:eastAsia="de-DE"/>
+        </w:rPr>
+        <w:t>.xlsx</w:t>
+      </w:r>
+      <w:r>
+        <w:rPr>
+          <w:rFonts w:eastAsia="Times New Roman" w:cstheme="minorHAnsi"/>
+          <w:lang w:eastAsia="de-DE"/>
+        </w:rPr>
         <w:t>“ dokumentiert.</w:t>
       </w:r>
     </w:p>
@@ -4618,7 +4935,7 @@
           <w:rFonts w:eastAsia="Times New Roman" w:cstheme="minorHAnsi"/>
           <w:lang w:eastAsia="de-DE"/>
         </w:rPr>
-        <w:t>Für die Darstellung der Architektur wird die UML-Modellierungssprache verwendet. Dabei kommen folgende Diagrammtypen zum Einsatz:</w:t>
+        <w:t>Für die Darstellung der Architektur kommen folgende Diagrammtypen zum Einsatz:</w:t>
       </w:r>
     </w:p>
     <w:p>
@@ -4702,35 +5019,60 @@
           <w:rFonts w:eastAsia="Times New Roman" w:cstheme="minorHAnsi"/>
           <w:lang w:eastAsia="de-DE"/>
         </w:rPr>
-        <w:t>Die Erstellung der Diagramme erfolgt mit dem Tool „Lucidchart</w:t>
-      </w:r>
+        <w:t>Die Erstellung der Diagramme erfolgt mit dem Tool „</w:t>
+      </w:r>
+      <w:proofErr w:type="spellStart"/>
       <w:r>
         <w:rPr>
           <w:rFonts w:eastAsia="Times New Roman" w:cstheme="minorHAnsi"/>
           <w:lang w:eastAsia="de-DE"/>
         </w:rPr>
-        <w:t>“</w:t>
-      </w:r>
+        <w:t>Lucidchart</w:t>
+      </w:r>
+      <w:proofErr w:type="spellEnd"/>
       <w:r>
         <w:rPr>
           <w:rFonts w:eastAsia="Times New Roman" w:cstheme="minorHAnsi"/>
           <w:lang w:eastAsia="de-DE"/>
         </w:rPr>
-        <w:t xml:space="preserve"> [</w:t>
+        <w:t>“</w:t>
       </w:r>
       <w:r>
         <w:rPr>
           <w:rFonts w:eastAsia="Times New Roman" w:cstheme="minorHAnsi"/>
           <w:lang w:eastAsia="de-DE"/>
         </w:rPr>
-        <w:t>3]</w:t>
+        <w:t xml:space="preserve"> [</w:t>
       </w:r>
       <w:r>
         <w:rPr>
           <w:rFonts w:eastAsia="Times New Roman" w:cstheme="minorHAnsi"/>
           <w:lang w:eastAsia="de-DE"/>
         </w:rPr>
-        <w:t xml:space="preserve"> bzw. yEd [4]</w:t>
+        <w:t>3]</w:t>
+      </w:r>
+      <w:r>
+        <w:rPr>
+          <w:rFonts w:eastAsia="Times New Roman" w:cstheme="minorHAnsi"/>
+          <w:lang w:eastAsia="de-DE"/>
+        </w:rPr>
+        <w:t xml:space="preserve"> bzw. </w:t>
+      </w:r>
+      <w:proofErr w:type="spellStart"/>
+      <w:r>
+        <w:rPr>
+          <w:rFonts w:eastAsia="Times New Roman" w:cstheme="minorHAnsi"/>
+          <w:lang w:eastAsia="de-DE"/>
+        </w:rPr>
+        <w:t>yEd</w:t>
+      </w:r>
+      <w:proofErr w:type="spellEnd"/>
+      <w:r>
+        <w:rPr>
+          <w:rFonts w:eastAsia="Times New Roman" w:cstheme="minorHAnsi"/>
+          <w:lang w:eastAsia="de-DE"/>
+        </w:rPr>
+        <w:t xml:space="preserve"> [4]</w:t>
       </w:r>
       <w:r>
         <w:rPr>
@@ -5005,13 +5347,29 @@
         </w:rPr>
       </w:pPr>
       <w:bookmarkStart w:id="27" w:name="_Toc232489610"/>
+      <w:proofErr w:type="spellStart"/>
       <w:r>
         <w:rPr>
           <w:lang w:val="en-US"/>
         </w:rPr>
-        <w:t>Verifizierung und Validierung</w:t>
+        <w:t>Verifizierung</w:t>
+      </w:r>
+      <w:proofErr w:type="spellEnd"/>
+      <w:r>
+        <w:rPr>
+          <w:lang w:val="en-US"/>
+        </w:rPr>
+        <w:t xml:space="preserve"> und </w:t>
+      </w:r>
+      <w:proofErr w:type="spellStart"/>
+      <w:r>
+        <w:rPr>
+          <w:lang w:val="en-US"/>
+        </w:rPr>
+        <w:t>Validierung</w:t>
       </w:r>
       <w:bookmarkEnd w:id="27"/>
+      <w:proofErr w:type="spellEnd"/>
     </w:p>
     <w:p>
       <w:pPr>
@@ -5029,11 +5387,19 @@
       </w:pPr>
       <w:bookmarkStart w:id="28" w:name="_Toc165127836"/>
       <w:bookmarkStart w:id="29" w:name="_Toc232489611"/>
+      <w:proofErr w:type="spellStart"/>
       <w:r>
         <w:rPr>
           <w:lang w:val="en-US"/>
         </w:rPr>
-        <w:t>Formelle Test Cases</w:t>
+        <w:t>Formelle</w:t>
+      </w:r>
+      <w:proofErr w:type="spellEnd"/>
+      <w:r>
+        <w:rPr>
+          <w:lang w:val="en-US"/>
+        </w:rPr>
+        <w:t xml:space="preserve"> Test Cases</w:t>
       </w:r>
       <w:bookmarkEnd w:id="28"/>
       <w:bookmarkEnd w:id="29"/>
@@ -5290,11 +5656,19 @@
                 <w:lang w:val="en-US"/>
               </w:rPr>
             </w:pPr>
-            <w:r>
-              <w:rPr>
-                <w:lang w:val="en-US"/>
-              </w:rPr>
-              <w:t>Github Sprints</w:t>
+            <w:proofErr w:type="spellStart"/>
+            <w:r>
+              <w:rPr>
+                <w:lang w:val="en-US"/>
+              </w:rPr>
+              <w:t>Github</w:t>
+            </w:r>
+            <w:proofErr w:type="spellEnd"/>
+            <w:r>
+              <w:rPr>
+                <w:lang w:val="en-US"/>
+              </w:rPr>
+              <w:t xml:space="preserve"> Sprints</w:t>
             </w:r>
           </w:p>
         </w:tc>
@@ -5553,6 +5927,7 @@
                 <w:lang w:val="en-US"/>
               </w:rPr>
             </w:pPr>
+            <w:proofErr w:type="spellStart"/>
             <w:r>
               <w:rPr>
                 <w:rFonts w:eastAsia="Times New Roman" w:cstheme="minorHAnsi"/>
@@ -5560,6 +5935,7 @@
               </w:rPr>
               <w:t>Lucidchart</w:t>
             </w:r>
+            <w:proofErr w:type="spellEnd"/>
           </w:p>
         </w:tc>
         <w:tc>
@@ -5649,12 +6025,14 @@
                 <w:lang w:val="en-US"/>
               </w:rPr>
             </w:pPr>
+            <w:proofErr w:type="spellStart"/>
             <w:r>
               <w:rPr>
                 <w:lang w:val="en-US"/>
               </w:rPr>
               <w:t>yEd</w:t>
             </w:r>
+            <w:proofErr w:type="spellEnd"/>
           </w:p>
         </w:tc>
         <w:tc>
@@ -6389,8 +6767,13 @@
                 <w:lang w:val="en-US"/>
               </w:rPr>
             </w:pPr>
-            <w:r>
-              <w:t>Scrum Master</w:t>
+            <w:proofErr w:type="spellStart"/>
+            <w:r>
+              <w:t>Scrum</w:t>
+            </w:r>
+            <w:proofErr w:type="spellEnd"/>
+            <w:r>
+              <w:t xml:space="preserve"> Master</w:t>
             </w:r>
           </w:p>
         </w:tc>
@@ -6490,7 +6873,15 @@
               </w:rPr>
             </w:pPr>
             <w:r>
-              <w:t>Testingenieur, Product Owner</w:t>
+              <w:t xml:space="preserve">Testingenieur, </w:t>
+            </w:r>
+            <w:proofErr w:type="spellStart"/>
+            <w:r>
+              <w:t>Product</w:t>
+            </w:r>
+            <w:proofErr w:type="spellEnd"/>
+            <w:r>
+              <w:t xml:space="preserve"> Owner</w:t>
             </w:r>
           </w:p>
         </w:tc>
@@ -8517,6 +8908,7 @@
   <w:style w:type="character" w:default="1" w:styleId="Absatz-Standardschriftart">
     <w:name w:val="Default Paragraph Font"/>
     <w:uiPriority w:val="1"/>
+    <w:semiHidden/>
     <w:unhideWhenUsed/>
   </w:style>
   <w:style w:type="table" w:default="1" w:styleId="NormaleTabelle">
@@ -9040,6 +9432,7 @@
   </w:compat>
   <w:rsids>
     <w:rsidRoot w:val="00B02220"/>
+    <w:rsid w:val="00002DAE"/>
     <w:rsid w:val="000C4669"/>
     <w:rsid w:val="000D5D5D"/>
     <w:rsid w:val="000F7AE0"/>
@@ -9056,6 +9449,7 @@
     <w:rsid w:val="00494141"/>
     <w:rsid w:val="004C1C0F"/>
     <w:rsid w:val="004D295B"/>
+    <w:rsid w:val="004F1900"/>
     <w:rsid w:val="004F715D"/>
     <w:rsid w:val="004F7D21"/>
     <w:rsid w:val="005543CF"/>

</xml_diff>

<commit_message>
@David 4.1. im Entwicklungsplan ergänzt
</commit_message>
<xml_diff>
--- a/doc/Gruppe1_Audio_BPM_Erkennung_Entwicklungsplan.docx
+++ b/doc/Gruppe1_Audio_BPM_Erkennung_Entwicklungsplan.docx
@@ -57,7 +57,6 @@
         </w:rPr>
         <w:t xml:space="preserve">Audio BPM </w:t>
       </w:r>
-      <w:proofErr w:type="spellStart"/>
       <w:r>
         <w:rPr>
           <w:sz w:val="52"/>
@@ -66,7 +65,6 @@
         </w:rPr>
         <w:t>Erkennung</w:t>
       </w:r>
-      <w:proofErr w:type="spellEnd"/>
     </w:p>
     <w:p>
       <w:pPr>
@@ -2017,21 +2015,11 @@
         <w:pStyle w:val="berschrift1"/>
       </w:pPr>
       <w:bookmarkStart w:id="0" w:name="_Toc232489591"/>
-      <w:proofErr w:type="spellStart"/>
       <w:r>
         <w:lastRenderedPageBreak/>
-        <w:t>Document</w:t>
-      </w:r>
-      <w:proofErr w:type="spellEnd"/>
-      <w:r>
-        <w:t xml:space="preserve"> </w:t>
-      </w:r>
-      <w:proofErr w:type="spellStart"/>
-      <w:r>
-        <w:t>History</w:t>
+        <w:t>Document History</w:t>
       </w:r>
       <w:bookmarkEnd w:id="0"/>
-      <w:proofErr w:type="spellEnd"/>
     </w:p>
     <w:p/>
     <w:tbl>
@@ -2071,11 +2059,9 @@
             <w:tcW w:w="6232" w:type="dxa"/>
           </w:tcPr>
           <w:p>
-            <w:proofErr w:type="spellStart"/>
             <w:r>
               <w:t>Changes</w:t>
             </w:r>
-            <w:proofErr w:type="spellEnd"/>
           </w:p>
         </w:tc>
       </w:tr>
@@ -2338,31 +2324,7 @@
           </w:tcPr>
           <w:p>
             <w:r>
-              <w:t xml:space="preserve">Veränderung </w:t>
-            </w:r>
-            <w:proofErr w:type="gramStart"/>
-            <w:r>
-              <w:t>des Kapitel</w:t>
-            </w:r>
-            <w:proofErr w:type="gramEnd"/>
-            <w:r>
-              <w:t xml:space="preserve"> „</w:t>
-            </w:r>
-            <w:proofErr w:type="spellStart"/>
-            <w:r>
-              <w:t>Scrum</w:t>
-            </w:r>
-            <w:proofErr w:type="spellEnd"/>
-            <w:r>
-              <w:t>//Sprints“ und „</w:t>
-            </w:r>
-            <w:proofErr w:type="spellStart"/>
-            <w:r>
-              <w:t>Anforderungsmanagment</w:t>
-            </w:r>
-            <w:proofErr w:type="spellEnd"/>
-            <w:r>
-              <w:t>“</w:t>
+              <w:t>Veränderung des Kapitel „Scrum//Sprints“ und „Anforderungsmanagment“</w:t>
             </w:r>
           </w:p>
         </w:tc>
@@ -2375,14 +2337,9 @@
       </w:pPr>
       <w:bookmarkStart w:id="1" w:name="_Toc232489592"/>
       <w:r>
-        <w:t xml:space="preserve">Template </w:t>
-      </w:r>
-      <w:proofErr w:type="spellStart"/>
-      <w:r>
-        <w:t>History</w:t>
+        <w:t>Template History</w:t>
       </w:r>
       <w:bookmarkEnd w:id="1"/>
-      <w:proofErr w:type="spellEnd"/>
     </w:p>
     <w:p/>
     <w:tbl>
@@ -2422,11 +2379,9 @@
             <w:tcW w:w="6232" w:type="dxa"/>
           </w:tcPr>
           <w:p>
-            <w:proofErr w:type="spellStart"/>
             <w:r>
               <w:t>Changes</w:t>
             </w:r>
-            <w:proofErr w:type="spellEnd"/>
           </w:p>
         </w:tc>
       </w:tr>
@@ -2543,7 +2498,6 @@
         </w:rPr>
       </w:pPr>
       <w:bookmarkStart w:id="3" w:name="_Toc232489594"/>
-      <w:proofErr w:type="spellStart"/>
       <w:r>
         <w:rPr>
           <w:lang w:val="en-US"/>
@@ -2551,7 +2505,6 @@
         <w:t>Umfang</w:t>
       </w:r>
       <w:bookmarkEnd w:id="3"/>
-      <w:proofErr w:type="spellEnd"/>
     </w:p>
     <w:p>
       <w:r>
@@ -2645,21 +2598,12 @@
           <w:numId w:val="11"/>
         </w:numPr>
       </w:pPr>
-      <w:proofErr w:type="spellStart"/>
       <w:r>
         <w:rPr>
           <w:b/>
           <w:bCs/>
         </w:rPr>
-        <w:t>Traceability</w:t>
-      </w:r>
-      <w:proofErr w:type="spellEnd"/>
-      <w:r>
-        <w:rPr>
-          <w:b/>
-          <w:bCs/>
-        </w:rPr>
-        <w:t>:</w:t>
+        <w:t>Traceability:</w:t>
       </w:r>
       <w:r>
         <w:t xml:space="preserve"> Dokumentation einer lückenlosen Nachverfolgbarkeit (100%) über alle oben genannten Phasen hinweg.</w:t>
@@ -2703,7 +2647,6 @@
         </w:rPr>
       </w:pPr>
       <w:bookmarkStart w:id="4" w:name="_Toc232489595"/>
-      <w:proofErr w:type="spellStart"/>
       <w:r>
         <w:rPr>
           <w:lang w:val="en-US"/>
@@ -2720,43 +2663,20 @@
         <w:rPr>
           <w:lang w:val="en-US"/>
         </w:rPr>
-        <w:t>ation</w:t>
-      </w:r>
-      <w:proofErr w:type="spellEnd"/>
-      <w:r>
+        <w:t>ation des Projektes</w:t>
+      </w:r>
+      <w:bookmarkEnd w:id="4"/>
+    </w:p>
+    <w:p>
+      <w:pPr>
         <w:rPr>
           <w:lang w:val="en-US"/>
         </w:rPr>
-        <w:t xml:space="preserve"> des </w:t>
-      </w:r>
-      <w:proofErr w:type="spellStart"/>
-      <w:r>
-        <w:rPr>
-          <w:lang w:val="en-US"/>
-        </w:rPr>
-        <w:t>Projektes</w:t>
-      </w:r>
-      <w:bookmarkEnd w:id="4"/>
-      <w:proofErr w:type="spellEnd"/>
-    </w:p>
-    <w:p>
-      <w:pPr>
-        <w:rPr>
-          <w:lang w:val="en-US"/>
-        </w:rPr>
-      </w:pPr>
-    </w:p>
-    <w:p>
-      <w:r>
-        <w:t xml:space="preserve">Das Projekt wird die agile Methode </w:t>
-      </w:r>
-      <w:proofErr w:type="spellStart"/>
-      <w:r>
-        <w:t>Scrum</w:t>
-      </w:r>
-      <w:proofErr w:type="spellEnd"/>
-      <w:r>
-        <w:t xml:space="preserve"> für die Entwicklung verwenden.</w:t>
+      </w:pPr>
+    </w:p>
+    <w:p>
+      <w:r>
+        <w:t>Das Projekt wird die agile Methode Scrum für die Entwicklung verwenden.</w:t>
       </w:r>
     </w:p>
     <w:p>
@@ -2773,15 +2693,7 @@
     </w:p>
     <w:p>
       <w:r>
-        <w:t xml:space="preserve">Das Team besteht </w:t>
-      </w:r>
-      <w:proofErr w:type="gramStart"/>
-      <w:r>
-        <w:t>aus folgenden</w:t>
-      </w:r>
-      <w:proofErr w:type="gramEnd"/>
-      <w:r>
-        <w:t xml:space="preserve"> Mitgliedern mit den entsprechenden Rollen und Verantwortlichkeiten:</w:t>
+        <w:t>Das Team besteht aus folgenden Mitgliedern mit den entsprechenden Rollen und Verantwortlichkeiten:</w:t>
       </w:r>
     </w:p>
     <w:tbl>
@@ -2878,13 +2790,8 @@
             <w:hideMark/>
           </w:tcPr>
           <w:p>
-            <w:proofErr w:type="spellStart"/>
-            <w:r>
-              <w:t>Scrum</w:t>
-            </w:r>
-            <w:proofErr w:type="spellEnd"/>
-            <w:r>
-              <w:t xml:space="preserve"> Master</w:t>
+            <w:r>
+              <w:t>Scrum Master</w:t>
             </w:r>
           </w:p>
         </w:tc>
@@ -3009,13 +2916,8 @@
             <w:r>
               <w:t xml:space="preserve">Testingenieur, </w:t>
             </w:r>
-            <w:proofErr w:type="spellStart"/>
-            <w:r>
-              <w:t>Product</w:t>
-            </w:r>
-            <w:proofErr w:type="spellEnd"/>
-            <w:r>
-              <w:t xml:space="preserve"> Owner</w:t>
+            <w:r>
+              <w:t>Product Owner</w:t>
             </w:r>
           </w:p>
         </w:tc>
@@ -3237,29 +3139,13 @@
         <w:t>.xlsx“</w:t>
       </w:r>
       <w:r>
-        <w:t xml:space="preserve"> definiert, die effektive Kapazität der einzelnen Teammitglieder festgelegt sowie die geplanten Aktivitäten und die entsprechende „Definition </w:t>
-      </w:r>
-      <w:proofErr w:type="spellStart"/>
-      <w:r>
-        <w:t>of</w:t>
-      </w:r>
-      <w:proofErr w:type="spellEnd"/>
-      <w:r>
-        <w:t xml:space="preserve"> Done“ bestimmt</w:t>
+        <w:t xml:space="preserve"> definiert, die effektive Kapazität der einzelnen Teammitglieder festgelegt sowie die geplanten Aktivitäten und die entsprechende „Definition of Done“ bestimmt</w:t>
       </w:r>
       <w:r>
         <w:t xml:space="preserve">. </w:t>
       </w:r>
       <w:r>
-        <w:t>Zur Nachverfolgbarkeit wird ein iteratives Burn-</w:t>
-      </w:r>
-      <w:proofErr w:type="spellStart"/>
-      <w:r>
-        <w:t>up</w:t>
-      </w:r>
-      <w:proofErr w:type="spellEnd"/>
-      <w:r>
-        <w:t>-Chart eingesetzt. Dabei entwickelt sich die Anzahl der abgeschlossenen Tasks entlang der geplanten Tasks, die im Projektverlauf dynamisch erweitert</w:t>
+        <w:t>Zur Nachverfolgbarkeit wird ein iteratives Burn-up-Chart eingesetzt. Dabei entwickelt sich die Anzahl der abgeschlossenen Tasks entlang der geplanten Tasks, die im Projektverlauf dynamisch erweitert</w:t>
       </w:r>
       <w:r>
         <w:t xml:space="preserve"> </w:t>
@@ -3276,28 +3162,12 @@
     </w:p>
     <w:p>
       <w:r>
-        <w:t xml:space="preserve">Der amtierende </w:t>
-      </w:r>
-      <w:proofErr w:type="spellStart"/>
-      <w:r>
-        <w:t>Scrum</w:t>
-      </w:r>
-      <w:proofErr w:type="spellEnd"/>
-      <w:r>
-        <w:t xml:space="preserve"> Master berichtet an Herrn Pagliarulo, falls Blocker auftreten, die nicht innerhalb des Teams gelöst werden können.</w:t>
-      </w:r>
-    </w:p>
-    <w:p>
-      <w:r>
-        <w:t xml:space="preserve">Ein Sprint Review sowie eine Sprint Retrospektive finden am letzten Donnerstag des Sprints statt. Im Sprint Review werden dem </w:t>
-      </w:r>
-      <w:proofErr w:type="spellStart"/>
-      <w:r>
-        <w:t>Product</w:t>
-      </w:r>
-      <w:proofErr w:type="spellEnd"/>
-      <w:r>
-        <w:t xml:space="preserve"> Owner und anderen Gruppen die erzielten Ergebnisse präsentiert. Aus der Retrospektive werden Maßnahmen zur Verbesserung für die kommenden Sprints abgeleitet.</w:t>
+        <w:t>Der amtierende Scrum Master berichtet an Herrn Pagliarulo, falls Blocker auftreten, die nicht innerhalb des Teams gelöst werden können.</w:t>
+      </w:r>
+    </w:p>
+    <w:p>
+      <w:r>
+        <w:t>Ein Sprint Review sowie eine Sprint Retrospektive finden am letzten Donnerstag des Sprints statt. Im Sprint Review werden dem Product Owner und anderen Gruppen die erzielten Ergebnisse präsentiert. Aus der Retrospektive werden Maßnahmen zur Verbesserung für die kommenden Sprints abgeleitet.</w:t>
       </w:r>
       <w:r>
         <w:t xml:space="preserve"> </w:t>
@@ -3349,32 +3219,11 @@
         <w:t>Das Board ist in mehrere Spalten unterteilt, die den jeweiligen Bearbeitungsstatus widerspiegeln</w:t>
       </w:r>
       <w:r>
-        <w:t xml:space="preserve"> (Backlog, </w:t>
-      </w:r>
-      <w:proofErr w:type="spellStart"/>
-      <w:r>
-        <w:t>Requirements</w:t>
-      </w:r>
-      <w:proofErr w:type="spellEnd"/>
-      <w:r>
-        <w:t xml:space="preserve"> Definition, Architecture Design, Implementation, </w:t>
-      </w:r>
-      <w:proofErr w:type="spellStart"/>
-      <w:r>
-        <w:t>Verification</w:t>
-      </w:r>
-      <w:proofErr w:type="spellEnd"/>
-      <w:r>
-        <w:t>, Done</w:t>
-      </w:r>
-      <w:r>
-        <w:t xml:space="preserve">, Sprint </w:t>
-      </w:r>
-      <w:proofErr w:type="spellStart"/>
-      <w:r>
-        <w:t>Planning</w:t>
-      </w:r>
-      <w:proofErr w:type="spellEnd"/>
+        <w:t xml:space="preserve"> (Backlog, Requirements Definition, Architecture Design, Implementation, Verification, Done</w:t>
+      </w:r>
+      <w:r>
+        <w:t>, Sprint Planning</w:t>
+      </w:r>
       <w:r>
         <w:t>).</w:t>
       </w:r>
@@ -3457,15 +3306,7 @@
         <w:t xml:space="preserve"> Kanban Board wird </w:t>
       </w:r>
       <w:r>
-        <w:t xml:space="preserve">mit der Project Funktion von </w:t>
-      </w:r>
-      <w:proofErr w:type="spellStart"/>
-      <w:r>
-        <w:t>Github</w:t>
-      </w:r>
-      <w:proofErr w:type="spellEnd"/>
-      <w:r>
-        <w:t xml:space="preserve"> erstellt.</w:t>
+        <w:t>mit der Project Funktion von Github erstellt.</w:t>
       </w:r>
     </w:p>
     <w:p/>
@@ -3508,26 +3349,10 @@
     </w:p>
     <w:p>
       <w:r>
-        <w:t xml:space="preserve">GitHub wird ebenso als </w:t>
-      </w:r>
-      <w:proofErr w:type="spellStart"/>
-      <w:r>
-        <w:t>Versionierungsprogramm</w:t>
-      </w:r>
-      <w:proofErr w:type="spellEnd"/>
-      <w:r>
-        <w:t xml:space="preserve"> </w:t>
-      </w:r>
-      <w:r>
-        <w:t>(</w:t>
-      </w:r>
-      <w:proofErr w:type="spellStart"/>
-      <w:r>
-        <w:t>Git</w:t>
-      </w:r>
-      <w:proofErr w:type="spellEnd"/>
-      <w:r>
-        <w:t xml:space="preserve">) </w:t>
+        <w:t xml:space="preserve">GitHub wird ebenso als Versionierungsprogramm </w:t>
+      </w:r>
+      <w:r>
+        <w:t xml:space="preserve">(Git) </w:t>
       </w:r>
       <w:r>
         <w:t>verwendet.</w:t>
@@ -3541,29 +3366,13 @@
         </w:rPr>
       </w:pPr>
       <w:bookmarkStart w:id="13" w:name="_Toc232489600"/>
-      <w:proofErr w:type="spellStart"/>
       <w:r>
         <w:rPr>
           <w:lang w:val="en-US"/>
         </w:rPr>
-        <w:t>Anwendung</w:t>
-      </w:r>
-      <w:proofErr w:type="spellEnd"/>
-      <w:r>
-        <w:rPr>
-          <w:lang w:val="en-US"/>
-        </w:rPr>
-        <w:t xml:space="preserve"> &amp; </w:t>
-      </w:r>
-      <w:proofErr w:type="spellStart"/>
-      <w:r>
-        <w:rPr>
-          <w:lang w:val="en-US"/>
-        </w:rPr>
-        <w:t>Ziele</w:t>
+        <w:t>Anwendung &amp; Ziele</w:t>
       </w:r>
       <w:bookmarkEnd w:id="13"/>
-      <w:proofErr w:type="spellEnd"/>
     </w:p>
     <w:p>
       <w:pPr>
@@ -3744,15 +3553,7 @@
           </w:tcPr>
           <w:p>
             <w:r>
-              <w:t xml:space="preserve">User Stories </w:t>
-            </w:r>
-            <w:proofErr w:type="spellStart"/>
-            <w:r>
-              <w:t>reviewed</w:t>
-            </w:r>
-            <w:proofErr w:type="spellEnd"/>
-            <w:r>
-              <w:t xml:space="preserve"> und freigegeben</w:t>
+              <w:t>User Stories reviewed und freigegeben</w:t>
             </w:r>
           </w:p>
         </w:tc>
@@ -3787,21 +3588,8 @@
               </w:rPr>
             </w:pPr>
             <w:r>
-              <w:t xml:space="preserve">100% </w:t>
-            </w:r>
-            <w:proofErr w:type="spellStart"/>
-            <w:r>
-              <w:t>reviewed</w:t>
-            </w:r>
-            <w:proofErr w:type="spellEnd"/>
-            <w:r>
-              <w:t xml:space="preserve"> &amp; </w:t>
-            </w:r>
-            <w:proofErr w:type="spellStart"/>
-            <w:r>
-              <w:t>approved</w:t>
-            </w:r>
-            <w:proofErr w:type="spellEnd"/>
+              <w:t>100% reviewed &amp; approved</w:t>
+            </w:r>
           </w:p>
         </w:tc>
       </w:tr>
@@ -3851,28 +3639,12 @@
                 <w:lang w:val="en-US"/>
               </w:rPr>
             </w:pPr>
-            <w:proofErr w:type="spellStart"/>
-            <w:r>
-              <w:rPr>
-                <w:lang w:val="en-US"/>
-              </w:rPr>
-              <w:t>Architektur</w:t>
-            </w:r>
-            <w:proofErr w:type="spellEnd"/>
-            <w:r>
-              <w:rPr>
-                <w:lang w:val="en-US"/>
-              </w:rPr>
-              <w:t xml:space="preserve">-Doku </w:t>
-            </w:r>
-            <w:proofErr w:type="spellStart"/>
-            <w:r>
-              <w:rPr>
-                <w:lang w:val="en-US"/>
-              </w:rPr>
-              <w:t>freigegeben</w:t>
-            </w:r>
-            <w:proofErr w:type="spellEnd"/>
+            <w:r>
+              <w:rPr>
+                <w:lang w:val="en-US"/>
+              </w:rPr>
+              <w:t>Architektur-Doku freigegeben</w:t>
+            </w:r>
           </w:p>
         </w:tc>
       </w:tr>
@@ -3914,19 +3686,11 @@
                 <w:lang w:val="en-US"/>
               </w:rPr>
             </w:pPr>
-            <w:proofErr w:type="spellStart"/>
-            <w:r>
-              <w:rPr>
-                <w:lang w:val="en-US"/>
-              </w:rPr>
-              <w:t>abgeschlossene</w:t>
-            </w:r>
-            <w:proofErr w:type="spellEnd"/>
-            <w:r>
-              <w:rPr>
-                <w:lang w:val="en-US"/>
-              </w:rPr>
-              <w:t xml:space="preserve"> Stories</w:t>
+            <w:r>
+              <w:rPr>
+                <w:lang w:val="en-US"/>
+              </w:rPr>
+              <w:t>abgeschlossene Stories</w:t>
             </w:r>
           </w:p>
         </w:tc>
@@ -3944,49 +3708,7 @@
               <w:rPr>
                 <w:lang w:val="en-US"/>
               </w:rPr>
-              <w:t>Alle Stories „</w:t>
-            </w:r>
-            <w:proofErr w:type="gramStart"/>
-            <w:r>
-              <w:rPr>
-                <w:lang w:val="en-US"/>
-              </w:rPr>
-              <w:t>Done“</w:t>
-            </w:r>
-            <w:proofErr w:type="gramEnd"/>
-            <w:r>
-              <w:rPr>
-                <w:lang w:val="en-US"/>
-              </w:rPr>
-              <w:t xml:space="preserve">, </w:t>
-            </w:r>
-            <w:proofErr w:type="spellStart"/>
-            <w:r>
-              <w:rPr>
-                <w:lang w:val="en-US"/>
-              </w:rPr>
-              <w:t>keine</w:t>
-            </w:r>
-            <w:proofErr w:type="spellEnd"/>
-            <w:r>
-              <w:rPr>
-                <w:lang w:val="en-US"/>
-              </w:rPr>
-              <w:t xml:space="preserve"> </w:t>
-            </w:r>
-            <w:proofErr w:type="spellStart"/>
-            <w:r>
-              <w:rPr>
-                <w:lang w:val="en-US"/>
-              </w:rPr>
-              <w:t>kritischen</w:t>
-            </w:r>
-            <w:proofErr w:type="spellEnd"/>
-            <w:r>
-              <w:rPr>
-                <w:lang w:val="en-US"/>
-              </w:rPr>
-              <w:t xml:space="preserve"> Bugs</w:t>
+              <w:t>Alle Stories „Done“, keine kritischen Bugs</w:t>
             </w:r>
           </w:p>
         </w:tc>
@@ -4023,7 +3745,6 @@
                 <w:lang w:val="en-US"/>
               </w:rPr>
             </w:pPr>
-            <w:proofErr w:type="spellStart"/>
             <w:r>
               <w:rPr>
                 <w:lang w:val="en-US"/>
@@ -4034,14 +3755,7 @@
               <w:rPr>
                 <w:lang w:val="en-US"/>
               </w:rPr>
-              <w:t>estandene</w:t>
-            </w:r>
-            <w:proofErr w:type="spellEnd"/>
-            <w:r>
-              <w:rPr>
-                <w:lang w:val="en-US"/>
-              </w:rPr>
-              <w:t xml:space="preserve"> Tests</w:t>
+              <w:t>estandene Tests</w:t>
             </w:r>
             <w:r>
               <w:rPr>
@@ -4065,16 +3779,8 @@
               <w:rPr>
                 <w:lang w:val="en-US"/>
               </w:rPr>
-              <w:t xml:space="preserve">≥95% Tests </w:t>
-            </w:r>
-            <w:proofErr w:type="spellStart"/>
-            <w:r>
-              <w:rPr>
-                <w:lang w:val="en-US"/>
-              </w:rPr>
-              <w:t>bestanden</w:t>
-            </w:r>
-            <w:proofErr w:type="spellEnd"/>
+              <w:t>≥95% Tests bestanden</w:t>
+            </w:r>
           </w:p>
         </w:tc>
       </w:tr>
@@ -4094,7 +3800,6 @@
         </w:rPr>
       </w:pPr>
       <w:bookmarkStart w:id="17" w:name="_Toc232489603"/>
-      <w:proofErr w:type="spellStart"/>
       <w:r>
         <w:rPr>
           <w:lang w:val="en-US"/>
@@ -4102,7 +3807,6 @@
         <w:t>Anforderungsmanagement</w:t>
       </w:r>
       <w:bookmarkEnd w:id="17"/>
-      <w:proofErr w:type="spellEnd"/>
     </w:p>
     <w:p>
       <w:pPr>
@@ -4560,13 +4264,8 @@
           </w:tcPr>
           <w:p>
             <w:r>
-              <w:t xml:space="preserve">TBD, in Review, </w:t>
-            </w:r>
-            <w:proofErr w:type="spellStart"/>
-            <w:r>
-              <w:t>Reviewed</w:t>
-            </w:r>
-            <w:proofErr w:type="spellEnd"/>
+              <w:t>TBD, in Review, Reviewed</w:t>
+            </w:r>
           </w:p>
         </w:tc>
       </w:tr>
@@ -4576,11 +4275,9 @@
             <w:tcW w:w="1250" w:type="dxa"/>
           </w:tcPr>
           <w:p>
-            <w:proofErr w:type="spellStart"/>
             <w:r>
               <w:t>Verification</w:t>
             </w:r>
-            <w:proofErr w:type="spellEnd"/>
           </w:p>
         </w:tc>
         <w:tc>
@@ -4632,15 +4329,7 @@
         <w:t xml:space="preserve"> </w:t>
       </w:r>
       <w:r>
-        <w:t>verwaltet. Die Nachverfolgbarkeit (</w:t>
-      </w:r>
-      <w:proofErr w:type="spellStart"/>
-      <w:r>
-        <w:t>Traceability</w:t>
-      </w:r>
-      <w:proofErr w:type="spellEnd"/>
-      <w:r>
-        <w:t>) zwischen User Stories und Anforderungen wird ebenfalls in dieser Tabelle manuell gepflegt.</w:t>
+        <w:t>verwaltet. Die Nachverfolgbarkeit (Traceability) zwischen User Stories und Anforderungen wird ebenfalls in dieser Tabelle manuell gepflegt.</w:t>
       </w:r>
     </w:p>
     <w:p>
@@ -4752,20 +4441,12 @@
         </w:rPr>
       </w:pPr>
       <w:bookmarkStart w:id="19" w:name="_Toc232489605"/>
-      <w:proofErr w:type="spellStart"/>
       <w:r>
         <w:rPr>
           <w:lang w:val="en-US"/>
         </w:rPr>
         <w:lastRenderedPageBreak/>
-        <w:t>Architektur</w:t>
-      </w:r>
-      <w:proofErr w:type="spellEnd"/>
-      <w:r>
-        <w:rPr>
-          <w:lang w:val="en-US"/>
-        </w:rPr>
-        <w:t xml:space="preserve"> &amp; Design</w:t>
+        <w:t>Architektur &amp; Design</w:t>
       </w:r>
       <w:bookmarkStart w:id="20" w:name="_Toc165127832"/>
       <w:bookmarkEnd w:id="19"/>
@@ -4857,23 +4538,7 @@
           <w:rFonts w:eastAsia="Times New Roman" w:cstheme="minorHAnsi"/>
           <w:lang w:eastAsia="de-DE"/>
         </w:rPr>
-        <w:t>Die einzelnen Architekturelemente werden eindeutig benannt und gemäß folgender Namenskonvention identifiziert: &lt;</w:t>
-      </w:r>
-      <w:proofErr w:type="spellStart"/>
-      <w:r>
-        <w:rPr>
-          <w:rFonts w:eastAsia="Times New Roman" w:cstheme="minorHAnsi"/>
-          <w:lang w:eastAsia="de-DE"/>
-        </w:rPr>
-        <w:t>ArchEl_x</w:t>
-      </w:r>
-      <w:proofErr w:type="spellEnd"/>
-      <w:r>
-        <w:rPr>
-          <w:rFonts w:eastAsia="Times New Roman" w:cstheme="minorHAnsi"/>
-          <w:lang w:eastAsia="de-DE"/>
-        </w:rPr>
-        <w:t>&gt;. Diese Identifikatoren dienen dazu, Anforderungen eindeutig mit den jeweiligen Architekturelementen zu verknüpfen. Die Zuordnung wird in der Excel-Datei „</w:t>
+        <w:t>Die einzelnen Architekturelemente werden eindeutig benannt und gemäß folgender Namenskonvention identifiziert: &lt;ArchEl_x&gt;. Diese Identifikatoren dienen dazu, Anforderungen eindeutig mit den jeweiligen Architekturelementen zu verknüpfen. Die Zuordnung wird in der Excel-Datei „</w:t>
       </w:r>
       <w:r>
         <w:rPr>
@@ -5019,60 +4684,35 @@
           <w:rFonts w:eastAsia="Times New Roman" w:cstheme="minorHAnsi"/>
           <w:lang w:eastAsia="de-DE"/>
         </w:rPr>
-        <w:t>Die Erstellung der Diagramme erfolgt mit dem Tool „</w:t>
-      </w:r>
-      <w:proofErr w:type="spellStart"/>
+        <w:t>Die Erstellung der Diagramme erfolgt mit dem Tool „Lucidchart</w:t>
+      </w:r>
       <w:r>
         <w:rPr>
           <w:rFonts w:eastAsia="Times New Roman" w:cstheme="minorHAnsi"/>
           <w:lang w:eastAsia="de-DE"/>
         </w:rPr>
-        <w:t>Lucidchart</w:t>
-      </w:r>
-      <w:proofErr w:type="spellEnd"/>
+        <w:t>“</w:t>
+      </w:r>
       <w:r>
         <w:rPr>
           <w:rFonts w:eastAsia="Times New Roman" w:cstheme="minorHAnsi"/>
           <w:lang w:eastAsia="de-DE"/>
         </w:rPr>
-        <w:t>“</w:t>
+        <w:t xml:space="preserve"> [</w:t>
       </w:r>
       <w:r>
         <w:rPr>
           <w:rFonts w:eastAsia="Times New Roman" w:cstheme="minorHAnsi"/>
           <w:lang w:eastAsia="de-DE"/>
         </w:rPr>
-        <w:t xml:space="preserve"> [</w:t>
+        <w:t>3]</w:t>
       </w:r>
       <w:r>
         <w:rPr>
           <w:rFonts w:eastAsia="Times New Roman" w:cstheme="minorHAnsi"/>
           <w:lang w:eastAsia="de-DE"/>
         </w:rPr>
-        <w:t>3]</w:t>
-      </w:r>
-      <w:r>
-        <w:rPr>
-          <w:rFonts w:eastAsia="Times New Roman" w:cstheme="minorHAnsi"/>
-          <w:lang w:eastAsia="de-DE"/>
-        </w:rPr>
-        <w:t xml:space="preserve"> bzw. </w:t>
-      </w:r>
-      <w:proofErr w:type="spellStart"/>
-      <w:r>
-        <w:rPr>
-          <w:rFonts w:eastAsia="Times New Roman" w:cstheme="minorHAnsi"/>
-          <w:lang w:eastAsia="de-DE"/>
-        </w:rPr>
-        <w:t>yEd</w:t>
-      </w:r>
-      <w:proofErr w:type="spellEnd"/>
-      <w:r>
-        <w:rPr>
-          <w:rFonts w:eastAsia="Times New Roman" w:cstheme="minorHAnsi"/>
-          <w:lang w:eastAsia="de-DE"/>
-        </w:rPr>
-        <w:t xml:space="preserve"> [4]</w:t>
+        <w:t xml:space="preserve"> bzw. yEd [4]</w:t>
       </w:r>
       <w:r>
         <w:rPr>
@@ -5347,29 +4987,13 @@
         </w:rPr>
       </w:pPr>
       <w:bookmarkStart w:id="27" w:name="_Toc232489610"/>
-      <w:proofErr w:type="spellStart"/>
       <w:r>
         <w:rPr>
           <w:lang w:val="en-US"/>
         </w:rPr>
-        <w:t>Verifizierung</w:t>
-      </w:r>
-      <w:proofErr w:type="spellEnd"/>
-      <w:r>
-        <w:rPr>
-          <w:lang w:val="en-US"/>
-        </w:rPr>
-        <w:t xml:space="preserve"> und </w:t>
-      </w:r>
-      <w:proofErr w:type="spellStart"/>
-      <w:r>
-        <w:rPr>
-          <w:lang w:val="en-US"/>
-        </w:rPr>
-        <w:t>Validierung</w:t>
+        <w:t>Verifizierung und Validierung</w:t>
       </w:r>
       <w:bookmarkEnd w:id="27"/>
-      <w:proofErr w:type="spellEnd"/>
     </w:p>
     <w:p>
       <w:pPr>
@@ -5387,19 +5011,11 @@
       </w:pPr>
       <w:bookmarkStart w:id="28" w:name="_Toc165127836"/>
       <w:bookmarkStart w:id="29" w:name="_Toc232489611"/>
-      <w:proofErr w:type="spellStart"/>
       <w:r>
         <w:rPr>
           <w:lang w:val="en-US"/>
         </w:rPr>
-        <w:t>Formelle</w:t>
-      </w:r>
-      <w:proofErr w:type="spellEnd"/>
-      <w:r>
-        <w:rPr>
-          <w:lang w:val="en-US"/>
-        </w:rPr>
-        <w:t xml:space="preserve"> Test Cases</w:t>
+        <w:t>Formelle Test Cases</w:t>
       </w:r>
       <w:bookmarkEnd w:id="28"/>
       <w:bookmarkEnd w:id="29"/>
@@ -5656,19 +5272,11 @@
                 <w:lang w:val="en-US"/>
               </w:rPr>
             </w:pPr>
-            <w:proofErr w:type="spellStart"/>
-            <w:r>
-              <w:rPr>
-                <w:lang w:val="en-US"/>
-              </w:rPr>
-              <w:t>Github</w:t>
-            </w:r>
-            <w:proofErr w:type="spellEnd"/>
-            <w:r>
-              <w:rPr>
-                <w:lang w:val="en-US"/>
-              </w:rPr>
-              <w:t xml:space="preserve"> Sprints</w:t>
+            <w:r>
+              <w:rPr>
+                <w:lang w:val="en-US"/>
+              </w:rPr>
+              <w:t>Github Sprints</w:t>
             </w:r>
           </w:p>
         </w:tc>
@@ -5804,7 +5412,13 @@
               <w:rPr>
                 <w:lang w:val="en-US"/>
               </w:rPr>
-              <w:t>.0</w:t>
+              <w:t>.</w:t>
+            </w:r>
+            <w:r>
+              <w:rPr>
+                <w:lang w:val="en-US"/>
+              </w:rPr>
+              <w:t>1</w:t>
             </w:r>
           </w:p>
         </w:tc>
@@ -5927,7 +5541,6 @@
                 <w:lang w:val="en-US"/>
               </w:rPr>
             </w:pPr>
-            <w:proofErr w:type="spellStart"/>
             <w:r>
               <w:rPr>
                 <w:rFonts w:eastAsia="Times New Roman" w:cstheme="minorHAnsi"/>
@@ -5935,7 +5548,6 @@
               </w:rPr>
               <w:t>Lucidchart</w:t>
             </w:r>
-            <w:proofErr w:type="spellEnd"/>
           </w:p>
         </w:tc>
         <w:tc>
@@ -6025,14 +5637,12 @@
                 <w:lang w:val="en-US"/>
               </w:rPr>
             </w:pPr>
-            <w:proofErr w:type="spellStart"/>
             <w:r>
               <w:rPr>
                 <w:lang w:val="en-US"/>
               </w:rPr>
               <w:t>yEd</w:t>
             </w:r>
-            <w:proofErr w:type="spellEnd"/>
           </w:p>
         </w:tc>
         <w:tc>
@@ -6072,556 +5682,6 @@
               </w:rPr>
               <w:t>1.0</w:t>
             </w:r>
-          </w:p>
-        </w:tc>
-      </w:tr>
-      <w:tr>
-        <w:tc>
-          <w:tcPr>
-            <w:tcW w:w="704" w:type="dxa"/>
-          </w:tcPr>
-          <w:p>
-            <w:pPr>
-              <w:rPr>
-                <w:lang w:val="en-US"/>
-              </w:rPr>
-            </w:pPr>
-          </w:p>
-        </w:tc>
-        <w:tc>
-          <w:tcPr>
-            <w:tcW w:w="3402" w:type="dxa"/>
-          </w:tcPr>
-          <w:p>
-            <w:pPr>
-              <w:rPr>
-                <w:lang w:val="en-US"/>
-              </w:rPr>
-            </w:pPr>
-          </w:p>
-        </w:tc>
-        <w:tc>
-          <w:tcPr>
-            <w:tcW w:w="4084" w:type="dxa"/>
-          </w:tcPr>
-          <w:p>
-            <w:pPr>
-              <w:rPr>
-                <w:lang w:val="en-US"/>
-              </w:rPr>
-            </w:pPr>
-          </w:p>
-        </w:tc>
-        <w:tc>
-          <w:tcPr>
-            <w:tcW w:w="872" w:type="dxa"/>
-          </w:tcPr>
-          <w:p>
-            <w:pPr>
-              <w:rPr>
-                <w:lang w:val="en-US"/>
-              </w:rPr>
-            </w:pPr>
-          </w:p>
-        </w:tc>
-      </w:tr>
-      <w:tr>
-        <w:tc>
-          <w:tcPr>
-            <w:tcW w:w="704" w:type="dxa"/>
-          </w:tcPr>
-          <w:p>
-            <w:pPr>
-              <w:rPr>
-                <w:lang w:val="en-US"/>
-              </w:rPr>
-            </w:pPr>
-          </w:p>
-        </w:tc>
-        <w:tc>
-          <w:tcPr>
-            <w:tcW w:w="3402" w:type="dxa"/>
-          </w:tcPr>
-          <w:p>
-            <w:pPr>
-              <w:rPr>
-                <w:lang w:val="en-US"/>
-              </w:rPr>
-            </w:pPr>
-          </w:p>
-        </w:tc>
-        <w:tc>
-          <w:tcPr>
-            <w:tcW w:w="4084" w:type="dxa"/>
-          </w:tcPr>
-          <w:p>
-            <w:pPr>
-              <w:rPr>
-                <w:lang w:val="en-US"/>
-              </w:rPr>
-            </w:pPr>
-          </w:p>
-        </w:tc>
-        <w:tc>
-          <w:tcPr>
-            <w:tcW w:w="872" w:type="dxa"/>
-          </w:tcPr>
-          <w:p>
-            <w:pPr>
-              <w:rPr>
-                <w:lang w:val="en-US"/>
-              </w:rPr>
-            </w:pPr>
-          </w:p>
-        </w:tc>
-      </w:tr>
-      <w:tr>
-        <w:tc>
-          <w:tcPr>
-            <w:tcW w:w="704" w:type="dxa"/>
-          </w:tcPr>
-          <w:p>
-            <w:pPr>
-              <w:rPr>
-                <w:lang w:val="en-US"/>
-              </w:rPr>
-            </w:pPr>
-          </w:p>
-        </w:tc>
-        <w:tc>
-          <w:tcPr>
-            <w:tcW w:w="3402" w:type="dxa"/>
-          </w:tcPr>
-          <w:p>
-            <w:pPr>
-              <w:rPr>
-                <w:lang w:val="en-US"/>
-              </w:rPr>
-            </w:pPr>
-          </w:p>
-        </w:tc>
-        <w:tc>
-          <w:tcPr>
-            <w:tcW w:w="4084" w:type="dxa"/>
-          </w:tcPr>
-          <w:p>
-            <w:pPr>
-              <w:rPr>
-                <w:lang w:val="en-US"/>
-              </w:rPr>
-            </w:pPr>
-          </w:p>
-        </w:tc>
-        <w:tc>
-          <w:tcPr>
-            <w:tcW w:w="872" w:type="dxa"/>
-          </w:tcPr>
-          <w:p>
-            <w:pPr>
-              <w:rPr>
-                <w:lang w:val="en-US"/>
-              </w:rPr>
-            </w:pPr>
-          </w:p>
-        </w:tc>
-      </w:tr>
-      <w:tr>
-        <w:tc>
-          <w:tcPr>
-            <w:tcW w:w="704" w:type="dxa"/>
-          </w:tcPr>
-          <w:p>
-            <w:pPr>
-              <w:rPr>
-                <w:lang w:val="en-US"/>
-              </w:rPr>
-            </w:pPr>
-          </w:p>
-        </w:tc>
-        <w:tc>
-          <w:tcPr>
-            <w:tcW w:w="3402" w:type="dxa"/>
-          </w:tcPr>
-          <w:p>
-            <w:pPr>
-              <w:rPr>
-                <w:lang w:val="en-US"/>
-              </w:rPr>
-            </w:pPr>
-          </w:p>
-        </w:tc>
-        <w:tc>
-          <w:tcPr>
-            <w:tcW w:w="4084" w:type="dxa"/>
-          </w:tcPr>
-          <w:p>
-            <w:pPr>
-              <w:rPr>
-                <w:lang w:val="en-US"/>
-              </w:rPr>
-            </w:pPr>
-          </w:p>
-        </w:tc>
-        <w:tc>
-          <w:tcPr>
-            <w:tcW w:w="872" w:type="dxa"/>
-          </w:tcPr>
-          <w:p>
-            <w:pPr>
-              <w:rPr>
-                <w:lang w:val="en-US"/>
-              </w:rPr>
-            </w:pPr>
-          </w:p>
-        </w:tc>
-      </w:tr>
-      <w:tr>
-        <w:tc>
-          <w:tcPr>
-            <w:tcW w:w="704" w:type="dxa"/>
-          </w:tcPr>
-          <w:p>
-            <w:pPr>
-              <w:rPr>
-                <w:lang w:val="en-US"/>
-              </w:rPr>
-            </w:pPr>
-          </w:p>
-        </w:tc>
-        <w:tc>
-          <w:tcPr>
-            <w:tcW w:w="3402" w:type="dxa"/>
-          </w:tcPr>
-          <w:p>
-            <w:pPr>
-              <w:rPr>
-                <w:lang w:val="en-US"/>
-              </w:rPr>
-            </w:pPr>
-          </w:p>
-        </w:tc>
-        <w:tc>
-          <w:tcPr>
-            <w:tcW w:w="4084" w:type="dxa"/>
-          </w:tcPr>
-          <w:p>
-            <w:pPr>
-              <w:rPr>
-                <w:lang w:val="en-US"/>
-              </w:rPr>
-            </w:pPr>
-          </w:p>
-        </w:tc>
-        <w:tc>
-          <w:tcPr>
-            <w:tcW w:w="872" w:type="dxa"/>
-          </w:tcPr>
-          <w:p>
-            <w:pPr>
-              <w:rPr>
-                <w:lang w:val="en-US"/>
-              </w:rPr>
-            </w:pPr>
-          </w:p>
-        </w:tc>
-      </w:tr>
-      <w:tr>
-        <w:tc>
-          <w:tcPr>
-            <w:tcW w:w="704" w:type="dxa"/>
-          </w:tcPr>
-          <w:p>
-            <w:pPr>
-              <w:rPr>
-                <w:lang w:val="en-US"/>
-              </w:rPr>
-            </w:pPr>
-          </w:p>
-        </w:tc>
-        <w:tc>
-          <w:tcPr>
-            <w:tcW w:w="3402" w:type="dxa"/>
-          </w:tcPr>
-          <w:p>
-            <w:pPr>
-              <w:rPr>
-                <w:lang w:val="en-US"/>
-              </w:rPr>
-            </w:pPr>
-          </w:p>
-        </w:tc>
-        <w:tc>
-          <w:tcPr>
-            <w:tcW w:w="4084" w:type="dxa"/>
-          </w:tcPr>
-          <w:p>
-            <w:pPr>
-              <w:rPr>
-                <w:lang w:val="en-US"/>
-              </w:rPr>
-            </w:pPr>
-          </w:p>
-        </w:tc>
-        <w:tc>
-          <w:tcPr>
-            <w:tcW w:w="872" w:type="dxa"/>
-          </w:tcPr>
-          <w:p>
-            <w:pPr>
-              <w:rPr>
-                <w:lang w:val="en-US"/>
-              </w:rPr>
-            </w:pPr>
-          </w:p>
-        </w:tc>
-      </w:tr>
-      <w:tr>
-        <w:tc>
-          <w:tcPr>
-            <w:tcW w:w="704" w:type="dxa"/>
-          </w:tcPr>
-          <w:p>
-            <w:pPr>
-              <w:rPr>
-                <w:lang w:val="en-US"/>
-              </w:rPr>
-            </w:pPr>
-          </w:p>
-        </w:tc>
-        <w:tc>
-          <w:tcPr>
-            <w:tcW w:w="3402" w:type="dxa"/>
-          </w:tcPr>
-          <w:p>
-            <w:pPr>
-              <w:rPr>
-                <w:lang w:val="en-US"/>
-              </w:rPr>
-            </w:pPr>
-          </w:p>
-        </w:tc>
-        <w:tc>
-          <w:tcPr>
-            <w:tcW w:w="4084" w:type="dxa"/>
-          </w:tcPr>
-          <w:p>
-            <w:pPr>
-              <w:rPr>
-                <w:lang w:val="en-US"/>
-              </w:rPr>
-            </w:pPr>
-          </w:p>
-        </w:tc>
-        <w:tc>
-          <w:tcPr>
-            <w:tcW w:w="872" w:type="dxa"/>
-          </w:tcPr>
-          <w:p>
-            <w:pPr>
-              <w:rPr>
-                <w:lang w:val="en-US"/>
-              </w:rPr>
-            </w:pPr>
-          </w:p>
-        </w:tc>
-      </w:tr>
-      <w:tr>
-        <w:tc>
-          <w:tcPr>
-            <w:tcW w:w="704" w:type="dxa"/>
-          </w:tcPr>
-          <w:p>
-            <w:pPr>
-              <w:rPr>
-                <w:lang w:val="en-US"/>
-              </w:rPr>
-            </w:pPr>
-          </w:p>
-        </w:tc>
-        <w:tc>
-          <w:tcPr>
-            <w:tcW w:w="3402" w:type="dxa"/>
-          </w:tcPr>
-          <w:p>
-            <w:pPr>
-              <w:rPr>
-                <w:lang w:val="en-US"/>
-              </w:rPr>
-            </w:pPr>
-          </w:p>
-        </w:tc>
-        <w:tc>
-          <w:tcPr>
-            <w:tcW w:w="4084" w:type="dxa"/>
-          </w:tcPr>
-          <w:p>
-            <w:pPr>
-              <w:rPr>
-                <w:lang w:val="en-US"/>
-              </w:rPr>
-            </w:pPr>
-          </w:p>
-        </w:tc>
-        <w:tc>
-          <w:tcPr>
-            <w:tcW w:w="872" w:type="dxa"/>
-          </w:tcPr>
-          <w:p>
-            <w:pPr>
-              <w:rPr>
-                <w:lang w:val="en-US"/>
-              </w:rPr>
-            </w:pPr>
-          </w:p>
-        </w:tc>
-      </w:tr>
-      <w:tr>
-        <w:tc>
-          <w:tcPr>
-            <w:tcW w:w="704" w:type="dxa"/>
-          </w:tcPr>
-          <w:p>
-            <w:pPr>
-              <w:rPr>
-                <w:lang w:val="en-US"/>
-              </w:rPr>
-            </w:pPr>
-          </w:p>
-        </w:tc>
-        <w:tc>
-          <w:tcPr>
-            <w:tcW w:w="3402" w:type="dxa"/>
-          </w:tcPr>
-          <w:p>
-            <w:pPr>
-              <w:rPr>
-                <w:lang w:val="en-US"/>
-              </w:rPr>
-            </w:pPr>
-          </w:p>
-        </w:tc>
-        <w:tc>
-          <w:tcPr>
-            <w:tcW w:w="4084" w:type="dxa"/>
-          </w:tcPr>
-          <w:p>
-            <w:pPr>
-              <w:rPr>
-                <w:lang w:val="en-US"/>
-              </w:rPr>
-            </w:pPr>
-          </w:p>
-        </w:tc>
-        <w:tc>
-          <w:tcPr>
-            <w:tcW w:w="872" w:type="dxa"/>
-          </w:tcPr>
-          <w:p>
-            <w:pPr>
-              <w:rPr>
-                <w:lang w:val="en-US"/>
-              </w:rPr>
-            </w:pPr>
-          </w:p>
-        </w:tc>
-      </w:tr>
-      <w:tr>
-        <w:tc>
-          <w:tcPr>
-            <w:tcW w:w="704" w:type="dxa"/>
-          </w:tcPr>
-          <w:p>
-            <w:pPr>
-              <w:rPr>
-                <w:lang w:val="en-US"/>
-              </w:rPr>
-            </w:pPr>
-          </w:p>
-        </w:tc>
-        <w:tc>
-          <w:tcPr>
-            <w:tcW w:w="3402" w:type="dxa"/>
-          </w:tcPr>
-          <w:p>
-            <w:pPr>
-              <w:rPr>
-                <w:lang w:val="en-US"/>
-              </w:rPr>
-            </w:pPr>
-          </w:p>
-        </w:tc>
-        <w:tc>
-          <w:tcPr>
-            <w:tcW w:w="4084" w:type="dxa"/>
-          </w:tcPr>
-          <w:p>
-            <w:pPr>
-              <w:rPr>
-                <w:lang w:val="en-US"/>
-              </w:rPr>
-            </w:pPr>
-          </w:p>
-        </w:tc>
-        <w:tc>
-          <w:tcPr>
-            <w:tcW w:w="872" w:type="dxa"/>
-          </w:tcPr>
-          <w:p>
-            <w:pPr>
-              <w:rPr>
-                <w:lang w:val="en-US"/>
-              </w:rPr>
-            </w:pPr>
-          </w:p>
-        </w:tc>
-      </w:tr>
-      <w:tr>
-        <w:tc>
-          <w:tcPr>
-            <w:tcW w:w="704" w:type="dxa"/>
-          </w:tcPr>
-          <w:p>
-            <w:pPr>
-              <w:rPr>
-                <w:lang w:val="en-US"/>
-              </w:rPr>
-            </w:pPr>
-          </w:p>
-        </w:tc>
-        <w:tc>
-          <w:tcPr>
-            <w:tcW w:w="3402" w:type="dxa"/>
-          </w:tcPr>
-          <w:p>
-            <w:pPr>
-              <w:rPr>
-                <w:lang w:val="en-US"/>
-              </w:rPr>
-            </w:pPr>
-          </w:p>
-        </w:tc>
-        <w:tc>
-          <w:tcPr>
-            <w:tcW w:w="4084" w:type="dxa"/>
-          </w:tcPr>
-          <w:p>
-            <w:pPr>
-              <w:rPr>
-                <w:lang w:val="en-US"/>
-              </w:rPr>
-            </w:pPr>
-          </w:p>
-        </w:tc>
-        <w:tc>
-          <w:tcPr>
-            <w:tcW w:w="872" w:type="dxa"/>
-          </w:tcPr>
-          <w:p>
-            <w:pPr>
-              <w:rPr>
-                <w:lang w:val="en-US"/>
-              </w:rPr>
-            </w:pPr>
           </w:p>
         </w:tc>
       </w:tr>
@@ -6767,13 +5827,8 @@
                 <w:lang w:val="en-US"/>
               </w:rPr>
             </w:pPr>
-            <w:proofErr w:type="spellStart"/>
-            <w:r>
-              <w:t>Scrum</w:t>
-            </w:r>
-            <w:proofErr w:type="spellEnd"/>
-            <w:r>
-              <w:t xml:space="preserve"> Master</w:t>
+            <w:r>
+              <w:t>Scrum Master</w:t>
             </w:r>
           </w:p>
         </w:tc>
@@ -6873,15 +5928,7 @@
               </w:rPr>
             </w:pPr>
             <w:r>
-              <w:t xml:space="preserve">Testingenieur, </w:t>
-            </w:r>
-            <w:proofErr w:type="spellStart"/>
-            <w:r>
-              <w:t>Product</w:t>
-            </w:r>
-            <w:proofErr w:type="spellEnd"/>
-            <w:r>
-              <w:t xml:space="preserve"> Owner</w:t>
+              <w:t>Testingenieur, Product Owner</w:t>
             </w:r>
           </w:p>
         </w:tc>
@@ -9445,6 +8492,7 @@
     <w:rsid w:val="003A3048"/>
     <w:rsid w:val="003E7898"/>
     <w:rsid w:val="00420A76"/>
+    <w:rsid w:val="004408F8"/>
     <w:rsid w:val="004745EE"/>
     <w:rsid w:val="00494141"/>
     <w:rsid w:val="004C1C0F"/>
@@ -9454,6 +8502,7 @@
     <w:rsid w:val="004F7D21"/>
     <w:rsid w:val="005543CF"/>
     <w:rsid w:val="00663E13"/>
+    <w:rsid w:val="007808F0"/>
     <w:rsid w:val="00835503"/>
     <w:rsid w:val="008376DC"/>
     <w:rsid w:val="00844CED"/>

</xml_diff>